<commit_message>
Statewide analyses under the audited rules; Colorado section
</commit_message>
<xml_diff>
--- a/paper/Before_and_After_the_Map_manuscript.docx
+++ b/paper/Before_and_After_the_Map_manuscript.docx
@@ -75,7 +75,7 @@
           <w:sz w:val="22"/>
           <w:szCs w:val="22"/>
         </w:rPr>
-        <w:t xml:space="preserve"> Environmental inequality is usually measured where regulatory inventories begin, in the 1980s, long after the industrial geography that produces it was laid down. This paper reconstructs that geography for Denver from its first state business directory (1871) to the present and asks what came first: hazardous industry, the people who lived beside it, or the instruments — the 1925 zoning ordinance and the 1938 HOLC map — that are often credited with creating the pattern. Three sources are linked: the street-level hazardous trades of 34 business-directory editions (1871–1956) and 13 complete manufacturers' directory editions (1965–1992); the complete-count censuses of 1880–1940 aggregated to reconstructed enumeration districts and census tracts within 10 km of downtown for 1950–2020; and the city's 1929 zoning map, the 1938 HOLC map and today's assessor parcels. Four findings follow. First, the disparities preceded both instruments. From 1880 to 1940 districts nearer hazardous industry held more foreign-born, labouring and lodging households and fewer owners, and the hazardous trades that opened before 1940 opened in places that already had more of those households. Second, the land the appraisers graded D combined two different geographies. Black Denver became concentrated in two residential D areas northeast of downtown between 1900 and 1930, before the map, while the industrially zoned land, in D and in the ungraded industrial zones, lost Black residents and became Mexican and Hispano. The D–C Black gap describes the first geography, not the second. Third, neither instrument coincides with an acceleration that the data can detect. Per directory edition, hazardous siting after 1938 favoured D land within the range it had before (D/C 2.1, against 1.7–6.4), and after 1950 the Hispanic concentration beside industry is strong between places but does not track a tract's own changes in industry. Hazardous manufacturers that arrived after 1965 went to tracts that were less poor than those that never had one, and those tracts then gained Hispanic residents faster. Concentration of both groups in D and industrial tracts peaked around 1960 and has declined since. Fourth, four in ten of the 1965–92 sites are still industrial parcels, and most of the 168 now residential were small firms in residential buildings rather than conversions. The instruments recorded an industrial and racial geography that already existed; the data do not show that either created it or measurably accelerated it.</w:t>
+        <w:t xml:space="preserve"> Environmental inequality is usually measured where regulatory inventories begin, in the 1980s, long after the industrial geography that produces it was laid down. This paper reconstructs that geography for Denver from its first state business directory (1871) to the present and asks what came first: hazardous industry, the people who lived beside it, or the instruments — the 1925 zoning ordinance and the 1938 HOLC map — that are often credited with creating the pattern. Three sources are linked: the street-level hazardous trades of 34 business-directory editions (1871–1956) and 13 complete manufacturers' directory editions (1965–1992); the complete-count censuses of 1880–1940 aggregated to reconstructed enumeration districts and census tracts within 10 km of downtown for 1950–2020; and the city's 1929 zoning map, the 1938 HOLC map and today's assessor parcels. Four findings follow. First, the disparities preceded both instruments. From 1880 to 1940 districts nearer hazardous industry held more foreign-born, labouring and lodging households and fewer owners, and the hazardous trades that opened before 1940 opened in places that already had more of those households. Second, the land the appraisers graded D combined two different geographies. Black Denver became concentrated in two residential D areas northeast of downtown between 1900 and 1930, before the map, while the industrially zoned land, in D and in the ungraded industrial zones, lost Black residents and became Mexican and Hispano. The D–C Black gap describes the first geography, not the second. Third, neither instrument coincides with an acceleration that the data can detect. Per directory edition, hazardous siting after 1938 favoured D land within the range it had before (D/C 2.1, against 1.7–6.4), and after 1950 the Hispanic concentration beside industry is strong between places but does not track a tract's own changes in industry. Hazardous manufacturers that arrived after 1965 went to tracts that were less poor than those that never had one, and those tracts then gained Hispanic residents faster. Concentration of both groups in D and industrial tracts peaked around 1960 and has declined since. Fourth, four in ten of the 1965–92 sites are still industrial parcels, and most of the 168 now residential were small firms in residential buildings rather than conversions. Across Colorado, the Hispanic–industry association is a Front Range pattern that has moved from Denver to its suburbs and the northern Front Range, while poverty and renting beside industry are statewide. The instruments recorded an industrial and racial geography that already existed; the data do not show that either created it or measurably accelerated it.</w:t>
       </w:r>
     </w:p>
     <w:p>
@@ -176,7 +176,7 @@
           <w:sz w:val="24"/>
           <w:szCs w:val="24"/>
         </w:rPr>
-        <w:t xml:space="preserve">The argument runs in three steps, each with its own section of evidence. Section 3 uses the complete-count censuses of 1880–1940, aggregated to reconstructed enumeration districts, to describe who lived beside the hazardous trades in each decade before the instruments of the 1920s and 1930s existed. Section 4 brings in the 1925 zoning ordinance and the 1938 HOLC map and asks, in the design of Aaronson, Hartley and Mazumder (2021), whether the map created the pattern or recorded it, using the map's own boundaries as the comparison and controlling for rail and for what the city had already zoned. Section 4 ends with descriptive sequences on fixed geographies — which came first in each place, industry or its neighbours, and whether anything changed when the zoning or the map arrived. Section 5 carries the analysis onto census tracts from 1950 to 2020, where the group beside industry changes. Section 6 asks what became of the sites themselves, matching every one to the parcel that stands there today. Section 7 draws the steps together and sets out what the evidence can and cannot support.</w:t>
+        <w:t xml:space="preserve">The argument runs in three steps, each with its own section of evidence. Section 3 uses the complete-count censuses of 1880–1940, aggregated to reconstructed enumeration districts, to describe who lived beside the hazardous trades in each decade before the instruments of the 1920s and 1930s existed. Section 4 brings in the 1925 zoning ordinance and the 1938 HOLC map and asks, in the design of Aaronson, Hartley and Mazumder (2021), whether the map created the pattern or recorded it, using the map's own boundaries as the comparison and controlling for rail and for what the city had already zoned. Section 4 ends with descriptive sequences on fixed geographies — which came first in each place, industry or its neighbours, and whether anything changed when the zoning or the map arrived. Section 5 carries the analysis onto census tracts from 1950 to 2020, where the group beside industry changes. Section 6 asks what became of the sites themselves, matching every one to the parcel that stands there today. Section 7 asks how far the Denver pattern extends across Colorado. Section 8 draws the steps together and sets out what the evidence can and cannot support.</w:t>
       </w:r>
     </w:p>
     <w:p>
@@ -36560,7 +36560,3597 @@
           <w:sz w:val="26"/>
           <w:szCs w:val="26"/>
         </w:rPr>
-        <w:t xml:space="preserve">7. Discussion and conclusion</w:t>
+        <w:t xml:space="preserve">7. Colorado beyond Denver</w:t>
+      </w:r>
+    </w:p>
+    <w:p>
+      <w:pPr>
+        <w:spacing w:after="160" w:line="360"/>
+        <w:jc w:val="both"/>
+      </w:pPr>
+      <w:r>
+        <w:rPr>
+          <w:rFonts w:ascii="Times New Roman" w:cs="Times New Roman" w:eastAsia="Times New Roman" w:hAnsi="Times New Roman"/>
+          <w:b w:val="false"/>
+          <w:bCs w:val="false"/>
+          <w:i w:val="false"/>
+          <w:iCs w:val="false"/>
+          <w:sz w:val="24"/>
+          <w:szCs w:val="24"/>
+        </w:rPr>
+        <w:t xml:space="preserve">The same directories and censuses cover the whole state, which allows three checks on how far the Denver pattern extends. They use the rules applied to Denver: the Frickel &amp; Elliott sectors, the complete editions, street-located sites, a 200-resident minimum and fixed tract sets.</w:t>
+      </w:r>
+    </w:p>
+    <w:p>
+      <w:pPr>
+        <w:spacing w:after="160" w:line="360"/>
+        <w:jc w:val="both"/>
+      </w:pPr>
+      <w:r>
+        <w:rPr>
+          <w:rFonts w:ascii="Times New Roman" w:cs="Times New Roman" w:eastAsia="Times New Roman" w:hAnsi="Times New Roman"/>
+          <w:b/>
+          <w:bCs/>
+          <w:i w:val="false"/>
+          <w:iCs w:val="false"/>
+          <w:sz w:val="24"/>
+          <w:szCs w:val="24"/>
+        </w:rPr>
+        <w:t xml:space="preserve">Where the industry was.</w:t>
+      </w:r>
+      <w:r>
+        <w:rPr>
+          <w:rFonts w:ascii="Times New Roman" w:cs="Times New Roman" w:eastAsia="Times New Roman" w:hAnsi="Times New Roman"/>
+          <w:b w:val="false"/>
+          <w:bCs w:val="false"/>
+          <w:i w:val="false"/>
+          <w:iCs w:val="false"/>
+          <w:sz w:val="24"/>
+          <w:szCs w:val="24"/>
+        </w:rPr>
+        <w:t xml:space="preserve"> Before 1940 the state's hazardous trades moved from the mining districts to Denver. In 1880 the mining counties held 40% of the listed trades and 30% of the population, and Pueblo, with its smelters, held 9% of the trades and 4% of the people; from 1900 Denver held 43–74% of the trades with 28–32% of the population. The shares move with the editions that survive, so they show direction rather than precise levels. Across counties, more trades per resident went with more foreign-born residents in every census (correlations 0.12–0.37) and with fewer Hispanic residents in five of six (−0.14 to −0.44): the Hispano counties of the south, farming and coal country, held 9–13% of the population and 0–7% of the trades. At the state scale before 1940, hazardous industry and Hispanic Colorado were in different places; the association that Section 5 finds after 1950 formed as Hispano and Mexican residents moved into the industrial neighbourhoods of the cities. After 1965 the industry left Denver for the rest of the Front Range.</w:t>
+      </w:r>
+    </w:p>
+    <w:p>
+      <w:pPr>
+        <w:spacing w:after="80" w:before="240"/>
+      </w:pPr>
+      <w:r>
+        <w:rPr>
+          <w:rFonts w:ascii="Times New Roman" w:cs="Times New Roman" w:eastAsia="Times New Roman" w:hAnsi="Times New Roman"/>
+          <w:b/>
+          <w:bCs/>
+          <w:sz w:val="20"/>
+          <w:szCs w:val="20"/>
+        </w:rPr>
+        <w:t xml:space="preserve">Table 17. Share of Colorado's located hazardous-sector manufacturers by region, selected complete editions, and share of the 1990 population</w:t>
+      </w:r>
+    </w:p>
+    <w:tbl>
+      <w:tblPr>
+        <w:tblW w:type="dxa" w:w="9360"/>
+        <w:tblBorders>
+          <w:top w:val="single" w:sz="6"/>
+          <w:left w:val="none"/>
+          <w:bottom w:val="single" w:sz="6"/>
+          <w:right w:val="none"/>
+          <w:insideH w:val="single" w:color="BBBBBB" w:sz="2"/>
+          <w:insideV w:val="none"/>
+        </w:tblBorders>
+      </w:tblPr>
+      <w:tblGrid>
+        <w:gridCol w:w="2808"/>
+        <w:gridCol w:w="1310"/>
+        <w:gridCol w:w="1310"/>
+        <w:gridCol w:w="1310"/>
+        <w:gridCol w:w="1310"/>
+        <w:gridCol w:w="1312"/>
+      </w:tblGrid>
+      <w:tr>
+        <w:trPr>
+          <w:tblHeader/>
+        </w:trPr>
+        <w:tc>
+          <w:tcPr>
+            <w:tcW w:type="dxa" w:w="2808"/>
+            <w:shd w:fill="EDEDED" w:color="auto" w:val="clear"/>
+            <w:tcMar>
+              <w:top w:type="dxa" w:w="40"/>
+              <w:left w:type="dxa" w:w="60"/>
+              <w:bottom w:type="dxa" w:w="40"/>
+              <w:right w:type="dxa" w:w="60"/>
+            </w:tcMar>
+          </w:tcPr>
+          <w:p>
+            <w:pPr>
+              <w:jc w:val="left"/>
+            </w:pPr>
+            <w:r>
+              <w:rPr>
+                <w:rFonts w:ascii="Times New Roman" w:cs="Times New Roman" w:eastAsia="Times New Roman" w:hAnsi="Times New Roman"/>
+                <w:b/>
+                <w:bCs/>
+                <w:i w:val="false"/>
+                <w:iCs w:val="false"/>
+                <w:sz w:val="18"/>
+                <w:szCs w:val="18"/>
+              </w:rPr>
+              <w:t xml:space="preserve">region</w:t>
+            </w:r>
+          </w:p>
+        </w:tc>
+        <w:tc>
+          <w:tcPr>
+            <w:tcW w:type="dxa" w:w="1310"/>
+            <w:shd w:fill="EDEDED" w:color="auto" w:val="clear"/>
+            <w:tcMar>
+              <w:top w:type="dxa" w:w="40"/>
+              <w:left w:type="dxa" w:w="60"/>
+              <w:bottom w:type="dxa" w:w="40"/>
+              <w:right w:type="dxa" w:w="60"/>
+            </w:tcMar>
+          </w:tcPr>
+          <w:p>
+            <w:pPr>
+              <w:jc w:val="right"/>
+            </w:pPr>
+            <w:r>
+              <w:rPr>
+                <w:rFonts w:ascii="Times New Roman" w:cs="Times New Roman" w:eastAsia="Times New Roman" w:hAnsi="Times New Roman"/>
+                <w:b/>
+                <w:bCs/>
+                <w:i w:val="false"/>
+                <w:iCs w:val="false"/>
+                <w:sz w:val="18"/>
+                <w:szCs w:val="18"/>
+              </w:rPr>
+              <w:t xml:space="preserve">1966</w:t>
+            </w:r>
+          </w:p>
+        </w:tc>
+        <w:tc>
+          <w:tcPr>
+            <w:tcW w:type="dxa" w:w="1310"/>
+            <w:shd w:fill="EDEDED" w:color="auto" w:val="clear"/>
+            <w:tcMar>
+              <w:top w:type="dxa" w:w="40"/>
+              <w:left w:type="dxa" w:w="60"/>
+              <w:bottom w:type="dxa" w:w="40"/>
+              <w:right w:type="dxa" w:w="60"/>
+            </w:tcMar>
+          </w:tcPr>
+          <w:p>
+            <w:pPr>
+              <w:jc w:val="right"/>
+            </w:pPr>
+            <w:r>
+              <w:rPr>
+                <w:rFonts w:ascii="Times New Roman" w:cs="Times New Roman" w:eastAsia="Times New Roman" w:hAnsi="Times New Roman"/>
+                <w:b/>
+                <w:bCs/>
+                <w:i w:val="false"/>
+                <w:iCs w:val="false"/>
+                <w:sz w:val="18"/>
+                <w:szCs w:val="18"/>
+              </w:rPr>
+              <w:t xml:space="preserve">1970</w:t>
+            </w:r>
+          </w:p>
+        </w:tc>
+        <w:tc>
+          <w:tcPr>
+            <w:tcW w:type="dxa" w:w="1310"/>
+            <w:shd w:fill="EDEDED" w:color="auto" w:val="clear"/>
+            <w:tcMar>
+              <w:top w:type="dxa" w:w="40"/>
+              <w:left w:type="dxa" w:w="60"/>
+              <w:bottom w:type="dxa" w:w="40"/>
+              <w:right w:type="dxa" w:w="60"/>
+            </w:tcMar>
+          </w:tcPr>
+          <w:p>
+            <w:pPr>
+              <w:jc w:val="right"/>
+            </w:pPr>
+            <w:r>
+              <w:rPr>
+                <w:rFonts w:ascii="Times New Roman" w:cs="Times New Roman" w:eastAsia="Times New Roman" w:hAnsi="Times New Roman"/>
+                <w:b/>
+                <w:bCs/>
+                <w:i w:val="false"/>
+                <w:iCs w:val="false"/>
+                <w:sz w:val="18"/>
+                <w:szCs w:val="18"/>
+              </w:rPr>
+              <w:t xml:space="preserve">1980</w:t>
+            </w:r>
+          </w:p>
+        </w:tc>
+        <w:tc>
+          <w:tcPr>
+            <w:tcW w:type="dxa" w:w="1310"/>
+            <w:shd w:fill="EDEDED" w:color="auto" w:val="clear"/>
+            <w:tcMar>
+              <w:top w:type="dxa" w:w="40"/>
+              <w:left w:type="dxa" w:w="60"/>
+              <w:bottom w:type="dxa" w:w="40"/>
+              <w:right w:type="dxa" w:w="60"/>
+            </w:tcMar>
+          </w:tcPr>
+          <w:p>
+            <w:pPr>
+              <w:jc w:val="right"/>
+            </w:pPr>
+            <w:r>
+              <w:rPr>
+                <w:rFonts w:ascii="Times New Roman" w:cs="Times New Roman" w:eastAsia="Times New Roman" w:hAnsi="Times New Roman"/>
+                <w:b/>
+                <w:bCs/>
+                <w:i w:val="false"/>
+                <w:iCs w:val="false"/>
+                <w:sz w:val="18"/>
+                <w:szCs w:val="18"/>
+              </w:rPr>
+              <w:t xml:space="preserve">1992</w:t>
+            </w:r>
+          </w:p>
+        </w:tc>
+        <w:tc>
+          <w:tcPr>
+            <w:tcW w:type="dxa" w:w="1312"/>
+            <w:shd w:fill="EDEDED" w:color="auto" w:val="clear"/>
+            <w:tcMar>
+              <w:top w:type="dxa" w:w="40"/>
+              <w:left w:type="dxa" w:w="60"/>
+              <w:bottom w:type="dxa" w:w="40"/>
+              <w:right w:type="dxa" w:w="60"/>
+            </w:tcMar>
+          </w:tcPr>
+          <w:p>
+            <w:pPr>
+              <w:jc w:val="right"/>
+            </w:pPr>
+            <w:r>
+              <w:rPr>
+                <w:rFonts w:ascii="Times New Roman" w:cs="Times New Roman" w:eastAsia="Times New Roman" w:hAnsi="Times New Roman"/>
+                <w:b/>
+                <w:bCs/>
+                <w:i w:val="false"/>
+                <w:iCs w:val="false"/>
+                <w:sz w:val="18"/>
+                <w:szCs w:val="18"/>
+              </w:rPr>
+              <w:t xml:space="preserve">share of 1990 population</w:t>
+            </w:r>
+          </w:p>
+        </w:tc>
+      </w:tr>
+      <w:tr>
+        <w:trPr>
+          <w:tblHeader w:val="false"/>
+        </w:trPr>
+        <w:tc>
+          <w:tcPr>
+            <w:tcW w:type="dxa" w:w="2808"/>
+            <w:tcMar>
+              <w:top w:type="dxa" w:w="40"/>
+              <w:left w:type="dxa" w:w="60"/>
+              <w:bottom w:type="dxa" w:w="40"/>
+              <w:right w:type="dxa" w:w="60"/>
+            </w:tcMar>
+          </w:tcPr>
+          <w:p>
+            <w:pPr>
+              <w:jc w:val="left"/>
+            </w:pPr>
+            <w:r>
+              <w:rPr>
+                <w:rFonts w:ascii="Times New Roman" w:cs="Times New Roman" w:eastAsia="Times New Roman" w:hAnsi="Times New Roman"/>
+                <w:b w:val="false"/>
+                <w:bCs w:val="false"/>
+                <w:i w:val="false"/>
+                <w:iCs w:val="false"/>
+                <w:sz w:val="18"/>
+                <w:szCs w:val="18"/>
+              </w:rPr>
+              <w:t xml:space="preserve">Denver</w:t>
+            </w:r>
+          </w:p>
+        </w:tc>
+        <w:tc>
+          <w:tcPr>
+            <w:tcW w:type="dxa" w:w="1310"/>
+            <w:tcMar>
+              <w:top w:type="dxa" w:w="40"/>
+              <w:left w:type="dxa" w:w="60"/>
+              <w:bottom w:type="dxa" w:w="40"/>
+              <w:right w:type="dxa" w:w="60"/>
+            </w:tcMar>
+          </w:tcPr>
+          <w:p>
+            <w:pPr>
+              <w:jc w:val="right"/>
+            </w:pPr>
+            <w:r>
+              <w:rPr>
+                <w:rFonts w:ascii="Times New Roman" w:cs="Times New Roman" w:eastAsia="Times New Roman" w:hAnsi="Times New Roman"/>
+                <w:b w:val="false"/>
+                <w:bCs w:val="false"/>
+                <w:i w:val="false"/>
+                <w:iCs w:val="false"/>
+                <w:sz w:val="18"/>
+                <w:szCs w:val="18"/>
+              </w:rPr>
+              <w:t xml:space="preserve">51.3</w:t>
+            </w:r>
+          </w:p>
+        </w:tc>
+        <w:tc>
+          <w:tcPr>
+            <w:tcW w:type="dxa" w:w="1310"/>
+            <w:tcMar>
+              <w:top w:type="dxa" w:w="40"/>
+              <w:left w:type="dxa" w:w="60"/>
+              <w:bottom w:type="dxa" w:w="40"/>
+              <w:right w:type="dxa" w:w="60"/>
+            </w:tcMar>
+          </w:tcPr>
+          <w:p>
+            <w:pPr>
+              <w:jc w:val="right"/>
+            </w:pPr>
+            <w:r>
+              <w:rPr>
+                <w:rFonts w:ascii="Times New Roman" w:cs="Times New Roman" w:eastAsia="Times New Roman" w:hAnsi="Times New Roman"/>
+                <w:b w:val="false"/>
+                <w:bCs w:val="false"/>
+                <w:i w:val="false"/>
+                <w:iCs w:val="false"/>
+                <w:sz w:val="18"/>
+                <w:szCs w:val="18"/>
+              </w:rPr>
+              <w:t xml:space="preserve">51.1</w:t>
+            </w:r>
+          </w:p>
+        </w:tc>
+        <w:tc>
+          <w:tcPr>
+            <w:tcW w:type="dxa" w:w="1310"/>
+            <w:tcMar>
+              <w:top w:type="dxa" w:w="40"/>
+              <w:left w:type="dxa" w:w="60"/>
+              <w:bottom w:type="dxa" w:w="40"/>
+              <w:right w:type="dxa" w:w="60"/>
+            </w:tcMar>
+          </w:tcPr>
+          <w:p>
+            <w:pPr>
+              <w:jc w:val="right"/>
+            </w:pPr>
+            <w:r>
+              <w:rPr>
+                <w:rFonts w:ascii="Times New Roman" w:cs="Times New Roman" w:eastAsia="Times New Roman" w:hAnsi="Times New Roman"/>
+                <w:b w:val="false"/>
+                <w:bCs w:val="false"/>
+                <w:i w:val="false"/>
+                <w:iCs w:val="false"/>
+                <w:sz w:val="18"/>
+                <w:szCs w:val="18"/>
+              </w:rPr>
+              <w:t xml:space="preserve">33.1</w:t>
+            </w:r>
+          </w:p>
+        </w:tc>
+        <w:tc>
+          <w:tcPr>
+            <w:tcW w:type="dxa" w:w="1310"/>
+            <w:tcMar>
+              <w:top w:type="dxa" w:w="40"/>
+              <w:left w:type="dxa" w:w="60"/>
+              <w:bottom w:type="dxa" w:w="40"/>
+              <w:right w:type="dxa" w:w="60"/>
+            </w:tcMar>
+          </w:tcPr>
+          <w:p>
+            <w:pPr>
+              <w:jc w:val="right"/>
+            </w:pPr>
+            <w:r>
+              <w:rPr>
+                <w:rFonts w:ascii="Times New Roman" w:cs="Times New Roman" w:eastAsia="Times New Roman" w:hAnsi="Times New Roman"/>
+                <w:b w:val="false"/>
+                <w:bCs w:val="false"/>
+                <w:i w:val="false"/>
+                <w:iCs w:val="false"/>
+                <w:sz w:val="18"/>
+                <w:szCs w:val="18"/>
+              </w:rPr>
+              <w:t xml:space="preserve">26.0</w:t>
+            </w:r>
+          </w:p>
+        </w:tc>
+        <w:tc>
+          <w:tcPr>
+            <w:tcW w:type="dxa" w:w="1312"/>
+            <w:tcMar>
+              <w:top w:type="dxa" w:w="40"/>
+              <w:left w:type="dxa" w:w="60"/>
+              <w:bottom w:type="dxa" w:w="40"/>
+              <w:right w:type="dxa" w:w="60"/>
+            </w:tcMar>
+          </w:tcPr>
+          <w:p>
+            <w:pPr>
+              <w:jc w:val="right"/>
+            </w:pPr>
+            <w:r>
+              <w:rPr>
+                <w:rFonts w:ascii="Times New Roman" w:cs="Times New Roman" w:eastAsia="Times New Roman" w:hAnsi="Times New Roman"/>
+                <w:b w:val="false"/>
+                <w:bCs w:val="false"/>
+                <w:i w:val="false"/>
+                <w:iCs w:val="false"/>
+                <w:sz w:val="18"/>
+                <w:szCs w:val="18"/>
+              </w:rPr>
+              <w:t xml:space="preserve">14.2</w:t>
+            </w:r>
+          </w:p>
+        </w:tc>
+      </w:tr>
+      <w:tr>
+        <w:trPr>
+          <w:tblHeader w:val="false"/>
+        </w:trPr>
+        <w:tc>
+          <w:tcPr>
+            <w:tcW w:type="dxa" w:w="2808"/>
+            <w:tcMar>
+              <w:top w:type="dxa" w:w="40"/>
+              <w:left w:type="dxa" w:w="60"/>
+              <w:bottom w:type="dxa" w:w="40"/>
+              <w:right w:type="dxa" w:w="60"/>
+            </w:tcMar>
+          </w:tcPr>
+          <w:p>
+            <w:pPr>
+              <w:jc w:val="left"/>
+            </w:pPr>
+            <w:r>
+              <w:rPr>
+                <w:rFonts w:ascii="Times New Roman" w:cs="Times New Roman" w:eastAsia="Times New Roman" w:hAnsi="Times New Roman"/>
+                <w:b w:val="false"/>
+                <w:bCs w:val="false"/>
+                <w:i w:val="false"/>
+                <w:iCs w:val="false"/>
+                <w:sz w:val="18"/>
+                <w:szCs w:val="18"/>
+              </w:rPr>
+              <w:t xml:space="preserve">Denver suburbs (Adams, Arapahoe, Broomfield, Douglas, Jefferson)</w:t>
+            </w:r>
+          </w:p>
+        </w:tc>
+        <w:tc>
+          <w:tcPr>
+            <w:tcW w:type="dxa" w:w="1310"/>
+            <w:tcMar>
+              <w:top w:type="dxa" w:w="40"/>
+              <w:left w:type="dxa" w:w="60"/>
+              <w:bottom w:type="dxa" w:w="40"/>
+              <w:right w:type="dxa" w:w="60"/>
+            </w:tcMar>
+          </w:tcPr>
+          <w:p>
+            <w:pPr>
+              <w:jc w:val="right"/>
+            </w:pPr>
+            <w:r>
+              <w:rPr>
+                <w:rFonts w:ascii="Times New Roman" w:cs="Times New Roman" w:eastAsia="Times New Roman" w:hAnsi="Times New Roman"/>
+                <w:b w:val="false"/>
+                <w:bCs w:val="false"/>
+                <w:i w:val="false"/>
+                <w:iCs w:val="false"/>
+                <w:sz w:val="18"/>
+                <w:szCs w:val="18"/>
+              </w:rPr>
+              <w:t xml:space="preserve">19.6</w:t>
+            </w:r>
+          </w:p>
+        </w:tc>
+        <w:tc>
+          <w:tcPr>
+            <w:tcW w:type="dxa" w:w="1310"/>
+            <w:tcMar>
+              <w:top w:type="dxa" w:w="40"/>
+              <w:left w:type="dxa" w:w="60"/>
+              <w:bottom w:type="dxa" w:w="40"/>
+              <w:right w:type="dxa" w:w="60"/>
+            </w:tcMar>
+          </w:tcPr>
+          <w:p>
+            <w:pPr>
+              <w:jc w:val="right"/>
+            </w:pPr>
+            <w:r>
+              <w:rPr>
+                <w:rFonts w:ascii="Times New Roman" w:cs="Times New Roman" w:eastAsia="Times New Roman" w:hAnsi="Times New Roman"/>
+                <w:b w:val="false"/>
+                <w:bCs w:val="false"/>
+                <w:i w:val="false"/>
+                <w:iCs w:val="false"/>
+                <w:sz w:val="18"/>
+                <w:szCs w:val="18"/>
+              </w:rPr>
+              <w:t xml:space="preserve">24.2</w:t>
+            </w:r>
+          </w:p>
+        </w:tc>
+        <w:tc>
+          <w:tcPr>
+            <w:tcW w:type="dxa" w:w="1310"/>
+            <w:tcMar>
+              <w:top w:type="dxa" w:w="40"/>
+              <w:left w:type="dxa" w:w="60"/>
+              <w:bottom w:type="dxa" w:w="40"/>
+              <w:right w:type="dxa" w:w="60"/>
+            </w:tcMar>
+          </w:tcPr>
+          <w:p>
+            <w:pPr>
+              <w:jc w:val="right"/>
+            </w:pPr>
+            <w:r>
+              <w:rPr>
+                <w:rFonts w:ascii="Times New Roman" w:cs="Times New Roman" w:eastAsia="Times New Roman" w:hAnsi="Times New Roman"/>
+                <w:b w:val="false"/>
+                <w:bCs w:val="false"/>
+                <w:i w:val="false"/>
+                <w:iCs w:val="false"/>
+                <w:sz w:val="18"/>
+                <w:szCs w:val="18"/>
+              </w:rPr>
+              <w:t xml:space="preserve">32.7</w:t>
+            </w:r>
+          </w:p>
+        </w:tc>
+        <w:tc>
+          <w:tcPr>
+            <w:tcW w:type="dxa" w:w="1310"/>
+            <w:tcMar>
+              <w:top w:type="dxa" w:w="40"/>
+              <w:left w:type="dxa" w:w="60"/>
+              <w:bottom w:type="dxa" w:w="40"/>
+              <w:right w:type="dxa" w:w="60"/>
+            </w:tcMar>
+          </w:tcPr>
+          <w:p>
+            <w:pPr>
+              <w:jc w:val="right"/>
+            </w:pPr>
+            <w:r>
+              <w:rPr>
+                <w:rFonts w:ascii="Times New Roman" w:cs="Times New Roman" w:eastAsia="Times New Roman" w:hAnsi="Times New Roman"/>
+                <w:b w:val="false"/>
+                <w:bCs w:val="false"/>
+                <w:i w:val="false"/>
+                <w:iCs w:val="false"/>
+                <w:sz w:val="18"/>
+                <w:szCs w:val="18"/>
+              </w:rPr>
+              <w:t xml:space="preserve">29.8</w:t>
+            </w:r>
+          </w:p>
+        </w:tc>
+        <w:tc>
+          <w:tcPr>
+            <w:tcW w:type="dxa" w:w="1312"/>
+            <w:tcMar>
+              <w:top w:type="dxa" w:w="40"/>
+              <w:left w:type="dxa" w:w="60"/>
+              <w:bottom w:type="dxa" w:w="40"/>
+              <w:right w:type="dxa" w:w="60"/>
+            </w:tcMar>
+          </w:tcPr>
+          <w:p>
+            <w:pPr>
+              <w:jc w:val="right"/>
+            </w:pPr>
+            <w:r>
+              <w:rPr>
+                <w:rFonts w:ascii="Times New Roman" w:cs="Times New Roman" w:eastAsia="Times New Roman" w:hAnsi="Times New Roman"/>
+                <w:b w:val="false"/>
+                <w:bCs w:val="false"/>
+                <w:i w:val="false"/>
+                <w:iCs w:val="false"/>
+                <w:sz w:val="18"/>
+                <w:szCs w:val="18"/>
+              </w:rPr>
+              <w:t xml:space="preserve">35.6</w:t>
+            </w:r>
+          </w:p>
+        </w:tc>
+      </w:tr>
+      <w:tr>
+        <w:trPr>
+          <w:tblHeader w:val="false"/>
+        </w:trPr>
+        <w:tc>
+          <w:tcPr>
+            <w:tcW w:type="dxa" w:w="2808"/>
+            <w:tcMar>
+              <w:top w:type="dxa" w:w="40"/>
+              <w:left w:type="dxa" w:w="60"/>
+              <w:bottom w:type="dxa" w:w="40"/>
+              <w:right w:type="dxa" w:w="60"/>
+            </w:tcMar>
+          </w:tcPr>
+          <w:p>
+            <w:pPr>
+              <w:jc w:val="left"/>
+            </w:pPr>
+            <w:r>
+              <w:rPr>
+                <w:rFonts w:ascii="Times New Roman" w:cs="Times New Roman" w:eastAsia="Times New Roman" w:hAnsi="Times New Roman"/>
+                <w:b w:val="false"/>
+                <w:bCs w:val="false"/>
+                <w:i w:val="false"/>
+                <w:iCs w:val="false"/>
+                <w:sz w:val="18"/>
+                <w:szCs w:val="18"/>
+              </w:rPr>
+              <w:t xml:space="preserve">Boulder, Larimer and Weld</w:t>
+            </w:r>
+          </w:p>
+        </w:tc>
+        <w:tc>
+          <w:tcPr>
+            <w:tcW w:type="dxa" w:w="1310"/>
+            <w:tcMar>
+              <w:top w:type="dxa" w:w="40"/>
+              <w:left w:type="dxa" w:w="60"/>
+              <w:bottom w:type="dxa" w:w="40"/>
+              <w:right w:type="dxa" w:w="60"/>
+            </w:tcMar>
+          </w:tcPr>
+          <w:p>
+            <w:pPr>
+              <w:jc w:val="right"/>
+            </w:pPr>
+            <w:r>
+              <w:rPr>
+                <w:rFonts w:ascii="Times New Roman" w:cs="Times New Roman" w:eastAsia="Times New Roman" w:hAnsi="Times New Roman"/>
+                <w:b w:val="false"/>
+                <w:bCs w:val="false"/>
+                <w:i w:val="false"/>
+                <w:iCs w:val="false"/>
+                <w:sz w:val="18"/>
+                <w:szCs w:val="18"/>
+              </w:rPr>
+              <w:t xml:space="preserve">8.9</w:t>
+            </w:r>
+          </w:p>
+        </w:tc>
+        <w:tc>
+          <w:tcPr>
+            <w:tcW w:type="dxa" w:w="1310"/>
+            <w:tcMar>
+              <w:top w:type="dxa" w:w="40"/>
+              <w:left w:type="dxa" w:w="60"/>
+              <w:bottom w:type="dxa" w:w="40"/>
+              <w:right w:type="dxa" w:w="60"/>
+            </w:tcMar>
+          </w:tcPr>
+          <w:p>
+            <w:pPr>
+              <w:jc w:val="right"/>
+            </w:pPr>
+            <w:r>
+              <w:rPr>
+                <w:rFonts w:ascii="Times New Roman" w:cs="Times New Roman" w:eastAsia="Times New Roman" w:hAnsi="Times New Roman"/>
+                <w:b w:val="false"/>
+                <w:bCs w:val="false"/>
+                <w:i w:val="false"/>
+                <w:iCs w:val="false"/>
+                <w:sz w:val="18"/>
+                <w:szCs w:val="18"/>
+              </w:rPr>
+              <w:t xml:space="preserve">9.6</w:t>
+            </w:r>
+          </w:p>
+        </w:tc>
+        <w:tc>
+          <w:tcPr>
+            <w:tcW w:type="dxa" w:w="1310"/>
+            <w:tcMar>
+              <w:top w:type="dxa" w:w="40"/>
+              <w:left w:type="dxa" w:w="60"/>
+              <w:bottom w:type="dxa" w:w="40"/>
+              <w:right w:type="dxa" w:w="60"/>
+            </w:tcMar>
+          </w:tcPr>
+          <w:p>
+            <w:pPr>
+              <w:jc w:val="right"/>
+            </w:pPr>
+            <w:r>
+              <w:rPr>
+                <w:rFonts w:ascii="Times New Roman" w:cs="Times New Roman" w:eastAsia="Times New Roman" w:hAnsi="Times New Roman"/>
+                <w:b w:val="false"/>
+                <w:bCs w:val="false"/>
+                <w:i w:val="false"/>
+                <w:iCs w:val="false"/>
+                <w:sz w:val="18"/>
+                <w:szCs w:val="18"/>
+              </w:rPr>
+              <w:t xml:space="preserve">16.6</w:t>
+            </w:r>
+          </w:p>
+        </w:tc>
+        <w:tc>
+          <w:tcPr>
+            <w:tcW w:type="dxa" w:w="1310"/>
+            <w:tcMar>
+              <w:top w:type="dxa" w:w="40"/>
+              <w:left w:type="dxa" w:w="60"/>
+              <w:bottom w:type="dxa" w:w="40"/>
+              <w:right w:type="dxa" w:w="60"/>
+            </w:tcMar>
+          </w:tcPr>
+          <w:p>
+            <w:pPr>
+              <w:jc w:val="right"/>
+            </w:pPr>
+            <w:r>
+              <w:rPr>
+                <w:rFonts w:ascii="Times New Roman" w:cs="Times New Roman" w:eastAsia="Times New Roman" w:hAnsi="Times New Roman"/>
+                <w:b w:val="false"/>
+                <w:bCs w:val="false"/>
+                <w:i w:val="false"/>
+                <w:iCs w:val="false"/>
+                <w:sz w:val="18"/>
+                <w:szCs w:val="18"/>
+              </w:rPr>
+              <w:t xml:space="preserve">23.2</w:t>
+            </w:r>
+          </w:p>
+        </w:tc>
+        <w:tc>
+          <w:tcPr>
+            <w:tcW w:type="dxa" w:w="1312"/>
+            <w:tcMar>
+              <w:top w:type="dxa" w:w="40"/>
+              <w:left w:type="dxa" w:w="60"/>
+              <w:bottom w:type="dxa" w:w="40"/>
+              <w:right w:type="dxa" w:w="60"/>
+            </w:tcMar>
+          </w:tcPr>
+          <w:p>
+            <w:pPr>
+              <w:jc w:val="right"/>
+            </w:pPr>
+            <w:r>
+              <w:rPr>
+                <w:rFonts w:ascii="Times New Roman" w:cs="Times New Roman" w:eastAsia="Times New Roman" w:hAnsi="Times New Roman"/>
+                <w:b w:val="false"/>
+                <w:bCs w:val="false"/>
+                <w:i w:val="false"/>
+                <w:iCs w:val="false"/>
+                <w:sz w:val="18"/>
+                <w:szCs w:val="18"/>
+              </w:rPr>
+              <w:t xml:space="preserve">16.0</w:t>
+            </w:r>
+          </w:p>
+        </w:tc>
+      </w:tr>
+      <w:tr>
+        <w:trPr>
+          <w:tblHeader w:val="false"/>
+        </w:trPr>
+        <w:tc>
+          <w:tcPr>
+            <w:tcW w:type="dxa" w:w="2808"/>
+            <w:tcMar>
+              <w:top w:type="dxa" w:w="40"/>
+              <w:left w:type="dxa" w:w="60"/>
+              <w:bottom w:type="dxa" w:w="40"/>
+              <w:right w:type="dxa" w:w="60"/>
+            </w:tcMar>
+          </w:tcPr>
+          <w:p>
+            <w:pPr>
+              <w:jc w:val="left"/>
+            </w:pPr>
+            <w:r>
+              <w:rPr>
+                <w:rFonts w:ascii="Times New Roman" w:cs="Times New Roman" w:eastAsia="Times New Roman" w:hAnsi="Times New Roman"/>
+                <w:b w:val="false"/>
+                <w:bCs w:val="false"/>
+                <w:i w:val="false"/>
+                <w:iCs w:val="false"/>
+                <w:sz w:val="18"/>
+                <w:szCs w:val="18"/>
+              </w:rPr>
+              <w:t xml:space="preserve">Colorado Springs (El Paso)</w:t>
+            </w:r>
+          </w:p>
+        </w:tc>
+        <w:tc>
+          <w:tcPr>
+            <w:tcW w:type="dxa" w:w="1310"/>
+            <w:tcMar>
+              <w:top w:type="dxa" w:w="40"/>
+              <w:left w:type="dxa" w:w="60"/>
+              <w:bottom w:type="dxa" w:w="40"/>
+              <w:right w:type="dxa" w:w="60"/>
+            </w:tcMar>
+          </w:tcPr>
+          <w:p>
+            <w:pPr>
+              <w:jc w:val="right"/>
+            </w:pPr>
+            <w:r>
+              <w:rPr>
+                <w:rFonts w:ascii="Times New Roman" w:cs="Times New Roman" w:eastAsia="Times New Roman" w:hAnsi="Times New Roman"/>
+                <w:b w:val="false"/>
+                <w:bCs w:val="false"/>
+                <w:i w:val="false"/>
+                <w:iCs w:val="false"/>
+                <w:sz w:val="18"/>
+                <w:szCs w:val="18"/>
+              </w:rPr>
+              <w:t xml:space="preserve">5.1</w:t>
+            </w:r>
+          </w:p>
+        </w:tc>
+        <w:tc>
+          <w:tcPr>
+            <w:tcW w:type="dxa" w:w="1310"/>
+            <w:tcMar>
+              <w:top w:type="dxa" w:w="40"/>
+              <w:left w:type="dxa" w:w="60"/>
+              <w:bottom w:type="dxa" w:w="40"/>
+              <w:right w:type="dxa" w:w="60"/>
+            </w:tcMar>
+          </w:tcPr>
+          <w:p>
+            <w:pPr>
+              <w:jc w:val="right"/>
+            </w:pPr>
+            <w:r>
+              <w:rPr>
+                <w:rFonts w:ascii="Times New Roman" w:cs="Times New Roman" w:eastAsia="Times New Roman" w:hAnsi="Times New Roman"/>
+                <w:b w:val="false"/>
+                <w:bCs w:val="false"/>
+                <w:i w:val="false"/>
+                <w:iCs w:val="false"/>
+                <w:sz w:val="18"/>
+                <w:szCs w:val="18"/>
+              </w:rPr>
+              <w:t xml:space="preserve">5.6</w:t>
+            </w:r>
+          </w:p>
+        </w:tc>
+        <w:tc>
+          <w:tcPr>
+            <w:tcW w:type="dxa" w:w="1310"/>
+            <w:tcMar>
+              <w:top w:type="dxa" w:w="40"/>
+              <w:left w:type="dxa" w:w="60"/>
+              <w:bottom w:type="dxa" w:w="40"/>
+              <w:right w:type="dxa" w:w="60"/>
+            </w:tcMar>
+          </w:tcPr>
+          <w:p>
+            <w:pPr>
+              <w:jc w:val="right"/>
+            </w:pPr>
+            <w:r>
+              <w:rPr>
+                <w:rFonts w:ascii="Times New Roman" w:cs="Times New Roman" w:eastAsia="Times New Roman" w:hAnsi="Times New Roman"/>
+                <w:b w:val="false"/>
+                <w:bCs w:val="false"/>
+                <w:i w:val="false"/>
+                <w:iCs w:val="false"/>
+                <w:sz w:val="18"/>
+                <w:szCs w:val="18"/>
+              </w:rPr>
+              <w:t xml:space="preserve">7.5</w:t>
+            </w:r>
+          </w:p>
+        </w:tc>
+        <w:tc>
+          <w:tcPr>
+            <w:tcW w:type="dxa" w:w="1310"/>
+            <w:tcMar>
+              <w:top w:type="dxa" w:w="40"/>
+              <w:left w:type="dxa" w:w="60"/>
+              <w:bottom w:type="dxa" w:w="40"/>
+              <w:right w:type="dxa" w:w="60"/>
+            </w:tcMar>
+          </w:tcPr>
+          <w:p>
+            <w:pPr>
+              <w:jc w:val="right"/>
+            </w:pPr>
+            <w:r>
+              <w:rPr>
+                <w:rFonts w:ascii="Times New Roman" w:cs="Times New Roman" w:eastAsia="Times New Roman" w:hAnsi="Times New Roman"/>
+                <w:b w:val="false"/>
+                <w:bCs w:val="false"/>
+                <w:i w:val="false"/>
+                <w:iCs w:val="false"/>
+                <w:sz w:val="18"/>
+                <w:szCs w:val="18"/>
+              </w:rPr>
+              <w:t xml:space="preserve">7.8</w:t>
+            </w:r>
+          </w:p>
+        </w:tc>
+        <w:tc>
+          <w:tcPr>
+            <w:tcW w:type="dxa" w:w="1312"/>
+            <w:tcMar>
+              <w:top w:type="dxa" w:w="40"/>
+              <w:left w:type="dxa" w:w="60"/>
+              <w:bottom w:type="dxa" w:w="40"/>
+              <w:right w:type="dxa" w:w="60"/>
+            </w:tcMar>
+          </w:tcPr>
+          <w:p>
+            <w:pPr>
+              <w:jc w:val="right"/>
+            </w:pPr>
+            <w:r>
+              <w:rPr>
+                <w:rFonts w:ascii="Times New Roman" w:cs="Times New Roman" w:eastAsia="Times New Roman" w:hAnsi="Times New Roman"/>
+                <w:b w:val="false"/>
+                <w:bCs w:val="false"/>
+                <w:i w:val="false"/>
+                <w:iCs w:val="false"/>
+                <w:sz w:val="18"/>
+                <w:szCs w:val="18"/>
+              </w:rPr>
+              <w:t xml:space="preserve">12.1</w:t>
+            </w:r>
+          </w:p>
+        </w:tc>
+      </w:tr>
+      <w:tr>
+        <w:trPr>
+          <w:tblHeader w:val="false"/>
+        </w:trPr>
+        <w:tc>
+          <w:tcPr>
+            <w:tcW w:type="dxa" w:w="2808"/>
+            <w:tcMar>
+              <w:top w:type="dxa" w:w="40"/>
+              <w:left w:type="dxa" w:w="60"/>
+              <w:bottom w:type="dxa" w:w="40"/>
+              <w:right w:type="dxa" w:w="60"/>
+            </w:tcMar>
+          </w:tcPr>
+          <w:p>
+            <w:pPr>
+              <w:jc w:val="left"/>
+            </w:pPr>
+            <w:r>
+              <w:rPr>
+                <w:rFonts w:ascii="Times New Roman" w:cs="Times New Roman" w:eastAsia="Times New Roman" w:hAnsi="Times New Roman"/>
+                <w:b w:val="false"/>
+                <w:bCs w:val="false"/>
+                <w:i w:val="false"/>
+                <w:iCs w:val="false"/>
+                <w:sz w:val="18"/>
+                <w:szCs w:val="18"/>
+              </w:rPr>
+              <w:t xml:space="preserve">Pueblo</w:t>
+            </w:r>
+          </w:p>
+        </w:tc>
+        <w:tc>
+          <w:tcPr>
+            <w:tcW w:type="dxa" w:w="1310"/>
+            <w:tcMar>
+              <w:top w:type="dxa" w:w="40"/>
+              <w:left w:type="dxa" w:w="60"/>
+              <w:bottom w:type="dxa" w:w="40"/>
+              <w:right w:type="dxa" w:w="60"/>
+            </w:tcMar>
+          </w:tcPr>
+          <w:p>
+            <w:pPr>
+              <w:jc w:val="right"/>
+            </w:pPr>
+            <w:r>
+              <w:rPr>
+                <w:rFonts w:ascii="Times New Roman" w:cs="Times New Roman" w:eastAsia="Times New Roman" w:hAnsi="Times New Roman"/>
+                <w:b w:val="false"/>
+                <w:bCs w:val="false"/>
+                <w:i w:val="false"/>
+                <w:iCs w:val="false"/>
+                <w:sz w:val="18"/>
+                <w:szCs w:val="18"/>
+              </w:rPr>
+              <w:t xml:space="preserve">3.2</w:t>
+            </w:r>
+          </w:p>
+        </w:tc>
+        <w:tc>
+          <w:tcPr>
+            <w:tcW w:type="dxa" w:w="1310"/>
+            <w:tcMar>
+              <w:top w:type="dxa" w:w="40"/>
+              <w:left w:type="dxa" w:w="60"/>
+              <w:bottom w:type="dxa" w:w="40"/>
+              <w:right w:type="dxa" w:w="60"/>
+            </w:tcMar>
+          </w:tcPr>
+          <w:p>
+            <w:pPr>
+              <w:jc w:val="right"/>
+            </w:pPr>
+            <w:r>
+              <w:rPr>
+                <w:rFonts w:ascii="Times New Roman" w:cs="Times New Roman" w:eastAsia="Times New Roman" w:hAnsi="Times New Roman"/>
+                <w:b w:val="false"/>
+                <w:bCs w:val="false"/>
+                <w:i w:val="false"/>
+                <w:iCs w:val="false"/>
+                <w:sz w:val="18"/>
+                <w:szCs w:val="18"/>
+              </w:rPr>
+              <w:t xml:space="preserve">2.0</w:t>
+            </w:r>
+          </w:p>
+        </w:tc>
+        <w:tc>
+          <w:tcPr>
+            <w:tcW w:type="dxa" w:w="1310"/>
+            <w:tcMar>
+              <w:top w:type="dxa" w:w="40"/>
+              <w:left w:type="dxa" w:w="60"/>
+              <w:bottom w:type="dxa" w:w="40"/>
+              <w:right w:type="dxa" w:w="60"/>
+            </w:tcMar>
+          </w:tcPr>
+          <w:p>
+            <w:pPr>
+              <w:jc w:val="right"/>
+            </w:pPr>
+            <w:r>
+              <w:rPr>
+                <w:rFonts w:ascii="Times New Roman" w:cs="Times New Roman" w:eastAsia="Times New Roman" w:hAnsi="Times New Roman"/>
+                <w:b w:val="false"/>
+                <w:bCs w:val="false"/>
+                <w:i w:val="false"/>
+                <w:iCs w:val="false"/>
+                <w:sz w:val="18"/>
+                <w:szCs w:val="18"/>
+              </w:rPr>
+              <w:t xml:space="preserve">1.8</w:t>
+            </w:r>
+          </w:p>
+        </w:tc>
+        <w:tc>
+          <w:tcPr>
+            <w:tcW w:type="dxa" w:w="1310"/>
+            <w:tcMar>
+              <w:top w:type="dxa" w:w="40"/>
+              <w:left w:type="dxa" w:w="60"/>
+              <w:bottom w:type="dxa" w:w="40"/>
+              <w:right w:type="dxa" w:w="60"/>
+            </w:tcMar>
+          </w:tcPr>
+          <w:p>
+            <w:pPr>
+              <w:jc w:val="right"/>
+            </w:pPr>
+            <w:r>
+              <w:rPr>
+                <w:rFonts w:ascii="Times New Roman" w:cs="Times New Roman" w:eastAsia="Times New Roman" w:hAnsi="Times New Roman"/>
+                <w:b w:val="false"/>
+                <w:bCs w:val="false"/>
+                <w:i w:val="false"/>
+                <w:iCs w:val="false"/>
+                <w:sz w:val="18"/>
+                <w:szCs w:val="18"/>
+              </w:rPr>
+              <w:t xml:space="preserve">2.0</w:t>
+            </w:r>
+          </w:p>
+        </w:tc>
+        <w:tc>
+          <w:tcPr>
+            <w:tcW w:type="dxa" w:w="1312"/>
+            <w:tcMar>
+              <w:top w:type="dxa" w:w="40"/>
+              <w:left w:type="dxa" w:w="60"/>
+              <w:bottom w:type="dxa" w:w="40"/>
+              <w:right w:type="dxa" w:w="60"/>
+            </w:tcMar>
+          </w:tcPr>
+          <w:p>
+            <w:pPr>
+              <w:jc w:val="right"/>
+            </w:pPr>
+            <w:r>
+              <w:rPr>
+                <w:rFonts w:ascii="Times New Roman" w:cs="Times New Roman" w:eastAsia="Times New Roman" w:hAnsi="Times New Roman"/>
+                <w:b w:val="false"/>
+                <w:bCs w:val="false"/>
+                <w:i w:val="false"/>
+                <w:iCs w:val="false"/>
+                <w:sz w:val="18"/>
+                <w:szCs w:val="18"/>
+              </w:rPr>
+              <w:t xml:space="preserve">3.7</w:t>
+            </w:r>
+          </w:p>
+        </w:tc>
+      </w:tr>
+      <w:tr>
+        <w:trPr>
+          <w:tblHeader w:val="false"/>
+        </w:trPr>
+        <w:tc>
+          <w:tcPr>
+            <w:tcW w:type="dxa" w:w="2808"/>
+            <w:tcMar>
+              <w:top w:type="dxa" w:w="40"/>
+              <w:left w:type="dxa" w:w="60"/>
+              <w:bottom w:type="dxa" w:w="40"/>
+              <w:right w:type="dxa" w:w="60"/>
+            </w:tcMar>
+          </w:tcPr>
+          <w:p>
+            <w:pPr>
+              <w:jc w:val="left"/>
+            </w:pPr>
+            <w:r>
+              <w:rPr>
+                <w:rFonts w:ascii="Times New Roman" w:cs="Times New Roman" w:eastAsia="Times New Roman" w:hAnsi="Times New Roman"/>
+                <w:b w:val="false"/>
+                <w:bCs w:val="false"/>
+                <w:i w:val="false"/>
+                <w:iCs w:val="false"/>
+                <w:sz w:val="18"/>
+                <w:szCs w:val="18"/>
+              </w:rPr>
+              <w:t xml:space="preserve">Grand Junction (Mesa)</w:t>
+            </w:r>
+          </w:p>
+        </w:tc>
+        <w:tc>
+          <w:tcPr>
+            <w:tcW w:type="dxa" w:w="1310"/>
+            <w:tcMar>
+              <w:top w:type="dxa" w:w="40"/>
+              <w:left w:type="dxa" w:w="60"/>
+              <w:bottom w:type="dxa" w:w="40"/>
+              <w:right w:type="dxa" w:w="60"/>
+            </w:tcMar>
+          </w:tcPr>
+          <w:p>
+            <w:pPr>
+              <w:jc w:val="right"/>
+            </w:pPr>
+            <w:r>
+              <w:rPr>
+                <w:rFonts w:ascii="Times New Roman" w:cs="Times New Roman" w:eastAsia="Times New Roman" w:hAnsi="Times New Roman"/>
+                <w:b w:val="false"/>
+                <w:bCs w:val="false"/>
+                <w:i w:val="false"/>
+                <w:iCs w:val="false"/>
+                <w:sz w:val="18"/>
+                <w:szCs w:val="18"/>
+              </w:rPr>
+              <w:t xml:space="preserve">4.4</w:t>
+            </w:r>
+          </w:p>
+        </w:tc>
+        <w:tc>
+          <w:tcPr>
+            <w:tcW w:type="dxa" w:w="1310"/>
+            <w:tcMar>
+              <w:top w:type="dxa" w:w="40"/>
+              <w:left w:type="dxa" w:w="60"/>
+              <w:bottom w:type="dxa" w:w="40"/>
+              <w:right w:type="dxa" w:w="60"/>
+            </w:tcMar>
+          </w:tcPr>
+          <w:p>
+            <w:pPr>
+              <w:jc w:val="right"/>
+            </w:pPr>
+            <w:r>
+              <w:rPr>
+                <w:rFonts w:ascii="Times New Roman" w:cs="Times New Roman" w:eastAsia="Times New Roman" w:hAnsi="Times New Roman"/>
+                <w:b w:val="false"/>
+                <w:bCs w:val="false"/>
+                <w:i w:val="false"/>
+                <w:iCs w:val="false"/>
+                <w:sz w:val="18"/>
+                <w:szCs w:val="18"/>
+              </w:rPr>
+              <w:t xml:space="preserve">2.5</w:t>
+            </w:r>
+          </w:p>
+        </w:tc>
+        <w:tc>
+          <w:tcPr>
+            <w:tcW w:type="dxa" w:w="1310"/>
+            <w:tcMar>
+              <w:top w:type="dxa" w:w="40"/>
+              <w:left w:type="dxa" w:w="60"/>
+              <w:bottom w:type="dxa" w:w="40"/>
+              <w:right w:type="dxa" w:w="60"/>
+            </w:tcMar>
+          </w:tcPr>
+          <w:p>
+            <w:pPr>
+              <w:jc w:val="right"/>
+            </w:pPr>
+            <w:r>
+              <w:rPr>
+                <w:rFonts w:ascii="Times New Roman" w:cs="Times New Roman" w:eastAsia="Times New Roman" w:hAnsi="Times New Roman"/>
+                <w:b w:val="false"/>
+                <w:bCs w:val="false"/>
+                <w:i w:val="false"/>
+                <w:iCs w:val="false"/>
+                <w:sz w:val="18"/>
+                <w:szCs w:val="18"/>
+              </w:rPr>
+              <w:t xml:space="preserve">2.9</w:t>
+            </w:r>
+          </w:p>
+        </w:tc>
+        <w:tc>
+          <w:tcPr>
+            <w:tcW w:type="dxa" w:w="1310"/>
+            <w:tcMar>
+              <w:top w:type="dxa" w:w="40"/>
+              <w:left w:type="dxa" w:w="60"/>
+              <w:bottom w:type="dxa" w:w="40"/>
+              <w:right w:type="dxa" w:w="60"/>
+            </w:tcMar>
+          </w:tcPr>
+          <w:p>
+            <w:pPr>
+              <w:jc w:val="right"/>
+            </w:pPr>
+            <w:r>
+              <w:rPr>
+                <w:rFonts w:ascii="Times New Roman" w:cs="Times New Roman" w:eastAsia="Times New Roman" w:hAnsi="Times New Roman"/>
+                <w:b w:val="false"/>
+                <w:bCs w:val="false"/>
+                <w:i w:val="false"/>
+                <w:iCs w:val="false"/>
+                <w:sz w:val="18"/>
+                <w:szCs w:val="18"/>
+              </w:rPr>
+              <w:t xml:space="preserve">3.5</w:t>
+            </w:r>
+          </w:p>
+        </w:tc>
+        <w:tc>
+          <w:tcPr>
+            <w:tcW w:type="dxa" w:w="1312"/>
+            <w:tcMar>
+              <w:top w:type="dxa" w:w="40"/>
+              <w:left w:type="dxa" w:w="60"/>
+              <w:bottom w:type="dxa" w:w="40"/>
+              <w:right w:type="dxa" w:w="60"/>
+            </w:tcMar>
+          </w:tcPr>
+          <w:p>
+            <w:pPr>
+              <w:jc w:val="right"/>
+            </w:pPr>
+            <w:r>
+              <w:rPr>
+                <w:rFonts w:ascii="Times New Roman" w:cs="Times New Roman" w:eastAsia="Times New Roman" w:hAnsi="Times New Roman"/>
+                <w:b w:val="false"/>
+                <w:bCs w:val="false"/>
+                <w:i w:val="false"/>
+                <w:iCs w:val="false"/>
+                <w:sz w:val="18"/>
+                <w:szCs w:val="18"/>
+              </w:rPr>
+              <w:t xml:space="preserve">2.8</w:t>
+            </w:r>
+          </w:p>
+        </w:tc>
+      </w:tr>
+      <w:tr>
+        <w:trPr>
+          <w:tblHeader w:val="false"/>
+        </w:trPr>
+        <w:tc>
+          <w:tcPr>
+            <w:tcW w:type="dxa" w:w="2808"/>
+            <w:tcMar>
+              <w:top w:type="dxa" w:w="40"/>
+              <w:left w:type="dxa" w:w="60"/>
+              <w:bottom w:type="dxa" w:w="40"/>
+              <w:right w:type="dxa" w:w="60"/>
+            </w:tcMar>
+          </w:tcPr>
+          <w:p>
+            <w:pPr>
+              <w:jc w:val="left"/>
+            </w:pPr>
+            <w:r>
+              <w:rPr>
+                <w:rFonts w:ascii="Times New Roman" w:cs="Times New Roman" w:eastAsia="Times New Roman" w:hAnsi="Times New Roman"/>
+                <w:b w:val="false"/>
+                <w:bCs w:val="false"/>
+                <w:i w:val="false"/>
+                <w:iCs w:val="false"/>
+                <w:sz w:val="18"/>
+                <w:szCs w:val="18"/>
+              </w:rPr>
+              <w:t xml:space="preserve">rest of Colorado</w:t>
+            </w:r>
+          </w:p>
+        </w:tc>
+        <w:tc>
+          <w:tcPr>
+            <w:tcW w:type="dxa" w:w="1310"/>
+            <w:tcMar>
+              <w:top w:type="dxa" w:w="40"/>
+              <w:left w:type="dxa" w:w="60"/>
+              <w:bottom w:type="dxa" w:w="40"/>
+              <w:right w:type="dxa" w:w="60"/>
+            </w:tcMar>
+          </w:tcPr>
+          <w:p>
+            <w:pPr>
+              <w:jc w:val="right"/>
+            </w:pPr>
+            <w:r>
+              <w:rPr>
+                <w:rFonts w:ascii="Times New Roman" w:cs="Times New Roman" w:eastAsia="Times New Roman" w:hAnsi="Times New Roman"/>
+                <w:b w:val="false"/>
+                <w:bCs w:val="false"/>
+                <w:i w:val="false"/>
+                <w:iCs w:val="false"/>
+                <w:sz w:val="18"/>
+                <w:szCs w:val="18"/>
+              </w:rPr>
+              <w:t xml:space="preserve">7.6</w:t>
+            </w:r>
+          </w:p>
+        </w:tc>
+        <w:tc>
+          <w:tcPr>
+            <w:tcW w:type="dxa" w:w="1310"/>
+            <w:tcMar>
+              <w:top w:type="dxa" w:w="40"/>
+              <w:left w:type="dxa" w:w="60"/>
+              <w:bottom w:type="dxa" w:w="40"/>
+              <w:right w:type="dxa" w:w="60"/>
+            </w:tcMar>
+          </w:tcPr>
+          <w:p>
+            <w:pPr>
+              <w:jc w:val="right"/>
+            </w:pPr>
+            <w:r>
+              <w:rPr>
+                <w:rFonts w:ascii="Times New Roman" w:cs="Times New Roman" w:eastAsia="Times New Roman" w:hAnsi="Times New Roman"/>
+                <w:b w:val="false"/>
+                <w:bCs w:val="false"/>
+                <w:i w:val="false"/>
+                <w:iCs w:val="false"/>
+                <w:sz w:val="18"/>
+                <w:szCs w:val="18"/>
+              </w:rPr>
+              <w:t xml:space="preserve">5.1</w:t>
+            </w:r>
+          </w:p>
+        </w:tc>
+        <w:tc>
+          <w:tcPr>
+            <w:tcW w:type="dxa" w:w="1310"/>
+            <w:tcMar>
+              <w:top w:type="dxa" w:w="40"/>
+              <w:left w:type="dxa" w:w="60"/>
+              <w:bottom w:type="dxa" w:w="40"/>
+              <w:right w:type="dxa" w:w="60"/>
+            </w:tcMar>
+          </w:tcPr>
+          <w:p>
+            <w:pPr>
+              <w:jc w:val="right"/>
+            </w:pPr>
+            <w:r>
+              <w:rPr>
+                <w:rFonts w:ascii="Times New Roman" w:cs="Times New Roman" w:eastAsia="Times New Roman" w:hAnsi="Times New Roman"/>
+                <w:b w:val="false"/>
+                <w:bCs w:val="false"/>
+                <w:i w:val="false"/>
+                <w:iCs w:val="false"/>
+                <w:sz w:val="18"/>
+                <w:szCs w:val="18"/>
+              </w:rPr>
+              <w:t xml:space="preserve">5.3</w:t>
+            </w:r>
+          </w:p>
+        </w:tc>
+        <w:tc>
+          <w:tcPr>
+            <w:tcW w:type="dxa" w:w="1310"/>
+            <w:tcMar>
+              <w:top w:type="dxa" w:w="40"/>
+              <w:left w:type="dxa" w:w="60"/>
+              <w:bottom w:type="dxa" w:w="40"/>
+              <w:right w:type="dxa" w:w="60"/>
+            </w:tcMar>
+          </w:tcPr>
+          <w:p>
+            <w:pPr>
+              <w:jc w:val="right"/>
+            </w:pPr>
+            <w:r>
+              <w:rPr>
+                <w:rFonts w:ascii="Times New Roman" w:cs="Times New Roman" w:eastAsia="Times New Roman" w:hAnsi="Times New Roman"/>
+                <w:b w:val="false"/>
+                <w:bCs w:val="false"/>
+                <w:i w:val="false"/>
+                <w:iCs w:val="false"/>
+                <w:sz w:val="18"/>
+                <w:szCs w:val="18"/>
+              </w:rPr>
+              <w:t xml:space="preserve">7.8</w:t>
+            </w:r>
+          </w:p>
+        </w:tc>
+        <w:tc>
+          <w:tcPr>
+            <w:tcW w:type="dxa" w:w="1312"/>
+            <w:tcMar>
+              <w:top w:type="dxa" w:w="40"/>
+              <w:left w:type="dxa" w:w="60"/>
+              <w:bottom w:type="dxa" w:w="40"/>
+              <w:right w:type="dxa" w:w="60"/>
+            </w:tcMar>
+          </w:tcPr>
+          <w:p>
+            <w:pPr>
+              <w:jc w:val="right"/>
+            </w:pPr>
+            <w:r>
+              <w:rPr>
+                <w:rFonts w:ascii="Times New Roman" w:cs="Times New Roman" w:eastAsia="Times New Roman" w:hAnsi="Times New Roman"/>
+                <w:b w:val="false"/>
+                <w:bCs w:val="false"/>
+                <w:i w:val="false"/>
+                <w:iCs w:val="false"/>
+                <w:sz w:val="18"/>
+                <w:szCs w:val="18"/>
+              </w:rPr>
+              <w:t xml:space="preserve">15.6</w:t>
+            </w:r>
+          </w:p>
+        </w:tc>
+      </w:tr>
+    </w:tbl>
+    <w:p>
+      <w:pPr>
+        <w:spacing w:after="120"/>
+      </w:pPr>
+    </w:p>
+    <w:p>
+      <w:pPr>
+        <w:spacing w:after="160" w:line="360"/>
+        <w:jc w:val="both"/>
+      </w:pPr>
+      <w:r>
+        <w:rPr>
+          <w:rFonts w:ascii="Times New Roman" w:cs="Times New Roman" w:eastAsia="Times New Roman" w:hAnsi="Times New Roman"/>
+          <w:b w:val="false"/>
+          <w:bCs w:val="false"/>
+          <w:i w:val="false"/>
+          <w:iCs w:val="false"/>
+          <w:sz w:val="24"/>
+          <w:szCs w:val="24"/>
+        </w:rPr>
+        <w:t xml:space="preserve">Percentage of the state's located hazardous-sector manufacturers in each complete edition. The 1965 edition is omitted: it places 73% in Denver, an outlier against every later edition.</w:t>
+      </w:r>
+    </w:p>
+    <w:p>
+      <w:pPr>
+        <w:spacing w:after="160" w:line="360"/>
+        <w:jc w:val="both"/>
+      </w:pPr>
+      <w:r>
+        <w:rPr>
+          <w:rFonts w:ascii="Times New Roman" w:cs="Times New Roman" w:eastAsia="Times New Roman" w:hAnsi="Times New Roman"/>
+          <w:b/>
+          <w:bCs/>
+          <w:i w:val="false"/>
+          <w:iCs w:val="false"/>
+          <w:sz w:val="24"/>
+          <w:szCs w:val="24"/>
+        </w:rPr>
+        <w:t xml:space="preserve">Who lives beside it.</w:t>
+      </w:r>
+      <w:r>
+        <w:rPr>
+          <w:rFonts w:ascii="Times New Roman" w:cs="Times New Roman" w:eastAsia="Times New Roman" w:hAnsi="Times New Roman"/>
+          <w:b w:val="false"/>
+          <w:bCs w:val="false"/>
+          <w:i w:val="false"/>
+          <w:iCs w:val="false"/>
+          <w:sz w:val="24"/>
+          <w:szCs w:val="24"/>
+        </w:rPr>
+        <w:t xml:space="preserve"> For every Colorado tract with 200 or more residents in each census from 1990 (1,158 tracts), each composition measure is regressed on the tract's log density of hazardous firms of the decade, with log population density and county fixed effects (HC1 errors); as in Denver, 2000–2020 use the 1983–92 sites.</w:t>
+      </w:r>
+    </w:p>
+    <w:p>
+      <w:pPr>
+        <w:spacing w:after="80" w:before="240"/>
+      </w:pPr>
+      <w:r>
+        <w:rPr>
+          <w:rFonts w:ascii="Times New Roman" w:cs="Times New Roman" w:eastAsia="Times New Roman" w:hAnsi="Times New Roman"/>
+          <w:b/>
+          <w:bCs/>
+          <w:sz w:val="20"/>
+          <w:szCs w:val="20"/>
+        </w:rPr>
+        <w:t xml:space="preserve">Table 18. Tract composition and hazardous-firm density across Colorado, 1990–2020, by region (tracts with 200+ residents in every census from 1990)</w:t>
+      </w:r>
+    </w:p>
+    <w:tbl>
+      <w:tblPr>
+        <w:tblW w:type="dxa" w:w="9360"/>
+        <w:tblBorders>
+          <w:top w:val="single" w:sz="6"/>
+          <w:left w:val="none"/>
+          <w:bottom w:val="single" w:sz="6"/>
+          <w:right w:val="none"/>
+          <w:insideH w:val="single" w:color="BBBBBB" w:sz="2"/>
+          <w:insideV w:val="none"/>
+        </w:tblBorders>
+      </w:tblPr>
+      <w:tblGrid>
+        <w:gridCol w:w="2808"/>
+        <w:gridCol w:w="1310"/>
+        <w:gridCol w:w="1310"/>
+        <w:gridCol w:w="1310"/>
+        <w:gridCol w:w="1310"/>
+        <w:gridCol w:w="1312"/>
+      </w:tblGrid>
+      <w:tr>
+        <w:trPr>
+          <w:tblHeader/>
+        </w:trPr>
+        <w:tc>
+          <w:tcPr>
+            <w:tcW w:type="dxa" w:w="2808"/>
+            <w:shd w:fill="EDEDED" w:color="auto" w:val="clear"/>
+            <w:tcMar>
+              <w:top w:type="dxa" w:w="40"/>
+              <w:left w:type="dxa" w:w="60"/>
+              <w:bottom w:type="dxa" w:w="40"/>
+              <w:right w:type="dxa" w:w="60"/>
+            </w:tcMar>
+          </w:tcPr>
+          <w:p>
+            <w:pPr>
+              <w:jc w:val="left"/>
+            </w:pPr>
+            <w:r>
+              <w:rPr>
+                <w:rFonts w:ascii="Times New Roman" w:cs="Times New Roman" w:eastAsia="Times New Roman" w:hAnsi="Times New Roman"/>
+                <w:b/>
+                <w:bCs/>
+                <w:i w:val="false"/>
+                <w:iCs w:val="false"/>
+                <w:sz w:val="18"/>
+                <w:szCs w:val="18"/>
+              </w:rPr>
+              <w:t xml:space="preserve">region (tracts)</w:t>
+            </w:r>
+          </w:p>
+        </w:tc>
+        <w:tc>
+          <w:tcPr>
+            <w:tcW w:type="dxa" w:w="1310"/>
+            <w:shd w:fill="EDEDED" w:color="auto" w:val="clear"/>
+            <w:tcMar>
+              <w:top w:type="dxa" w:w="40"/>
+              <w:left w:type="dxa" w:w="60"/>
+              <w:bottom w:type="dxa" w:w="40"/>
+              <w:right w:type="dxa" w:w="60"/>
+            </w:tcMar>
+          </w:tcPr>
+          <w:p>
+            <w:pPr>
+              <w:jc w:val="right"/>
+            </w:pPr>
+            <w:r>
+              <w:rPr>
+                <w:rFonts w:ascii="Times New Roman" w:cs="Times New Roman" w:eastAsia="Times New Roman" w:hAnsi="Times New Roman"/>
+                <w:b/>
+                <w:bCs/>
+                <w:i w:val="false"/>
+                <w:iCs w:val="false"/>
+                <w:sz w:val="18"/>
+                <w:szCs w:val="18"/>
+              </w:rPr>
+              <w:t xml:space="preserve">outcome</w:t>
+            </w:r>
+          </w:p>
+        </w:tc>
+        <w:tc>
+          <w:tcPr>
+            <w:tcW w:type="dxa" w:w="1310"/>
+            <w:shd w:fill="EDEDED" w:color="auto" w:val="clear"/>
+            <w:tcMar>
+              <w:top w:type="dxa" w:w="40"/>
+              <w:left w:type="dxa" w:w="60"/>
+              <w:bottom w:type="dxa" w:w="40"/>
+              <w:right w:type="dxa" w:w="60"/>
+            </w:tcMar>
+          </w:tcPr>
+          <w:p>
+            <w:pPr>
+              <w:jc w:val="right"/>
+            </w:pPr>
+            <w:r>
+              <w:rPr>
+                <w:rFonts w:ascii="Times New Roman" w:cs="Times New Roman" w:eastAsia="Times New Roman" w:hAnsi="Times New Roman"/>
+                <w:b/>
+                <w:bCs/>
+                <w:i w:val="false"/>
+                <w:iCs w:val="false"/>
+                <w:sz w:val="18"/>
+                <w:szCs w:val="18"/>
+              </w:rPr>
+              <w:t xml:space="preserve">1990</w:t>
+            </w:r>
+          </w:p>
+        </w:tc>
+        <w:tc>
+          <w:tcPr>
+            <w:tcW w:type="dxa" w:w="1310"/>
+            <w:shd w:fill="EDEDED" w:color="auto" w:val="clear"/>
+            <w:tcMar>
+              <w:top w:type="dxa" w:w="40"/>
+              <w:left w:type="dxa" w:w="60"/>
+              <w:bottom w:type="dxa" w:w="40"/>
+              <w:right w:type="dxa" w:w="60"/>
+            </w:tcMar>
+          </w:tcPr>
+          <w:p>
+            <w:pPr>
+              <w:jc w:val="right"/>
+            </w:pPr>
+            <w:r>
+              <w:rPr>
+                <w:rFonts w:ascii="Times New Roman" w:cs="Times New Roman" w:eastAsia="Times New Roman" w:hAnsi="Times New Roman"/>
+                <w:b/>
+                <w:bCs/>
+                <w:i w:val="false"/>
+                <w:iCs w:val="false"/>
+                <w:sz w:val="18"/>
+                <w:szCs w:val="18"/>
+              </w:rPr>
+              <w:t xml:space="preserve">2000</w:t>
+            </w:r>
+          </w:p>
+        </w:tc>
+        <w:tc>
+          <w:tcPr>
+            <w:tcW w:type="dxa" w:w="1310"/>
+            <w:shd w:fill="EDEDED" w:color="auto" w:val="clear"/>
+            <w:tcMar>
+              <w:top w:type="dxa" w:w="40"/>
+              <w:left w:type="dxa" w:w="60"/>
+              <w:bottom w:type="dxa" w:w="40"/>
+              <w:right w:type="dxa" w:w="60"/>
+            </w:tcMar>
+          </w:tcPr>
+          <w:p>
+            <w:pPr>
+              <w:jc w:val="right"/>
+            </w:pPr>
+            <w:r>
+              <w:rPr>
+                <w:rFonts w:ascii="Times New Roman" w:cs="Times New Roman" w:eastAsia="Times New Roman" w:hAnsi="Times New Roman"/>
+                <w:b/>
+                <w:bCs/>
+                <w:i w:val="false"/>
+                <w:iCs w:val="false"/>
+                <w:sz w:val="18"/>
+                <w:szCs w:val="18"/>
+              </w:rPr>
+              <w:t xml:space="preserve">2010</w:t>
+            </w:r>
+          </w:p>
+        </w:tc>
+        <w:tc>
+          <w:tcPr>
+            <w:tcW w:type="dxa" w:w="1312"/>
+            <w:shd w:fill="EDEDED" w:color="auto" w:val="clear"/>
+            <w:tcMar>
+              <w:top w:type="dxa" w:w="40"/>
+              <w:left w:type="dxa" w:w="60"/>
+              <w:bottom w:type="dxa" w:w="40"/>
+              <w:right w:type="dxa" w:w="60"/>
+            </w:tcMar>
+          </w:tcPr>
+          <w:p>
+            <w:pPr>
+              <w:jc w:val="right"/>
+            </w:pPr>
+            <w:r>
+              <w:rPr>
+                <w:rFonts w:ascii="Times New Roman" w:cs="Times New Roman" w:eastAsia="Times New Roman" w:hAnsi="Times New Roman"/>
+                <w:b/>
+                <w:bCs/>
+                <w:i w:val="false"/>
+                <w:iCs w:val="false"/>
+                <w:sz w:val="18"/>
+                <w:szCs w:val="18"/>
+              </w:rPr>
+              <w:t xml:space="preserve">2020</w:t>
+            </w:r>
+          </w:p>
+        </w:tc>
+      </w:tr>
+      <w:tr>
+        <w:trPr>
+          <w:tblHeader w:val="false"/>
+        </w:trPr>
+        <w:tc>
+          <w:tcPr>
+            <w:tcW w:type="dxa" w:w="2808"/>
+            <w:tcMar>
+              <w:top w:type="dxa" w:w="40"/>
+              <w:left w:type="dxa" w:w="60"/>
+              <w:bottom w:type="dxa" w:w="40"/>
+              <w:right w:type="dxa" w:w="60"/>
+            </w:tcMar>
+          </w:tcPr>
+          <w:p>
+            <w:pPr>
+              <w:jc w:val="left"/>
+            </w:pPr>
+            <w:r>
+              <w:rPr>
+                <w:rFonts w:ascii="Times New Roman" w:cs="Times New Roman" w:eastAsia="Times New Roman" w:hAnsi="Times New Roman"/>
+                <w:b w:val="false"/>
+                <w:bCs w:val="false"/>
+                <w:i w:val="false"/>
+                <w:iCs w:val="false"/>
+                <w:sz w:val="18"/>
+                <w:szCs w:val="18"/>
+              </w:rPr>
+              <w:t xml:space="preserve">Colorado (1,158)</w:t>
+            </w:r>
+          </w:p>
+        </w:tc>
+        <w:tc>
+          <w:tcPr>
+            <w:tcW w:type="dxa" w:w="1310"/>
+            <w:tcMar>
+              <w:top w:type="dxa" w:w="40"/>
+              <w:left w:type="dxa" w:w="60"/>
+              <w:bottom w:type="dxa" w:w="40"/>
+              <w:right w:type="dxa" w:w="60"/>
+            </w:tcMar>
+          </w:tcPr>
+          <w:p>
+            <w:pPr>
+              <w:jc w:val="right"/>
+            </w:pPr>
+            <w:r>
+              <w:rPr>
+                <w:rFonts w:ascii="Times New Roman" w:cs="Times New Roman" w:eastAsia="Times New Roman" w:hAnsi="Times New Roman"/>
+                <w:b w:val="false"/>
+                <w:bCs w:val="false"/>
+                <w:i w:val="false"/>
+                <w:iCs w:val="false"/>
+                <w:sz w:val="18"/>
+                <w:szCs w:val="18"/>
+              </w:rPr>
+              <w:t xml:space="preserve">% Hispanic</w:t>
+            </w:r>
+          </w:p>
+        </w:tc>
+        <w:tc>
+          <w:tcPr>
+            <w:tcW w:type="dxa" w:w="1310"/>
+            <w:tcMar>
+              <w:top w:type="dxa" w:w="40"/>
+              <w:left w:type="dxa" w:w="60"/>
+              <w:bottom w:type="dxa" w:w="40"/>
+              <w:right w:type="dxa" w:w="60"/>
+            </w:tcMar>
+          </w:tcPr>
+          <w:p>
+            <w:pPr>
+              <w:jc w:val="right"/>
+            </w:pPr>
+            <w:r>
+              <w:rPr>
+                <w:rFonts w:ascii="Times New Roman" w:cs="Times New Roman" w:eastAsia="Times New Roman" w:hAnsi="Times New Roman"/>
+                <w:b w:val="false"/>
+                <w:bCs w:val="false"/>
+                <w:i w:val="false"/>
+                <w:iCs w:val="false"/>
+                <w:sz w:val="18"/>
+                <w:szCs w:val="18"/>
+              </w:rPr>
+              <w:t xml:space="preserve">+8.3***</w:t>
+            </w:r>
+          </w:p>
+        </w:tc>
+        <w:tc>
+          <w:tcPr>
+            <w:tcW w:type="dxa" w:w="1310"/>
+            <w:tcMar>
+              <w:top w:type="dxa" w:w="40"/>
+              <w:left w:type="dxa" w:w="60"/>
+              <w:bottom w:type="dxa" w:w="40"/>
+              <w:right w:type="dxa" w:w="60"/>
+            </w:tcMar>
+          </w:tcPr>
+          <w:p>
+            <w:pPr>
+              <w:jc w:val="right"/>
+            </w:pPr>
+            <w:r>
+              <w:rPr>
+                <w:rFonts w:ascii="Times New Roman" w:cs="Times New Roman" w:eastAsia="Times New Roman" w:hAnsi="Times New Roman"/>
+                <w:b w:val="false"/>
+                <w:bCs w:val="false"/>
+                <w:i w:val="false"/>
+                <w:iCs w:val="false"/>
+                <w:sz w:val="18"/>
+                <w:szCs w:val="18"/>
+              </w:rPr>
+              <w:t xml:space="preserve">+9.7***</w:t>
+            </w:r>
+          </w:p>
+        </w:tc>
+        <w:tc>
+          <w:tcPr>
+            <w:tcW w:type="dxa" w:w="1310"/>
+            <w:tcMar>
+              <w:top w:type="dxa" w:w="40"/>
+              <w:left w:type="dxa" w:w="60"/>
+              <w:bottom w:type="dxa" w:w="40"/>
+              <w:right w:type="dxa" w:w="60"/>
+            </w:tcMar>
+          </w:tcPr>
+          <w:p>
+            <w:pPr>
+              <w:jc w:val="right"/>
+            </w:pPr>
+            <w:r>
+              <w:rPr>
+                <w:rFonts w:ascii="Times New Roman" w:cs="Times New Roman" w:eastAsia="Times New Roman" w:hAnsi="Times New Roman"/>
+                <w:b w:val="false"/>
+                <w:bCs w:val="false"/>
+                <w:i w:val="false"/>
+                <w:iCs w:val="false"/>
+                <w:sz w:val="18"/>
+                <w:szCs w:val="18"/>
+              </w:rPr>
+              <w:t xml:space="preserve">+8.3***</w:t>
+            </w:r>
+          </w:p>
+        </w:tc>
+        <w:tc>
+          <w:tcPr>
+            <w:tcW w:type="dxa" w:w="1312"/>
+            <w:tcMar>
+              <w:top w:type="dxa" w:w="40"/>
+              <w:left w:type="dxa" w:w="60"/>
+              <w:bottom w:type="dxa" w:w="40"/>
+              <w:right w:type="dxa" w:w="60"/>
+            </w:tcMar>
+          </w:tcPr>
+          <w:p>
+            <w:pPr>
+              <w:jc w:val="right"/>
+            </w:pPr>
+            <w:r>
+              <w:rPr>
+                <w:rFonts w:ascii="Times New Roman" w:cs="Times New Roman" w:eastAsia="Times New Roman" w:hAnsi="Times New Roman"/>
+                <w:b w:val="false"/>
+                <w:bCs w:val="false"/>
+                <w:i w:val="false"/>
+                <w:iCs w:val="false"/>
+                <w:sz w:val="18"/>
+                <w:szCs w:val="18"/>
+              </w:rPr>
+              <w:t xml:space="preserve">+5.1***</w:t>
+            </w:r>
+          </w:p>
+        </w:tc>
+      </w:tr>
+      <w:tr>
+        <w:trPr>
+          <w:tblHeader w:val="false"/>
+        </w:trPr>
+        <w:tc>
+          <w:tcPr>
+            <w:tcW w:type="dxa" w:w="2808"/>
+            <w:tcMar>
+              <w:top w:type="dxa" w:w="40"/>
+              <w:left w:type="dxa" w:w="60"/>
+              <w:bottom w:type="dxa" w:w="40"/>
+              <w:right w:type="dxa" w:w="60"/>
+            </w:tcMar>
+          </w:tcPr>
+          <w:p>
+            <w:pPr>
+              <w:jc w:val="left"/>
+            </w:pPr>
+            <w:r>
+              <w:rPr>
+                <w:rFonts w:ascii="Times New Roman" w:cs="Times New Roman" w:eastAsia="Times New Roman" w:hAnsi="Times New Roman"/>
+                <w:b w:val="false"/>
+                <w:bCs w:val="false"/>
+                <w:i w:val="false"/>
+                <w:iCs w:val="false"/>
+                <w:sz w:val="18"/>
+                <w:szCs w:val="18"/>
+              </w:rPr>
+              <w:t xml:space="preserve">Denver (137)</w:t>
+            </w:r>
+          </w:p>
+        </w:tc>
+        <w:tc>
+          <w:tcPr>
+            <w:tcW w:type="dxa" w:w="1310"/>
+            <w:tcMar>
+              <w:top w:type="dxa" w:w="40"/>
+              <w:left w:type="dxa" w:w="60"/>
+              <w:bottom w:type="dxa" w:w="40"/>
+              <w:right w:type="dxa" w:w="60"/>
+            </w:tcMar>
+          </w:tcPr>
+          <w:p>
+            <w:pPr>
+              <w:jc w:val="right"/>
+            </w:pPr>
+            <w:r>
+              <w:rPr>
+                <w:rFonts w:ascii="Times New Roman" w:cs="Times New Roman" w:eastAsia="Times New Roman" w:hAnsi="Times New Roman"/>
+                <w:b w:val="false"/>
+                <w:bCs w:val="false"/>
+                <w:i w:val="false"/>
+                <w:iCs w:val="false"/>
+                <w:sz w:val="18"/>
+                <w:szCs w:val="18"/>
+              </w:rPr>
+              <w:t xml:space="preserve">% Hispanic</w:t>
+            </w:r>
+          </w:p>
+        </w:tc>
+        <w:tc>
+          <w:tcPr>
+            <w:tcW w:type="dxa" w:w="1310"/>
+            <w:tcMar>
+              <w:top w:type="dxa" w:w="40"/>
+              <w:left w:type="dxa" w:w="60"/>
+              <w:bottom w:type="dxa" w:w="40"/>
+              <w:right w:type="dxa" w:w="60"/>
+            </w:tcMar>
+          </w:tcPr>
+          <w:p>
+            <w:pPr>
+              <w:jc w:val="right"/>
+            </w:pPr>
+            <w:r>
+              <w:rPr>
+                <w:rFonts w:ascii="Times New Roman" w:cs="Times New Roman" w:eastAsia="Times New Roman" w:hAnsi="Times New Roman"/>
+                <w:b w:val="false"/>
+                <w:bCs w:val="false"/>
+                <w:i w:val="false"/>
+                <w:iCs w:val="false"/>
+                <w:sz w:val="18"/>
+                <w:szCs w:val="18"/>
+              </w:rPr>
+              <w:t xml:space="preserve">+16.5***</w:t>
+            </w:r>
+          </w:p>
+        </w:tc>
+        <w:tc>
+          <w:tcPr>
+            <w:tcW w:type="dxa" w:w="1310"/>
+            <w:tcMar>
+              <w:top w:type="dxa" w:w="40"/>
+              <w:left w:type="dxa" w:w="60"/>
+              <w:bottom w:type="dxa" w:w="40"/>
+              <w:right w:type="dxa" w:w="60"/>
+            </w:tcMar>
+          </w:tcPr>
+          <w:p>
+            <w:pPr>
+              <w:jc w:val="right"/>
+            </w:pPr>
+            <w:r>
+              <w:rPr>
+                <w:rFonts w:ascii="Times New Roman" w:cs="Times New Roman" w:eastAsia="Times New Roman" w:hAnsi="Times New Roman"/>
+                <w:b w:val="false"/>
+                <w:bCs w:val="false"/>
+                <w:i w:val="false"/>
+                <w:iCs w:val="false"/>
+                <w:sz w:val="18"/>
+                <w:szCs w:val="18"/>
+              </w:rPr>
+              <w:t xml:space="preserve">+16.6***</w:t>
+            </w:r>
+          </w:p>
+        </w:tc>
+        <w:tc>
+          <w:tcPr>
+            <w:tcW w:type="dxa" w:w="1310"/>
+            <w:tcMar>
+              <w:top w:type="dxa" w:w="40"/>
+              <w:left w:type="dxa" w:w="60"/>
+              <w:bottom w:type="dxa" w:w="40"/>
+              <w:right w:type="dxa" w:w="60"/>
+            </w:tcMar>
+          </w:tcPr>
+          <w:p>
+            <w:pPr>
+              <w:jc w:val="right"/>
+            </w:pPr>
+            <w:r>
+              <w:rPr>
+                <w:rFonts w:ascii="Times New Roman" w:cs="Times New Roman" w:eastAsia="Times New Roman" w:hAnsi="Times New Roman"/>
+                <w:b w:val="false"/>
+                <w:bCs w:val="false"/>
+                <w:i w:val="false"/>
+                <w:iCs w:val="false"/>
+                <w:sz w:val="18"/>
+                <w:szCs w:val="18"/>
+              </w:rPr>
+              <w:t xml:space="preserve">+10.0***</w:t>
+            </w:r>
+          </w:p>
+        </w:tc>
+        <w:tc>
+          <w:tcPr>
+            <w:tcW w:type="dxa" w:w="1312"/>
+            <w:tcMar>
+              <w:top w:type="dxa" w:w="40"/>
+              <w:left w:type="dxa" w:w="60"/>
+              <w:bottom w:type="dxa" w:w="40"/>
+              <w:right w:type="dxa" w:w="60"/>
+            </w:tcMar>
+          </w:tcPr>
+          <w:p>
+            <w:pPr>
+              <w:jc w:val="right"/>
+            </w:pPr>
+            <w:r>
+              <w:rPr>
+                <w:rFonts w:ascii="Times New Roman" w:cs="Times New Roman" w:eastAsia="Times New Roman" w:hAnsi="Times New Roman"/>
+                <w:b w:val="false"/>
+                <w:bCs w:val="false"/>
+                <w:i w:val="false"/>
+                <w:iCs w:val="false"/>
+                <w:sz w:val="18"/>
+                <w:szCs w:val="18"/>
+              </w:rPr>
+              <w:t xml:space="preserve">+3.3</w:t>
+            </w:r>
+          </w:p>
+        </w:tc>
+      </w:tr>
+      <w:tr>
+        <w:trPr>
+          <w:tblHeader w:val="false"/>
+        </w:trPr>
+        <w:tc>
+          <w:tcPr>
+            <w:tcW w:type="dxa" w:w="2808"/>
+            <w:tcMar>
+              <w:top w:type="dxa" w:w="40"/>
+              <w:left w:type="dxa" w:w="60"/>
+              <w:bottom w:type="dxa" w:w="40"/>
+              <w:right w:type="dxa" w:w="60"/>
+            </w:tcMar>
+          </w:tcPr>
+          <w:p>
+            <w:pPr>
+              <w:jc w:val="left"/>
+            </w:pPr>
+            <w:r>
+              <w:rPr>
+                <w:rFonts w:ascii="Times New Roman" w:cs="Times New Roman" w:eastAsia="Times New Roman" w:hAnsi="Times New Roman"/>
+                <w:b w:val="false"/>
+                <w:bCs w:val="false"/>
+                <w:i w:val="false"/>
+                <w:iCs w:val="false"/>
+                <w:sz w:val="18"/>
+                <w:szCs w:val="18"/>
+              </w:rPr>
+              <w:t xml:space="preserve">Denver suburbs (413)</w:t>
+            </w:r>
+          </w:p>
+        </w:tc>
+        <w:tc>
+          <w:tcPr>
+            <w:tcW w:type="dxa" w:w="1310"/>
+            <w:tcMar>
+              <w:top w:type="dxa" w:w="40"/>
+              <w:left w:type="dxa" w:w="60"/>
+              <w:bottom w:type="dxa" w:w="40"/>
+              <w:right w:type="dxa" w:w="60"/>
+            </w:tcMar>
+          </w:tcPr>
+          <w:p>
+            <w:pPr>
+              <w:jc w:val="right"/>
+            </w:pPr>
+            <w:r>
+              <w:rPr>
+                <w:rFonts w:ascii="Times New Roman" w:cs="Times New Roman" w:eastAsia="Times New Roman" w:hAnsi="Times New Roman"/>
+                <w:b w:val="false"/>
+                <w:bCs w:val="false"/>
+                <w:i w:val="false"/>
+                <w:iCs w:val="false"/>
+                <w:sz w:val="18"/>
+                <w:szCs w:val="18"/>
+              </w:rPr>
+              <w:t xml:space="preserve">% Hispanic</w:t>
+            </w:r>
+          </w:p>
+        </w:tc>
+        <w:tc>
+          <w:tcPr>
+            <w:tcW w:type="dxa" w:w="1310"/>
+            <w:tcMar>
+              <w:top w:type="dxa" w:w="40"/>
+              <w:left w:type="dxa" w:w="60"/>
+              <w:bottom w:type="dxa" w:w="40"/>
+              <w:right w:type="dxa" w:w="60"/>
+            </w:tcMar>
+          </w:tcPr>
+          <w:p>
+            <w:pPr>
+              <w:jc w:val="right"/>
+            </w:pPr>
+            <w:r>
+              <w:rPr>
+                <w:rFonts w:ascii="Times New Roman" w:cs="Times New Roman" w:eastAsia="Times New Roman" w:hAnsi="Times New Roman"/>
+                <w:b w:val="false"/>
+                <w:bCs w:val="false"/>
+                <w:i w:val="false"/>
+                <w:iCs w:val="false"/>
+                <w:sz w:val="18"/>
+                <w:szCs w:val="18"/>
+              </w:rPr>
+              <w:t xml:space="preserve">+3.3***</w:t>
+            </w:r>
+          </w:p>
+        </w:tc>
+        <w:tc>
+          <w:tcPr>
+            <w:tcW w:type="dxa" w:w="1310"/>
+            <w:tcMar>
+              <w:top w:type="dxa" w:w="40"/>
+              <w:left w:type="dxa" w:w="60"/>
+              <w:bottom w:type="dxa" w:w="40"/>
+              <w:right w:type="dxa" w:w="60"/>
+            </w:tcMar>
+          </w:tcPr>
+          <w:p>
+            <w:pPr>
+              <w:jc w:val="right"/>
+            </w:pPr>
+            <w:r>
+              <w:rPr>
+                <w:rFonts w:ascii="Times New Roman" w:cs="Times New Roman" w:eastAsia="Times New Roman" w:hAnsi="Times New Roman"/>
+                <w:b w:val="false"/>
+                <w:bCs w:val="false"/>
+                <w:i w:val="false"/>
+                <w:iCs w:val="false"/>
+                <w:sz w:val="18"/>
+                <w:szCs w:val="18"/>
+              </w:rPr>
+              <w:t xml:space="preserve">+6.8***</w:t>
+            </w:r>
+          </w:p>
+        </w:tc>
+        <w:tc>
+          <w:tcPr>
+            <w:tcW w:type="dxa" w:w="1310"/>
+            <w:tcMar>
+              <w:top w:type="dxa" w:w="40"/>
+              <w:left w:type="dxa" w:w="60"/>
+              <w:bottom w:type="dxa" w:w="40"/>
+              <w:right w:type="dxa" w:w="60"/>
+            </w:tcMar>
+          </w:tcPr>
+          <w:p>
+            <w:pPr>
+              <w:jc w:val="right"/>
+            </w:pPr>
+            <w:r>
+              <w:rPr>
+                <w:rFonts w:ascii="Times New Roman" w:cs="Times New Roman" w:eastAsia="Times New Roman" w:hAnsi="Times New Roman"/>
+                <w:b w:val="false"/>
+                <w:bCs w:val="false"/>
+                <w:i w:val="false"/>
+                <w:iCs w:val="false"/>
+                <w:sz w:val="18"/>
+                <w:szCs w:val="18"/>
+              </w:rPr>
+              <w:t xml:space="preserve">+8.4***</w:t>
+            </w:r>
+          </w:p>
+        </w:tc>
+        <w:tc>
+          <w:tcPr>
+            <w:tcW w:type="dxa" w:w="1312"/>
+            <w:tcMar>
+              <w:top w:type="dxa" w:w="40"/>
+              <w:left w:type="dxa" w:w="60"/>
+              <w:bottom w:type="dxa" w:w="40"/>
+              <w:right w:type="dxa" w:w="60"/>
+            </w:tcMar>
+          </w:tcPr>
+          <w:p>
+            <w:pPr>
+              <w:jc w:val="right"/>
+            </w:pPr>
+            <w:r>
+              <w:rPr>
+                <w:rFonts w:ascii="Times New Roman" w:cs="Times New Roman" w:eastAsia="Times New Roman" w:hAnsi="Times New Roman"/>
+                <w:b w:val="false"/>
+                <w:bCs w:val="false"/>
+                <w:i w:val="false"/>
+                <w:iCs w:val="false"/>
+                <w:sz w:val="18"/>
+                <w:szCs w:val="18"/>
+              </w:rPr>
+              <w:t xml:space="preserve">+7.0***</w:t>
+            </w:r>
+          </w:p>
+        </w:tc>
+      </w:tr>
+      <w:tr>
+        <w:trPr>
+          <w:tblHeader w:val="false"/>
+        </w:trPr>
+        <w:tc>
+          <w:tcPr>
+            <w:tcW w:type="dxa" w:w="2808"/>
+            <w:tcMar>
+              <w:top w:type="dxa" w:w="40"/>
+              <w:left w:type="dxa" w:w="60"/>
+              <w:bottom w:type="dxa" w:w="40"/>
+              <w:right w:type="dxa" w:w="60"/>
+            </w:tcMar>
+          </w:tcPr>
+          <w:p>
+            <w:pPr>
+              <w:jc w:val="left"/>
+            </w:pPr>
+            <w:r>
+              <w:rPr>
+                <w:rFonts w:ascii="Times New Roman" w:cs="Times New Roman" w:eastAsia="Times New Roman" w:hAnsi="Times New Roman"/>
+                <w:b w:val="false"/>
+                <w:bCs w:val="false"/>
+                <w:i w:val="false"/>
+                <w:iCs w:val="false"/>
+                <w:sz w:val="18"/>
+                <w:szCs w:val="18"/>
+              </w:rPr>
+              <w:t xml:space="preserve">Boulder, Larimer, Weld (193)</w:t>
+            </w:r>
+          </w:p>
+        </w:tc>
+        <w:tc>
+          <w:tcPr>
+            <w:tcW w:type="dxa" w:w="1310"/>
+            <w:tcMar>
+              <w:top w:type="dxa" w:w="40"/>
+              <w:left w:type="dxa" w:w="60"/>
+              <w:bottom w:type="dxa" w:w="40"/>
+              <w:right w:type="dxa" w:w="60"/>
+            </w:tcMar>
+          </w:tcPr>
+          <w:p>
+            <w:pPr>
+              <w:jc w:val="right"/>
+            </w:pPr>
+            <w:r>
+              <w:rPr>
+                <w:rFonts w:ascii="Times New Roman" w:cs="Times New Roman" w:eastAsia="Times New Roman" w:hAnsi="Times New Roman"/>
+                <w:b w:val="false"/>
+                <w:bCs w:val="false"/>
+                <w:i w:val="false"/>
+                <w:iCs w:val="false"/>
+                <w:sz w:val="18"/>
+                <w:szCs w:val="18"/>
+              </w:rPr>
+              <w:t xml:space="preserve">% Hispanic</w:t>
+            </w:r>
+          </w:p>
+        </w:tc>
+        <w:tc>
+          <w:tcPr>
+            <w:tcW w:type="dxa" w:w="1310"/>
+            <w:tcMar>
+              <w:top w:type="dxa" w:w="40"/>
+              <w:left w:type="dxa" w:w="60"/>
+              <w:bottom w:type="dxa" w:w="40"/>
+              <w:right w:type="dxa" w:w="60"/>
+            </w:tcMar>
+          </w:tcPr>
+          <w:p>
+            <w:pPr>
+              <w:jc w:val="right"/>
+            </w:pPr>
+            <w:r>
+              <w:rPr>
+                <w:rFonts w:ascii="Times New Roman" w:cs="Times New Roman" w:eastAsia="Times New Roman" w:hAnsi="Times New Roman"/>
+                <w:b w:val="false"/>
+                <w:bCs w:val="false"/>
+                <w:i w:val="false"/>
+                <w:iCs w:val="false"/>
+                <w:sz w:val="18"/>
+                <w:szCs w:val="18"/>
+              </w:rPr>
+              <w:t xml:space="preserve">+5.5**</w:t>
+            </w:r>
+          </w:p>
+        </w:tc>
+        <w:tc>
+          <w:tcPr>
+            <w:tcW w:type="dxa" w:w="1310"/>
+            <w:tcMar>
+              <w:top w:type="dxa" w:w="40"/>
+              <w:left w:type="dxa" w:w="60"/>
+              <w:bottom w:type="dxa" w:w="40"/>
+              <w:right w:type="dxa" w:w="60"/>
+            </w:tcMar>
+          </w:tcPr>
+          <w:p>
+            <w:pPr>
+              <w:jc w:val="right"/>
+            </w:pPr>
+            <w:r>
+              <w:rPr>
+                <w:rFonts w:ascii="Times New Roman" w:cs="Times New Roman" w:eastAsia="Times New Roman" w:hAnsi="Times New Roman"/>
+                <w:b w:val="false"/>
+                <w:bCs w:val="false"/>
+                <w:i w:val="false"/>
+                <w:iCs w:val="false"/>
+                <w:sz w:val="18"/>
+                <w:szCs w:val="18"/>
+              </w:rPr>
+              <w:t xml:space="preserve">+8.3***</w:t>
+            </w:r>
+          </w:p>
+        </w:tc>
+        <w:tc>
+          <w:tcPr>
+            <w:tcW w:type="dxa" w:w="1310"/>
+            <w:tcMar>
+              <w:top w:type="dxa" w:w="40"/>
+              <w:left w:type="dxa" w:w="60"/>
+              <w:bottom w:type="dxa" w:w="40"/>
+              <w:right w:type="dxa" w:w="60"/>
+            </w:tcMar>
+          </w:tcPr>
+          <w:p>
+            <w:pPr>
+              <w:jc w:val="right"/>
+            </w:pPr>
+            <w:r>
+              <w:rPr>
+                <w:rFonts w:ascii="Times New Roman" w:cs="Times New Roman" w:eastAsia="Times New Roman" w:hAnsi="Times New Roman"/>
+                <w:b w:val="false"/>
+                <w:bCs w:val="false"/>
+                <w:i w:val="false"/>
+                <w:iCs w:val="false"/>
+                <w:sz w:val="18"/>
+                <w:szCs w:val="18"/>
+              </w:rPr>
+              <w:t xml:space="preserve">+8.9***</w:t>
+            </w:r>
+          </w:p>
+        </w:tc>
+        <w:tc>
+          <w:tcPr>
+            <w:tcW w:type="dxa" w:w="1312"/>
+            <w:tcMar>
+              <w:top w:type="dxa" w:w="40"/>
+              <w:left w:type="dxa" w:w="60"/>
+              <w:bottom w:type="dxa" w:w="40"/>
+              <w:right w:type="dxa" w:w="60"/>
+            </w:tcMar>
+          </w:tcPr>
+          <w:p>
+            <w:pPr>
+              <w:jc w:val="right"/>
+            </w:pPr>
+            <w:r>
+              <w:rPr>
+                <w:rFonts w:ascii="Times New Roman" w:cs="Times New Roman" w:eastAsia="Times New Roman" w:hAnsi="Times New Roman"/>
+                <w:b w:val="false"/>
+                <w:bCs w:val="false"/>
+                <w:i w:val="false"/>
+                <w:iCs w:val="false"/>
+                <w:sz w:val="18"/>
+                <w:szCs w:val="18"/>
+              </w:rPr>
+              <w:t xml:space="preserve">+6.1**</w:t>
+            </w:r>
+          </w:p>
+        </w:tc>
+      </w:tr>
+      <w:tr>
+        <w:trPr>
+          <w:tblHeader w:val="false"/>
+        </w:trPr>
+        <w:tc>
+          <w:tcPr>
+            <w:tcW w:type="dxa" w:w="2808"/>
+            <w:tcMar>
+              <w:top w:type="dxa" w:w="40"/>
+              <w:left w:type="dxa" w:w="60"/>
+              <w:bottom w:type="dxa" w:w="40"/>
+              <w:right w:type="dxa" w:w="60"/>
+            </w:tcMar>
+          </w:tcPr>
+          <w:p>
+            <w:pPr>
+              <w:jc w:val="left"/>
+            </w:pPr>
+            <w:r>
+              <w:rPr>
+                <w:rFonts w:ascii="Times New Roman" w:cs="Times New Roman" w:eastAsia="Times New Roman" w:hAnsi="Times New Roman"/>
+                <w:b w:val="false"/>
+                <w:bCs w:val="false"/>
+                <w:i w:val="false"/>
+                <w:iCs w:val="false"/>
+                <w:sz w:val="18"/>
+                <w:szCs w:val="18"/>
+              </w:rPr>
+              <w:t xml:space="preserve">Colorado Springs (124)</w:t>
+            </w:r>
+          </w:p>
+        </w:tc>
+        <w:tc>
+          <w:tcPr>
+            <w:tcW w:type="dxa" w:w="1310"/>
+            <w:tcMar>
+              <w:top w:type="dxa" w:w="40"/>
+              <w:left w:type="dxa" w:w="60"/>
+              <w:bottom w:type="dxa" w:w="40"/>
+              <w:right w:type="dxa" w:w="60"/>
+            </w:tcMar>
+          </w:tcPr>
+          <w:p>
+            <w:pPr>
+              <w:jc w:val="right"/>
+            </w:pPr>
+            <w:r>
+              <w:rPr>
+                <w:rFonts w:ascii="Times New Roman" w:cs="Times New Roman" w:eastAsia="Times New Roman" w:hAnsi="Times New Roman"/>
+                <w:b w:val="false"/>
+                <w:bCs w:val="false"/>
+                <w:i w:val="false"/>
+                <w:iCs w:val="false"/>
+                <w:sz w:val="18"/>
+                <w:szCs w:val="18"/>
+              </w:rPr>
+              <w:t xml:space="preserve">% Hispanic</w:t>
+            </w:r>
+          </w:p>
+        </w:tc>
+        <w:tc>
+          <w:tcPr>
+            <w:tcW w:type="dxa" w:w="1310"/>
+            <w:tcMar>
+              <w:top w:type="dxa" w:w="40"/>
+              <w:left w:type="dxa" w:w="60"/>
+              <w:bottom w:type="dxa" w:w="40"/>
+              <w:right w:type="dxa" w:w="60"/>
+            </w:tcMar>
+          </w:tcPr>
+          <w:p>
+            <w:pPr>
+              <w:jc w:val="right"/>
+            </w:pPr>
+            <w:r>
+              <w:rPr>
+                <w:rFonts w:ascii="Times New Roman" w:cs="Times New Roman" w:eastAsia="Times New Roman" w:hAnsi="Times New Roman"/>
+                <w:b w:val="false"/>
+                <w:bCs w:val="false"/>
+                <w:i w:val="false"/>
+                <w:iCs w:val="false"/>
+                <w:sz w:val="18"/>
+                <w:szCs w:val="18"/>
+              </w:rPr>
+              <w:t xml:space="preserve">+3.1***</w:t>
+            </w:r>
+          </w:p>
+        </w:tc>
+        <w:tc>
+          <w:tcPr>
+            <w:tcW w:type="dxa" w:w="1310"/>
+            <w:tcMar>
+              <w:top w:type="dxa" w:w="40"/>
+              <w:left w:type="dxa" w:w="60"/>
+              <w:bottom w:type="dxa" w:w="40"/>
+              <w:right w:type="dxa" w:w="60"/>
+            </w:tcMar>
+          </w:tcPr>
+          <w:p>
+            <w:pPr>
+              <w:jc w:val="right"/>
+            </w:pPr>
+            <w:r>
+              <w:rPr>
+                <w:rFonts w:ascii="Times New Roman" w:cs="Times New Roman" w:eastAsia="Times New Roman" w:hAnsi="Times New Roman"/>
+                <w:b w:val="false"/>
+                <w:bCs w:val="false"/>
+                <w:i w:val="false"/>
+                <w:iCs w:val="false"/>
+                <w:sz w:val="18"/>
+                <w:szCs w:val="18"/>
+              </w:rPr>
+              <w:t xml:space="preserve">+4.0**</w:t>
+            </w:r>
+          </w:p>
+        </w:tc>
+        <w:tc>
+          <w:tcPr>
+            <w:tcW w:type="dxa" w:w="1310"/>
+            <w:tcMar>
+              <w:top w:type="dxa" w:w="40"/>
+              <w:left w:type="dxa" w:w="60"/>
+              <w:bottom w:type="dxa" w:w="40"/>
+              <w:right w:type="dxa" w:w="60"/>
+            </w:tcMar>
+          </w:tcPr>
+          <w:p>
+            <w:pPr>
+              <w:jc w:val="right"/>
+            </w:pPr>
+            <w:r>
+              <w:rPr>
+                <w:rFonts w:ascii="Times New Roman" w:cs="Times New Roman" w:eastAsia="Times New Roman" w:hAnsi="Times New Roman"/>
+                <w:b w:val="false"/>
+                <w:bCs w:val="false"/>
+                <w:i w:val="false"/>
+                <w:iCs w:val="false"/>
+                <w:sz w:val="18"/>
+                <w:szCs w:val="18"/>
+              </w:rPr>
+              <w:t xml:space="preserve">+3.7*</w:t>
+            </w:r>
+          </w:p>
+        </w:tc>
+        <w:tc>
+          <w:tcPr>
+            <w:tcW w:type="dxa" w:w="1312"/>
+            <w:tcMar>
+              <w:top w:type="dxa" w:w="40"/>
+              <w:left w:type="dxa" w:w="60"/>
+              <w:bottom w:type="dxa" w:w="40"/>
+              <w:right w:type="dxa" w:w="60"/>
+            </w:tcMar>
+          </w:tcPr>
+          <w:p>
+            <w:pPr>
+              <w:jc w:val="right"/>
+            </w:pPr>
+            <w:r>
+              <w:rPr>
+                <w:rFonts w:ascii="Times New Roman" w:cs="Times New Roman" w:eastAsia="Times New Roman" w:hAnsi="Times New Roman"/>
+                <w:b w:val="false"/>
+                <w:bCs w:val="false"/>
+                <w:i w:val="false"/>
+                <w:iCs w:val="false"/>
+                <w:sz w:val="18"/>
+                <w:szCs w:val="18"/>
+              </w:rPr>
+              <w:t xml:space="preserve">+3.1</w:t>
+            </w:r>
+          </w:p>
+        </w:tc>
+      </w:tr>
+      <w:tr>
+        <w:trPr>
+          <w:tblHeader w:val="false"/>
+        </w:trPr>
+        <w:tc>
+          <w:tcPr>
+            <w:tcW w:type="dxa" w:w="2808"/>
+            <w:tcMar>
+              <w:top w:type="dxa" w:w="40"/>
+              <w:left w:type="dxa" w:w="60"/>
+              <w:bottom w:type="dxa" w:w="40"/>
+              <w:right w:type="dxa" w:w="60"/>
+            </w:tcMar>
+          </w:tcPr>
+          <w:p>
+            <w:pPr>
+              <w:jc w:val="left"/>
+            </w:pPr>
+            <w:r>
+              <w:rPr>
+                <w:rFonts w:ascii="Times New Roman" w:cs="Times New Roman" w:eastAsia="Times New Roman" w:hAnsi="Times New Roman"/>
+                <w:b w:val="false"/>
+                <w:bCs w:val="false"/>
+                <w:i w:val="false"/>
+                <w:iCs w:val="false"/>
+                <w:sz w:val="18"/>
+                <w:szCs w:val="18"/>
+              </w:rPr>
+              <w:t xml:space="preserve">Pueblo (52)</w:t>
+            </w:r>
+          </w:p>
+        </w:tc>
+        <w:tc>
+          <w:tcPr>
+            <w:tcW w:type="dxa" w:w="1310"/>
+            <w:tcMar>
+              <w:top w:type="dxa" w:w="40"/>
+              <w:left w:type="dxa" w:w="60"/>
+              <w:bottom w:type="dxa" w:w="40"/>
+              <w:right w:type="dxa" w:w="60"/>
+            </w:tcMar>
+          </w:tcPr>
+          <w:p>
+            <w:pPr>
+              <w:jc w:val="right"/>
+            </w:pPr>
+            <w:r>
+              <w:rPr>
+                <w:rFonts w:ascii="Times New Roman" w:cs="Times New Roman" w:eastAsia="Times New Roman" w:hAnsi="Times New Roman"/>
+                <w:b w:val="false"/>
+                <w:bCs w:val="false"/>
+                <w:i w:val="false"/>
+                <w:iCs w:val="false"/>
+                <w:sz w:val="18"/>
+                <w:szCs w:val="18"/>
+              </w:rPr>
+              <w:t xml:space="preserve">% Hispanic</w:t>
+            </w:r>
+          </w:p>
+        </w:tc>
+        <w:tc>
+          <w:tcPr>
+            <w:tcW w:type="dxa" w:w="1310"/>
+            <w:tcMar>
+              <w:top w:type="dxa" w:w="40"/>
+              <w:left w:type="dxa" w:w="60"/>
+              <w:bottom w:type="dxa" w:w="40"/>
+              <w:right w:type="dxa" w:w="60"/>
+            </w:tcMar>
+          </w:tcPr>
+          <w:p>
+            <w:pPr>
+              <w:jc w:val="right"/>
+            </w:pPr>
+            <w:r>
+              <w:rPr>
+                <w:rFonts w:ascii="Times New Roman" w:cs="Times New Roman" w:eastAsia="Times New Roman" w:hAnsi="Times New Roman"/>
+                <w:b w:val="false"/>
+                <w:bCs w:val="false"/>
+                <w:i w:val="false"/>
+                <w:iCs w:val="false"/>
+                <w:sz w:val="18"/>
+                <w:szCs w:val="18"/>
+              </w:rPr>
+              <w:t xml:space="preserve">+12.1</w:t>
+            </w:r>
+          </w:p>
+        </w:tc>
+        <w:tc>
+          <w:tcPr>
+            <w:tcW w:type="dxa" w:w="1310"/>
+            <w:tcMar>
+              <w:top w:type="dxa" w:w="40"/>
+              <w:left w:type="dxa" w:w="60"/>
+              <w:bottom w:type="dxa" w:w="40"/>
+              <w:right w:type="dxa" w:w="60"/>
+            </w:tcMar>
+          </w:tcPr>
+          <w:p>
+            <w:pPr>
+              <w:jc w:val="right"/>
+            </w:pPr>
+            <w:r>
+              <w:rPr>
+                <w:rFonts w:ascii="Times New Roman" w:cs="Times New Roman" w:eastAsia="Times New Roman" w:hAnsi="Times New Roman"/>
+                <w:b w:val="false"/>
+                <w:bCs w:val="false"/>
+                <w:i w:val="false"/>
+                <w:iCs w:val="false"/>
+                <w:sz w:val="18"/>
+                <w:szCs w:val="18"/>
+              </w:rPr>
+              <w:t xml:space="preserve">+12.7*</w:t>
+            </w:r>
+          </w:p>
+        </w:tc>
+        <w:tc>
+          <w:tcPr>
+            <w:tcW w:type="dxa" w:w="1310"/>
+            <w:tcMar>
+              <w:top w:type="dxa" w:w="40"/>
+              <w:left w:type="dxa" w:w="60"/>
+              <w:bottom w:type="dxa" w:w="40"/>
+              <w:right w:type="dxa" w:w="60"/>
+            </w:tcMar>
+          </w:tcPr>
+          <w:p>
+            <w:pPr>
+              <w:jc w:val="right"/>
+            </w:pPr>
+            <w:r>
+              <w:rPr>
+                <w:rFonts w:ascii="Times New Roman" w:cs="Times New Roman" w:eastAsia="Times New Roman" w:hAnsi="Times New Roman"/>
+                <w:b w:val="false"/>
+                <w:bCs w:val="false"/>
+                <w:i w:val="false"/>
+                <w:iCs w:val="false"/>
+                <w:sz w:val="18"/>
+                <w:szCs w:val="18"/>
+              </w:rPr>
+              <w:t xml:space="preserve">+12.3**</w:t>
+            </w:r>
+          </w:p>
+        </w:tc>
+        <w:tc>
+          <w:tcPr>
+            <w:tcW w:type="dxa" w:w="1312"/>
+            <w:tcMar>
+              <w:top w:type="dxa" w:w="40"/>
+              <w:left w:type="dxa" w:w="60"/>
+              <w:bottom w:type="dxa" w:w="40"/>
+              <w:right w:type="dxa" w:w="60"/>
+            </w:tcMar>
+          </w:tcPr>
+          <w:p>
+            <w:pPr>
+              <w:jc w:val="right"/>
+            </w:pPr>
+            <w:r>
+              <w:rPr>
+                <w:rFonts w:ascii="Times New Roman" w:cs="Times New Roman" w:eastAsia="Times New Roman" w:hAnsi="Times New Roman"/>
+                <w:b w:val="false"/>
+                <w:bCs w:val="false"/>
+                <w:i w:val="false"/>
+                <w:iCs w:val="false"/>
+                <w:sz w:val="18"/>
+                <w:szCs w:val="18"/>
+              </w:rPr>
+              <w:t xml:space="preserve">+8.9**</w:t>
+            </w:r>
+          </w:p>
+        </w:tc>
+      </w:tr>
+      <w:tr>
+        <w:trPr>
+          <w:tblHeader w:val="false"/>
+        </w:trPr>
+        <w:tc>
+          <w:tcPr>
+            <w:tcW w:type="dxa" w:w="2808"/>
+            <w:tcMar>
+              <w:top w:type="dxa" w:w="40"/>
+              <w:left w:type="dxa" w:w="60"/>
+              <w:bottom w:type="dxa" w:w="40"/>
+              <w:right w:type="dxa" w:w="60"/>
+            </w:tcMar>
+          </w:tcPr>
+          <w:p>
+            <w:pPr>
+              <w:jc w:val="left"/>
+            </w:pPr>
+            <w:r>
+              <w:rPr>
+                <w:rFonts w:ascii="Times New Roman" w:cs="Times New Roman" w:eastAsia="Times New Roman" w:hAnsi="Times New Roman"/>
+                <w:b w:val="false"/>
+                <w:bCs w:val="false"/>
+                <w:i w:val="false"/>
+                <w:iCs w:val="false"/>
+                <w:sz w:val="18"/>
+                <w:szCs w:val="18"/>
+              </w:rPr>
+              <w:t xml:space="preserve">rest of Colorado (210)</w:t>
+            </w:r>
+          </w:p>
+        </w:tc>
+        <w:tc>
+          <w:tcPr>
+            <w:tcW w:type="dxa" w:w="1310"/>
+            <w:tcMar>
+              <w:top w:type="dxa" w:w="40"/>
+              <w:left w:type="dxa" w:w="60"/>
+              <w:bottom w:type="dxa" w:w="40"/>
+              <w:right w:type="dxa" w:w="60"/>
+            </w:tcMar>
+          </w:tcPr>
+          <w:p>
+            <w:pPr>
+              <w:jc w:val="right"/>
+            </w:pPr>
+            <w:r>
+              <w:rPr>
+                <w:rFonts w:ascii="Times New Roman" w:cs="Times New Roman" w:eastAsia="Times New Roman" w:hAnsi="Times New Roman"/>
+                <w:b w:val="false"/>
+                <w:bCs w:val="false"/>
+                <w:i w:val="false"/>
+                <w:iCs w:val="false"/>
+                <w:sz w:val="18"/>
+                <w:szCs w:val="18"/>
+              </w:rPr>
+              <w:t xml:space="preserve">% Hispanic</w:t>
+            </w:r>
+          </w:p>
+        </w:tc>
+        <w:tc>
+          <w:tcPr>
+            <w:tcW w:type="dxa" w:w="1310"/>
+            <w:tcMar>
+              <w:top w:type="dxa" w:w="40"/>
+              <w:left w:type="dxa" w:w="60"/>
+              <w:bottom w:type="dxa" w:w="40"/>
+              <w:right w:type="dxa" w:w="60"/>
+            </w:tcMar>
+          </w:tcPr>
+          <w:p>
+            <w:pPr>
+              <w:jc w:val="right"/>
+            </w:pPr>
+            <w:r>
+              <w:rPr>
+                <w:rFonts w:ascii="Times New Roman" w:cs="Times New Roman" w:eastAsia="Times New Roman" w:hAnsi="Times New Roman"/>
+                <w:b w:val="false"/>
+                <w:bCs w:val="false"/>
+                <w:i w:val="false"/>
+                <w:iCs w:val="false"/>
+                <w:sz w:val="18"/>
+                <w:szCs w:val="18"/>
+              </w:rPr>
+              <w:t xml:space="preserve">+0.8</w:t>
+            </w:r>
+          </w:p>
+        </w:tc>
+        <w:tc>
+          <w:tcPr>
+            <w:tcW w:type="dxa" w:w="1310"/>
+            <w:tcMar>
+              <w:top w:type="dxa" w:w="40"/>
+              <w:left w:type="dxa" w:w="60"/>
+              <w:bottom w:type="dxa" w:w="40"/>
+              <w:right w:type="dxa" w:w="60"/>
+            </w:tcMar>
+          </w:tcPr>
+          <w:p>
+            <w:pPr>
+              <w:jc w:val="right"/>
+            </w:pPr>
+            <w:r>
+              <w:rPr>
+                <w:rFonts w:ascii="Times New Roman" w:cs="Times New Roman" w:eastAsia="Times New Roman" w:hAnsi="Times New Roman"/>
+                <w:b w:val="false"/>
+                <w:bCs w:val="false"/>
+                <w:i w:val="false"/>
+                <w:iCs w:val="false"/>
+                <w:sz w:val="18"/>
+                <w:szCs w:val="18"/>
+              </w:rPr>
+              <w:t xml:space="preserve">−0.4</w:t>
+            </w:r>
+          </w:p>
+        </w:tc>
+        <w:tc>
+          <w:tcPr>
+            <w:tcW w:type="dxa" w:w="1310"/>
+            <w:tcMar>
+              <w:top w:type="dxa" w:w="40"/>
+              <w:left w:type="dxa" w:w="60"/>
+              <w:bottom w:type="dxa" w:w="40"/>
+              <w:right w:type="dxa" w:w="60"/>
+            </w:tcMar>
+          </w:tcPr>
+          <w:p>
+            <w:pPr>
+              <w:jc w:val="right"/>
+            </w:pPr>
+            <w:r>
+              <w:rPr>
+                <w:rFonts w:ascii="Times New Roman" w:cs="Times New Roman" w:eastAsia="Times New Roman" w:hAnsi="Times New Roman"/>
+                <w:b w:val="false"/>
+                <w:bCs w:val="false"/>
+                <w:i w:val="false"/>
+                <w:iCs w:val="false"/>
+                <w:sz w:val="18"/>
+                <w:szCs w:val="18"/>
+              </w:rPr>
+              <w:t xml:space="preserve">−0.4</w:t>
+            </w:r>
+          </w:p>
+        </w:tc>
+        <w:tc>
+          <w:tcPr>
+            <w:tcW w:type="dxa" w:w="1312"/>
+            <w:tcMar>
+              <w:top w:type="dxa" w:w="40"/>
+              <w:left w:type="dxa" w:w="60"/>
+              <w:bottom w:type="dxa" w:w="40"/>
+              <w:right w:type="dxa" w:w="60"/>
+            </w:tcMar>
+          </w:tcPr>
+          <w:p>
+            <w:pPr>
+              <w:jc w:val="right"/>
+            </w:pPr>
+            <w:r>
+              <w:rPr>
+                <w:rFonts w:ascii="Times New Roman" w:cs="Times New Roman" w:eastAsia="Times New Roman" w:hAnsi="Times New Roman"/>
+                <w:b w:val="false"/>
+                <w:bCs w:val="false"/>
+                <w:i w:val="false"/>
+                <w:iCs w:val="false"/>
+                <w:sz w:val="18"/>
+                <w:szCs w:val="18"/>
+              </w:rPr>
+              <w:t xml:space="preserve">0.0</w:t>
+            </w:r>
+          </w:p>
+        </w:tc>
+      </w:tr>
+      <w:tr>
+        <w:trPr>
+          <w:tblHeader w:val="false"/>
+        </w:trPr>
+        <w:tc>
+          <w:tcPr>
+            <w:tcW w:type="dxa" w:w="2808"/>
+            <w:tcMar>
+              <w:top w:type="dxa" w:w="40"/>
+              <w:left w:type="dxa" w:w="60"/>
+              <w:bottom w:type="dxa" w:w="40"/>
+              <w:right w:type="dxa" w:w="60"/>
+            </w:tcMar>
+          </w:tcPr>
+          <w:p>
+            <w:pPr>
+              <w:jc w:val="left"/>
+            </w:pPr>
+            <w:r>
+              <w:rPr>
+                <w:rFonts w:ascii="Times New Roman" w:cs="Times New Roman" w:eastAsia="Times New Roman" w:hAnsi="Times New Roman"/>
+                <w:b w:val="false"/>
+                <w:bCs w:val="false"/>
+                <w:i w:val="false"/>
+                <w:iCs w:val="false"/>
+                <w:sz w:val="18"/>
+                <w:szCs w:val="18"/>
+              </w:rPr>
+              <w:t xml:space="preserve">Colorado (1,158)</w:t>
+            </w:r>
+          </w:p>
+        </w:tc>
+        <w:tc>
+          <w:tcPr>
+            <w:tcW w:type="dxa" w:w="1310"/>
+            <w:tcMar>
+              <w:top w:type="dxa" w:w="40"/>
+              <w:left w:type="dxa" w:w="60"/>
+              <w:bottom w:type="dxa" w:w="40"/>
+              <w:right w:type="dxa" w:w="60"/>
+            </w:tcMar>
+          </w:tcPr>
+          <w:p>
+            <w:pPr>
+              <w:jc w:val="right"/>
+            </w:pPr>
+            <w:r>
+              <w:rPr>
+                <w:rFonts w:ascii="Times New Roman" w:cs="Times New Roman" w:eastAsia="Times New Roman" w:hAnsi="Times New Roman"/>
+                <w:b w:val="false"/>
+                <w:bCs w:val="false"/>
+                <w:i w:val="false"/>
+                <w:iCs w:val="false"/>
+                <w:sz w:val="18"/>
+                <w:szCs w:val="18"/>
+              </w:rPr>
+              <w:t xml:space="preserve">% below poverty</w:t>
+            </w:r>
+          </w:p>
+        </w:tc>
+        <w:tc>
+          <w:tcPr>
+            <w:tcW w:type="dxa" w:w="1310"/>
+            <w:tcMar>
+              <w:top w:type="dxa" w:w="40"/>
+              <w:left w:type="dxa" w:w="60"/>
+              <w:bottom w:type="dxa" w:w="40"/>
+              <w:right w:type="dxa" w:w="60"/>
+            </w:tcMar>
+          </w:tcPr>
+          <w:p>
+            <w:pPr>
+              <w:jc w:val="right"/>
+            </w:pPr>
+            <w:r>
+              <w:rPr>
+                <w:rFonts w:ascii="Times New Roman" w:cs="Times New Roman" w:eastAsia="Times New Roman" w:hAnsi="Times New Roman"/>
+                <w:b w:val="false"/>
+                <w:bCs w:val="false"/>
+                <w:i w:val="false"/>
+                <w:iCs w:val="false"/>
+                <w:sz w:val="18"/>
+                <w:szCs w:val="18"/>
+              </w:rPr>
+              <w:t xml:space="preserve">+6.6***</w:t>
+            </w:r>
+          </w:p>
+        </w:tc>
+        <w:tc>
+          <w:tcPr>
+            <w:tcW w:type="dxa" w:w="1310"/>
+            <w:tcMar>
+              <w:top w:type="dxa" w:w="40"/>
+              <w:left w:type="dxa" w:w="60"/>
+              <w:bottom w:type="dxa" w:w="40"/>
+              <w:right w:type="dxa" w:w="60"/>
+            </w:tcMar>
+          </w:tcPr>
+          <w:p>
+            <w:pPr>
+              <w:jc w:val="right"/>
+            </w:pPr>
+            <w:r>
+              <w:rPr>
+                <w:rFonts w:ascii="Times New Roman" w:cs="Times New Roman" w:eastAsia="Times New Roman" w:hAnsi="Times New Roman"/>
+                <w:b w:val="false"/>
+                <w:bCs w:val="false"/>
+                <w:i w:val="false"/>
+                <w:iCs w:val="false"/>
+                <w:sz w:val="18"/>
+                <w:szCs w:val="18"/>
+              </w:rPr>
+              <w:t xml:space="preserve">+4.8***</w:t>
+            </w:r>
+          </w:p>
+        </w:tc>
+        <w:tc>
+          <w:tcPr>
+            <w:tcW w:type="dxa" w:w="1310"/>
+            <w:tcMar>
+              <w:top w:type="dxa" w:w="40"/>
+              <w:left w:type="dxa" w:w="60"/>
+              <w:bottom w:type="dxa" w:w="40"/>
+              <w:right w:type="dxa" w:w="60"/>
+            </w:tcMar>
+          </w:tcPr>
+          <w:p>
+            <w:pPr>
+              <w:jc w:val="right"/>
+            </w:pPr>
+            <w:r>
+              <w:rPr>
+                <w:rFonts w:ascii="Times New Roman" w:cs="Times New Roman" w:eastAsia="Times New Roman" w:hAnsi="Times New Roman"/>
+                <w:b w:val="false"/>
+                <w:bCs w:val="false"/>
+                <w:i w:val="false"/>
+                <w:iCs w:val="false"/>
+                <w:sz w:val="18"/>
+                <w:szCs w:val="18"/>
+              </w:rPr>
+              <w:t xml:space="preserve">+6.5***</w:t>
+            </w:r>
+          </w:p>
+        </w:tc>
+        <w:tc>
+          <w:tcPr>
+            <w:tcW w:type="dxa" w:w="1312"/>
+            <w:tcMar>
+              <w:top w:type="dxa" w:w="40"/>
+              <w:left w:type="dxa" w:w="60"/>
+              <w:bottom w:type="dxa" w:w="40"/>
+              <w:right w:type="dxa" w:w="60"/>
+            </w:tcMar>
+          </w:tcPr>
+          <w:p>
+            <w:pPr>
+              <w:jc w:val="right"/>
+            </w:pPr>
+            <w:r>
+              <w:rPr>
+                <w:rFonts w:ascii="Times New Roman" w:cs="Times New Roman" w:eastAsia="Times New Roman" w:hAnsi="Times New Roman"/>
+                <w:b w:val="false"/>
+                <w:bCs w:val="false"/>
+                <w:i w:val="false"/>
+                <w:iCs w:val="false"/>
+                <w:sz w:val="18"/>
+                <w:szCs w:val="18"/>
+              </w:rPr>
+              <w:t xml:space="preserve">+3.7***</w:t>
+            </w:r>
+          </w:p>
+        </w:tc>
+      </w:tr>
+      <w:tr>
+        <w:trPr>
+          <w:tblHeader w:val="false"/>
+        </w:trPr>
+        <w:tc>
+          <w:tcPr>
+            <w:tcW w:type="dxa" w:w="2808"/>
+            <w:tcMar>
+              <w:top w:type="dxa" w:w="40"/>
+              <w:left w:type="dxa" w:w="60"/>
+              <w:bottom w:type="dxa" w:w="40"/>
+              <w:right w:type="dxa" w:w="60"/>
+            </w:tcMar>
+          </w:tcPr>
+          <w:p>
+            <w:pPr>
+              <w:jc w:val="left"/>
+            </w:pPr>
+            <w:r>
+              <w:rPr>
+                <w:rFonts w:ascii="Times New Roman" w:cs="Times New Roman" w:eastAsia="Times New Roman" w:hAnsi="Times New Roman"/>
+                <w:b w:val="false"/>
+                <w:bCs w:val="false"/>
+                <w:i w:val="false"/>
+                <w:iCs w:val="false"/>
+                <w:sz w:val="18"/>
+                <w:szCs w:val="18"/>
+              </w:rPr>
+              <w:t xml:space="preserve">Colorado (1,158)</w:t>
+            </w:r>
+          </w:p>
+        </w:tc>
+        <w:tc>
+          <w:tcPr>
+            <w:tcW w:type="dxa" w:w="1310"/>
+            <w:tcMar>
+              <w:top w:type="dxa" w:w="40"/>
+              <w:left w:type="dxa" w:w="60"/>
+              <w:bottom w:type="dxa" w:w="40"/>
+              <w:right w:type="dxa" w:w="60"/>
+            </w:tcMar>
+          </w:tcPr>
+          <w:p>
+            <w:pPr>
+              <w:jc w:val="right"/>
+            </w:pPr>
+            <w:r>
+              <w:rPr>
+                <w:rFonts w:ascii="Times New Roman" w:cs="Times New Roman" w:eastAsia="Times New Roman" w:hAnsi="Times New Roman"/>
+                <w:b w:val="false"/>
+                <w:bCs w:val="false"/>
+                <w:i w:val="false"/>
+                <w:iCs w:val="false"/>
+                <w:sz w:val="18"/>
+                <w:szCs w:val="18"/>
+              </w:rPr>
+              <w:t xml:space="preserve">% owner-occupied</w:t>
+            </w:r>
+          </w:p>
+        </w:tc>
+        <w:tc>
+          <w:tcPr>
+            <w:tcW w:type="dxa" w:w="1310"/>
+            <w:tcMar>
+              <w:top w:type="dxa" w:w="40"/>
+              <w:left w:type="dxa" w:w="60"/>
+              <w:bottom w:type="dxa" w:w="40"/>
+              <w:right w:type="dxa" w:w="60"/>
+            </w:tcMar>
+          </w:tcPr>
+          <w:p>
+            <w:pPr>
+              <w:jc w:val="right"/>
+            </w:pPr>
+            <w:r>
+              <w:rPr>
+                <w:rFonts w:ascii="Times New Roman" w:cs="Times New Roman" w:eastAsia="Times New Roman" w:hAnsi="Times New Roman"/>
+                <w:b w:val="false"/>
+                <w:bCs w:val="false"/>
+                <w:i w:val="false"/>
+                <w:iCs w:val="false"/>
+                <w:sz w:val="18"/>
+                <w:szCs w:val="18"/>
+              </w:rPr>
+              <w:t xml:space="preserve">−7.0***</w:t>
+            </w:r>
+          </w:p>
+        </w:tc>
+        <w:tc>
+          <w:tcPr>
+            <w:tcW w:type="dxa" w:w="1310"/>
+            <w:tcMar>
+              <w:top w:type="dxa" w:w="40"/>
+              <w:left w:type="dxa" w:w="60"/>
+              <w:bottom w:type="dxa" w:w="40"/>
+              <w:right w:type="dxa" w:w="60"/>
+            </w:tcMar>
+          </w:tcPr>
+          <w:p>
+            <w:pPr>
+              <w:jc w:val="right"/>
+            </w:pPr>
+            <w:r>
+              <w:rPr>
+                <w:rFonts w:ascii="Times New Roman" w:cs="Times New Roman" w:eastAsia="Times New Roman" w:hAnsi="Times New Roman"/>
+                <w:b w:val="false"/>
+                <w:bCs w:val="false"/>
+                <w:i w:val="false"/>
+                <w:iCs w:val="false"/>
+                <w:sz w:val="18"/>
+                <w:szCs w:val="18"/>
+              </w:rPr>
+              <w:t xml:space="preserve">−8.9***</w:t>
+            </w:r>
+          </w:p>
+        </w:tc>
+        <w:tc>
+          <w:tcPr>
+            <w:tcW w:type="dxa" w:w="1310"/>
+            <w:tcMar>
+              <w:top w:type="dxa" w:w="40"/>
+              <w:left w:type="dxa" w:w="60"/>
+              <w:bottom w:type="dxa" w:w="40"/>
+              <w:right w:type="dxa" w:w="60"/>
+            </w:tcMar>
+          </w:tcPr>
+          <w:p>
+            <w:pPr>
+              <w:jc w:val="right"/>
+            </w:pPr>
+            <w:r>
+              <w:rPr>
+                <w:rFonts w:ascii="Times New Roman" w:cs="Times New Roman" w:eastAsia="Times New Roman" w:hAnsi="Times New Roman"/>
+                <w:b w:val="false"/>
+                <w:bCs w:val="false"/>
+                <w:i w:val="false"/>
+                <w:iCs w:val="false"/>
+                <w:sz w:val="18"/>
+                <w:szCs w:val="18"/>
+              </w:rPr>
+              <w:t xml:space="preserve">−9.8***</w:t>
+            </w:r>
+          </w:p>
+        </w:tc>
+        <w:tc>
+          <w:tcPr>
+            <w:tcW w:type="dxa" w:w="1312"/>
+            <w:tcMar>
+              <w:top w:type="dxa" w:w="40"/>
+              <w:left w:type="dxa" w:w="60"/>
+              <w:bottom w:type="dxa" w:w="40"/>
+              <w:right w:type="dxa" w:w="60"/>
+            </w:tcMar>
+          </w:tcPr>
+          <w:p>
+            <w:pPr>
+              <w:jc w:val="right"/>
+            </w:pPr>
+            <w:r>
+              <w:rPr>
+                <w:rFonts w:ascii="Times New Roman" w:cs="Times New Roman" w:eastAsia="Times New Roman" w:hAnsi="Times New Roman"/>
+                <w:b w:val="false"/>
+                <w:bCs w:val="false"/>
+                <w:i w:val="false"/>
+                <w:iCs w:val="false"/>
+                <w:sz w:val="18"/>
+                <w:szCs w:val="18"/>
+              </w:rPr>
+              <w:t xml:space="preserve">−10.3***</w:t>
+            </w:r>
+          </w:p>
+        </w:tc>
+      </w:tr>
+      <w:tr>
+        <w:trPr>
+          <w:tblHeader w:val="false"/>
+        </w:trPr>
+        <w:tc>
+          <w:tcPr>
+            <w:tcW w:type="dxa" w:w="2808"/>
+            <w:tcMar>
+              <w:top w:type="dxa" w:w="40"/>
+              <w:left w:type="dxa" w:w="60"/>
+              <w:bottom w:type="dxa" w:w="40"/>
+              <w:right w:type="dxa" w:w="60"/>
+            </w:tcMar>
+          </w:tcPr>
+          <w:p>
+            <w:pPr>
+              <w:jc w:val="left"/>
+            </w:pPr>
+            <w:r>
+              <w:rPr>
+                <w:rFonts w:ascii="Times New Roman" w:cs="Times New Roman" w:eastAsia="Times New Roman" w:hAnsi="Times New Roman"/>
+                <w:b w:val="false"/>
+                <w:bCs w:val="false"/>
+                <w:i w:val="false"/>
+                <w:iCs w:val="false"/>
+                <w:sz w:val="18"/>
+                <w:szCs w:val="18"/>
+              </w:rPr>
+              <w:t xml:space="preserve">Colorado (1,158)</w:t>
+            </w:r>
+          </w:p>
+        </w:tc>
+        <w:tc>
+          <w:tcPr>
+            <w:tcW w:type="dxa" w:w="1310"/>
+            <w:tcMar>
+              <w:top w:type="dxa" w:w="40"/>
+              <w:left w:type="dxa" w:w="60"/>
+              <w:bottom w:type="dxa" w:w="40"/>
+              <w:right w:type="dxa" w:w="60"/>
+            </w:tcMar>
+          </w:tcPr>
+          <w:p>
+            <w:pPr>
+              <w:jc w:val="right"/>
+            </w:pPr>
+            <w:r>
+              <w:rPr>
+                <w:rFonts w:ascii="Times New Roman" w:cs="Times New Roman" w:eastAsia="Times New Roman" w:hAnsi="Times New Roman"/>
+                <w:b w:val="false"/>
+                <w:bCs w:val="false"/>
+                <w:i w:val="false"/>
+                <w:iCs w:val="false"/>
+                <w:sz w:val="18"/>
+                <w:szCs w:val="18"/>
+              </w:rPr>
+              <w:t xml:space="preserve">% Black</w:t>
+            </w:r>
+          </w:p>
+        </w:tc>
+        <w:tc>
+          <w:tcPr>
+            <w:tcW w:type="dxa" w:w="1310"/>
+            <w:tcMar>
+              <w:top w:type="dxa" w:w="40"/>
+              <w:left w:type="dxa" w:w="60"/>
+              <w:bottom w:type="dxa" w:w="40"/>
+              <w:right w:type="dxa" w:w="60"/>
+            </w:tcMar>
+          </w:tcPr>
+          <w:p>
+            <w:pPr>
+              <w:jc w:val="right"/>
+            </w:pPr>
+            <w:r>
+              <w:rPr>
+                <w:rFonts w:ascii="Times New Roman" w:cs="Times New Roman" w:eastAsia="Times New Roman" w:hAnsi="Times New Roman"/>
+                <w:b w:val="false"/>
+                <w:bCs w:val="false"/>
+                <w:i w:val="false"/>
+                <w:iCs w:val="false"/>
+                <w:sz w:val="18"/>
+                <w:szCs w:val="18"/>
+              </w:rPr>
+              <w:t xml:space="preserve">+0.2</w:t>
+            </w:r>
+          </w:p>
+        </w:tc>
+        <w:tc>
+          <w:tcPr>
+            <w:tcW w:type="dxa" w:w="1310"/>
+            <w:tcMar>
+              <w:top w:type="dxa" w:w="40"/>
+              <w:left w:type="dxa" w:w="60"/>
+              <w:bottom w:type="dxa" w:w="40"/>
+              <w:right w:type="dxa" w:w="60"/>
+            </w:tcMar>
+          </w:tcPr>
+          <w:p>
+            <w:pPr>
+              <w:jc w:val="right"/>
+            </w:pPr>
+            <w:r>
+              <w:rPr>
+                <w:rFonts w:ascii="Times New Roman" w:cs="Times New Roman" w:eastAsia="Times New Roman" w:hAnsi="Times New Roman"/>
+                <w:b w:val="false"/>
+                <w:bCs w:val="false"/>
+                <w:i w:val="false"/>
+                <w:iCs w:val="false"/>
+                <w:sz w:val="18"/>
+                <w:szCs w:val="18"/>
+              </w:rPr>
+              <w:t xml:space="preserve">−0.3</w:t>
+            </w:r>
+          </w:p>
+        </w:tc>
+        <w:tc>
+          <w:tcPr>
+            <w:tcW w:type="dxa" w:w="1310"/>
+            <w:tcMar>
+              <w:top w:type="dxa" w:w="40"/>
+              <w:left w:type="dxa" w:w="60"/>
+              <w:bottom w:type="dxa" w:w="40"/>
+              <w:right w:type="dxa" w:w="60"/>
+            </w:tcMar>
+          </w:tcPr>
+          <w:p>
+            <w:pPr>
+              <w:jc w:val="right"/>
+            </w:pPr>
+            <w:r>
+              <w:rPr>
+                <w:rFonts w:ascii="Times New Roman" w:cs="Times New Roman" w:eastAsia="Times New Roman" w:hAnsi="Times New Roman"/>
+                <w:b w:val="false"/>
+                <w:bCs w:val="false"/>
+                <w:i w:val="false"/>
+                <w:iCs w:val="false"/>
+                <w:sz w:val="18"/>
+                <w:szCs w:val="18"/>
+              </w:rPr>
+              <w:t xml:space="preserve">−0.4</w:t>
+            </w:r>
+          </w:p>
+        </w:tc>
+        <w:tc>
+          <w:tcPr>
+            <w:tcW w:type="dxa" w:w="1312"/>
+            <w:tcMar>
+              <w:top w:type="dxa" w:w="40"/>
+              <w:left w:type="dxa" w:w="60"/>
+              <w:bottom w:type="dxa" w:w="40"/>
+              <w:right w:type="dxa" w:w="60"/>
+            </w:tcMar>
+          </w:tcPr>
+          <w:p>
+            <w:pPr>
+              <w:jc w:val="right"/>
+            </w:pPr>
+            <w:r>
+              <w:rPr>
+                <w:rFonts w:ascii="Times New Roman" w:cs="Times New Roman" w:eastAsia="Times New Roman" w:hAnsi="Times New Roman"/>
+                <w:b w:val="false"/>
+                <w:bCs w:val="false"/>
+                <w:i w:val="false"/>
+                <w:iCs w:val="false"/>
+                <w:sz w:val="18"/>
+                <w:szCs w:val="18"/>
+              </w:rPr>
+              <w:t xml:space="preserve">−0.4</w:t>
+            </w:r>
+          </w:p>
+        </w:tc>
+      </w:tr>
+    </w:tbl>
+    <w:p>
+      <w:pPr>
+        <w:spacing w:after="120"/>
+      </w:pPr>
+    </w:p>
+    <w:p>
+      <w:pPr>
+        <w:spacing w:after="160" w:line="360"/>
+        <w:jc w:val="both"/>
+      </w:pPr>
+      <w:r>
+        <w:rPr>
+          <w:rFonts w:ascii="Times New Roman" w:cs="Times New Roman" w:eastAsia="Times New Roman" w:hAnsi="Times New Roman"/>
+          <w:b w:val="false"/>
+          <w:bCs w:val="false"/>
+          <w:i w:val="false"/>
+          <w:iCs w:val="false"/>
+          <w:sz w:val="24"/>
+          <w:szCs w:val="24"/>
+        </w:rPr>
+        <w:t xml:space="preserve">* p &lt; 0.05, ** p &lt; 0.01, *** p &lt; 0.001. Percentage points per log unit of hazardous firms per km². Poverty is associated with industry in every region, including the rest of Colorado (+7 to +9 points); ownership is lower beside industry everywhere; the Black share is not associated with it in any region except Pueblo, weakly.</w:t>
+      </w:r>
+    </w:p>
+    <w:p>
+      <w:pPr>
+        <w:spacing w:after="160" w:line="360"/>
+        <w:jc w:val="both"/>
+      </w:pPr>
+      <w:r>
+        <w:rPr>
+          <w:rFonts w:ascii="Times New Roman" w:cs="Times New Roman" w:eastAsia="Times New Roman" w:hAnsi="Times New Roman"/>
+          <w:b w:val="false"/>
+          <w:bCs w:val="false"/>
+          <w:i w:val="false"/>
+          <w:iCs w:val="false"/>
+          <w:sz w:val="24"/>
+          <w:szCs w:val="24"/>
+        </w:rPr>
+        <w:t xml:space="preserve">The Hispanic association is a Front Range pattern, absent outside the cities, and it moved outward. In Denver it weakened from 2000 and is not significant by 2020; in the suburbs and the northern Front Range it strengthened from 1990 to 2010. Because 2000–2020 measure distance to the same 1983–92 sites, that change is a change in who lives around fixed industrial land, not new siting. Poverty and renting beside industry are statewide.</w:t>
+      </w:r>
+    </w:p>
+    <w:p>
+      <w:pPr>
+        <w:spacing w:after="160" w:line="360"/>
+        <w:jc w:val="both"/>
+      </w:pPr>
+      <w:r>
+        <w:rPr>
+          <w:rFonts w:ascii="Times New Roman" w:cs="Times New Roman" w:eastAsia="Times New Roman" w:hAnsi="Times New Roman"/>
+          <w:b/>
+          <w:bCs/>
+          <w:i w:val="false"/>
+          <w:iCs w:val="false"/>
+          <w:sz w:val="24"/>
+          <w:szCs w:val="24"/>
+        </w:rPr>
+        <w:t xml:space="preserve">Today.</w:t>
+      </w:r>
+      <w:r>
+        <w:rPr>
+          <w:rFonts w:ascii="Times New Roman" w:cs="Times New Roman" w:eastAsia="Times New Roman" w:hAnsi="Times New Roman"/>
+          <w:b w:val="false"/>
+          <w:bCs w:val="false"/>
+          <w:i w:val="false"/>
+          <w:iCs w:val="false"/>
+          <w:sz w:val="24"/>
+          <w:szCs w:val="24"/>
+        </w:rPr>
+        <w:t xml:space="preserve"> Across 1,428 Colorado tracts of 2020 with 500 or more residents, in spatial-error models with log population density, each log unit of historical hazardous firm-years (1965–92) goes with 1.2 points more people of colour (p &lt; 0.001), 1.8 points more low-income residents (p &lt; 0.001) and 3.0 percentiles on the state's EnviroScreen index (p &lt; 0.001); former sites with no record in the searched inventories show the same pattern for income (+2.4 points) and EnviroScreen (+3.6 percentiles). These are associations at one date. Present health outcomes are only weakly related, in models estimated before the audit and not yet re-estimated under the rules above: the former sites without a cleanup record show no association with asthma, birth weight, life expectancy or chronic disease; the known historical sites are associated with asthma hospitalisation and shorter life expectancy, but non-hazardous manufacturers show the same association with life expectancy, which points to the general disadvantage of old industrial districts rather than to hazardous use as such.</w:t>
+      </w:r>
+    </w:p>
+    <w:p>
+      <w:pPr>
+        <w:spacing w:after="160" w:line="360"/>
+        <w:jc w:val="both"/>
+      </w:pPr>
+      <w:r>
+        <w:rPr>
+          <w:rFonts w:ascii="Times New Roman" w:cs="Times New Roman" w:eastAsia="Times New Roman" w:hAnsi="Times New Roman"/>
+          <w:b/>
+          <w:bCs/>
+          <w:i w:val="false"/>
+          <w:iCs w:val="false"/>
+          <w:sz w:val="24"/>
+          <w:szCs w:val="24"/>
+        </w:rPr>
+        <w:t xml:space="preserve">The other graded cities.</w:t>
+      </w:r>
+      <w:r>
+        <w:rPr>
+          <w:rFonts w:ascii="Times New Roman" w:cs="Times New Roman" w:eastAsia="Times New Roman" w:hAnsi="Times New Roman"/>
+          <w:b w:val="false"/>
+          <w:bCs w:val="false"/>
+          <w:i w:val="false"/>
+          <w:iCs w:val="false"/>
+          <w:sz w:val="24"/>
+          <w:szCs w:val="24"/>
+        </w:rPr>
+        <w:t xml:space="preserve"> Mapping Inequality holds Pueblo's 1938 HOLC map and local appraisal maps for Colorado Springs, Greeley, Fort Collins, Grand Junction, Boulder, Longmont and Fort Morgan. They cannot carry the Denver design. Outside Denver the pre-1960 directory places trades only at the town, not the street, so there is no pre-map industrial geography; the full count has not been reconstructed into districts outside Denver; and the graded areas cover few tracts (15 in Pueblo, 1–9 in the other cities). Pueblo — steel, an older Hispano and immigrant workforce, and a HOLC map — is the natural second case, but it needs its own street-level directory series and district reconstruction first.</w:t>
+      </w:r>
+    </w:p>
+    <w:p>
+      <w:pPr>
+        <w:pStyle w:val="Heading1"/>
+        <w:spacing w:after="160" w:before="360"/>
+      </w:pPr>
+      <w:r>
+        <w:rPr>
+          <w:rFonts w:ascii="Times New Roman" w:cs="Times New Roman" w:eastAsia="Times New Roman" w:hAnsi="Times New Roman"/>
+          <w:b/>
+          <w:bCs/>
+          <w:color w:val="000000"/>
+          <w:sz w:val="26"/>
+          <w:szCs w:val="26"/>
+        </w:rPr>
+        <w:t xml:space="preserve">8. Discussion and conclusion</w:t>
       </w:r>
     </w:p>
     <w:p>

</xml_diff>

<commit_message>
Denver-only manuscript; Denver website with a Colorado trends tab
</commit_message>
<xml_diff>
--- a/paper/Before_and_After_the_Map_manuscript.docx
+++ b/paper/Before_and_After_the_Map_manuscript.docx
@@ -75,7 +75,7 @@
           <w:sz w:val="22"/>
           <w:szCs w:val="22"/>
         </w:rPr>
-        <w:t xml:space="preserve"> Environmental inequality is usually measured where regulatory inventories begin, in the 1980s, long after the industrial geography that produces it was laid down. This paper reconstructs that geography for Denver from its first state business directory (1871) to the present and asks what came first: hazardous industry, the people who lived beside it, or the instruments — the 1925 zoning ordinance and the 1938 HOLC map — that are often credited with creating the pattern. Three sources are linked: the street-level hazardous trades of 34 business-directory editions (1871–1956) and 13 complete manufacturers' directory editions (1965–1992); the complete-count censuses of 1880–1940 aggregated to reconstructed enumeration districts and census tracts within 10 km of downtown for 1950–2020; and the city's 1929 zoning map, the 1938 HOLC map and today's assessor parcels. Four findings follow. First, the disparities preceded both instruments. From 1880 to 1940 districts nearer hazardous industry held more foreign-born, labouring and lodging households and fewer owners, and the hazardous trades that opened before 1940 opened in places that already had more of those households. Second, the land the appraisers graded D combined two different geographies. Black Denver became concentrated in two residential D areas northeast of downtown between 1900 and 1930, before the map, while the industrially zoned land, in D and in the ungraded industrial zones, lost Black residents and became Mexican and Hispano. The D–C Black gap describes the first geography, not the second. Third, neither instrument coincides with an acceleration that the data can detect. Per directory edition, hazardous siting after 1938 favoured D land within the range it had before (D/C 2.1, against 1.7–6.4), and after 1950 the Hispanic concentration beside industry is strong between places but does not track a tract's own changes in industry. Hazardous manufacturers that arrived after 1965 went to tracts that were less poor than those that never had one, and those tracts then gained Hispanic residents faster. Concentration of both groups in D and industrial tracts peaked around 1960 and has declined since. Fourth, four in ten of the 1965–92 sites are still industrial parcels, and most of the 168 now residential were small firms in residential buildings rather than conversions. Across Colorado, the Hispanic–industry association is a Front Range pattern that has moved from Denver to its suburbs and the northern Front Range, while poverty and renting beside industry are statewide. The instruments recorded an industrial and racial geography that already existed; the data do not show that either created it or measurably accelerated it.</w:t>
+        <w:t xml:space="preserve"> Environmental inequality is usually measured where regulatory inventories begin, in the 1980s, long after the industrial geography that produces it was laid down. This paper reconstructs that geography for Denver from its first state business directory (1871) to the present and asks what came first: hazardous industry, the people who lived beside it, or the instruments — the 1925 zoning ordinance and the 1938 HOLC map — that are often credited with creating the pattern. Three sources are linked: the street-level hazardous trades of 34 business-directory editions (1871–1956) and 13 complete manufacturers' directory editions (1965–1992); the complete-count censuses of 1880–1940 aggregated to reconstructed enumeration districts and census tracts within 10 km of downtown for 1950–2020; and the city's 1929 zoning map, the 1938 HOLC map and today's assessor parcels. Four findings follow. First, the disparities preceded both instruments. From 1880 to 1940 districts nearer hazardous industry held more foreign-born, labouring and lodging households and fewer owners, and the hazardous trades that opened before 1940 opened in places that already had more of those households. Second, the land the appraisers graded D combined two different geographies. Black Denver became concentrated in two residential D areas northeast of downtown between 1900 and 1930, before the map, while the industrially zoned land, in D and in the ungraded industrial zones, lost Black residents and became Mexican and Hispano. The D–C Black gap describes the first geography, not the second. Third, neither instrument coincides with an acceleration that the data can detect. Per directory edition, hazardous siting after 1938 favoured D land within the range it had before (D/C 2.1, against 1.7–6.4), and after 1950 the Hispanic concentration beside industry is strong between places but does not track a tract's own changes in industry. Hazardous manufacturers that arrived after 1965 went to tracts that were less poor than those that never had one, and those tracts then gained Hispanic residents faster. Concentration of both groups in D and industrial tracts peaked around 1960 and has declined since. Fourth, four in ten of the 1965–92 sites are still industrial parcels, and most of the 168 now residential were small firms in residential buildings rather than conversions. The instruments recorded an industrial and racial geography that already existed; the data do not show that either created it or measurably accelerated it.</w:t>
       </w:r>
     </w:p>
     <w:p>
@@ -176,7 +176,7 @@
           <w:sz w:val="24"/>
           <w:szCs w:val="24"/>
         </w:rPr>
-        <w:t xml:space="preserve">The argument runs in three steps, each with its own section of evidence. Section 3 uses the complete-count censuses of 1880–1940, aggregated to reconstructed enumeration districts, to describe who lived beside the hazardous trades in each decade before the instruments of the 1920s and 1930s existed. Section 4 brings in the 1925 zoning ordinance and the 1938 HOLC map and asks, in the design of Aaronson, Hartley and Mazumder (2021), whether the map created the pattern or recorded it, using the map's own boundaries as the comparison and controlling for rail and for what the city had already zoned. Section 4 ends with descriptive sequences on fixed geographies — which came first in each place, industry or its neighbours, and whether anything changed when the zoning or the map arrived. Section 5 carries the analysis onto census tracts from 1950 to 2020, where the group beside industry changes. Section 6 asks what became of the sites themselves, matching every one to the parcel that stands there today. Section 7 asks how far the Denver pattern extends across Colorado. Section 8 draws the steps together and sets out what the evidence can and cannot support.</w:t>
+        <w:t xml:space="preserve">The argument runs in three steps, each with its own section of evidence. Section 3 uses the complete-count censuses of 1880–1940, aggregated to reconstructed enumeration districts, to describe who lived beside the hazardous trades in each decade before the instruments of the 1920s and 1930s existed. Section 4 brings in the 1925 zoning ordinance and the 1938 HOLC map and asks, in the design of Aaronson, Hartley and Mazumder (2021), whether the map created the pattern or recorded it, using the map's own boundaries as the comparison and controlling for rail and for what the city had already zoned. Section 4 ends with descriptive sequences on fixed geographies — which came first in each place, industry or its neighbours, and whether anything changed when the zoning or the map arrived. Section 5 carries the analysis onto census tracts from 1950 to 2020, where the group beside industry changes. Section 6 asks what became of the sites themselves, matching every one to the parcel that stands there today. Section 7 draws the steps together and sets out what the evidence can and cannot support.</w:t>
       </w:r>
     </w:p>
     <w:p>
@@ -36560,3597 +36560,7 @@
           <w:sz w:val="26"/>
           <w:szCs w:val="26"/>
         </w:rPr>
-        <w:t xml:space="preserve">7. Colorado beyond Denver</w:t>
-      </w:r>
-    </w:p>
-    <w:p>
-      <w:pPr>
-        <w:spacing w:after="160" w:line="360"/>
-        <w:jc w:val="both"/>
-      </w:pPr>
-      <w:r>
-        <w:rPr>
-          <w:rFonts w:ascii="Times New Roman" w:cs="Times New Roman" w:eastAsia="Times New Roman" w:hAnsi="Times New Roman"/>
-          <w:b w:val="false"/>
-          <w:bCs w:val="false"/>
-          <w:i w:val="false"/>
-          <w:iCs w:val="false"/>
-          <w:sz w:val="24"/>
-          <w:szCs w:val="24"/>
-        </w:rPr>
-        <w:t xml:space="preserve">The same directories and censuses cover the whole state, which allows three checks on how far the Denver pattern extends. They use the rules applied to Denver: the Frickel &amp; Elliott sectors, the complete editions, street-located sites, a 200-resident minimum and fixed tract sets.</w:t>
-      </w:r>
-    </w:p>
-    <w:p>
-      <w:pPr>
-        <w:spacing w:after="160" w:line="360"/>
-        <w:jc w:val="both"/>
-      </w:pPr>
-      <w:r>
-        <w:rPr>
-          <w:rFonts w:ascii="Times New Roman" w:cs="Times New Roman" w:eastAsia="Times New Roman" w:hAnsi="Times New Roman"/>
-          <w:b/>
-          <w:bCs/>
-          <w:i w:val="false"/>
-          <w:iCs w:val="false"/>
-          <w:sz w:val="24"/>
-          <w:szCs w:val="24"/>
-        </w:rPr>
-        <w:t xml:space="preserve">Where the industry was.</w:t>
-      </w:r>
-      <w:r>
-        <w:rPr>
-          <w:rFonts w:ascii="Times New Roman" w:cs="Times New Roman" w:eastAsia="Times New Roman" w:hAnsi="Times New Roman"/>
-          <w:b w:val="false"/>
-          <w:bCs w:val="false"/>
-          <w:i w:val="false"/>
-          <w:iCs w:val="false"/>
-          <w:sz w:val="24"/>
-          <w:szCs w:val="24"/>
-        </w:rPr>
-        <w:t xml:space="preserve"> Before 1940 the state's hazardous trades moved from the mining districts to Denver. In 1880 the mining counties held 40% of the listed trades and 30% of the population, and Pueblo, with its smelters, held 9% of the trades and 4% of the people; from 1900 Denver held 43–74% of the trades with 28–32% of the population. The shares move with the editions that survive, so they show direction rather than precise levels. Across counties, more trades per resident went with more foreign-born residents in every census (correlations 0.12–0.37) and with fewer Hispanic residents in five of six (−0.14 to −0.44): the Hispano counties of the south, farming and coal country, held 9–13% of the population and 0–7% of the trades. At the state scale before 1940, hazardous industry and Hispanic Colorado were in different places; the association that Section 5 finds after 1950 formed as Hispano and Mexican residents moved into the industrial neighbourhoods of the cities. After 1965 the industry left Denver for the rest of the Front Range.</w:t>
-      </w:r>
-    </w:p>
-    <w:p>
-      <w:pPr>
-        <w:spacing w:after="80" w:before="240"/>
-      </w:pPr>
-      <w:r>
-        <w:rPr>
-          <w:rFonts w:ascii="Times New Roman" w:cs="Times New Roman" w:eastAsia="Times New Roman" w:hAnsi="Times New Roman"/>
-          <w:b/>
-          <w:bCs/>
-          <w:sz w:val="20"/>
-          <w:szCs w:val="20"/>
-        </w:rPr>
-        <w:t xml:space="preserve">Table 17. Share of Colorado's located hazardous-sector manufacturers by region, selected complete editions, and share of the 1990 population</w:t>
-      </w:r>
-    </w:p>
-    <w:tbl>
-      <w:tblPr>
-        <w:tblW w:type="dxa" w:w="9360"/>
-        <w:tblBorders>
-          <w:top w:val="single" w:sz="6"/>
-          <w:left w:val="none"/>
-          <w:bottom w:val="single" w:sz="6"/>
-          <w:right w:val="none"/>
-          <w:insideH w:val="single" w:color="BBBBBB" w:sz="2"/>
-          <w:insideV w:val="none"/>
-        </w:tblBorders>
-      </w:tblPr>
-      <w:tblGrid>
-        <w:gridCol w:w="2808"/>
-        <w:gridCol w:w="1310"/>
-        <w:gridCol w:w="1310"/>
-        <w:gridCol w:w="1310"/>
-        <w:gridCol w:w="1310"/>
-        <w:gridCol w:w="1312"/>
-      </w:tblGrid>
-      <w:tr>
-        <w:trPr>
-          <w:tblHeader/>
-        </w:trPr>
-        <w:tc>
-          <w:tcPr>
-            <w:tcW w:type="dxa" w:w="2808"/>
-            <w:shd w:fill="EDEDED" w:color="auto" w:val="clear"/>
-            <w:tcMar>
-              <w:top w:type="dxa" w:w="40"/>
-              <w:left w:type="dxa" w:w="60"/>
-              <w:bottom w:type="dxa" w:w="40"/>
-              <w:right w:type="dxa" w:w="60"/>
-            </w:tcMar>
-          </w:tcPr>
-          <w:p>
-            <w:pPr>
-              <w:jc w:val="left"/>
-            </w:pPr>
-            <w:r>
-              <w:rPr>
-                <w:rFonts w:ascii="Times New Roman" w:cs="Times New Roman" w:eastAsia="Times New Roman" w:hAnsi="Times New Roman"/>
-                <w:b/>
-                <w:bCs/>
-                <w:i w:val="false"/>
-                <w:iCs w:val="false"/>
-                <w:sz w:val="18"/>
-                <w:szCs w:val="18"/>
-              </w:rPr>
-              <w:t xml:space="preserve">region</w:t>
-            </w:r>
-          </w:p>
-        </w:tc>
-        <w:tc>
-          <w:tcPr>
-            <w:tcW w:type="dxa" w:w="1310"/>
-            <w:shd w:fill="EDEDED" w:color="auto" w:val="clear"/>
-            <w:tcMar>
-              <w:top w:type="dxa" w:w="40"/>
-              <w:left w:type="dxa" w:w="60"/>
-              <w:bottom w:type="dxa" w:w="40"/>
-              <w:right w:type="dxa" w:w="60"/>
-            </w:tcMar>
-          </w:tcPr>
-          <w:p>
-            <w:pPr>
-              <w:jc w:val="right"/>
-            </w:pPr>
-            <w:r>
-              <w:rPr>
-                <w:rFonts w:ascii="Times New Roman" w:cs="Times New Roman" w:eastAsia="Times New Roman" w:hAnsi="Times New Roman"/>
-                <w:b/>
-                <w:bCs/>
-                <w:i w:val="false"/>
-                <w:iCs w:val="false"/>
-                <w:sz w:val="18"/>
-                <w:szCs w:val="18"/>
-              </w:rPr>
-              <w:t xml:space="preserve">1966</w:t>
-            </w:r>
-          </w:p>
-        </w:tc>
-        <w:tc>
-          <w:tcPr>
-            <w:tcW w:type="dxa" w:w="1310"/>
-            <w:shd w:fill="EDEDED" w:color="auto" w:val="clear"/>
-            <w:tcMar>
-              <w:top w:type="dxa" w:w="40"/>
-              <w:left w:type="dxa" w:w="60"/>
-              <w:bottom w:type="dxa" w:w="40"/>
-              <w:right w:type="dxa" w:w="60"/>
-            </w:tcMar>
-          </w:tcPr>
-          <w:p>
-            <w:pPr>
-              <w:jc w:val="right"/>
-            </w:pPr>
-            <w:r>
-              <w:rPr>
-                <w:rFonts w:ascii="Times New Roman" w:cs="Times New Roman" w:eastAsia="Times New Roman" w:hAnsi="Times New Roman"/>
-                <w:b/>
-                <w:bCs/>
-                <w:i w:val="false"/>
-                <w:iCs w:val="false"/>
-                <w:sz w:val="18"/>
-                <w:szCs w:val="18"/>
-              </w:rPr>
-              <w:t xml:space="preserve">1970</w:t>
-            </w:r>
-          </w:p>
-        </w:tc>
-        <w:tc>
-          <w:tcPr>
-            <w:tcW w:type="dxa" w:w="1310"/>
-            <w:shd w:fill="EDEDED" w:color="auto" w:val="clear"/>
-            <w:tcMar>
-              <w:top w:type="dxa" w:w="40"/>
-              <w:left w:type="dxa" w:w="60"/>
-              <w:bottom w:type="dxa" w:w="40"/>
-              <w:right w:type="dxa" w:w="60"/>
-            </w:tcMar>
-          </w:tcPr>
-          <w:p>
-            <w:pPr>
-              <w:jc w:val="right"/>
-            </w:pPr>
-            <w:r>
-              <w:rPr>
-                <w:rFonts w:ascii="Times New Roman" w:cs="Times New Roman" w:eastAsia="Times New Roman" w:hAnsi="Times New Roman"/>
-                <w:b/>
-                <w:bCs/>
-                <w:i w:val="false"/>
-                <w:iCs w:val="false"/>
-                <w:sz w:val="18"/>
-                <w:szCs w:val="18"/>
-              </w:rPr>
-              <w:t xml:space="preserve">1980</w:t>
-            </w:r>
-          </w:p>
-        </w:tc>
-        <w:tc>
-          <w:tcPr>
-            <w:tcW w:type="dxa" w:w="1310"/>
-            <w:shd w:fill="EDEDED" w:color="auto" w:val="clear"/>
-            <w:tcMar>
-              <w:top w:type="dxa" w:w="40"/>
-              <w:left w:type="dxa" w:w="60"/>
-              <w:bottom w:type="dxa" w:w="40"/>
-              <w:right w:type="dxa" w:w="60"/>
-            </w:tcMar>
-          </w:tcPr>
-          <w:p>
-            <w:pPr>
-              <w:jc w:val="right"/>
-            </w:pPr>
-            <w:r>
-              <w:rPr>
-                <w:rFonts w:ascii="Times New Roman" w:cs="Times New Roman" w:eastAsia="Times New Roman" w:hAnsi="Times New Roman"/>
-                <w:b/>
-                <w:bCs/>
-                <w:i w:val="false"/>
-                <w:iCs w:val="false"/>
-                <w:sz w:val="18"/>
-                <w:szCs w:val="18"/>
-              </w:rPr>
-              <w:t xml:space="preserve">1992</w:t>
-            </w:r>
-          </w:p>
-        </w:tc>
-        <w:tc>
-          <w:tcPr>
-            <w:tcW w:type="dxa" w:w="1312"/>
-            <w:shd w:fill="EDEDED" w:color="auto" w:val="clear"/>
-            <w:tcMar>
-              <w:top w:type="dxa" w:w="40"/>
-              <w:left w:type="dxa" w:w="60"/>
-              <w:bottom w:type="dxa" w:w="40"/>
-              <w:right w:type="dxa" w:w="60"/>
-            </w:tcMar>
-          </w:tcPr>
-          <w:p>
-            <w:pPr>
-              <w:jc w:val="right"/>
-            </w:pPr>
-            <w:r>
-              <w:rPr>
-                <w:rFonts w:ascii="Times New Roman" w:cs="Times New Roman" w:eastAsia="Times New Roman" w:hAnsi="Times New Roman"/>
-                <w:b/>
-                <w:bCs/>
-                <w:i w:val="false"/>
-                <w:iCs w:val="false"/>
-                <w:sz w:val="18"/>
-                <w:szCs w:val="18"/>
-              </w:rPr>
-              <w:t xml:space="preserve">share of 1990 population</w:t>
-            </w:r>
-          </w:p>
-        </w:tc>
-      </w:tr>
-      <w:tr>
-        <w:trPr>
-          <w:tblHeader w:val="false"/>
-        </w:trPr>
-        <w:tc>
-          <w:tcPr>
-            <w:tcW w:type="dxa" w:w="2808"/>
-            <w:tcMar>
-              <w:top w:type="dxa" w:w="40"/>
-              <w:left w:type="dxa" w:w="60"/>
-              <w:bottom w:type="dxa" w:w="40"/>
-              <w:right w:type="dxa" w:w="60"/>
-            </w:tcMar>
-          </w:tcPr>
-          <w:p>
-            <w:pPr>
-              <w:jc w:val="left"/>
-            </w:pPr>
-            <w:r>
-              <w:rPr>
-                <w:rFonts w:ascii="Times New Roman" w:cs="Times New Roman" w:eastAsia="Times New Roman" w:hAnsi="Times New Roman"/>
-                <w:b w:val="false"/>
-                <w:bCs w:val="false"/>
-                <w:i w:val="false"/>
-                <w:iCs w:val="false"/>
-                <w:sz w:val="18"/>
-                <w:szCs w:val="18"/>
-              </w:rPr>
-              <w:t xml:space="preserve">Denver</w:t>
-            </w:r>
-          </w:p>
-        </w:tc>
-        <w:tc>
-          <w:tcPr>
-            <w:tcW w:type="dxa" w:w="1310"/>
-            <w:tcMar>
-              <w:top w:type="dxa" w:w="40"/>
-              <w:left w:type="dxa" w:w="60"/>
-              <w:bottom w:type="dxa" w:w="40"/>
-              <w:right w:type="dxa" w:w="60"/>
-            </w:tcMar>
-          </w:tcPr>
-          <w:p>
-            <w:pPr>
-              <w:jc w:val="right"/>
-            </w:pPr>
-            <w:r>
-              <w:rPr>
-                <w:rFonts w:ascii="Times New Roman" w:cs="Times New Roman" w:eastAsia="Times New Roman" w:hAnsi="Times New Roman"/>
-                <w:b w:val="false"/>
-                <w:bCs w:val="false"/>
-                <w:i w:val="false"/>
-                <w:iCs w:val="false"/>
-                <w:sz w:val="18"/>
-                <w:szCs w:val="18"/>
-              </w:rPr>
-              <w:t xml:space="preserve">51.3</w:t>
-            </w:r>
-          </w:p>
-        </w:tc>
-        <w:tc>
-          <w:tcPr>
-            <w:tcW w:type="dxa" w:w="1310"/>
-            <w:tcMar>
-              <w:top w:type="dxa" w:w="40"/>
-              <w:left w:type="dxa" w:w="60"/>
-              <w:bottom w:type="dxa" w:w="40"/>
-              <w:right w:type="dxa" w:w="60"/>
-            </w:tcMar>
-          </w:tcPr>
-          <w:p>
-            <w:pPr>
-              <w:jc w:val="right"/>
-            </w:pPr>
-            <w:r>
-              <w:rPr>
-                <w:rFonts w:ascii="Times New Roman" w:cs="Times New Roman" w:eastAsia="Times New Roman" w:hAnsi="Times New Roman"/>
-                <w:b w:val="false"/>
-                <w:bCs w:val="false"/>
-                <w:i w:val="false"/>
-                <w:iCs w:val="false"/>
-                <w:sz w:val="18"/>
-                <w:szCs w:val="18"/>
-              </w:rPr>
-              <w:t xml:space="preserve">51.1</w:t>
-            </w:r>
-          </w:p>
-        </w:tc>
-        <w:tc>
-          <w:tcPr>
-            <w:tcW w:type="dxa" w:w="1310"/>
-            <w:tcMar>
-              <w:top w:type="dxa" w:w="40"/>
-              <w:left w:type="dxa" w:w="60"/>
-              <w:bottom w:type="dxa" w:w="40"/>
-              <w:right w:type="dxa" w:w="60"/>
-            </w:tcMar>
-          </w:tcPr>
-          <w:p>
-            <w:pPr>
-              <w:jc w:val="right"/>
-            </w:pPr>
-            <w:r>
-              <w:rPr>
-                <w:rFonts w:ascii="Times New Roman" w:cs="Times New Roman" w:eastAsia="Times New Roman" w:hAnsi="Times New Roman"/>
-                <w:b w:val="false"/>
-                <w:bCs w:val="false"/>
-                <w:i w:val="false"/>
-                <w:iCs w:val="false"/>
-                <w:sz w:val="18"/>
-                <w:szCs w:val="18"/>
-              </w:rPr>
-              <w:t xml:space="preserve">33.1</w:t>
-            </w:r>
-          </w:p>
-        </w:tc>
-        <w:tc>
-          <w:tcPr>
-            <w:tcW w:type="dxa" w:w="1310"/>
-            <w:tcMar>
-              <w:top w:type="dxa" w:w="40"/>
-              <w:left w:type="dxa" w:w="60"/>
-              <w:bottom w:type="dxa" w:w="40"/>
-              <w:right w:type="dxa" w:w="60"/>
-            </w:tcMar>
-          </w:tcPr>
-          <w:p>
-            <w:pPr>
-              <w:jc w:val="right"/>
-            </w:pPr>
-            <w:r>
-              <w:rPr>
-                <w:rFonts w:ascii="Times New Roman" w:cs="Times New Roman" w:eastAsia="Times New Roman" w:hAnsi="Times New Roman"/>
-                <w:b w:val="false"/>
-                <w:bCs w:val="false"/>
-                <w:i w:val="false"/>
-                <w:iCs w:val="false"/>
-                <w:sz w:val="18"/>
-                <w:szCs w:val="18"/>
-              </w:rPr>
-              <w:t xml:space="preserve">26.0</w:t>
-            </w:r>
-          </w:p>
-        </w:tc>
-        <w:tc>
-          <w:tcPr>
-            <w:tcW w:type="dxa" w:w="1312"/>
-            <w:tcMar>
-              <w:top w:type="dxa" w:w="40"/>
-              <w:left w:type="dxa" w:w="60"/>
-              <w:bottom w:type="dxa" w:w="40"/>
-              <w:right w:type="dxa" w:w="60"/>
-            </w:tcMar>
-          </w:tcPr>
-          <w:p>
-            <w:pPr>
-              <w:jc w:val="right"/>
-            </w:pPr>
-            <w:r>
-              <w:rPr>
-                <w:rFonts w:ascii="Times New Roman" w:cs="Times New Roman" w:eastAsia="Times New Roman" w:hAnsi="Times New Roman"/>
-                <w:b w:val="false"/>
-                <w:bCs w:val="false"/>
-                <w:i w:val="false"/>
-                <w:iCs w:val="false"/>
-                <w:sz w:val="18"/>
-                <w:szCs w:val="18"/>
-              </w:rPr>
-              <w:t xml:space="preserve">14.2</w:t>
-            </w:r>
-          </w:p>
-        </w:tc>
-      </w:tr>
-      <w:tr>
-        <w:trPr>
-          <w:tblHeader w:val="false"/>
-        </w:trPr>
-        <w:tc>
-          <w:tcPr>
-            <w:tcW w:type="dxa" w:w="2808"/>
-            <w:tcMar>
-              <w:top w:type="dxa" w:w="40"/>
-              <w:left w:type="dxa" w:w="60"/>
-              <w:bottom w:type="dxa" w:w="40"/>
-              <w:right w:type="dxa" w:w="60"/>
-            </w:tcMar>
-          </w:tcPr>
-          <w:p>
-            <w:pPr>
-              <w:jc w:val="left"/>
-            </w:pPr>
-            <w:r>
-              <w:rPr>
-                <w:rFonts w:ascii="Times New Roman" w:cs="Times New Roman" w:eastAsia="Times New Roman" w:hAnsi="Times New Roman"/>
-                <w:b w:val="false"/>
-                <w:bCs w:val="false"/>
-                <w:i w:val="false"/>
-                <w:iCs w:val="false"/>
-                <w:sz w:val="18"/>
-                <w:szCs w:val="18"/>
-              </w:rPr>
-              <w:t xml:space="preserve">Denver suburbs (Adams, Arapahoe, Broomfield, Douglas, Jefferson)</w:t>
-            </w:r>
-          </w:p>
-        </w:tc>
-        <w:tc>
-          <w:tcPr>
-            <w:tcW w:type="dxa" w:w="1310"/>
-            <w:tcMar>
-              <w:top w:type="dxa" w:w="40"/>
-              <w:left w:type="dxa" w:w="60"/>
-              <w:bottom w:type="dxa" w:w="40"/>
-              <w:right w:type="dxa" w:w="60"/>
-            </w:tcMar>
-          </w:tcPr>
-          <w:p>
-            <w:pPr>
-              <w:jc w:val="right"/>
-            </w:pPr>
-            <w:r>
-              <w:rPr>
-                <w:rFonts w:ascii="Times New Roman" w:cs="Times New Roman" w:eastAsia="Times New Roman" w:hAnsi="Times New Roman"/>
-                <w:b w:val="false"/>
-                <w:bCs w:val="false"/>
-                <w:i w:val="false"/>
-                <w:iCs w:val="false"/>
-                <w:sz w:val="18"/>
-                <w:szCs w:val="18"/>
-              </w:rPr>
-              <w:t xml:space="preserve">19.6</w:t>
-            </w:r>
-          </w:p>
-        </w:tc>
-        <w:tc>
-          <w:tcPr>
-            <w:tcW w:type="dxa" w:w="1310"/>
-            <w:tcMar>
-              <w:top w:type="dxa" w:w="40"/>
-              <w:left w:type="dxa" w:w="60"/>
-              <w:bottom w:type="dxa" w:w="40"/>
-              <w:right w:type="dxa" w:w="60"/>
-            </w:tcMar>
-          </w:tcPr>
-          <w:p>
-            <w:pPr>
-              <w:jc w:val="right"/>
-            </w:pPr>
-            <w:r>
-              <w:rPr>
-                <w:rFonts w:ascii="Times New Roman" w:cs="Times New Roman" w:eastAsia="Times New Roman" w:hAnsi="Times New Roman"/>
-                <w:b w:val="false"/>
-                <w:bCs w:val="false"/>
-                <w:i w:val="false"/>
-                <w:iCs w:val="false"/>
-                <w:sz w:val="18"/>
-                <w:szCs w:val="18"/>
-              </w:rPr>
-              <w:t xml:space="preserve">24.2</w:t>
-            </w:r>
-          </w:p>
-        </w:tc>
-        <w:tc>
-          <w:tcPr>
-            <w:tcW w:type="dxa" w:w="1310"/>
-            <w:tcMar>
-              <w:top w:type="dxa" w:w="40"/>
-              <w:left w:type="dxa" w:w="60"/>
-              <w:bottom w:type="dxa" w:w="40"/>
-              <w:right w:type="dxa" w:w="60"/>
-            </w:tcMar>
-          </w:tcPr>
-          <w:p>
-            <w:pPr>
-              <w:jc w:val="right"/>
-            </w:pPr>
-            <w:r>
-              <w:rPr>
-                <w:rFonts w:ascii="Times New Roman" w:cs="Times New Roman" w:eastAsia="Times New Roman" w:hAnsi="Times New Roman"/>
-                <w:b w:val="false"/>
-                <w:bCs w:val="false"/>
-                <w:i w:val="false"/>
-                <w:iCs w:val="false"/>
-                <w:sz w:val="18"/>
-                <w:szCs w:val="18"/>
-              </w:rPr>
-              <w:t xml:space="preserve">32.7</w:t>
-            </w:r>
-          </w:p>
-        </w:tc>
-        <w:tc>
-          <w:tcPr>
-            <w:tcW w:type="dxa" w:w="1310"/>
-            <w:tcMar>
-              <w:top w:type="dxa" w:w="40"/>
-              <w:left w:type="dxa" w:w="60"/>
-              <w:bottom w:type="dxa" w:w="40"/>
-              <w:right w:type="dxa" w:w="60"/>
-            </w:tcMar>
-          </w:tcPr>
-          <w:p>
-            <w:pPr>
-              <w:jc w:val="right"/>
-            </w:pPr>
-            <w:r>
-              <w:rPr>
-                <w:rFonts w:ascii="Times New Roman" w:cs="Times New Roman" w:eastAsia="Times New Roman" w:hAnsi="Times New Roman"/>
-                <w:b w:val="false"/>
-                <w:bCs w:val="false"/>
-                <w:i w:val="false"/>
-                <w:iCs w:val="false"/>
-                <w:sz w:val="18"/>
-                <w:szCs w:val="18"/>
-              </w:rPr>
-              <w:t xml:space="preserve">29.8</w:t>
-            </w:r>
-          </w:p>
-        </w:tc>
-        <w:tc>
-          <w:tcPr>
-            <w:tcW w:type="dxa" w:w="1312"/>
-            <w:tcMar>
-              <w:top w:type="dxa" w:w="40"/>
-              <w:left w:type="dxa" w:w="60"/>
-              <w:bottom w:type="dxa" w:w="40"/>
-              <w:right w:type="dxa" w:w="60"/>
-            </w:tcMar>
-          </w:tcPr>
-          <w:p>
-            <w:pPr>
-              <w:jc w:val="right"/>
-            </w:pPr>
-            <w:r>
-              <w:rPr>
-                <w:rFonts w:ascii="Times New Roman" w:cs="Times New Roman" w:eastAsia="Times New Roman" w:hAnsi="Times New Roman"/>
-                <w:b w:val="false"/>
-                <w:bCs w:val="false"/>
-                <w:i w:val="false"/>
-                <w:iCs w:val="false"/>
-                <w:sz w:val="18"/>
-                <w:szCs w:val="18"/>
-              </w:rPr>
-              <w:t xml:space="preserve">35.6</w:t>
-            </w:r>
-          </w:p>
-        </w:tc>
-      </w:tr>
-      <w:tr>
-        <w:trPr>
-          <w:tblHeader w:val="false"/>
-        </w:trPr>
-        <w:tc>
-          <w:tcPr>
-            <w:tcW w:type="dxa" w:w="2808"/>
-            <w:tcMar>
-              <w:top w:type="dxa" w:w="40"/>
-              <w:left w:type="dxa" w:w="60"/>
-              <w:bottom w:type="dxa" w:w="40"/>
-              <w:right w:type="dxa" w:w="60"/>
-            </w:tcMar>
-          </w:tcPr>
-          <w:p>
-            <w:pPr>
-              <w:jc w:val="left"/>
-            </w:pPr>
-            <w:r>
-              <w:rPr>
-                <w:rFonts w:ascii="Times New Roman" w:cs="Times New Roman" w:eastAsia="Times New Roman" w:hAnsi="Times New Roman"/>
-                <w:b w:val="false"/>
-                <w:bCs w:val="false"/>
-                <w:i w:val="false"/>
-                <w:iCs w:val="false"/>
-                <w:sz w:val="18"/>
-                <w:szCs w:val="18"/>
-              </w:rPr>
-              <w:t xml:space="preserve">Boulder, Larimer and Weld</w:t>
-            </w:r>
-          </w:p>
-        </w:tc>
-        <w:tc>
-          <w:tcPr>
-            <w:tcW w:type="dxa" w:w="1310"/>
-            <w:tcMar>
-              <w:top w:type="dxa" w:w="40"/>
-              <w:left w:type="dxa" w:w="60"/>
-              <w:bottom w:type="dxa" w:w="40"/>
-              <w:right w:type="dxa" w:w="60"/>
-            </w:tcMar>
-          </w:tcPr>
-          <w:p>
-            <w:pPr>
-              <w:jc w:val="right"/>
-            </w:pPr>
-            <w:r>
-              <w:rPr>
-                <w:rFonts w:ascii="Times New Roman" w:cs="Times New Roman" w:eastAsia="Times New Roman" w:hAnsi="Times New Roman"/>
-                <w:b w:val="false"/>
-                <w:bCs w:val="false"/>
-                <w:i w:val="false"/>
-                <w:iCs w:val="false"/>
-                <w:sz w:val="18"/>
-                <w:szCs w:val="18"/>
-              </w:rPr>
-              <w:t xml:space="preserve">8.9</w:t>
-            </w:r>
-          </w:p>
-        </w:tc>
-        <w:tc>
-          <w:tcPr>
-            <w:tcW w:type="dxa" w:w="1310"/>
-            <w:tcMar>
-              <w:top w:type="dxa" w:w="40"/>
-              <w:left w:type="dxa" w:w="60"/>
-              <w:bottom w:type="dxa" w:w="40"/>
-              <w:right w:type="dxa" w:w="60"/>
-            </w:tcMar>
-          </w:tcPr>
-          <w:p>
-            <w:pPr>
-              <w:jc w:val="right"/>
-            </w:pPr>
-            <w:r>
-              <w:rPr>
-                <w:rFonts w:ascii="Times New Roman" w:cs="Times New Roman" w:eastAsia="Times New Roman" w:hAnsi="Times New Roman"/>
-                <w:b w:val="false"/>
-                <w:bCs w:val="false"/>
-                <w:i w:val="false"/>
-                <w:iCs w:val="false"/>
-                <w:sz w:val="18"/>
-                <w:szCs w:val="18"/>
-              </w:rPr>
-              <w:t xml:space="preserve">9.6</w:t>
-            </w:r>
-          </w:p>
-        </w:tc>
-        <w:tc>
-          <w:tcPr>
-            <w:tcW w:type="dxa" w:w="1310"/>
-            <w:tcMar>
-              <w:top w:type="dxa" w:w="40"/>
-              <w:left w:type="dxa" w:w="60"/>
-              <w:bottom w:type="dxa" w:w="40"/>
-              <w:right w:type="dxa" w:w="60"/>
-            </w:tcMar>
-          </w:tcPr>
-          <w:p>
-            <w:pPr>
-              <w:jc w:val="right"/>
-            </w:pPr>
-            <w:r>
-              <w:rPr>
-                <w:rFonts w:ascii="Times New Roman" w:cs="Times New Roman" w:eastAsia="Times New Roman" w:hAnsi="Times New Roman"/>
-                <w:b w:val="false"/>
-                <w:bCs w:val="false"/>
-                <w:i w:val="false"/>
-                <w:iCs w:val="false"/>
-                <w:sz w:val="18"/>
-                <w:szCs w:val="18"/>
-              </w:rPr>
-              <w:t xml:space="preserve">16.6</w:t>
-            </w:r>
-          </w:p>
-        </w:tc>
-        <w:tc>
-          <w:tcPr>
-            <w:tcW w:type="dxa" w:w="1310"/>
-            <w:tcMar>
-              <w:top w:type="dxa" w:w="40"/>
-              <w:left w:type="dxa" w:w="60"/>
-              <w:bottom w:type="dxa" w:w="40"/>
-              <w:right w:type="dxa" w:w="60"/>
-            </w:tcMar>
-          </w:tcPr>
-          <w:p>
-            <w:pPr>
-              <w:jc w:val="right"/>
-            </w:pPr>
-            <w:r>
-              <w:rPr>
-                <w:rFonts w:ascii="Times New Roman" w:cs="Times New Roman" w:eastAsia="Times New Roman" w:hAnsi="Times New Roman"/>
-                <w:b w:val="false"/>
-                <w:bCs w:val="false"/>
-                <w:i w:val="false"/>
-                <w:iCs w:val="false"/>
-                <w:sz w:val="18"/>
-                <w:szCs w:val="18"/>
-              </w:rPr>
-              <w:t xml:space="preserve">23.2</w:t>
-            </w:r>
-          </w:p>
-        </w:tc>
-        <w:tc>
-          <w:tcPr>
-            <w:tcW w:type="dxa" w:w="1312"/>
-            <w:tcMar>
-              <w:top w:type="dxa" w:w="40"/>
-              <w:left w:type="dxa" w:w="60"/>
-              <w:bottom w:type="dxa" w:w="40"/>
-              <w:right w:type="dxa" w:w="60"/>
-            </w:tcMar>
-          </w:tcPr>
-          <w:p>
-            <w:pPr>
-              <w:jc w:val="right"/>
-            </w:pPr>
-            <w:r>
-              <w:rPr>
-                <w:rFonts w:ascii="Times New Roman" w:cs="Times New Roman" w:eastAsia="Times New Roman" w:hAnsi="Times New Roman"/>
-                <w:b w:val="false"/>
-                <w:bCs w:val="false"/>
-                <w:i w:val="false"/>
-                <w:iCs w:val="false"/>
-                <w:sz w:val="18"/>
-                <w:szCs w:val="18"/>
-              </w:rPr>
-              <w:t xml:space="preserve">16.0</w:t>
-            </w:r>
-          </w:p>
-        </w:tc>
-      </w:tr>
-      <w:tr>
-        <w:trPr>
-          <w:tblHeader w:val="false"/>
-        </w:trPr>
-        <w:tc>
-          <w:tcPr>
-            <w:tcW w:type="dxa" w:w="2808"/>
-            <w:tcMar>
-              <w:top w:type="dxa" w:w="40"/>
-              <w:left w:type="dxa" w:w="60"/>
-              <w:bottom w:type="dxa" w:w="40"/>
-              <w:right w:type="dxa" w:w="60"/>
-            </w:tcMar>
-          </w:tcPr>
-          <w:p>
-            <w:pPr>
-              <w:jc w:val="left"/>
-            </w:pPr>
-            <w:r>
-              <w:rPr>
-                <w:rFonts w:ascii="Times New Roman" w:cs="Times New Roman" w:eastAsia="Times New Roman" w:hAnsi="Times New Roman"/>
-                <w:b w:val="false"/>
-                <w:bCs w:val="false"/>
-                <w:i w:val="false"/>
-                <w:iCs w:val="false"/>
-                <w:sz w:val="18"/>
-                <w:szCs w:val="18"/>
-              </w:rPr>
-              <w:t xml:space="preserve">Colorado Springs (El Paso)</w:t>
-            </w:r>
-          </w:p>
-        </w:tc>
-        <w:tc>
-          <w:tcPr>
-            <w:tcW w:type="dxa" w:w="1310"/>
-            <w:tcMar>
-              <w:top w:type="dxa" w:w="40"/>
-              <w:left w:type="dxa" w:w="60"/>
-              <w:bottom w:type="dxa" w:w="40"/>
-              <w:right w:type="dxa" w:w="60"/>
-            </w:tcMar>
-          </w:tcPr>
-          <w:p>
-            <w:pPr>
-              <w:jc w:val="right"/>
-            </w:pPr>
-            <w:r>
-              <w:rPr>
-                <w:rFonts w:ascii="Times New Roman" w:cs="Times New Roman" w:eastAsia="Times New Roman" w:hAnsi="Times New Roman"/>
-                <w:b w:val="false"/>
-                <w:bCs w:val="false"/>
-                <w:i w:val="false"/>
-                <w:iCs w:val="false"/>
-                <w:sz w:val="18"/>
-                <w:szCs w:val="18"/>
-              </w:rPr>
-              <w:t xml:space="preserve">5.1</w:t>
-            </w:r>
-          </w:p>
-        </w:tc>
-        <w:tc>
-          <w:tcPr>
-            <w:tcW w:type="dxa" w:w="1310"/>
-            <w:tcMar>
-              <w:top w:type="dxa" w:w="40"/>
-              <w:left w:type="dxa" w:w="60"/>
-              <w:bottom w:type="dxa" w:w="40"/>
-              <w:right w:type="dxa" w:w="60"/>
-            </w:tcMar>
-          </w:tcPr>
-          <w:p>
-            <w:pPr>
-              <w:jc w:val="right"/>
-            </w:pPr>
-            <w:r>
-              <w:rPr>
-                <w:rFonts w:ascii="Times New Roman" w:cs="Times New Roman" w:eastAsia="Times New Roman" w:hAnsi="Times New Roman"/>
-                <w:b w:val="false"/>
-                <w:bCs w:val="false"/>
-                <w:i w:val="false"/>
-                <w:iCs w:val="false"/>
-                <w:sz w:val="18"/>
-                <w:szCs w:val="18"/>
-              </w:rPr>
-              <w:t xml:space="preserve">5.6</w:t>
-            </w:r>
-          </w:p>
-        </w:tc>
-        <w:tc>
-          <w:tcPr>
-            <w:tcW w:type="dxa" w:w="1310"/>
-            <w:tcMar>
-              <w:top w:type="dxa" w:w="40"/>
-              <w:left w:type="dxa" w:w="60"/>
-              <w:bottom w:type="dxa" w:w="40"/>
-              <w:right w:type="dxa" w:w="60"/>
-            </w:tcMar>
-          </w:tcPr>
-          <w:p>
-            <w:pPr>
-              <w:jc w:val="right"/>
-            </w:pPr>
-            <w:r>
-              <w:rPr>
-                <w:rFonts w:ascii="Times New Roman" w:cs="Times New Roman" w:eastAsia="Times New Roman" w:hAnsi="Times New Roman"/>
-                <w:b w:val="false"/>
-                <w:bCs w:val="false"/>
-                <w:i w:val="false"/>
-                <w:iCs w:val="false"/>
-                <w:sz w:val="18"/>
-                <w:szCs w:val="18"/>
-              </w:rPr>
-              <w:t xml:space="preserve">7.5</w:t>
-            </w:r>
-          </w:p>
-        </w:tc>
-        <w:tc>
-          <w:tcPr>
-            <w:tcW w:type="dxa" w:w="1310"/>
-            <w:tcMar>
-              <w:top w:type="dxa" w:w="40"/>
-              <w:left w:type="dxa" w:w="60"/>
-              <w:bottom w:type="dxa" w:w="40"/>
-              <w:right w:type="dxa" w:w="60"/>
-            </w:tcMar>
-          </w:tcPr>
-          <w:p>
-            <w:pPr>
-              <w:jc w:val="right"/>
-            </w:pPr>
-            <w:r>
-              <w:rPr>
-                <w:rFonts w:ascii="Times New Roman" w:cs="Times New Roman" w:eastAsia="Times New Roman" w:hAnsi="Times New Roman"/>
-                <w:b w:val="false"/>
-                <w:bCs w:val="false"/>
-                <w:i w:val="false"/>
-                <w:iCs w:val="false"/>
-                <w:sz w:val="18"/>
-                <w:szCs w:val="18"/>
-              </w:rPr>
-              <w:t xml:space="preserve">7.8</w:t>
-            </w:r>
-          </w:p>
-        </w:tc>
-        <w:tc>
-          <w:tcPr>
-            <w:tcW w:type="dxa" w:w="1312"/>
-            <w:tcMar>
-              <w:top w:type="dxa" w:w="40"/>
-              <w:left w:type="dxa" w:w="60"/>
-              <w:bottom w:type="dxa" w:w="40"/>
-              <w:right w:type="dxa" w:w="60"/>
-            </w:tcMar>
-          </w:tcPr>
-          <w:p>
-            <w:pPr>
-              <w:jc w:val="right"/>
-            </w:pPr>
-            <w:r>
-              <w:rPr>
-                <w:rFonts w:ascii="Times New Roman" w:cs="Times New Roman" w:eastAsia="Times New Roman" w:hAnsi="Times New Roman"/>
-                <w:b w:val="false"/>
-                <w:bCs w:val="false"/>
-                <w:i w:val="false"/>
-                <w:iCs w:val="false"/>
-                <w:sz w:val="18"/>
-                <w:szCs w:val="18"/>
-              </w:rPr>
-              <w:t xml:space="preserve">12.1</w:t>
-            </w:r>
-          </w:p>
-        </w:tc>
-      </w:tr>
-      <w:tr>
-        <w:trPr>
-          <w:tblHeader w:val="false"/>
-        </w:trPr>
-        <w:tc>
-          <w:tcPr>
-            <w:tcW w:type="dxa" w:w="2808"/>
-            <w:tcMar>
-              <w:top w:type="dxa" w:w="40"/>
-              <w:left w:type="dxa" w:w="60"/>
-              <w:bottom w:type="dxa" w:w="40"/>
-              <w:right w:type="dxa" w:w="60"/>
-            </w:tcMar>
-          </w:tcPr>
-          <w:p>
-            <w:pPr>
-              <w:jc w:val="left"/>
-            </w:pPr>
-            <w:r>
-              <w:rPr>
-                <w:rFonts w:ascii="Times New Roman" w:cs="Times New Roman" w:eastAsia="Times New Roman" w:hAnsi="Times New Roman"/>
-                <w:b w:val="false"/>
-                <w:bCs w:val="false"/>
-                <w:i w:val="false"/>
-                <w:iCs w:val="false"/>
-                <w:sz w:val="18"/>
-                <w:szCs w:val="18"/>
-              </w:rPr>
-              <w:t xml:space="preserve">Pueblo</w:t>
-            </w:r>
-          </w:p>
-        </w:tc>
-        <w:tc>
-          <w:tcPr>
-            <w:tcW w:type="dxa" w:w="1310"/>
-            <w:tcMar>
-              <w:top w:type="dxa" w:w="40"/>
-              <w:left w:type="dxa" w:w="60"/>
-              <w:bottom w:type="dxa" w:w="40"/>
-              <w:right w:type="dxa" w:w="60"/>
-            </w:tcMar>
-          </w:tcPr>
-          <w:p>
-            <w:pPr>
-              <w:jc w:val="right"/>
-            </w:pPr>
-            <w:r>
-              <w:rPr>
-                <w:rFonts w:ascii="Times New Roman" w:cs="Times New Roman" w:eastAsia="Times New Roman" w:hAnsi="Times New Roman"/>
-                <w:b w:val="false"/>
-                <w:bCs w:val="false"/>
-                <w:i w:val="false"/>
-                <w:iCs w:val="false"/>
-                <w:sz w:val="18"/>
-                <w:szCs w:val="18"/>
-              </w:rPr>
-              <w:t xml:space="preserve">3.2</w:t>
-            </w:r>
-          </w:p>
-        </w:tc>
-        <w:tc>
-          <w:tcPr>
-            <w:tcW w:type="dxa" w:w="1310"/>
-            <w:tcMar>
-              <w:top w:type="dxa" w:w="40"/>
-              <w:left w:type="dxa" w:w="60"/>
-              <w:bottom w:type="dxa" w:w="40"/>
-              <w:right w:type="dxa" w:w="60"/>
-            </w:tcMar>
-          </w:tcPr>
-          <w:p>
-            <w:pPr>
-              <w:jc w:val="right"/>
-            </w:pPr>
-            <w:r>
-              <w:rPr>
-                <w:rFonts w:ascii="Times New Roman" w:cs="Times New Roman" w:eastAsia="Times New Roman" w:hAnsi="Times New Roman"/>
-                <w:b w:val="false"/>
-                <w:bCs w:val="false"/>
-                <w:i w:val="false"/>
-                <w:iCs w:val="false"/>
-                <w:sz w:val="18"/>
-                <w:szCs w:val="18"/>
-              </w:rPr>
-              <w:t xml:space="preserve">2.0</w:t>
-            </w:r>
-          </w:p>
-        </w:tc>
-        <w:tc>
-          <w:tcPr>
-            <w:tcW w:type="dxa" w:w="1310"/>
-            <w:tcMar>
-              <w:top w:type="dxa" w:w="40"/>
-              <w:left w:type="dxa" w:w="60"/>
-              <w:bottom w:type="dxa" w:w="40"/>
-              <w:right w:type="dxa" w:w="60"/>
-            </w:tcMar>
-          </w:tcPr>
-          <w:p>
-            <w:pPr>
-              <w:jc w:val="right"/>
-            </w:pPr>
-            <w:r>
-              <w:rPr>
-                <w:rFonts w:ascii="Times New Roman" w:cs="Times New Roman" w:eastAsia="Times New Roman" w:hAnsi="Times New Roman"/>
-                <w:b w:val="false"/>
-                <w:bCs w:val="false"/>
-                <w:i w:val="false"/>
-                <w:iCs w:val="false"/>
-                <w:sz w:val="18"/>
-                <w:szCs w:val="18"/>
-              </w:rPr>
-              <w:t xml:space="preserve">1.8</w:t>
-            </w:r>
-          </w:p>
-        </w:tc>
-        <w:tc>
-          <w:tcPr>
-            <w:tcW w:type="dxa" w:w="1310"/>
-            <w:tcMar>
-              <w:top w:type="dxa" w:w="40"/>
-              <w:left w:type="dxa" w:w="60"/>
-              <w:bottom w:type="dxa" w:w="40"/>
-              <w:right w:type="dxa" w:w="60"/>
-            </w:tcMar>
-          </w:tcPr>
-          <w:p>
-            <w:pPr>
-              <w:jc w:val="right"/>
-            </w:pPr>
-            <w:r>
-              <w:rPr>
-                <w:rFonts w:ascii="Times New Roman" w:cs="Times New Roman" w:eastAsia="Times New Roman" w:hAnsi="Times New Roman"/>
-                <w:b w:val="false"/>
-                <w:bCs w:val="false"/>
-                <w:i w:val="false"/>
-                <w:iCs w:val="false"/>
-                <w:sz w:val="18"/>
-                <w:szCs w:val="18"/>
-              </w:rPr>
-              <w:t xml:space="preserve">2.0</w:t>
-            </w:r>
-          </w:p>
-        </w:tc>
-        <w:tc>
-          <w:tcPr>
-            <w:tcW w:type="dxa" w:w="1312"/>
-            <w:tcMar>
-              <w:top w:type="dxa" w:w="40"/>
-              <w:left w:type="dxa" w:w="60"/>
-              <w:bottom w:type="dxa" w:w="40"/>
-              <w:right w:type="dxa" w:w="60"/>
-            </w:tcMar>
-          </w:tcPr>
-          <w:p>
-            <w:pPr>
-              <w:jc w:val="right"/>
-            </w:pPr>
-            <w:r>
-              <w:rPr>
-                <w:rFonts w:ascii="Times New Roman" w:cs="Times New Roman" w:eastAsia="Times New Roman" w:hAnsi="Times New Roman"/>
-                <w:b w:val="false"/>
-                <w:bCs w:val="false"/>
-                <w:i w:val="false"/>
-                <w:iCs w:val="false"/>
-                <w:sz w:val="18"/>
-                <w:szCs w:val="18"/>
-              </w:rPr>
-              <w:t xml:space="preserve">3.7</w:t>
-            </w:r>
-          </w:p>
-        </w:tc>
-      </w:tr>
-      <w:tr>
-        <w:trPr>
-          <w:tblHeader w:val="false"/>
-        </w:trPr>
-        <w:tc>
-          <w:tcPr>
-            <w:tcW w:type="dxa" w:w="2808"/>
-            <w:tcMar>
-              <w:top w:type="dxa" w:w="40"/>
-              <w:left w:type="dxa" w:w="60"/>
-              <w:bottom w:type="dxa" w:w="40"/>
-              <w:right w:type="dxa" w:w="60"/>
-            </w:tcMar>
-          </w:tcPr>
-          <w:p>
-            <w:pPr>
-              <w:jc w:val="left"/>
-            </w:pPr>
-            <w:r>
-              <w:rPr>
-                <w:rFonts w:ascii="Times New Roman" w:cs="Times New Roman" w:eastAsia="Times New Roman" w:hAnsi="Times New Roman"/>
-                <w:b w:val="false"/>
-                <w:bCs w:val="false"/>
-                <w:i w:val="false"/>
-                <w:iCs w:val="false"/>
-                <w:sz w:val="18"/>
-                <w:szCs w:val="18"/>
-              </w:rPr>
-              <w:t xml:space="preserve">Grand Junction (Mesa)</w:t>
-            </w:r>
-          </w:p>
-        </w:tc>
-        <w:tc>
-          <w:tcPr>
-            <w:tcW w:type="dxa" w:w="1310"/>
-            <w:tcMar>
-              <w:top w:type="dxa" w:w="40"/>
-              <w:left w:type="dxa" w:w="60"/>
-              <w:bottom w:type="dxa" w:w="40"/>
-              <w:right w:type="dxa" w:w="60"/>
-            </w:tcMar>
-          </w:tcPr>
-          <w:p>
-            <w:pPr>
-              <w:jc w:val="right"/>
-            </w:pPr>
-            <w:r>
-              <w:rPr>
-                <w:rFonts w:ascii="Times New Roman" w:cs="Times New Roman" w:eastAsia="Times New Roman" w:hAnsi="Times New Roman"/>
-                <w:b w:val="false"/>
-                <w:bCs w:val="false"/>
-                <w:i w:val="false"/>
-                <w:iCs w:val="false"/>
-                <w:sz w:val="18"/>
-                <w:szCs w:val="18"/>
-              </w:rPr>
-              <w:t xml:space="preserve">4.4</w:t>
-            </w:r>
-          </w:p>
-        </w:tc>
-        <w:tc>
-          <w:tcPr>
-            <w:tcW w:type="dxa" w:w="1310"/>
-            <w:tcMar>
-              <w:top w:type="dxa" w:w="40"/>
-              <w:left w:type="dxa" w:w="60"/>
-              <w:bottom w:type="dxa" w:w="40"/>
-              <w:right w:type="dxa" w:w="60"/>
-            </w:tcMar>
-          </w:tcPr>
-          <w:p>
-            <w:pPr>
-              <w:jc w:val="right"/>
-            </w:pPr>
-            <w:r>
-              <w:rPr>
-                <w:rFonts w:ascii="Times New Roman" w:cs="Times New Roman" w:eastAsia="Times New Roman" w:hAnsi="Times New Roman"/>
-                <w:b w:val="false"/>
-                <w:bCs w:val="false"/>
-                <w:i w:val="false"/>
-                <w:iCs w:val="false"/>
-                <w:sz w:val="18"/>
-                <w:szCs w:val="18"/>
-              </w:rPr>
-              <w:t xml:space="preserve">2.5</w:t>
-            </w:r>
-          </w:p>
-        </w:tc>
-        <w:tc>
-          <w:tcPr>
-            <w:tcW w:type="dxa" w:w="1310"/>
-            <w:tcMar>
-              <w:top w:type="dxa" w:w="40"/>
-              <w:left w:type="dxa" w:w="60"/>
-              <w:bottom w:type="dxa" w:w="40"/>
-              <w:right w:type="dxa" w:w="60"/>
-            </w:tcMar>
-          </w:tcPr>
-          <w:p>
-            <w:pPr>
-              <w:jc w:val="right"/>
-            </w:pPr>
-            <w:r>
-              <w:rPr>
-                <w:rFonts w:ascii="Times New Roman" w:cs="Times New Roman" w:eastAsia="Times New Roman" w:hAnsi="Times New Roman"/>
-                <w:b w:val="false"/>
-                <w:bCs w:val="false"/>
-                <w:i w:val="false"/>
-                <w:iCs w:val="false"/>
-                <w:sz w:val="18"/>
-                <w:szCs w:val="18"/>
-              </w:rPr>
-              <w:t xml:space="preserve">2.9</w:t>
-            </w:r>
-          </w:p>
-        </w:tc>
-        <w:tc>
-          <w:tcPr>
-            <w:tcW w:type="dxa" w:w="1310"/>
-            <w:tcMar>
-              <w:top w:type="dxa" w:w="40"/>
-              <w:left w:type="dxa" w:w="60"/>
-              <w:bottom w:type="dxa" w:w="40"/>
-              <w:right w:type="dxa" w:w="60"/>
-            </w:tcMar>
-          </w:tcPr>
-          <w:p>
-            <w:pPr>
-              <w:jc w:val="right"/>
-            </w:pPr>
-            <w:r>
-              <w:rPr>
-                <w:rFonts w:ascii="Times New Roman" w:cs="Times New Roman" w:eastAsia="Times New Roman" w:hAnsi="Times New Roman"/>
-                <w:b w:val="false"/>
-                <w:bCs w:val="false"/>
-                <w:i w:val="false"/>
-                <w:iCs w:val="false"/>
-                <w:sz w:val="18"/>
-                <w:szCs w:val="18"/>
-              </w:rPr>
-              <w:t xml:space="preserve">3.5</w:t>
-            </w:r>
-          </w:p>
-        </w:tc>
-        <w:tc>
-          <w:tcPr>
-            <w:tcW w:type="dxa" w:w="1312"/>
-            <w:tcMar>
-              <w:top w:type="dxa" w:w="40"/>
-              <w:left w:type="dxa" w:w="60"/>
-              <w:bottom w:type="dxa" w:w="40"/>
-              <w:right w:type="dxa" w:w="60"/>
-            </w:tcMar>
-          </w:tcPr>
-          <w:p>
-            <w:pPr>
-              <w:jc w:val="right"/>
-            </w:pPr>
-            <w:r>
-              <w:rPr>
-                <w:rFonts w:ascii="Times New Roman" w:cs="Times New Roman" w:eastAsia="Times New Roman" w:hAnsi="Times New Roman"/>
-                <w:b w:val="false"/>
-                <w:bCs w:val="false"/>
-                <w:i w:val="false"/>
-                <w:iCs w:val="false"/>
-                <w:sz w:val="18"/>
-                <w:szCs w:val="18"/>
-              </w:rPr>
-              <w:t xml:space="preserve">2.8</w:t>
-            </w:r>
-          </w:p>
-        </w:tc>
-      </w:tr>
-      <w:tr>
-        <w:trPr>
-          <w:tblHeader w:val="false"/>
-        </w:trPr>
-        <w:tc>
-          <w:tcPr>
-            <w:tcW w:type="dxa" w:w="2808"/>
-            <w:tcMar>
-              <w:top w:type="dxa" w:w="40"/>
-              <w:left w:type="dxa" w:w="60"/>
-              <w:bottom w:type="dxa" w:w="40"/>
-              <w:right w:type="dxa" w:w="60"/>
-            </w:tcMar>
-          </w:tcPr>
-          <w:p>
-            <w:pPr>
-              <w:jc w:val="left"/>
-            </w:pPr>
-            <w:r>
-              <w:rPr>
-                <w:rFonts w:ascii="Times New Roman" w:cs="Times New Roman" w:eastAsia="Times New Roman" w:hAnsi="Times New Roman"/>
-                <w:b w:val="false"/>
-                <w:bCs w:val="false"/>
-                <w:i w:val="false"/>
-                <w:iCs w:val="false"/>
-                <w:sz w:val="18"/>
-                <w:szCs w:val="18"/>
-              </w:rPr>
-              <w:t xml:space="preserve">rest of Colorado</w:t>
-            </w:r>
-          </w:p>
-        </w:tc>
-        <w:tc>
-          <w:tcPr>
-            <w:tcW w:type="dxa" w:w="1310"/>
-            <w:tcMar>
-              <w:top w:type="dxa" w:w="40"/>
-              <w:left w:type="dxa" w:w="60"/>
-              <w:bottom w:type="dxa" w:w="40"/>
-              <w:right w:type="dxa" w:w="60"/>
-            </w:tcMar>
-          </w:tcPr>
-          <w:p>
-            <w:pPr>
-              <w:jc w:val="right"/>
-            </w:pPr>
-            <w:r>
-              <w:rPr>
-                <w:rFonts w:ascii="Times New Roman" w:cs="Times New Roman" w:eastAsia="Times New Roman" w:hAnsi="Times New Roman"/>
-                <w:b w:val="false"/>
-                <w:bCs w:val="false"/>
-                <w:i w:val="false"/>
-                <w:iCs w:val="false"/>
-                <w:sz w:val="18"/>
-                <w:szCs w:val="18"/>
-              </w:rPr>
-              <w:t xml:space="preserve">7.6</w:t>
-            </w:r>
-          </w:p>
-        </w:tc>
-        <w:tc>
-          <w:tcPr>
-            <w:tcW w:type="dxa" w:w="1310"/>
-            <w:tcMar>
-              <w:top w:type="dxa" w:w="40"/>
-              <w:left w:type="dxa" w:w="60"/>
-              <w:bottom w:type="dxa" w:w="40"/>
-              <w:right w:type="dxa" w:w="60"/>
-            </w:tcMar>
-          </w:tcPr>
-          <w:p>
-            <w:pPr>
-              <w:jc w:val="right"/>
-            </w:pPr>
-            <w:r>
-              <w:rPr>
-                <w:rFonts w:ascii="Times New Roman" w:cs="Times New Roman" w:eastAsia="Times New Roman" w:hAnsi="Times New Roman"/>
-                <w:b w:val="false"/>
-                <w:bCs w:val="false"/>
-                <w:i w:val="false"/>
-                <w:iCs w:val="false"/>
-                <w:sz w:val="18"/>
-                <w:szCs w:val="18"/>
-              </w:rPr>
-              <w:t xml:space="preserve">5.1</w:t>
-            </w:r>
-          </w:p>
-        </w:tc>
-        <w:tc>
-          <w:tcPr>
-            <w:tcW w:type="dxa" w:w="1310"/>
-            <w:tcMar>
-              <w:top w:type="dxa" w:w="40"/>
-              <w:left w:type="dxa" w:w="60"/>
-              <w:bottom w:type="dxa" w:w="40"/>
-              <w:right w:type="dxa" w:w="60"/>
-            </w:tcMar>
-          </w:tcPr>
-          <w:p>
-            <w:pPr>
-              <w:jc w:val="right"/>
-            </w:pPr>
-            <w:r>
-              <w:rPr>
-                <w:rFonts w:ascii="Times New Roman" w:cs="Times New Roman" w:eastAsia="Times New Roman" w:hAnsi="Times New Roman"/>
-                <w:b w:val="false"/>
-                <w:bCs w:val="false"/>
-                <w:i w:val="false"/>
-                <w:iCs w:val="false"/>
-                <w:sz w:val="18"/>
-                <w:szCs w:val="18"/>
-              </w:rPr>
-              <w:t xml:space="preserve">5.3</w:t>
-            </w:r>
-          </w:p>
-        </w:tc>
-        <w:tc>
-          <w:tcPr>
-            <w:tcW w:type="dxa" w:w="1310"/>
-            <w:tcMar>
-              <w:top w:type="dxa" w:w="40"/>
-              <w:left w:type="dxa" w:w="60"/>
-              <w:bottom w:type="dxa" w:w="40"/>
-              <w:right w:type="dxa" w:w="60"/>
-            </w:tcMar>
-          </w:tcPr>
-          <w:p>
-            <w:pPr>
-              <w:jc w:val="right"/>
-            </w:pPr>
-            <w:r>
-              <w:rPr>
-                <w:rFonts w:ascii="Times New Roman" w:cs="Times New Roman" w:eastAsia="Times New Roman" w:hAnsi="Times New Roman"/>
-                <w:b w:val="false"/>
-                <w:bCs w:val="false"/>
-                <w:i w:val="false"/>
-                <w:iCs w:val="false"/>
-                <w:sz w:val="18"/>
-                <w:szCs w:val="18"/>
-              </w:rPr>
-              <w:t xml:space="preserve">7.8</w:t>
-            </w:r>
-          </w:p>
-        </w:tc>
-        <w:tc>
-          <w:tcPr>
-            <w:tcW w:type="dxa" w:w="1312"/>
-            <w:tcMar>
-              <w:top w:type="dxa" w:w="40"/>
-              <w:left w:type="dxa" w:w="60"/>
-              <w:bottom w:type="dxa" w:w="40"/>
-              <w:right w:type="dxa" w:w="60"/>
-            </w:tcMar>
-          </w:tcPr>
-          <w:p>
-            <w:pPr>
-              <w:jc w:val="right"/>
-            </w:pPr>
-            <w:r>
-              <w:rPr>
-                <w:rFonts w:ascii="Times New Roman" w:cs="Times New Roman" w:eastAsia="Times New Roman" w:hAnsi="Times New Roman"/>
-                <w:b w:val="false"/>
-                <w:bCs w:val="false"/>
-                <w:i w:val="false"/>
-                <w:iCs w:val="false"/>
-                <w:sz w:val="18"/>
-                <w:szCs w:val="18"/>
-              </w:rPr>
-              <w:t xml:space="preserve">15.6</w:t>
-            </w:r>
-          </w:p>
-        </w:tc>
-      </w:tr>
-    </w:tbl>
-    <w:p>
-      <w:pPr>
-        <w:spacing w:after="120"/>
-      </w:pPr>
-    </w:p>
-    <w:p>
-      <w:pPr>
-        <w:spacing w:after="160" w:line="360"/>
-        <w:jc w:val="both"/>
-      </w:pPr>
-      <w:r>
-        <w:rPr>
-          <w:rFonts w:ascii="Times New Roman" w:cs="Times New Roman" w:eastAsia="Times New Roman" w:hAnsi="Times New Roman"/>
-          <w:b w:val="false"/>
-          <w:bCs w:val="false"/>
-          <w:i w:val="false"/>
-          <w:iCs w:val="false"/>
-          <w:sz w:val="24"/>
-          <w:szCs w:val="24"/>
-        </w:rPr>
-        <w:t xml:space="preserve">Percentage of the state's located hazardous-sector manufacturers in each complete edition. The 1965 edition is omitted: it places 73% in Denver, an outlier against every later edition.</w:t>
-      </w:r>
-    </w:p>
-    <w:p>
-      <w:pPr>
-        <w:spacing w:after="160" w:line="360"/>
-        <w:jc w:val="both"/>
-      </w:pPr>
-      <w:r>
-        <w:rPr>
-          <w:rFonts w:ascii="Times New Roman" w:cs="Times New Roman" w:eastAsia="Times New Roman" w:hAnsi="Times New Roman"/>
-          <w:b/>
-          <w:bCs/>
-          <w:i w:val="false"/>
-          <w:iCs w:val="false"/>
-          <w:sz w:val="24"/>
-          <w:szCs w:val="24"/>
-        </w:rPr>
-        <w:t xml:space="preserve">Who lives beside it.</w:t>
-      </w:r>
-      <w:r>
-        <w:rPr>
-          <w:rFonts w:ascii="Times New Roman" w:cs="Times New Roman" w:eastAsia="Times New Roman" w:hAnsi="Times New Roman"/>
-          <w:b w:val="false"/>
-          <w:bCs w:val="false"/>
-          <w:i w:val="false"/>
-          <w:iCs w:val="false"/>
-          <w:sz w:val="24"/>
-          <w:szCs w:val="24"/>
-        </w:rPr>
-        <w:t xml:space="preserve"> For every Colorado tract with 200 or more residents in each census from 1990 (1,158 tracts), each composition measure is regressed on the tract's log density of hazardous firms of the decade, with log population density and county fixed effects (HC1 errors); as in Denver, 2000–2020 use the 1983–92 sites.</w:t>
-      </w:r>
-    </w:p>
-    <w:p>
-      <w:pPr>
-        <w:spacing w:after="80" w:before="240"/>
-      </w:pPr>
-      <w:r>
-        <w:rPr>
-          <w:rFonts w:ascii="Times New Roman" w:cs="Times New Roman" w:eastAsia="Times New Roman" w:hAnsi="Times New Roman"/>
-          <w:b/>
-          <w:bCs/>
-          <w:sz w:val="20"/>
-          <w:szCs w:val="20"/>
-        </w:rPr>
-        <w:t xml:space="preserve">Table 18. Tract composition and hazardous-firm density across Colorado, 1990–2020, by region (tracts with 200+ residents in every census from 1990)</w:t>
-      </w:r>
-    </w:p>
-    <w:tbl>
-      <w:tblPr>
-        <w:tblW w:type="dxa" w:w="9360"/>
-        <w:tblBorders>
-          <w:top w:val="single" w:sz="6"/>
-          <w:left w:val="none"/>
-          <w:bottom w:val="single" w:sz="6"/>
-          <w:right w:val="none"/>
-          <w:insideH w:val="single" w:color="BBBBBB" w:sz="2"/>
-          <w:insideV w:val="none"/>
-        </w:tblBorders>
-      </w:tblPr>
-      <w:tblGrid>
-        <w:gridCol w:w="2808"/>
-        <w:gridCol w:w="1310"/>
-        <w:gridCol w:w="1310"/>
-        <w:gridCol w:w="1310"/>
-        <w:gridCol w:w="1310"/>
-        <w:gridCol w:w="1312"/>
-      </w:tblGrid>
-      <w:tr>
-        <w:trPr>
-          <w:tblHeader/>
-        </w:trPr>
-        <w:tc>
-          <w:tcPr>
-            <w:tcW w:type="dxa" w:w="2808"/>
-            <w:shd w:fill="EDEDED" w:color="auto" w:val="clear"/>
-            <w:tcMar>
-              <w:top w:type="dxa" w:w="40"/>
-              <w:left w:type="dxa" w:w="60"/>
-              <w:bottom w:type="dxa" w:w="40"/>
-              <w:right w:type="dxa" w:w="60"/>
-            </w:tcMar>
-          </w:tcPr>
-          <w:p>
-            <w:pPr>
-              <w:jc w:val="left"/>
-            </w:pPr>
-            <w:r>
-              <w:rPr>
-                <w:rFonts w:ascii="Times New Roman" w:cs="Times New Roman" w:eastAsia="Times New Roman" w:hAnsi="Times New Roman"/>
-                <w:b/>
-                <w:bCs/>
-                <w:i w:val="false"/>
-                <w:iCs w:val="false"/>
-                <w:sz w:val="18"/>
-                <w:szCs w:val="18"/>
-              </w:rPr>
-              <w:t xml:space="preserve">region (tracts)</w:t>
-            </w:r>
-          </w:p>
-        </w:tc>
-        <w:tc>
-          <w:tcPr>
-            <w:tcW w:type="dxa" w:w="1310"/>
-            <w:shd w:fill="EDEDED" w:color="auto" w:val="clear"/>
-            <w:tcMar>
-              <w:top w:type="dxa" w:w="40"/>
-              <w:left w:type="dxa" w:w="60"/>
-              <w:bottom w:type="dxa" w:w="40"/>
-              <w:right w:type="dxa" w:w="60"/>
-            </w:tcMar>
-          </w:tcPr>
-          <w:p>
-            <w:pPr>
-              <w:jc w:val="right"/>
-            </w:pPr>
-            <w:r>
-              <w:rPr>
-                <w:rFonts w:ascii="Times New Roman" w:cs="Times New Roman" w:eastAsia="Times New Roman" w:hAnsi="Times New Roman"/>
-                <w:b/>
-                <w:bCs/>
-                <w:i w:val="false"/>
-                <w:iCs w:val="false"/>
-                <w:sz w:val="18"/>
-                <w:szCs w:val="18"/>
-              </w:rPr>
-              <w:t xml:space="preserve">outcome</w:t>
-            </w:r>
-          </w:p>
-        </w:tc>
-        <w:tc>
-          <w:tcPr>
-            <w:tcW w:type="dxa" w:w="1310"/>
-            <w:shd w:fill="EDEDED" w:color="auto" w:val="clear"/>
-            <w:tcMar>
-              <w:top w:type="dxa" w:w="40"/>
-              <w:left w:type="dxa" w:w="60"/>
-              <w:bottom w:type="dxa" w:w="40"/>
-              <w:right w:type="dxa" w:w="60"/>
-            </w:tcMar>
-          </w:tcPr>
-          <w:p>
-            <w:pPr>
-              <w:jc w:val="right"/>
-            </w:pPr>
-            <w:r>
-              <w:rPr>
-                <w:rFonts w:ascii="Times New Roman" w:cs="Times New Roman" w:eastAsia="Times New Roman" w:hAnsi="Times New Roman"/>
-                <w:b/>
-                <w:bCs/>
-                <w:i w:val="false"/>
-                <w:iCs w:val="false"/>
-                <w:sz w:val="18"/>
-                <w:szCs w:val="18"/>
-              </w:rPr>
-              <w:t xml:space="preserve">1990</w:t>
-            </w:r>
-          </w:p>
-        </w:tc>
-        <w:tc>
-          <w:tcPr>
-            <w:tcW w:type="dxa" w:w="1310"/>
-            <w:shd w:fill="EDEDED" w:color="auto" w:val="clear"/>
-            <w:tcMar>
-              <w:top w:type="dxa" w:w="40"/>
-              <w:left w:type="dxa" w:w="60"/>
-              <w:bottom w:type="dxa" w:w="40"/>
-              <w:right w:type="dxa" w:w="60"/>
-            </w:tcMar>
-          </w:tcPr>
-          <w:p>
-            <w:pPr>
-              <w:jc w:val="right"/>
-            </w:pPr>
-            <w:r>
-              <w:rPr>
-                <w:rFonts w:ascii="Times New Roman" w:cs="Times New Roman" w:eastAsia="Times New Roman" w:hAnsi="Times New Roman"/>
-                <w:b/>
-                <w:bCs/>
-                <w:i w:val="false"/>
-                <w:iCs w:val="false"/>
-                <w:sz w:val="18"/>
-                <w:szCs w:val="18"/>
-              </w:rPr>
-              <w:t xml:space="preserve">2000</w:t>
-            </w:r>
-          </w:p>
-        </w:tc>
-        <w:tc>
-          <w:tcPr>
-            <w:tcW w:type="dxa" w:w="1310"/>
-            <w:shd w:fill="EDEDED" w:color="auto" w:val="clear"/>
-            <w:tcMar>
-              <w:top w:type="dxa" w:w="40"/>
-              <w:left w:type="dxa" w:w="60"/>
-              <w:bottom w:type="dxa" w:w="40"/>
-              <w:right w:type="dxa" w:w="60"/>
-            </w:tcMar>
-          </w:tcPr>
-          <w:p>
-            <w:pPr>
-              <w:jc w:val="right"/>
-            </w:pPr>
-            <w:r>
-              <w:rPr>
-                <w:rFonts w:ascii="Times New Roman" w:cs="Times New Roman" w:eastAsia="Times New Roman" w:hAnsi="Times New Roman"/>
-                <w:b/>
-                <w:bCs/>
-                <w:i w:val="false"/>
-                <w:iCs w:val="false"/>
-                <w:sz w:val="18"/>
-                <w:szCs w:val="18"/>
-              </w:rPr>
-              <w:t xml:space="preserve">2010</w:t>
-            </w:r>
-          </w:p>
-        </w:tc>
-        <w:tc>
-          <w:tcPr>
-            <w:tcW w:type="dxa" w:w="1312"/>
-            <w:shd w:fill="EDEDED" w:color="auto" w:val="clear"/>
-            <w:tcMar>
-              <w:top w:type="dxa" w:w="40"/>
-              <w:left w:type="dxa" w:w="60"/>
-              <w:bottom w:type="dxa" w:w="40"/>
-              <w:right w:type="dxa" w:w="60"/>
-            </w:tcMar>
-          </w:tcPr>
-          <w:p>
-            <w:pPr>
-              <w:jc w:val="right"/>
-            </w:pPr>
-            <w:r>
-              <w:rPr>
-                <w:rFonts w:ascii="Times New Roman" w:cs="Times New Roman" w:eastAsia="Times New Roman" w:hAnsi="Times New Roman"/>
-                <w:b/>
-                <w:bCs/>
-                <w:i w:val="false"/>
-                <w:iCs w:val="false"/>
-                <w:sz w:val="18"/>
-                <w:szCs w:val="18"/>
-              </w:rPr>
-              <w:t xml:space="preserve">2020</w:t>
-            </w:r>
-          </w:p>
-        </w:tc>
-      </w:tr>
-      <w:tr>
-        <w:trPr>
-          <w:tblHeader w:val="false"/>
-        </w:trPr>
-        <w:tc>
-          <w:tcPr>
-            <w:tcW w:type="dxa" w:w="2808"/>
-            <w:tcMar>
-              <w:top w:type="dxa" w:w="40"/>
-              <w:left w:type="dxa" w:w="60"/>
-              <w:bottom w:type="dxa" w:w="40"/>
-              <w:right w:type="dxa" w:w="60"/>
-            </w:tcMar>
-          </w:tcPr>
-          <w:p>
-            <w:pPr>
-              <w:jc w:val="left"/>
-            </w:pPr>
-            <w:r>
-              <w:rPr>
-                <w:rFonts w:ascii="Times New Roman" w:cs="Times New Roman" w:eastAsia="Times New Roman" w:hAnsi="Times New Roman"/>
-                <w:b w:val="false"/>
-                <w:bCs w:val="false"/>
-                <w:i w:val="false"/>
-                <w:iCs w:val="false"/>
-                <w:sz w:val="18"/>
-                <w:szCs w:val="18"/>
-              </w:rPr>
-              <w:t xml:space="preserve">Colorado (1,158)</w:t>
-            </w:r>
-          </w:p>
-        </w:tc>
-        <w:tc>
-          <w:tcPr>
-            <w:tcW w:type="dxa" w:w="1310"/>
-            <w:tcMar>
-              <w:top w:type="dxa" w:w="40"/>
-              <w:left w:type="dxa" w:w="60"/>
-              <w:bottom w:type="dxa" w:w="40"/>
-              <w:right w:type="dxa" w:w="60"/>
-            </w:tcMar>
-          </w:tcPr>
-          <w:p>
-            <w:pPr>
-              <w:jc w:val="right"/>
-            </w:pPr>
-            <w:r>
-              <w:rPr>
-                <w:rFonts w:ascii="Times New Roman" w:cs="Times New Roman" w:eastAsia="Times New Roman" w:hAnsi="Times New Roman"/>
-                <w:b w:val="false"/>
-                <w:bCs w:val="false"/>
-                <w:i w:val="false"/>
-                <w:iCs w:val="false"/>
-                <w:sz w:val="18"/>
-                <w:szCs w:val="18"/>
-              </w:rPr>
-              <w:t xml:space="preserve">% Hispanic</w:t>
-            </w:r>
-          </w:p>
-        </w:tc>
-        <w:tc>
-          <w:tcPr>
-            <w:tcW w:type="dxa" w:w="1310"/>
-            <w:tcMar>
-              <w:top w:type="dxa" w:w="40"/>
-              <w:left w:type="dxa" w:w="60"/>
-              <w:bottom w:type="dxa" w:w="40"/>
-              <w:right w:type="dxa" w:w="60"/>
-            </w:tcMar>
-          </w:tcPr>
-          <w:p>
-            <w:pPr>
-              <w:jc w:val="right"/>
-            </w:pPr>
-            <w:r>
-              <w:rPr>
-                <w:rFonts w:ascii="Times New Roman" w:cs="Times New Roman" w:eastAsia="Times New Roman" w:hAnsi="Times New Roman"/>
-                <w:b w:val="false"/>
-                <w:bCs w:val="false"/>
-                <w:i w:val="false"/>
-                <w:iCs w:val="false"/>
-                <w:sz w:val="18"/>
-                <w:szCs w:val="18"/>
-              </w:rPr>
-              <w:t xml:space="preserve">+8.3***</w:t>
-            </w:r>
-          </w:p>
-        </w:tc>
-        <w:tc>
-          <w:tcPr>
-            <w:tcW w:type="dxa" w:w="1310"/>
-            <w:tcMar>
-              <w:top w:type="dxa" w:w="40"/>
-              <w:left w:type="dxa" w:w="60"/>
-              <w:bottom w:type="dxa" w:w="40"/>
-              <w:right w:type="dxa" w:w="60"/>
-            </w:tcMar>
-          </w:tcPr>
-          <w:p>
-            <w:pPr>
-              <w:jc w:val="right"/>
-            </w:pPr>
-            <w:r>
-              <w:rPr>
-                <w:rFonts w:ascii="Times New Roman" w:cs="Times New Roman" w:eastAsia="Times New Roman" w:hAnsi="Times New Roman"/>
-                <w:b w:val="false"/>
-                <w:bCs w:val="false"/>
-                <w:i w:val="false"/>
-                <w:iCs w:val="false"/>
-                <w:sz w:val="18"/>
-                <w:szCs w:val="18"/>
-              </w:rPr>
-              <w:t xml:space="preserve">+9.7***</w:t>
-            </w:r>
-          </w:p>
-        </w:tc>
-        <w:tc>
-          <w:tcPr>
-            <w:tcW w:type="dxa" w:w="1310"/>
-            <w:tcMar>
-              <w:top w:type="dxa" w:w="40"/>
-              <w:left w:type="dxa" w:w="60"/>
-              <w:bottom w:type="dxa" w:w="40"/>
-              <w:right w:type="dxa" w:w="60"/>
-            </w:tcMar>
-          </w:tcPr>
-          <w:p>
-            <w:pPr>
-              <w:jc w:val="right"/>
-            </w:pPr>
-            <w:r>
-              <w:rPr>
-                <w:rFonts w:ascii="Times New Roman" w:cs="Times New Roman" w:eastAsia="Times New Roman" w:hAnsi="Times New Roman"/>
-                <w:b w:val="false"/>
-                <w:bCs w:val="false"/>
-                <w:i w:val="false"/>
-                <w:iCs w:val="false"/>
-                <w:sz w:val="18"/>
-                <w:szCs w:val="18"/>
-              </w:rPr>
-              <w:t xml:space="preserve">+8.3***</w:t>
-            </w:r>
-          </w:p>
-        </w:tc>
-        <w:tc>
-          <w:tcPr>
-            <w:tcW w:type="dxa" w:w="1312"/>
-            <w:tcMar>
-              <w:top w:type="dxa" w:w="40"/>
-              <w:left w:type="dxa" w:w="60"/>
-              <w:bottom w:type="dxa" w:w="40"/>
-              <w:right w:type="dxa" w:w="60"/>
-            </w:tcMar>
-          </w:tcPr>
-          <w:p>
-            <w:pPr>
-              <w:jc w:val="right"/>
-            </w:pPr>
-            <w:r>
-              <w:rPr>
-                <w:rFonts w:ascii="Times New Roman" w:cs="Times New Roman" w:eastAsia="Times New Roman" w:hAnsi="Times New Roman"/>
-                <w:b w:val="false"/>
-                <w:bCs w:val="false"/>
-                <w:i w:val="false"/>
-                <w:iCs w:val="false"/>
-                <w:sz w:val="18"/>
-                <w:szCs w:val="18"/>
-              </w:rPr>
-              <w:t xml:space="preserve">+5.1***</w:t>
-            </w:r>
-          </w:p>
-        </w:tc>
-      </w:tr>
-      <w:tr>
-        <w:trPr>
-          <w:tblHeader w:val="false"/>
-        </w:trPr>
-        <w:tc>
-          <w:tcPr>
-            <w:tcW w:type="dxa" w:w="2808"/>
-            <w:tcMar>
-              <w:top w:type="dxa" w:w="40"/>
-              <w:left w:type="dxa" w:w="60"/>
-              <w:bottom w:type="dxa" w:w="40"/>
-              <w:right w:type="dxa" w:w="60"/>
-            </w:tcMar>
-          </w:tcPr>
-          <w:p>
-            <w:pPr>
-              <w:jc w:val="left"/>
-            </w:pPr>
-            <w:r>
-              <w:rPr>
-                <w:rFonts w:ascii="Times New Roman" w:cs="Times New Roman" w:eastAsia="Times New Roman" w:hAnsi="Times New Roman"/>
-                <w:b w:val="false"/>
-                <w:bCs w:val="false"/>
-                <w:i w:val="false"/>
-                <w:iCs w:val="false"/>
-                <w:sz w:val="18"/>
-                <w:szCs w:val="18"/>
-              </w:rPr>
-              <w:t xml:space="preserve">Denver (137)</w:t>
-            </w:r>
-          </w:p>
-        </w:tc>
-        <w:tc>
-          <w:tcPr>
-            <w:tcW w:type="dxa" w:w="1310"/>
-            <w:tcMar>
-              <w:top w:type="dxa" w:w="40"/>
-              <w:left w:type="dxa" w:w="60"/>
-              <w:bottom w:type="dxa" w:w="40"/>
-              <w:right w:type="dxa" w:w="60"/>
-            </w:tcMar>
-          </w:tcPr>
-          <w:p>
-            <w:pPr>
-              <w:jc w:val="right"/>
-            </w:pPr>
-            <w:r>
-              <w:rPr>
-                <w:rFonts w:ascii="Times New Roman" w:cs="Times New Roman" w:eastAsia="Times New Roman" w:hAnsi="Times New Roman"/>
-                <w:b w:val="false"/>
-                <w:bCs w:val="false"/>
-                <w:i w:val="false"/>
-                <w:iCs w:val="false"/>
-                <w:sz w:val="18"/>
-                <w:szCs w:val="18"/>
-              </w:rPr>
-              <w:t xml:space="preserve">% Hispanic</w:t>
-            </w:r>
-          </w:p>
-        </w:tc>
-        <w:tc>
-          <w:tcPr>
-            <w:tcW w:type="dxa" w:w="1310"/>
-            <w:tcMar>
-              <w:top w:type="dxa" w:w="40"/>
-              <w:left w:type="dxa" w:w="60"/>
-              <w:bottom w:type="dxa" w:w="40"/>
-              <w:right w:type="dxa" w:w="60"/>
-            </w:tcMar>
-          </w:tcPr>
-          <w:p>
-            <w:pPr>
-              <w:jc w:val="right"/>
-            </w:pPr>
-            <w:r>
-              <w:rPr>
-                <w:rFonts w:ascii="Times New Roman" w:cs="Times New Roman" w:eastAsia="Times New Roman" w:hAnsi="Times New Roman"/>
-                <w:b w:val="false"/>
-                <w:bCs w:val="false"/>
-                <w:i w:val="false"/>
-                <w:iCs w:val="false"/>
-                <w:sz w:val="18"/>
-                <w:szCs w:val="18"/>
-              </w:rPr>
-              <w:t xml:space="preserve">+16.5***</w:t>
-            </w:r>
-          </w:p>
-        </w:tc>
-        <w:tc>
-          <w:tcPr>
-            <w:tcW w:type="dxa" w:w="1310"/>
-            <w:tcMar>
-              <w:top w:type="dxa" w:w="40"/>
-              <w:left w:type="dxa" w:w="60"/>
-              <w:bottom w:type="dxa" w:w="40"/>
-              <w:right w:type="dxa" w:w="60"/>
-            </w:tcMar>
-          </w:tcPr>
-          <w:p>
-            <w:pPr>
-              <w:jc w:val="right"/>
-            </w:pPr>
-            <w:r>
-              <w:rPr>
-                <w:rFonts w:ascii="Times New Roman" w:cs="Times New Roman" w:eastAsia="Times New Roman" w:hAnsi="Times New Roman"/>
-                <w:b w:val="false"/>
-                <w:bCs w:val="false"/>
-                <w:i w:val="false"/>
-                <w:iCs w:val="false"/>
-                <w:sz w:val="18"/>
-                <w:szCs w:val="18"/>
-              </w:rPr>
-              <w:t xml:space="preserve">+16.6***</w:t>
-            </w:r>
-          </w:p>
-        </w:tc>
-        <w:tc>
-          <w:tcPr>
-            <w:tcW w:type="dxa" w:w="1310"/>
-            <w:tcMar>
-              <w:top w:type="dxa" w:w="40"/>
-              <w:left w:type="dxa" w:w="60"/>
-              <w:bottom w:type="dxa" w:w="40"/>
-              <w:right w:type="dxa" w:w="60"/>
-            </w:tcMar>
-          </w:tcPr>
-          <w:p>
-            <w:pPr>
-              <w:jc w:val="right"/>
-            </w:pPr>
-            <w:r>
-              <w:rPr>
-                <w:rFonts w:ascii="Times New Roman" w:cs="Times New Roman" w:eastAsia="Times New Roman" w:hAnsi="Times New Roman"/>
-                <w:b w:val="false"/>
-                <w:bCs w:val="false"/>
-                <w:i w:val="false"/>
-                <w:iCs w:val="false"/>
-                <w:sz w:val="18"/>
-                <w:szCs w:val="18"/>
-              </w:rPr>
-              <w:t xml:space="preserve">+10.0***</w:t>
-            </w:r>
-          </w:p>
-        </w:tc>
-        <w:tc>
-          <w:tcPr>
-            <w:tcW w:type="dxa" w:w="1312"/>
-            <w:tcMar>
-              <w:top w:type="dxa" w:w="40"/>
-              <w:left w:type="dxa" w:w="60"/>
-              <w:bottom w:type="dxa" w:w="40"/>
-              <w:right w:type="dxa" w:w="60"/>
-            </w:tcMar>
-          </w:tcPr>
-          <w:p>
-            <w:pPr>
-              <w:jc w:val="right"/>
-            </w:pPr>
-            <w:r>
-              <w:rPr>
-                <w:rFonts w:ascii="Times New Roman" w:cs="Times New Roman" w:eastAsia="Times New Roman" w:hAnsi="Times New Roman"/>
-                <w:b w:val="false"/>
-                <w:bCs w:val="false"/>
-                <w:i w:val="false"/>
-                <w:iCs w:val="false"/>
-                <w:sz w:val="18"/>
-                <w:szCs w:val="18"/>
-              </w:rPr>
-              <w:t xml:space="preserve">+3.3</w:t>
-            </w:r>
-          </w:p>
-        </w:tc>
-      </w:tr>
-      <w:tr>
-        <w:trPr>
-          <w:tblHeader w:val="false"/>
-        </w:trPr>
-        <w:tc>
-          <w:tcPr>
-            <w:tcW w:type="dxa" w:w="2808"/>
-            <w:tcMar>
-              <w:top w:type="dxa" w:w="40"/>
-              <w:left w:type="dxa" w:w="60"/>
-              <w:bottom w:type="dxa" w:w="40"/>
-              <w:right w:type="dxa" w:w="60"/>
-            </w:tcMar>
-          </w:tcPr>
-          <w:p>
-            <w:pPr>
-              <w:jc w:val="left"/>
-            </w:pPr>
-            <w:r>
-              <w:rPr>
-                <w:rFonts w:ascii="Times New Roman" w:cs="Times New Roman" w:eastAsia="Times New Roman" w:hAnsi="Times New Roman"/>
-                <w:b w:val="false"/>
-                <w:bCs w:val="false"/>
-                <w:i w:val="false"/>
-                <w:iCs w:val="false"/>
-                <w:sz w:val="18"/>
-                <w:szCs w:val="18"/>
-              </w:rPr>
-              <w:t xml:space="preserve">Denver suburbs (413)</w:t>
-            </w:r>
-          </w:p>
-        </w:tc>
-        <w:tc>
-          <w:tcPr>
-            <w:tcW w:type="dxa" w:w="1310"/>
-            <w:tcMar>
-              <w:top w:type="dxa" w:w="40"/>
-              <w:left w:type="dxa" w:w="60"/>
-              <w:bottom w:type="dxa" w:w="40"/>
-              <w:right w:type="dxa" w:w="60"/>
-            </w:tcMar>
-          </w:tcPr>
-          <w:p>
-            <w:pPr>
-              <w:jc w:val="right"/>
-            </w:pPr>
-            <w:r>
-              <w:rPr>
-                <w:rFonts w:ascii="Times New Roman" w:cs="Times New Roman" w:eastAsia="Times New Roman" w:hAnsi="Times New Roman"/>
-                <w:b w:val="false"/>
-                <w:bCs w:val="false"/>
-                <w:i w:val="false"/>
-                <w:iCs w:val="false"/>
-                <w:sz w:val="18"/>
-                <w:szCs w:val="18"/>
-              </w:rPr>
-              <w:t xml:space="preserve">% Hispanic</w:t>
-            </w:r>
-          </w:p>
-        </w:tc>
-        <w:tc>
-          <w:tcPr>
-            <w:tcW w:type="dxa" w:w="1310"/>
-            <w:tcMar>
-              <w:top w:type="dxa" w:w="40"/>
-              <w:left w:type="dxa" w:w="60"/>
-              <w:bottom w:type="dxa" w:w="40"/>
-              <w:right w:type="dxa" w:w="60"/>
-            </w:tcMar>
-          </w:tcPr>
-          <w:p>
-            <w:pPr>
-              <w:jc w:val="right"/>
-            </w:pPr>
-            <w:r>
-              <w:rPr>
-                <w:rFonts w:ascii="Times New Roman" w:cs="Times New Roman" w:eastAsia="Times New Roman" w:hAnsi="Times New Roman"/>
-                <w:b w:val="false"/>
-                <w:bCs w:val="false"/>
-                <w:i w:val="false"/>
-                <w:iCs w:val="false"/>
-                <w:sz w:val="18"/>
-                <w:szCs w:val="18"/>
-              </w:rPr>
-              <w:t xml:space="preserve">+3.3***</w:t>
-            </w:r>
-          </w:p>
-        </w:tc>
-        <w:tc>
-          <w:tcPr>
-            <w:tcW w:type="dxa" w:w="1310"/>
-            <w:tcMar>
-              <w:top w:type="dxa" w:w="40"/>
-              <w:left w:type="dxa" w:w="60"/>
-              <w:bottom w:type="dxa" w:w="40"/>
-              <w:right w:type="dxa" w:w="60"/>
-            </w:tcMar>
-          </w:tcPr>
-          <w:p>
-            <w:pPr>
-              <w:jc w:val="right"/>
-            </w:pPr>
-            <w:r>
-              <w:rPr>
-                <w:rFonts w:ascii="Times New Roman" w:cs="Times New Roman" w:eastAsia="Times New Roman" w:hAnsi="Times New Roman"/>
-                <w:b w:val="false"/>
-                <w:bCs w:val="false"/>
-                <w:i w:val="false"/>
-                <w:iCs w:val="false"/>
-                <w:sz w:val="18"/>
-                <w:szCs w:val="18"/>
-              </w:rPr>
-              <w:t xml:space="preserve">+6.8***</w:t>
-            </w:r>
-          </w:p>
-        </w:tc>
-        <w:tc>
-          <w:tcPr>
-            <w:tcW w:type="dxa" w:w="1310"/>
-            <w:tcMar>
-              <w:top w:type="dxa" w:w="40"/>
-              <w:left w:type="dxa" w:w="60"/>
-              <w:bottom w:type="dxa" w:w="40"/>
-              <w:right w:type="dxa" w:w="60"/>
-            </w:tcMar>
-          </w:tcPr>
-          <w:p>
-            <w:pPr>
-              <w:jc w:val="right"/>
-            </w:pPr>
-            <w:r>
-              <w:rPr>
-                <w:rFonts w:ascii="Times New Roman" w:cs="Times New Roman" w:eastAsia="Times New Roman" w:hAnsi="Times New Roman"/>
-                <w:b w:val="false"/>
-                <w:bCs w:val="false"/>
-                <w:i w:val="false"/>
-                <w:iCs w:val="false"/>
-                <w:sz w:val="18"/>
-                <w:szCs w:val="18"/>
-              </w:rPr>
-              <w:t xml:space="preserve">+8.4***</w:t>
-            </w:r>
-          </w:p>
-        </w:tc>
-        <w:tc>
-          <w:tcPr>
-            <w:tcW w:type="dxa" w:w="1312"/>
-            <w:tcMar>
-              <w:top w:type="dxa" w:w="40"/>
-              <w:left w:type="dxa" w:w="60"/>
-              <w:bottom w:type="dxa" w:w="40"/>
-              <w:right w:type="dxa" w:w="60"/>
-            </w:tcMar>
-          </w:tcPr>
-          <w:p>
-            <w:pPr>
-              <w:jc w:val="right"/>
-            </w:pPr>
-            <w:r>
-              <w:rPr>
-                <w:rFonts w:ascii="Times New Roman" w:cs="Times New Roman" w:eastAsia="Times New Roman" w:hAnsi="Times New Roman"/>
-                <w:b w:val="false"/>
-                <w:bCs w:val="false"/>
-                <w:i w:val="false"/>
-                <w:iCs w:val="false"/>
-                <w:sz w:val="18"/>
-                <w:szCs w:val="18"/>
-              </w:rPr>
-              <w:t xml:space="preserve">+7.0***</w:t>
-            </w:r>
-          </w:p>
-        </w:tc>
-      </w:tr>
-      <w:tr>
-        <w:trPr>
-          <w:tblHeader w:val="false"/>
-        </w:trPr>
-        <w:tc>
-          <w:tcPr>
-            <w:tcW w:type="dxa" w:w="2808"/>
-            <w:tcMar>
-              <w:top w:type="dxa" w:w="40"/>
-              <w:left w:type="dxa" w:w="60"/>
-              <w:bottom w:type="dxa" w:w="40"/>
-              <w:right w:type="dxa" w:w="60"/>
-            </w:tcMar>
-          </w:tcPr>
-          <w:p>
-            <w:pPr>
-              <w:jc w:val="left"/>
-            </w:pPr>
-            <w:r>
-              <w:rPr>
-                <w:rFonts w:ascii="Times New Roman" w:cs="Times New Roman" w:eastAsia="Times New Roman" w:hAnsi="Times New Roman"/>
-                <w:b w:val="false"/>
-                <w:bCs w:val="false"/>
-                <w:i w:val="false"/>
-                <w:iCs w:val="false"/>
-                <w:sz w:val="18"/>
-                <w:szCs w:val="18"/>
-              </w:rPr>
-              <w:t xml:space="preserve">Boulder, Larimer, Weld (193)</w:t>
-            </w:r>
-          </w:p>
-        </w:tc>
-        <w:tc>
-          <w:tcPr>
-            <w:tcW w:type="dxa" w:w="1310"/>
-            <w:tcMar>
-              <w:top w:type="dxa" w:w="40"/>
-              <w:left w:type="dxa" w:w="60"/>
-              <w:bottom w:type="dxa" w:w="40"/>
-              <w:right w:type="dxa" w:w="60"/>
-            </w:tcMar>
-          </w:tcPr>
-          <w:p>
-            <w:pPr>
-              <w:jc w:val="right"/>
-            </w:pPr>
-            <w:r>
-              <w:rPr>
-                <w:rFonts w:ascii="Times New Roman" w:cs="Times New Roman" w:eastAsia="Times New Roman" w:hAnsi="Times New Roman"/>
-                <w:b w:val="false"/>
-                <w:bCs w:val="false"/>
-                <w:i w:val="false"/>
-                <w:iCs w:val="false"/>
-                <w:sz w:val="18"/>
-                <w:szCs w:val="18"/>
-              </w:rPr>
-              <w:t xml:space="preserve">% Hispanic</w:t>
-            </w:r>
-          </w:p>
-        </w:tc>
-        <w:tc>
-          <w:tcPr>
-            <w:tcW w:type="dxa" w:w="1310"/>
-            <w:tcMar>
-              <w:top w:type="dxa" w:w="40"/>
-              <w:left w:type="dxa" w:w="60"/>
-              <w:bottom w:type="dxa" w:w="40"/>
-              <w:right w:type="dxa" w:w="60"/>
-            </w:tcMar>
-          </w:tcPr>
-          <w:p>
-            <w:pPr>
-              <w:jc w:val="right"/>
-            </w:pPr>
-            <w:r>
-              <w:rPr>
-                <w:rFonts w:ascii="Times New Roman" w:cs="Times New Roman" w:eastAsia="Times New Roman" w:hAnsi="Times New Roman"/>
-                <w:b w:val="false"/>
-                <w:bCs w:val="false"/>
-                <w:i w:val="false"/>
-                <w:iCs w:val="false"/>
-                <w:sz w:val="18"/>
-                <w:szCs w:val="18"/>
-              </w:rPr>
-              <w:t xml:space="preserve">+5.5**</w:t>
-            </w:r>
-          </w:p>
-        </w:tc>
-        <w:tc>
-          <w:tcPr>
-            <w:tcW w:type="dxa" w:w="1310"/>
-            <w:tcMar>
-              <w:top w:type="dxa" w:w="40"/>
-              <w:left w:type="dxa" w:w="60"/>
-              <w:bottom w:type="dxa" w:w="40"/>
-              <w:right w:type="dxa" w:w="60"/>
-            </w:tcMar>
-          </w:tcPr>
-          <w:p>
-            <w:pPr>
-              <w:jc w:val="right"/>
-            </w:pPr>
-            <w:r>
-              <w:rPr>
-                <w:rFonts w:ascii="Times New Roman" w:cs="Times New Roman" w:eastAsia="Times New Roman" w:hAnsi="Times New Roman"/>
-                <w:b w:val="false"/>
-                <w:bCs w:val="false"/>
-                <w:i w:val="false"/>
-                <w:iCs w:val="false"/>
-                <w:sz w:val="18"/>
-                <w:szCs w:val="18"/>
-              </w:rPr>
-              <w:t xml:space="preserve">+8.3***</w:t>
-            </w:r>
-          </w:p>
-        </w:tc>
-        <w:tc>
-          <w:tcPr>
-            <w:tcW w:type="dxa" w:w="1310"/>
-            <w:tcMar>
-              <w:top w:type="dxa" w:w="40"/>
-              <w:left w:type="dxa" w:w="60"/>
-              <w:bottom w:type="dxa" w:w="40"/>
-              <w:right w:type="dxa" w:w="60"/>
-            </w:tcMar>
-          </w:tcPr>
-          <w:p>
-            <w:pPr>
-              <w:jc w:val="right"/>
-            </w:pPr>
-            <w:r>
-              <w:rPr>
-                <w:rFonts w:ascii="Times New Roman" w:cs="Times New Roman" w:eastAsia="Times New Roman" w:hAnsi="Times New Roman"/>
-                <w:b w:val="false"/>
-                <w:bCs w:val="false"/>
-                <w:i w:val="false"/>
-                <w:iCs w:val="false"/>
-                <w:sz w:val="18"/>
-                <w:szCs w:val="18"/>
-              </w:rPr>
-              <w:t xml:space="preserve">+8.9***</w:t>
-            </w:r>
-          </w:p>
-        </w:tc>
-        <w:tc>
-          <w:tcPr>
-            <w:tcW w:type="dxa" w:w="1312"/>
-            <w:tcMar>
-              <w:top w:type="dxa" w:w="40"/>
-              <w:left w:type="dxa" w:w="60"/>
-              <w:bottom w:type="dxa" w:w="40"/>
-              <w:right w:type="dxa" w:w="60"/>
-            </w:tcMar>
-          </w:tcPr>
-          <w:p>
-            <w:pPr>
-              <w:jc w:val="right"/>
-            </w:pPr>
-            <w:r>
-              <w:rPr>
-                <w:rFonts w:ascii="Times New Roman" w:cs="Times New Roman" w:eastAsia="Times New Roman" w:hAnsi="Times New Roman"/>
-                <w:b w:val="false"/>
-                <w:bCs w:val="false"/>
-                <w:i w:val="false"/>
-                <w:iCs w:val="false"/>
-                <w:sz w:val="18"/>
-                <w:szCs w:val="18"/>
-              </w:rPr>
-              <w:t xml:space="preserve">+6.1**</w:t>
-            </w:r>
-          </w:p>
-        </w:tc>
-      </w:tr>
-      <w:tr>
-        <w:trPr>
-          <w:tblHeader w:val="false"/>
-        </w:trPr>
-        <w:tc>
-          <w:tcPr>
-            <w:tcW w:type="dxa" w:w="2808"/>
-            <w:tcMar>
-              <w:top w:type="dxa" w:w="40"/>
-              <w:left w:type="dxa" w:w="60"/>
-              <w:bottom w:type="dxa" w:w="40"/>
-              <w:right w:type="dxa" w:w="60"/>
-            </w:tcMar>
-          </w:tcPr>
-          <w:p>
-            <w:pPr>
-              <w:jc w:val="left"/>
-            </w:pPr>
-            <w:r>
-              <w:rPr>
-                <w:rFonts w:ascii="Times New Roman" w:cs="Times New Roman" w:eastAsia="Times New Roman" w:hAnsi="Times New Roman"/>
-                <w:b w:val="false"/>
-                <w:bCs w:val="false"/>
-                <w:i w:val="false"/>
-                <w:iCs w:val="false"/>
-                <w:sz w:val="18"/>
-                <w:szCs w:val="18"/>
-              </w:rPr>
-              <w:t xml:space="preserve">Colorado Springs (124)</w:t>
-            </w:r>
-          </w:p>
-        </w:tc>
-        <w:tc>
-          <w:tcPr>
-            <w:tcW w:type="dxa" w:w="1310"/>
-            <w:tcMar>
-              <w:top w:type="dxa" w:w="40"/>
-              <w:left w:type="dxa" w:w="60"/>
-              <w:bottom w:type="dxa" w:w="40"/>
-              <w:right w:type="dxa" w:w="60"/>
-            </w:tcMar>
-          </w:tcPr>
-          <w:p>
-            <w:pPr>
-              <w:jc w:val="right"/>
-            </w:pPr>
-            <w:r>
-              <w:rPr>
-                <w:rFonts w:ascii="Times New Roman" w:cs="Times New Roman" w:eastAsia="Times New Roman" w:hAnsi="Times New Roman"/>
-                <w:b w:val="false"/>
-                <w:bCs w:val="false"/>
-                <w:i w:val="false"/>
-                <w:iCs w:val="false"/>
-                <w:sz w:val="18"/>
-                <w:szCs w:val="18"/>
-              </w:rPr>
-              <w:t xml:space="preserve">% Hispanic</w:t>
-            </w:r>
-          </w:p>
-        </w:tc>
-        <w:tc>
-          <w:tcPr>
-            <w:tcW w:type="dxa" w:w="1310"/>
-            <w:tcMar>
-              <w:top w:type="dxa" w:w="40"/>
-              <w:left w:type="dxa" w:w="60"/>
-              <w:bottom w:type="dxa" w:w="40"/>
-              <w:right w:type="dxa" w:w="60"/>
-            </w:tcMar>
-          </w:tcPr>
-          <w:p>
-            <w:pPr>
-              <w:jc w:val="right"/>
-            </w:pPr>
-            <w:r>
-              <w:rPr>
-                <w:rFonts w:ascii="Times New Roman" w:cs="Times New Roman" w:eastAsia="Times New Roman" w:hAnsi="Times New Roman"/>
-                <w:b w:val="false"/>
-                <w:bCs w:val="false"/>
-                <w:i w:val="false"/>
-                <w:iCs w:val="false"/>
-                <w:sz w:val="18"/>
-                <w:szCs w:val="18"/>
-              </w:rPr>
-              <w:t xml:space="preserve">+3.1***</w:t>
-            </w:r>
-          </w:p>
-        </w:tc>
-        <w:tc>
-          <w:tcPr>
-            <w:tcW w:type="dxa" w:w="1310"/>
-            <w:tcMar>
-              <w:top w:type="dxa" w:w="40"/>
-              <w:left w:type="dxa" w:w="60"/>
-              <w:bottom w:type="dxa" w:w="40"/>
-              <w:right w:type="dxa" w:w="60"/>
-            </w:tcMar>
-          </w:tcPr>
-          <w:p>
-            <w:pPr>
-              <w:jc w:val="right"/>
-            </w:pPr>
-            <w:r>
-              <w:rPr>
-                <w:rFonts w:ascii="Times New Roman" w:cs="Times New Roman" w:eastAsia="Times New Roman" w:hAnsi="Times New Roman"/>
-                <w:b w:val="false"/>
-                <w:bCs w:val="false"/>
-                <w:i w:val="false"/>
-                <w:iCs w:val="false"/>
-                <w:sz w:val="18"/>
-                <w:szCs w:val="18"/>
-              </w:rPr>
-              <w:t xml:space="preserve">+4.0**</w:t>
-            </w:r>
-          </w:p>
-        </w:tc>
-        <w:tc>
-          <w:tcPr>
-            <w:tcW w:type="dxa" w:w="1310"/>
-            <w:tcMar>
-              <w:top w:type="dxa" w:w="40"/>
-              <w:left w:type="dxa" w:w="60"/>
-              <w:bottom w:type="dxa" w:w="40"/>
-              <w:right w:type="dxa" w:w="60"/>
-            </w:tcMar>
-          </w:tcPr>
-          <w:p>
-            <w:pPr>
-              <w:jc w:val="right"/>
-            </w:pPr>
-            <w:r>
-              <w:rPr>
-                <w:rFonts w:ascii="Times New Roman" w:cs="Times New Roman" w:eastAsia="Times New Roman" w:hAnsi="Times New Roman"/>
-                <w:b w:val="false"/>
-                <w:bCs w:val="false"/>
-                <w:i w:val="false"/>
-                <w:iCs w:val="false"/>
-                <w:sz w:val="18"/>
-                <w:szCs w:val="18"/>
-              </w:rPr>
-              <w:t xml:space="preserve">+3.7*</w:t>
-            </w:r>
-          </w:p>
-        </w:tc>
-        <w:tc>
-          <w:tcPr>
-            <w:tcW w:type="dxa" w:w="1312"/>
-            <w:tcMar>
-              <w:top w:type="dxa" w:w="40"/>
-              <w:left w:type="dxa" w:w="60"/>
-              <w:bottom w:type="dxa" w:w="40"/>
-              <w:right w:type="dxa" w:w="60"/>
-            </w:tcMar>
-          </w:tcPr>
-          <w:p>
-            <w:pPr>
-              <w:jc w:val="right"/>
-            </w:pPr>
-            <w:r>
-              <w:rPr>
-                <w:rFonts w:ascii="Times New Roman" w:cs="Times New Roman" w:eastAsia="Times New Roman" w:hAnsi="Times New Roman"/>
-                <w:b w:val="false"/>
-                <w:bCs w:val="false"/>
-                <w:i w:val="false"/>
-                <w:iCs w:val="false"/>
-                <w:sz w:val="18"/>
-                <w:szCs w:val="18"/>
-              </w:rPr>
-              <w:t xml:space="preserve">+3.1</w:t>
-            </w:r>
-          </w:p>
-        </w:tc>
-      </w:tr>
-      <w:tr>
-        <w:trPr>
-          <w:tblHeader w:val="false"/>
-        </w:trPr>
-        <w:tc>
-          <w:tcPr>
-            <w:tcW w:type="dxa" w:w="2808"/>
-            <w:tcMar>
-              <w:top w:type="dxa" w:w="40"/>
-              <w:left w:type="dxa" w:w="60"/>
-              <w:bottom w:type="dxa" w:w="40"/>
-              <w:right w:type="dxa" w:w="60"/>
-            </w:tcMar>
-          </w:tcPr>
-          <w:p>
-            <w:pPr>
-              <w:jc w:val="left"/>
-            </w:pPr>
-            <w:r>
-              <w:rPr>
-                <w:rFonts w:ascii="Times New Roman" w:cs="Times New Roman" w:eastAsia="Times New Roman" w:hAnsi="Times New Roman"/>
-                <w:b w:val="false"/>
-                <w:bCs w:val="false"/>
-                <w:i w:val="false"/>
-                <w:iCs w:val="false"/>
-                <w:sz w:val="18"/>
-                <w:szCs w:val="18"/>
-              </w:rPr>
-              <w:t xml:space="preserve">Pueblo (52)</w:t>
-            </w:r>
-          </w:p>
-        </w:tc>
-        <w:tc>
-          <w:tcPr>
-            <w:tcW w:type="dxa" w:w="1310"/>
-            <w:tcMar>
-              <w:top w:type="dxa" w:w="40"/>
-              <w:left w:type="dxa" w:w="60"/>
-              <w:bottom w:type="dxa" w:w="40"/>
-              <w:right w:type="dxa" w:w="60"/>
-            </w:tcMar>
-          </w:tcPr>
-          <w:p>
-            <w:pPr>
-              <w:jc w:val="right"/>
-            </w:pPr>
-            <w:r>
-              <w:rPr>
-                <w:rFonts w:ascii="Times New Roman" w:cs="Times New Roman" w:eastAsia="Times New Roman" w:hAnsi="Times New Roman"/>
-                <w:b w:val="false"/>
-                <w:bCs w:val="false"/>
-                <w:i w:val="false"/>
-                <w:iCs w:val="false"/>
-                <w:sz w:val="18"/>
-                <w:szCs w:val="18"/>
-              </w:rPr>
-              <w:t xml:space="preserve">% Hispanic</w:t>
-            </w:r>
-          </w:p>
-        </w:tc>
-        <w:tc>
-          <w:tcPr>
-            <w:tcW w:type="dxa" w:w="1310"/>
-            <w:tcMar>
-              <w:top w:type="dxa" w:w="40"/>
-              <w:left w:type="dxa" w:w="60"/>
-              <w:bottom w:type="dxa" w:w="40"/>
-              <w:right w:type="dxa" w:w="60"/>
-            </w:tcMar>
-          </w:tcPr>
-          <w:p>
-            <w:pPr>
-              <w:jc w:val="right"/>
-            </w:pPr>
-            <w:r>
-              <w:rPr>
-                <w:rFonts w:ascii="Times New Roman" w:cs="Times New Roman" w:eastAsia="Times New Roman" w:hAnsi="Times New Roman"/>
-                <w:b w:val="false"/>
-                <w:bCs w:val="false"/>
-                <w:i w:val="false"/>
-                <w:iCs w:val="false"/>
-                <w:sz w:val="18"/>
-                <w:szCs w:val="18"/>
-              </w:rPr>
-              <w:t xml:space="preserve">+12.1</w:t>
-            </w:r>
-          </w:p>
-        </w:tc>
-        <w:tc>
-          <w:tcPr>
-            <w:tcW w:type="dxa" w:w="1310"/>
-            <w:tcMar>
-              <w:top w:type="dxa" w:w="40"/>
-              <w:left w:type="dxa" w:w="60"/>
-              <w:bottom w:type="dxa" w:w="40"/>
-              <w:right w:type="dxa" w:w="60"/>
-            </w:tcMar>
-          </w:tcPr>
-          <w:p>
-            <w:pPr>
-              <w:jc w:val="right"/>
-            </w:pPr>
-            <w:r>
-              <w:rPr>
-                <w:rFonts w:ascii="Times New Roman" w:cs="Times New Roman" w:eastAsia="Times New Roman" w:hAnsi="Times New Roman"/>
-                <w:b w:val="false"/>
-                <w:bCs w:val="false"/>
-                <w:i w:val="false"/>
-                <w:iCs w:val="false"/>
-                <w:sz w:val="18"/>
-                <w:szCs w:val="18"/>
-              </w:rPr>
-              <w:t xml:space="preserve">+12.7*</w:t>
-            </w:r>
-          </w:p>
-        </w:tc>
-        <w:tc>
-          <w:tcPr>
-            <w:tcW w:type="dxa" w:w="1310"/>
-            <w:tcMar>
-              <w:top w:type="dxa" w:w="40"/>
-              <w:left w:type="dxa" w:w="60"/>
-              <w:bottom w:type="dxa" w:w="40"/>
-              <w:right w:type="dxa" w:w="60"/>
-            </w:tcMar>
-          </w:tcPr>
-          <w:p>
-            <w:pPr>
-              <w:jc w:val="right"/>
-            </w:pPr>
-            <w:r>
-              <w:rPr>
-                <w:rFonts w:ascii="Times New Roman" w:cs="Times New Roman" w:eastAsia="Times New Roman" w:hAnsi="Times New Roman"/>
-                <w:b w:val="false"/>
-                <w:bCs w:val="false"/>
-                <w:i w:val="false"/>
-                <w:iCs w:val="false"/>
-                <w:sz w:val="18"/>
-                <w:szCs w:val="18"/>
-              </w:rPr>
-              <w:t xml:space="preserve">+12.3**</w:t>
-            </w:r>
-          </w:p>
-        </w:tc>
-        <w:tc>
-          <w:tcPr>
-            <w:tcW w:type="dxa" w:w="1312"/>
-            <w:tcMar>
-              <w:top w:type="dxa" w:w="40"/>
-              <w:left w:type="dxa" w:w="60"/>
-              <w:bottom w:type="dxa" w:w="40"/>
-              <w:right w:type="dxa" w:w="60"/>
-            </w:tcMar>
-          </w:tcPr>
-          <w:p>
-            <w:pPr>
-              <w:jc w:val="right"/>
-            </w:pPr>
-            <w:r>
-              <w:rPr>
-                <w:rFonts w:ascii="Times New Roman" w:cs="Times New Roman" w:eastAsia="Times New Roman" w:hAnsi="Times New Roman"/>
-                <w:b w:val="false"/>
-                <w:bCs w:val="false"/>
-                <w:i w:val="false"/>
-                <w:iCs w:val="false"/>
-                <w:sz w:val="18"/>
-                <w:szCs w:val="18"/>
-              </w:rPr>
-              <w:t xml:space="preserve">+8.9**</w:t>
-            </w:r>
-          </w:p>
-        </w:tc>
-      </w:tr>
-      <w:tr>
-        <w:trPr>
-          <w:tblHeader w:val="false"/>
-        </w:trPr>
-        <w:tc>
-          <w:tcPr>
-            <w:tcW w:type="dxa" w:w="2808"/>
-            <w:tcMar>
-              <w:top w:type="dxa" w:w="40"/>
-              <w:left w:type="dxa" w:w="60"/>
-              <w:bottom w:type="dxa" w:w="40"/>
-              <w:right w:type="dxa" w:w="60"/>
-            </w:tcMar>
-          </w:tcPr>
-          <w:p>
-            <w:pPr>
-              <w:jc w:val="left"/>
-            </w:pPr>
-            <w:r>
-              <w:rPr>
-                <w:rFonts w:ascii="Times New Roman" w:cs="Times New Roman" w:eastAsia="Times New Roman" w:hAnsi="Times New Roman"/>
-                <w:b w:val="false"/>
-                <w:bCs w:val="false"/>
-                <w:i w:val="false"/>
-                <w:iCs w:val="false"/>
-                <w:sz w:val="18"/>
-                <w:szCs w:val="18"/>
-              </w:rPr>
-              <w:t xml:space="preserve">rest of Colorado (210)</w:t>
-            </w:r>
-          </w:p>
-        </w:tc>
-        <w:tc>
-          <w:tcPr>
-            <w:tcW w:type="dxa" w:w="1310"/>
-            <w:tcMar>
-              <w:top w:type="dxa" w:w="40"/>
-              <w:left w:type="dxa" w:w="60"/>
-              <w:bottom w:type="dxa" w:w="40"/>
-              <w:right w:type="dxa" w:w="60"/>
-            </w:tcMar>
-          </w:tcPr>
-          <w:p>
-            <w:pPr>
-              <w:jc w:val="right"/>
-            </w:pPr>
-            <w:r>
-              <w:rPr>
-                <w:rFonts w:ascii="Times New Roman" w:cs="Times New Roman" w:eastAsia="Times New Roman" w:hAnsi="Times New Roman"/>
-                <w:b w:val="false"/>
-                <w:bCs w:val="false"/>
-                <w:i w:val="false"/>
-                <w:iCs w:val="false"/>
-                <w:sz w:val="18"/>
-                <w:szCs w:val="18"/>
-              </w:rPr>
-              <w:t xml:space="preserve">% Hispanic</w:t>
-            </w:r>
-          </w:p>
-        </w:tc>
-        <w:tc>
-          <w:tcPr>
-            <w:tcW w:type="dxa" w:w="1310"/>
-            <w:tcMar>
-              <w:top w:type="dxa" w:w="40"/>
-              <w:left w:type="dxa" w:w="60"/>
-              <w:bottom w:type="dxa" w:w="40"/>
-              <w:right w:type="dxa" w:w="60"/>
-            </w:tcMar>
-          </w:tcPr>
-          <w:p>
-            <w:pPr>
-              <w:jc w:val="right"/>
-            </w:pPr>
-            <w:r>
-              <w:rPr>
-                <w:rFonts w:ascii="Times New Roman" w:cs="Times New Roman" w:eastAsia="Times New Roman" w:hAnsi="Times New Roman"/>
-                <w:b w:val="false"/>
-                <w:bCs w:val="false"/>
-                <w:i w:val="false"/>
-                <w:iCs w:val="false"/>
-                <w:sz w:val="18"/>
-                <w:szCs w:val="18"/>
-              </w:rPr>
-              <w:t xml:space="preserve">+0.8</w:t>
-            </w:r>
-          </w:p>
-        </w:tc>
-        <w:tc>
-          <w:tcPr>
-            <w:tcW w:type="dxa" w:w="1310"/>
-            <w:tcMar>
-              <w:top w:type="dxa" w:w="40"/>
-              <w:left w:type="dxa" w:w="60"/>
-              <w:bottom w:type="dxa" w:w="40"/>
-              <w:right w:type="dxa" w:w="60"/>
-            </w:tcMar>
-          </w:tcPr>
-          <w:p>
-            <w:pPr>
-              <w:jc w:val="right"/>
-            </w:pPr>
-            <w:r>
-              <w:rPr>
-                <w:rFonts w:ascii="Times New Roman" w:cs="Times New Roman" w:eastAsia="Times New Roman" w:hAnsi="Times New Roman"/>
-                <w:b w:val="false"/>
-                <w:bCs w:val="false"/>
-                <w:i w:val="false"/>
-                <w:iCs w:val="false"/>
-                <w:sz w:val="18"/>
-                <w:szCs w:val="18"/>
-              </w:rPr>
-              <w:t xml:space="preserve">−0.4</w:t>
-            </w:r>
-          </w:p>
-        </w:tc>
-        <w:tc>
-          <w:tcPr>
-            <w:tcW w:type="dxa" w:w="1310"/>
-            <w:tcMar>
-              <w:top w:type="dxa" w:w="40"/>
-              <w:left w:type="dxa" w:w="60"/>
-              <w:bottom w:type="dxa" w:w="40"/>
-              <w:right w:type="dxa" w:w="60"/>
-            </w:tcMar>
-          </w:tcPr>
-          <w:p>
-            <w:pPr>
-              <w:jc w:val="right"/>
-            </w:pPr>
-            <w:r>
-              <w:rPr>
-                <w:rFonts w:ascii="Times New Roman" w:cs="Times New Roman" w:eastAsia="Times New Roman" w:hAnsi="Times New Roman"/>
-                <w:b w:val="false"/>
-                <w:bCs w:val="false"/>
-                <w:i w:val="false"/>
-                <w:iCs w:val="false"/>
-                <w:sz w:val="18"/>
-                <w:szCs w:val="18"/>
-              </w:rPr>
-              <w:t xml:space="preserve">−0.4</w:t>
-            </w:r>
-          </w:p>
-        </w:tc>
-        <w:tc>
-          <w:tcPr>
-            <w:tcW w:type="dxa" w:w="1312"/>
-            <w:tcMar>
-              <w:top w:type="dxa" w:w="40"/>
-              <w:left w:type="dxa" w:w="60"/>
-              <w:bottom w:type="dxa" w:w="40"/>
-              <w:right w:type="dxa" w:w="60"/>
-            </w:tcMar>
-          </w:tcPr>
-          <w:p>
-            <w:pPr>
-              <w:jc w:val="right"/>
-            </w:pPr>
-            <w:r>
-              <w:rPr>
-                <w:rFonts w:ascii="Times New Roman" w:cs="Times New Roman" w:eastAsia="Times New Roman" w:hAnsi="Times New Roman"/>
-                <w:b w:val="false"/>
-                <w:bCs w:val="false"/>
-                <w:i w:val="false"/>
-                <w:iCs w:val="false"/>
-                <w:sz w:val="18"/>
-                <w:szCs w:val="18"/>
-              </w:rPr>
-              <w:t xml:space="preserve">0.0</w:t>
-            </w:r>
-          </w:p>
-        </w:tc>
-      </w:tr>
-      <w:tr>
-        <w:trPr>
-          <w:tblHeader w:val="false"/>
-        </w:trPr>
-        <w:tc>
-          <w:tcPr>
-            <w:tcW w:type="dxa" w:w="2808"/>
-            <w:tcMar>
-              <w:top w:type="dxa" w:w="40"/>
-              <w:left w:type="dxa" w:w="60"/>
-              <w:bottom w:type="dxa" w:w="40"/>
-              <w:right w:type="dxa" w:w="60"/>
-            </w:tcMar>
-          </w:tcPr>
-          <w:p>
-            <w:pPr>
-              <w:jc w:val="left"/>
-            </w:pPr>
-            <w:r>
-              <w:rPr>
-                <w:rFonts w:ascii="Times New Roman" w:cs="Times New Roman" w:eastAsia="Times New Roman" w:hAnsi="Times New Roman"/>
-                <w:b w:val="false"/>
-                <w:bCs w:val="false"/>
-                <w:i w:val="false"/>
-                <w:iCs w:val="false"/>
-                <w:sz w:val="18"/>
-                <w:szCs w:val="18"/>
-              </w:rPr>
-              <w:t xml:space="preserve">Colorado (1,158)</w:t>
-            </w:r>
-          </w:p>
-        </w:tc>
-        <w:tc>
-          <w:tcPr>
-            <w:tcW w:type="dxa" w:w="1310"/>
-            <w:tcMar>
-              <w:top w:type="dxa" w:w="40"/>
-              <w:left w:type="dxa" w:w="60"/>
-              <w:bottom w:type="dxa" w:w="40"/>
-              <w:right w:type="dxa" w:w="60"/>
-            </w:tcMar>
-          </w:tcPr>
-          <w:p>
-            <w:pPr>
-              <w:jc w:val="right"/>
-            </w:pPr>
-            <w:r>
-              <w:rPr>
-                <w:rFonts w:ascii="Times New Roman" w:cs="Times New Roman" w:eastAsia="Times New Roman" w:hAnsi="Times New Roman"/>
-                <w:b w:val="false"/>
-                <w:bCs w:val="false"/>
-                <w:i w:val="false"/>
-                <w:iCs w:val="false"/>
-                <w:sz w:val="18"/>
-                <w:szCs w:val="18"/>
-              </w:rPr>
-              <w:t xml:space="preserve">% below poverty</w:t>
-            </w:r>
-          </w:p>
-        </w:tc>
-        <w:tc>
-          <w:tcPr>
-            <w:tcW w:type="dxa" w:w="1310"/>
-            <w:tcMar>
-              <w:top w:type="dxa" w:w="40"/>
-              <w:left w:type="dxa" w:w="60"/>
-              <w:bottom w:type="dxa" w:w="40"/>
-              <w:right w:type="dxa" w:w="60"/>
-            </w:tcMar>
-          </w:tcPr>
-          <w:p>
-            <w:pPr>
-              <w:jc w:val="right"/>
-            </w:pPr>
-            <w:r>
-              <w:rPr>
-                <w:rFonts w:ascii="Times New Roman" w:cs="Times New Roman" w:eastAsia="Times New Roman" w:hAnsi="Times New Roman"/>
-                <w:b w:val="false"/>
-                <w:bCs w:val="false"/>
-                <w:i w:val="false"/>
-                <w:iCs w:val="false"/>
-                <w:sz w:val="18"/>
-                <w:szCs w:val="18"/>
-              </w:rPr>
-              <w:t xml:space="preserve">+6.6***</w:t>
-            </w:r>
-          </w:p>
-        </w:tc>
-        <w:tc>
-          <w:tcPr>
-            <w:tcW w:type="dxa" w:w="1310"/>
-            <w:tcMar>
-              <w:top w:type="dxa" w:w="40"/>
-              <w:left w:type="dxa" w:w="60"/>
-              <w:bottom w:type="dxa" w:w="40"/>
-              <w:right w:type="dxa" w:w="60"/>
-            </w:tcMar>
-          </w:tcPr>
-          <w:p>
-            <w:pPr>
-              <w:jc w:val="right"/>
-            </w:pPr>
-            <w:r>
-              <w:rPr>
-                <w:rFonts w:ascii="Times New Roman" w:cs="Times New Roman" w:eastAsia="Times New Roman" w:hAnsi="Times New Roman"/>
-                <w:b w:val="false"/>
-                <w:bCs w:val="false"/>
-                <w:i w:val="false"/>
-                <w:iCs w:val="false"/>
-                <w:sz w:val="18"/>
-                <w:szCs w:val="18"/>
-              </w:rPr>
-              <w:t xml:space="preserve">+4.8***</w:t>
-            </w:r>
-          </w:p>
-        </w:tc>
-        <w:tc>
-          <w:tcPr>
-            <w:tcW w:type="dxa" w:w="1310"/>
-            <w:tcMar>
-              <w:top w:type="dxa" w:w="40"/>
-              <w:left w:type="dxa" w:w="60"/>
-              <w:bottom w:type="dxa" w:w="40"/>
-              <w:right w:type="dxa" w:w="60"/>
-            </w:tcMar>
-          </w:tcPr>
-          <w:p>
-            <w:pPr>
-              <w:jc w:val="right"/>
-            </w:pPr>
-            <w:r>
-              <w:rPr>
-                <w:rFonts w:ascii="Times New Roman" w:cs="Times New Roman" w:eastAsia="Times New Roman" w:hAnsi="Times New Roman"/>
-                <w:b w:val="false"/>
-                <w:bCs w:val="false"/>
-                <w:i w:val="false"/>
-                <w:iCs w:val="false"/>
-                <w:sz w:val="18"/>
-                <w:szCs w:val="18"/>
-              </w:rPr>
-              <w:t xml:space="preserve">+6.5***</w:t>
-            </w:r>
-          </w:p>
-        </w:tc>
-        <w:tc>
-          <w:tcPr>
-            <w:tcW w:type="dxa" w:w="1312"/>
-            <w:tcMar>
-              <w:top w:type="dxa" w:w="40"/>
-              <w:left w:type="dxa" w:w="60"/>
-              <w:bottom w:type="dxa" w:w="40"/>
-              <w:right w:type="dxa" w:w="60"/>
-            </w:tcMar>
-          </w:tcPr>
-          <w:p>
-            <w:pPr>
-              <w:jc w:val="right"/>
-            </w:pPr>
-            <w:r>
-              <w:rPr>
-                <w:rFonts w:ascii="Times New Roman" w:cs="Times New Roman" w:eastAsia="Times New Roman" w:hAnsi="Times New Roman"/>
-                <w:b w:val="false"/>
-                <w:bCs w:val="false"/>
-                <w:i w:val="false"/>
-                <w:iCs w:val="false"/>
-                <w:sz w:val="18"/>
-                <w:szCs w:val="18"/>
-              </w:rPr>
-              <w:t xml:space="preserve">+3.7***</w:t>
-            </w:r>
-          </w:p>
-        </w:tc>
-      </w:tr>
-      <w:tr>
-        <w:trPr>
-          <w:tblHeader w:val="false"/>
-        </w:trPr>
-        <w:tc>
-          <w:tcPr>
-            <w:tcW w:type="dxa" w:w="2808"/>
-            <w:tcMar>
-              <w:top w:type="dxa" w:w="40"/>
-              <w:left w:type="dxa" w:w="60"/>
-              <w:bottom w:type="dxa" w:w="40"/>
-              <w:right w:type="dxa" w:w="60"/>
-            </w:tcMar>
-          </w:tcPr>
-          <w:p>
-            <w:pPr>
-              <w:jc w:val="left"/>
-            </w:pPr>
-            <w:r>
-              <w:rPr>
-                <w:rFonts w:ascii="Times New Roman" w:cs="Times New Roman" w:eastAsia="Times New Roman" w:hAnsi="Times New Roman"/>
-                <w:b w:val="false"/>
-                <w:bCs w:val="false"/>
-                <w:i w:val="false"/>
-                <w:iCs w:val="false"/>
-                <w:sz w:val="18"/>
-                <w:szCs w:val="18"/>
-              </w:rPr>
-              <w:t xml:space="preserve">Colorado (1,158)</w:t>
-            </w:r>
-          </w:p>
-        </w:tc>
-        <w:tc>
-          <w:tcPr>
-            <w:tcW w:type="dxa" w:w="1310"/>
-            <w:tcMar>
-              <w:top w:type="dxa" w:w="40"/>
-              <w:left w:type="dxa" w:w="60"/>
-              <w:bottom w:type="dxa" w:w="40"/>
-              <w:right w:type="dxa" w:w="60"/>
-            </w:tcMar>
-          </w:tcPr>
-          <w:p>
-            <w:pPr>
-              <w:jc w:val="right"/>
-            </w:pPr>
-            <w:r>
-              <w:rPr>
-                <w:rFonts w:ascii="Times New Roman" w:cs="Times New Roman" w:eastAsia="Times New Roman" w:hAnsi="Times New Roman"/>
-                <w:b w:val="false"/>
-                <w:bCs w:val="false"/>
-                <w:i w:val="false"/>
-                <w:iCs w:val="false"/>
-                <w:sz w:val="18"/>
-                <w:szCs w:val="18"/>
-              </w:rPr>
-              <w:t xml:space="preserve">% owner-occupied</w:t>
-            </w:r>
-          </w:p>
-        </w:tc>
-        <w:tc>
-          <w:tcPr>
-            <w:tcW w:type="dxa" w:w="1310"/>
-            <w:tcMar>
-              <w:top w:type="dxa" w:w="40"/>
-              <w:left w:type="dxa" w:w="60"/>
-              <w:bottom w:type="dxa" w:w="40"/>
-              <w:right w:type="dxa" w:w="60"/>
-            </w:tcMar>
-          </w:tcPr>
-          <w:p>
-            <w:pPr>
-              <w:jc w:val="right"/>
-            </w:pPr>
-            <w:r>
-              <w:rPr>
-                <w:rFonts w:ascii="Times New Roman" w:cs="Times New Roman" w:eastAsia="Times New Roman" w:hAnsi="Times New Roman"/>
-                <w:b w:val="false"/>
-                <w:bCs w:val="false"/>
-                <w:i w:val="false"/>
-                <w:iCs w:val="false"/>
-                <w:sz w:val="18"/>
-                <w:szCs w:val="18"/>
-              </w:rPr>
-              <w:t xml:space="preserve">−7.0***</w:t>
-            </w:r>
-          </w:p>
-        </w:tc>
-        <w:tc>
-          <w:tcPr>
-            <w:tcW w:type="dxa" w:w="1310"/>
-            <w:tcMar>
-              <w:top w:type="dxa" w:w="40"/>
-              <w:left w:type="dxa" w:w="60"/>
-              <w:bottom w:type="dxa" w:w="40"/>
-              <w:right w:type="dxa" w:w="60"/>
-            </w:tcMar>
-          </w:tcPr>
-          <w:p>
-            <w:pPr>
-              <w:jc w:val="right"/>
-            </w:pPr>
-            <w:r>
-              <w:rPr>
-                <w:rFonts w:ascii="Times New Roman" w:cs="Times New Roman" w:eastAsia="Times New Roman" w:hAnsi="Times New Roman"/>
-                <w:b w:val="false"/>
-                <w:bCs w:val="false"/>
-                <w:i w:val="false"/>
-                <w:iCs w:val="false"/>
-                <w:sz w:val="18"/>
-                <w:szCs w:val="18"/>
-              </w:rPr>
-              <w:t xml:space="preserve">−8.9***</w:t>
-            </w:r>
-          </w:p>
-        </w:tc>
-        <w:tc>
-          <w:tcPr>
-            <w:tcW w:type="dxa" w:w="1310"/>
-            <w:tcMar>
-              <w:top w:type="dxa" w:w="40"/>
-              <w:left w:type="dxa" w:w="60"/>
-              <w:bottom w:type="dxa" w:w="40"/>
-              <w:right w:type="dxa" w:w="60"/>
-            </w:tcMar>
-          </w:tcPr>
-          <w:p>
-            <w:pPr>
-              <w:jc w:val="right"/>
-            </w:pPr>
-            <w:r>
-              <w:rPr>
-                <w:rFonts w:ascii="Times New Roman" w:cs="Times New Roman" w:eastAsia="Times New Roman" w:hAnsi="Times New Roman"/>
-                <w:b w:val="false"/>
-                <w:bCs w:val="false"/>
-                <w:i w:val="false"/>
-                <w:iCs w:val="false"/>
-                <w:sz w:val="18"/>
-                <w:szCs w:val="18"/>
-              </w:rPr>
-              <w:t xml:space="preserve">−9.8***</w:t>
-            </w:r>
-          </w:p>
-        </w:tc>
-        <w:tc>
-          <w:tcPr>
-            <w:tcW w:type="dxa" w:w="1312"/>
-            <w:tcMar>
-              <w:top w:type="dxa" w:w="40"/>
-              <w:left w:type="dxa" w:w="60"/>
-              <w:bottom w:type="dxa" w:w="40"/>
-              <w:right w:type="dxa" w:w="60"/>
-            </w:tcMar>
-          </w:tcPr>
-          <w:p>
-            <w:pPr>
-              <w:jc w:val="right"/>
-            </w:pPr>
-            <w:r>
-              <w:rPr>
-                <w:rFonts w:ascii="Times New Roman" w:cs="Times New Roman" w:eastAsia="Times New Roman" w:hAnsi="Times New Roman"/>
-                <w:b w:val="false"/>
-                <w:bCs w:val="false"/>
-                <w:i w:val="false"/>
-                <w:iCs w:val="false"/>
-                <w:sz w:val="18"/>
-                <w:szCs w:val="18"/>
-              </w:rPr>
-              <w:t xml:space="preserve">−10.3***</w:t>
-            </w:r>
-          </w:p>
-        </w:tc>
-      </w:tr>
-      <w:tr>
-        <w:trPr>
-          <w:tblHeader w:val="false"/>
-        </w:trPr>
-        <w:tc>
-          <w:tcPr>
-            <w:tcW w:type="dxa" w:w="2808"/>
-            <w:tcMar>
-              <w:top w:type="dxa" w:w="40"/>
-              <w:left w:type="dxa" w:w="60"/>
-              <w:bottom w:type="dxa" w:w="40"/>
-              <w:right w:type="dxa" w:w="60"/>
-            </w:tcMar>
-          </w:tcPr>
-          <w:p>
-            <w:pPr>
-              <w:jc w:val="left"/>
-            </w:pPr>
-            <w:r>
-              <w:rPr>
-                <w:rFonts w:ascii="Times New Roman" w:cs="Times New Roman" w:eastAsia="Times New Roman" w:hAnsi="Times New Roman"/>
-                <w:b w:val="false"/>
-                <w:bCs w:val="false"/>
-                <w:i w:val="false"/>
-                <w:iCs w:val="false"/>
-                <w:sz w:val="18"/>
-                <w:szCs w:val="18"/>
-              </w:rPr>
-              <w:t xml:space="preserve">Colorado (1,158)</w:t>
-            </w:r>
-          </w:p>
-        </w:tc>
-        <w:tc>
-          <w:tcPr>
-            <w:tcW w:type="dxa" w:w="1310"/>
-            <w:tcMar>
-              <w:top w:type="dxa" w:w="40"/>
-              <w:left w:type="dxa" w:w="60"/>
-              <w:bottom w:type="dxa" w:w="40"/>
-              <w:right w:type="dxa" w:w="60"/>
-            </w:tcMar>
-          </w:tcPr>
-          <w:p>
-            <w:pPr>
-              <w:jc w:val="right"/>
-            </w:pPr>
-            <w:r>
-              <w:rPr>
-                <w:rFonts w:ascii="Times New Roman" w:cs="Times New Roman" w:eastAsia="Times New Roman" w:hAnsi="Times New Roman"/>
-                <w:b w:val="false"/>
-                <w:bCs w:val="false"/>
-                <w:i w:val="false"/>
-                <w:iCs w:val="false"/>
-                <w:sz w:val="18"/>
-                <w:szCs w:val="18"/>
-              </w:rPr>
-              <w:t xml:space="preserve">% Black</w:t>
-            </w:r>
-          </w:p>
-        </w:tc>
-        <w:tc>
-          <w:tcPr>
-            <w:tcW w:type="dxa" w:w="1310"/>
-            <w:tcMar>
-              <w:top w:type="dxa" w:w="40"/>
-              <w:left w:type="dxa" w:w="60"/>
-              <w:bottom w:type="dxa" w:w="40"/>
-              <w:right w:type="dxa" w:w="60"/>
-            </w:tcMar>
-          </w:tcPr>
-          <w:p>
-            <w:pPr>
-              <w:jc w:val="right"/>
-            </w:pPr>
-            <w:r>
-              <w:rPr>
-                <w:rFonts w:ascii="Times New Roman" w:cs="Times New Roman" w:eastAsia="Times New Roman" w:hAnsi="Times New Roman"/>
-                <w:b w:val="false"/>
-                <w:bCs w:val="false"/>
-                <w:i w:val="false"/>
-                <w:iCs w:val="false"/>
-                <w:sz w:val="18"/>
-                <w:szCs w:val="18"/>
-              </w:rPr>
-              <w:t xml:space="preserve">+0.2</w:t>
-            </w:r>
-          </w:p>
-        </w:tc>
-        <w:tc>
-          <w:tcPr>
-            <w:tcW w:type="dxa" w:w="1310"/>
-            <w:tcMar>
-              <w:top w:type="dxa" w:w="40"/>
-              <w:left w:type="dxa" w:w="60"/>
-              <w:bottom w:type="dxa" w:w="40"/>
-              <w:right w:type="dxa" w:w="60"/>
-            </w:tcMar>
-          </w:tcPr>
-          <w:p>
-            <w:pPr>
-              <w:jc w:val="right"/>
-            </w:pPr>
-            <w:r>
-              <w:rPr>
-                <w:rFonts w:ascii="Times New Roman" w:cs="Times New Roman" w:eastAsia="Times New Roman" w:hAnsi="Times New Roman"/>
-                <w:b w:val="false"/>
-                <w:bCs w:val="false"/>
-                <w:i w:val="false"/>
-                <w:iCs w:val="false"/>
-                <w:sz w:val="18"/>
-                <w:szCs w:val="18"/>
-              </w:rPr>
-              <w:t xml:space="preserve">−0.3</w:t>
-            </w:r>
-          </w:p>
-        </w:tc>
-        <w:tc>
-          <w:tcPr>
-            <w:tcW w:type="dxa" w:w="1310"/>
-            <w:tcMar>
-              <w:top w:type="dxa" w:w="40"/>
-              <w:left w:type="dxa" w:w="60"/>
-              <w:bottom w:type="dxa" w:w="40"/>
-              <w:right w:type="dxa" w:w="60"/>
-            </w:tcMar>
-          </w:tcPr>
-          <w:p>
-            <w:pPr>
-              <w:jc w:val="right"/>
-            </w:pPr>
-            <w:r>
-              <w:rPr>
-                <w:rFonts w:ascii="Times New Roman" w:cs="Times New Roman" w:eastAsia="Times New Roman" w:hAnsi="Times New Roman"/>
-                <w:b w:val="false"/>
-                <w:bCs w:val="false"/>
-                <w:i w:val="false"/>
-                <w:iCs w:val="false"/>
-                <w:sz w:val="18"/>
-                <w:szCs w:val="18"/>
-              </w:rPr>
-              <w:t xml:space="preserve">−0.4</w:t>
-            </w:r>
-          </w:p>
-        </w:tc>
-        <w:tc>
-          <w:tcPr>
-            <w:tcW w:type="dxa" w:w="1312"/>
-            <w:tcMar>
-              <w:top w:type="dxa" w:w="40"/>
-              <w:left w:type="dxa" w:w="60"/>
-              <w:bottom w:type="dxa" w:w="40"/>
-              <w:right w:type="dxa" w:w="60"/>
-            </w:tcMar>
-          </w:tcPr>
-          <w:p>
-            <w:pPr>
-              <w:jc w:val="right"/>
-            </w:pPr>
-            <w:r>
-              <w:rPr>
-                <w:rFonts w:ascii="Times New Roman" w:cs="Times New Roman" w:eastAsia="Times New Roman" w:hAnsi="Times New Roman"/>
-                <w:b w:val="false"/>
-                <w:bCs w:val="false"/>
-                <w:i w:val="false"/>
-                <w:iCs w:val="false"/>
-                <w:sz w:val="18"/>
-                <w:szCs w:val="18"/>
-              </w:rPr>
-              <w:t xml:space="preserve">−0.4</w:t>
-            </w:r>
-          </w:p>
-        </w:tc>
-      </w:tr>
-    </w:tbl>
-    <w:p>
-      <w:pPr>
-        <w:spacing w:after="120"/>
-      </w:pPr>
-    </w:p>
-    <w:p>
-      <w:pPr>
-        <w:spacing w:after="160" w:line="360"/>
-        <w:jc w:val="both"/>
-      </w:pPr>
-      <w:r>
-        <w:rPr>
-          <w:rFonts w:ascii="Times New Roman" w:cs="Times New Roman" w:eastAsia="Times New Roman" w:hAnsi="Times New Roman"/>
-          <w:b w:val="false"/>
-          <w:bCs w:val="false"/>
-          <w:i w:val="false"/>
-          <w:iCs w:val="false"/>
-          <w:sz w:val="24"/>
-          <w:szCs w:val="24"/>
-        </w:rPr>
-        <w:t xml:space="preserve">* p &lt; 0.05, ** p &lt; 0.01, *** p &lt; 0.001. Percentage points per log unit of hazardous firms per km². Poverty is associated with industry in every region, including the rest of Colorado (+7 to +9 points); ownership is lower beside industry everywhere; the Black share is not associated with it in any region except Pueblo, weakly.</w:t>
-      </w:r>
-    </w:p>
-    <w:p>
-      <w:pPr>
-        <w:spacing w:after="160" w:line="360"/>
-        <w:jc w:val="both"/>
-      </w:pPr>
-      <w:r>
-        <w:rPr>
-          <w:rFonts w:ascii="Times New Roman" w:cs="Times New Roman" w:eastAsia="Times New Roman" w:hAnsi="Times New Roman"/>
-          <w:b w:val="false"/>
-          <w:bCs w:val="false"/>
-          <w:i w:val="false"/>
-          <w:iCs w:val="false"/>
-          <w:sz w:val="24"/>
-          <w:szCs w:val="24"/>
-        </w:rPr>
-        <w:t xml:space="preserve">The Hispanic association is a Front Range pattern, absent outside the cities, and it moved outward. In Denver it weakened from 2000 and is not significant by 2020; in the suburbs and the northern Front Range it strengthened from 1990 to 2010. Because 2000–2020 measure distance to the same 1983–92 sites, that change is a change in who lives around fixed industrial land, not new siting. Poverty and renting beside industry are statewide.</w:t>
-      </w:r>
-    </w:p>
-    <w:p>
-      <w:pPr>
-        <w:spacing w:after="160" w:line="360"/>
-        <w:jc w:val="both"/>
-      </w:pPr>
-      <w:r>
-        <w:rPr>
-          <w:rFonts w:ascii="Times New Roman" w:cs="Times New Roman" w:eastAsia="Times New Roman" w:hAnsi="Times New Roman"/>
-          <w:b/>
-          <w:bCs/>
-          <w:i w:val="false"/>
-          <w:iCs w:val="false"/>
-          <w:sz w:val="24"/>
-          <w:szCs w:val="24"/>
-        </w:rPr>
-        <w:t xml:space="preserve">Today.</w:t>
-      </w:r>
-      <w:r>
-        <w:rPr>
-          <w:rFonts w:ascii="Times New Roman" w:cs="Times New Roman" w:eastAsia="Times New Roman" w:hAnsi="Times New Roman"/>
-          <w:b w:val="false"/>
-          <w:bCs w:val="false"/>
-          <w:i w:val="false"/>
-          <w:iCs w:val="false"/>
-          <w:sz w:val="24"/>
-          <w:szCs w:val="24"/>
-        </w:rPr>
-        <w:t xml:space="preserve"> Across 1,428 Colorado tracts of 2020 with 500 or more residents, in spatial-error models with log population density, each log unit of historical hazardous firm-years (1965–92) goes with 1.2 points more people of colour (p &lt; 0.001), 1.8 points more low-income residents (p &lt; 0.001) and 3.0 percentiles on the state's EnviroScreen index (p &lt; 0.001); former sites with no record in the searched inventories show the same pattern for income (+2.4 points) and EnviroScreen (+3.6 percentiles). These are associations at one date. Present health outcomes are only weakly related, in models estimated before the audit and not yet re-estimated under the rules above: the former sites without a cleanup record show no association with asthma, birth weight, life expectancy or chronic disease; the known historical sites are associated with asthma hospitalisation and shorter life expectancy, but non-hazardous manufacturers show the same association with life expectancy, which points to the general disadvantage of old industrial districts rather than to hazardous use as such.</w:t>
-      </w:r>
-    </w:p>
-    <w:p>
-      <w:pPr>
-        <w:spacing w:after="160" w:line="360"/>
-        <w:jc w:val="both"/>
-      </w:pPr>
-      <w:r>
-        <w:rPr>
-          <w:rFonts w:ascii="Times New Roman" w:cs="Times New Roman" w:eastAsia="Times New Roman" w:hAnsi="Times New Roman"/>
-          <w:b/>
-          <w:bCs/>
-          <w:i w:val="false"/>
-          <w:iCs w:val="false"/>
-          <w:sz w:val="24"/>
-          <w:szCs w:val="24"/>
-        </w:rPr>
-        <w:t xml:space="preserve">The other graded cities.</w:t>
-      </w:r>
-      <w:r>
-        <w:rPr>
-          <w:rFonts w:ascii="Times New Roman" w:cs="Times New Roman" w:eastAsia="Times New Roman" w:hAnsi="Times New Roman"/>
-          <w:b w:val="false"/>
-          <w:bCs w:val="false"/>
-          <w:i w:val="false"/>
-          <w:iCs w:val="false"/>
-          <w:sz w:val="24"/>
-          <w:szCs w:val="24"/>
-        </w:rPr>
-        <w:t xml:space="preserve"> Mapping Inequality holds Pueblo's 1938 HOLC map and local appraisal maps for Colorado Springs, Greeley, Fort Collins, Grand Junction, Boulder, Longmont and Fort Morgan. They cannot carry the Denver design. Outside Denver the pre-1960 directory places trades only at the town, not the street, so there is no pre-map industrial geography; the full count has not been reconstructed into districts outside Denver; and the graded areas cover few tracts (15 in Pueblo, 1–9 in the other cities). Pueblo — steel, an older Hispano and immigrant workforce, and a HOLC map — is the natural second case, but it needs its own street-level directory series and district reconstruction first.</w:t>
-      </w:r>
-    </w:p>
-    <w:p>
-      <w:pPr>
-        <w:pStyle w:val="Heading1"/>
-        <w:spacing w:after="160" w:before="360"/>
-      </w:pPr>
-      <w:r>
-        <w:rPr>
-          <w:rFonts w:ascii="Times New Roman" w:cs="Times New Roman" w:eastAsia="Times New Roman" w:hAnsi="Times New Roman"/>
-          <w:b/>
-          <w:bCs/>
-          <w:color w:val="000000"/>
-          <w:sz w:val="26"/>
-          <w:szCs w:val="26"/>
-        </w:rPr>
-        <w:t xml:space="preserve">8. Discussion and conclusion</w:t>
+        <w:t xml:space="preserve">7. Discussion and conclusion</w:t>
       </w:r>
     </w:p>
     <w:p>

</xml_diff>

<commit_message>
2023 zoning: 1929 districts, sites and tracts under today's zoning
</commit_message>
<xml_diff>
--- a/paper/Before_and_After_the_Map_manuscript.docx
+++ b/paper/Before_and_After_the_Map_manuscript.docx
@@ -36544,6 +36544,1312 @@
           <w:szCs w:val="24"/>
         </w:rPr>
         <w:t xml:space="preserve"> For 114 of the 168 residential sites of 1965–92 the present building was built in or before the site's last listing year (47 were built later; 7 have no date). Most of these are therefore small firms that operated in or beside houses and apartment buildings, or geocodes that fell on a neighbouring dwelling, rather than factories later replaced by housing. Of the 67 residential sites with no cleanup record, 51 are of this kind. Of the 62 pre-1960 trades now residential, 29 carry a building newer than the listing. The 82 later sites now in residential (67), civic (12) or park (3) use with no cleanup record, and the 62 pre-1960 trade sites now residential, are the cases for archival follow-up: the Sanborn sheets show what stood on the lot and what it stored, and the Polk reverse directories give the sequence of occupants. The 1890 Sanborn check in Section 2 is the first step of that work.</w:t>
+      </w:r>
+    </w:p>
+    <w:p>
+      <w:pPr>
+        <w:spacing w:after="160" w:line="360"/>
+        <w:jc w:val="both"/>
+      </w:pPr>
+      <w:r>
+        <w:rPr>
+          <w:rFonts w:ascii="Times New Roman" w:cs="Times New Roman" w:eastAsia="Times New Roman" w:hAnsi="Times New Roman"/>
+          <w:b/>
+          <w:bCs/>
+          <w:i w:val="false"/>
+          <w:iCs w:val="false"/>
+          <w:sz w:val="24"/>
+          <w:szCs w:val="24"/>
+        </w:rPr>
+        <w:t xml:space="preserve">Zoning in 2023.</w:t>
+      </w:r>
+      <w:r>
+        <w:rPr>
+          <w:rFonts w:ascii="Times New Roman" w:cs="Times New Roman" w:eastAsia="Times New Roman" w:hAnsi="Times New Roman"/>
+          <w:b w:val="false"/>
+          <w:bCs w:val="false"/>
+          <w:i w:val="false"/>
+          <w:iCs w:val="false"/>
+          <w:sz w:val="24"/>
+          <w:szCs w:val="24"/>
+        </w:rPr>
+        <w:t xml:space="preserve"> A Denver-metro zoning layer of 3 October 2023, compiled by Makarewicz (2023) for the National Zoning Atlas, places the local district codes of 51 jurisdictions in common categories and covers 99% of the study area. It refines the zoning count above in one respect: about a quarter of the Denver sites "still zoned industrial" lie in Denver's industrial mixed-use (I-MX) districts, which allow housing. Of the 959 Denver sites of 1965–92 that fall within the layer, 39% stand in industrial districts that exclude housing, 13.5% in I-MX and 34% in other mixed-use districts with housing. Of the 278 sites in the study tracts outside Denver County, which the city's parcel data do not cover, 58% stand in industrial districts. Seven in ten pre-1960 trade sites are now in mixed-use districts with housing. The land tells the same story: of the 24.6 km² zoned Industrial A in 1929, 51% is zoned industrial without housing in 2023, 12% industrial mixed use and 24% other mixed use with housing. Industrial zoning today sits beside the same population as in 1970. In the 22 study tracts with a fifth or more of their land zoned industrial, 49% of residents were Hispanic and 18% poor in 2020, against 25% and 11.5% in the 105 tracts with none.</w:t>
+      </w:r>
+    </w:p>
+    <w:p>
+      <w:pPr>
+        <w:spacing w:after="80" w:before="240"/>
+      </w:pPr>
+      <w:r>
+        <w:rPr>
+          <w:rFonts w:ascii="Times New Roman" w:cs="Times New Roman" w:eastAsia="Times New Roman" w:hAnsi="Times New Roman"/>
+          <w:b/>
+          <w:bCs/>
+          <w:sz w:val="20"/>
+          <w:szCs w:val="20"/>
+        </w:rPr>
+        <w:t xml:space="preserve">Table 17. Zoning in 2023 of the 1929 industrial districts and of the former hazardous sites</w:t>
+      </w:r>
+    </w:p>
+    <w:tbl>
+      <w:tblPr>
+        <w:tblW w:type="dxa" w:w="9360"/>
+        <w:tblBorders>
+          <w:top w:val="single" w:sz="6"/>
+          <w:left w:val="none"/>
+          <w:bottom w:val="single" w:sz="6"/>
+          <w:right w:val="none"/>
+          <w:insideH w:val="single" w:color="BBBBBB" w:sz="2"/>
+          <w:insideV w:val="none"/>
+        </w:tblBorders>
+      </w:tblPr>
+      <w:tblGrid>
+        <w:gridCol w:w="2808"/>
+        <w:gridCol w:w="1310"/>
+        <w:gridCol w:w="1310"/>
+        <w:gridCol w:w="1310"/>
+        <w:gridCol w:w="1310"/>
+        <w:gridCol w:w="1312"/>
+      </w:tblGrid>
+      <w:tr>
+        <w:trPr>
+          <w:tblHeader/>
+        </w:trPr>
+        <w:tc>
+          <w:tcPr>
+            <w:tcW w:type="dxa" w:w="2808"/>
+            <w:shd w:fill="EDEDED" w:color="auto" w:val="clear"/>
+            <w:tcMar>
+              <w:top w:type="dxa" w:w="40"/>
+              <w:left w:type="dxa" w:w="60"/>
+              <w:bottom w:type="dxa" w:w="40"/>
+              <w:right w:type="dxa" w:w="60"/>
+            </w:tcMar>
+          </w:tcPr>
+          <w:p>
+            <w:pPr>
+              <w:jc w:val="left"/>
+            </w:pPr>
+            <w:r>
+              <w:rPr>
+                <w:rFonts w:ascii="Times New Roman" w:cs="Times New Roman" w:eastAsia="Times New Roman" w:hAnsi="Times New Roman"/>
+                <w:b/>
+                <w:bCs/>
+                <w:i w:val="false"/>
+                <w:iCs w:val="false"/>
+                <w:sz w:val="18"/>
+                <w:szCs w:val="18"/>
+              </w:rPr>
+              <w:t xml:space="preserve">2023 zoning</w:t>
+            </w:r>
+          </w:p>
+        </w:tc>
+        <w:tc>
+          <w:tcPr>
+            <w:tcW w:type="dxa" w:w="1310"/>
+            <w:shd w:fill="EDEDED" w:color="auto" w:val="clear"/>
+            <w:tcMar>
+              <w:top w:type="dxa" w:w="40"/>
+              <w:left w:type="dxa" w:w="60"/>
+              <w:bottom w:type="dxa" w:w="40"/>
+              <w:right w:type="dxa" w:w="60"/>
+            </w:tcMar>
+          </w:tcPr>
+          <w:p>
+            <w:pPr>
+              <w:jc w:val="right"/>
+            </w:pPr>
+            <w:r>
+              <w:rPr>
+                <w:rFonts w:ascii="Times New Roman" w:cs="Times New Roman" w:eastAsia="Times New Roman" w:hAnsi="Times New Roman"/>
+                <w:b/>
+                <w:bCs/>
+                <w:i w:val="false"/>
+                <w:iCs w:val="false"/>
+                <w:sz w:val="18"/>
+                <w:szCs w:val="18"/>
+              </w:rPr>
+              <w:t xml:space="preserve">1929 Industrial A land (24.6 km²)</w:t>
+            </w:r>
+          </w:p>
+        </w:tc>
+        <w:tc>
+          <w:tcPr>
+            <w:tcW w:type="dxa" w:w="1310"/>
+            <w:shd w:fill="EDEDED" w:color="auto" w:val="clear"/>
+            <w:tcMar>
+              <w:top w:type="dxa" w:w="40"/>
+              <w:left w:type="dxa" w:w="60"/>
+              <w:bottom w:type="dxa" w:w="40"/>
+              <w:right w:type="dxa" w:w="60"/>
+            </w:tcMar>
+          </w:tcPr>
+          <w:p>
+            <w:pPr>
+              <w:jc w:val="right"/>
+            </w:pPr>
+            <w:r>
+              <w:rPr>
+                <w:rFonts w:ascii="Times New Roman" w:cs="Times New Roman" w:eastAsia="Times New Roman" w:hAnsi="Times New Roman"/>
+                <w:b/>
+                <w:bCs/>
+                <w:i w:val="false"/>
+                <w:iCs w:val="false"/>
+                <w:sz w:val="18"/>
+                <w:szCs w:val="18"/>
+              </w:rPr>
+              <w:t xml:space="preserve">1929 Industrial B land (3.8 km²)</w:t>
+            </w:r>
+          </w:p>
+        </w:tc>
+        <w:tc>
+          <w:tcPr>
+            <w:tcW w:type="dxa" w:w="1310"/>
+            <w:shd w:fill="EDEDED" w:color="auto" w:val="clear"/>
+            <w:tcMar>
+              <w:top w:type="dxa" w:w="40"/>
+              <w:left w:type="dxa" w:w="60"/>
+              <w:bottom w:type="dxa" w:w="40"/>
+              <w:right w:type="dxa" w:w="60"/>
+            </w:tcMar>
+          </w:tcPr>
+          <w:p>
+            <w:pPr>
+              <w:jc w:val="right"/>
+            </w:pPr>
+            <w:r>
+              <w:rPr>
+                <w:rFonts w:ascii="Times New Roman" w:cs="Times New Roman" w:eastAsia="Times New Roman" w:hAnsi="Times New Roman"/>
+                <w:b/>
+                <w:bCs/>
+                <w:i w:val="false"/>
+                <w:iCs w:val="false"/>
+                <w:sz w:val="18"/>
+                <w:szCs w:val="18"/>
+              </w:rPr>
+              <w:t xml:space="preserve">1965–92 sites, Denver County (n = 959)</w:t>
+            </w:r>
+          </w:p>
+        </w:tc>
+        <w:tc>
+          <w:tcPr>
+            <w:tcW w:type="dxa" w:w="1310"/>
+            <w:shd w:fill="EDEDED" w:color="auto" w:val="clear"/>
+            <w:tcMar>
+              <w:top w:type="dxa" w:w="40"/>
+              <w:left w:type="dxa" w:w="60"/>
+              <w:bottom w:type="dxa" w:w="40"/>
+              <w:right w:type="dxa" w:w="60"/>
+            </w:tcMar>
+          </w:tcPr>
+          <w:p>
+            <w:pPr>
+              <w:jc w:val="right"/>
+            </w:pPr>
+            <w:r>
+              <w:rPr>
+                <w:rFonts w:ascii="Times New Roman" w:cs="Times New Roman" w:eastAsia="Times New Roman" w:hAnsi="Times New Roman"/>
+                <w:b/>
+                <w:bCs/>
+                <w:i w:val="false"/>
+                <w:iCs w:val="false"/>
+                <w:sz w:val="18"/>
+                <w:szCs w:val="18"/>
+              </w:rPr>
+              <w:t xml:space="preserve">1965–92 sites, suburban study tracts (n = 278)</w:t>
+            </w:r>
+          </w:p>
+        </w:tc>
+        <w:tc>
+          <w:tcPr>
+            <w:tcW w:type="dxa" w:w="1312"/>
+            <w:shd w:fill="EDEDED" w:color="auto" w:val="clear"/>
+            <w:tcMar>
+              <w:top w:type="dxa" w:w="40"/>
+              <w:left w:type="dxa" w:w="60"/>
+              <w:bottom w:type="dxa" w:w="40"/>
+              <w:right w:type="dxa" w:w="60"/>
+            </w:tcMar>
+          </w:tcPr>
+          <w:p>
+            <w:pPr>
+              <w:jc w:val="right"/>
+            </w:pPr>
+            <w:r>
+              <w:rPr>
+                <w:rFonts w:ascii="Times New Roman" w:cs="Times New Roman" w:eastAsia="Times New Roman" w:hAnsi="Times New Roman"/>
+                <w:b/>
+                <w:bCs/>
+                <w:i w:val="false"/>
+                <w:iCs w:val="false"/>
+                <w:sz w:val="18"/>
+                <w:szCs w:val="18"/>
+              </w:rPr>
+              <w:t xml:space="preserve">pre-1960 trades, Denver County (n = 316)</w:t>
+            </w:r>
+          </w:p>
+        </w:tc>
+      </w:tr>
+      <w:tr>
+        <w:trPr>
+          <w:tblHeader w:val="false"/>
+        </w:trPr>
+        <w:tc>
+          <w:tcPr>
+            <w:tcW w:type="dxa" w:w="2808"/>
+            <w:tcMar>
+              <w:top w:type="dxa" w:w="40"/>
+              <w:left w:type="dxa" w:w="60"/>
+              <w:bottom w:type="dxa" w:w="40"/>
+              <w:right w:type="dxa" w:w="60"/>
+            </w:tcMar>
+          </w:tcPr>
+          <w:p>
+            <w:pPr>
+              <w:jc w:val="left"/>
+            </w:pPr>
+            <w:r>
+              <w:rPr>
+                <w:rFonts w:ascii="Times New Roman" w:cs="Times New Roman" w:eastAsia="Times New Roman" w:hAnsi="Times New Roman"/>
+                <w:b w:val="false"/>
+                <w:bCs w:val="false"/>
+                <w:i w:val="false"/>
+                <w:iCs w:val="false"/>
+                <w:sz w:val="18"/>
+                <w:szCs w:val="18"/>
+              </w:rPr>
+              <w:t xml:space="preserve">Industrial, housing not allowed</w:t>
+            </w:r>
+          </w:p>
+        </w:tc>
+        <w:tc>
+          <w:tcPr>
+            <w:tcW w:type="dxa" w:w="1310"/>
+            <w:tcMar>
+              <w:top w:type="dxa" w:w="40"/>
+              <w:left w:type="dxa" w:w="60"/>
+              <w:bottom w:type="dxa" w:w="40"/>
+              <w:right w:type="dxa" w:w="60"/>
+            </w:tcMar>
+          </w:tcPr>
+          <w:p>
+            <w:pPr>
+              <w:jc w:val="right"/>
+            </w:pPr>
+            <w:r>
+              <w:rPr>
+                <w:rFonts w:ascii="Times New Roman" w:cs="Times New Roman" w:eastAsia="Times New Roman" w:hAnsi="Times New Roman"/>
+                <w:b w:val="false"/>
+                <w:bCs w:val="false"/>
+                <w:i w:val="false"/>
+                <w:iCs w:val="false"/>
+                <w:sz w:val="18"/>
+                <w:szCs w:val="18"/>
+              </w:rPr>
+              <w:t xml:space="preserve">50.7%</w:t>
+            </w:r>
+          </w:p>
+        </w:tc>
+        <w:tc>
+          <w:tcPr>
+            <w:tcW w:type="dxa" w:w="1310"/>
+            <w:tcMar>
+              <w:top w:type="dxa" w:w="40"/>
+              <w:left w:type="dxa" w:w="60"/>
+              <w:bottom w:type="dxa" w:w="40"/>
+              <w:right w:type="dxa" w:w="60"/>
+            </w:tcMar>
+          </w:tcPr>
+          <w:p>
+            <w:pPr>
+              <w:jc w:val="right"/>
+            </w:pPr>
+            <w:r>
+              <w:rPr>
+                <w:rFonts w:ascii="Times New Roman" w:cs="Times New Roman" w:eastAsia="Times New Roman" w:hAnsi="Times New Roman"/>
+                <w:b w:val="false"/>
+                <w:bCs w:val="false"/>
+                <w:i w:val="false"/>
+                <w:iCs w:val="false"/>
+                <w:sz w:val="18"/>
+                <w:szCs w:val="18"/>
+              </w:rPr>
+              <w:t xml:space="preserve">59.9%</w:t>
+            </w:r>
+          </w:p>
+        </w:tc>
+        <w:tc>
+          <w:tcPr>
+            <w:tcW w:type="dxa" w:w="1310"/>
+            <w:tcMar>
+              <w:top w:type="dxa" w:w="40"/>
+              <w:left w:type="dxa" w:w="60"/>
+              <w:bottom w:type="dxa" w:w="40"/>
+              <w:right w:type="dxa" w:w="60"/>
+            </w:tcMar>
+          </w:tcPr>
+          <w:p>
+            <w:pPr>
+              <w:jc w:val="right"/>
+            </w:pPr>
+            <w:r>
+              <w:rPr>
+                <w:rFonts w:ascii="Times New Roman" w:cs="Times New Roman" w:eastAsia="Times New Roman" w:hAnsi="Times New Roman"/>
+                <w:b w:val="false"/>
+                <w:bCs w:val="false"/>
+                <w:i w:val="false"/>
+                <w:iCs w:val="false"/>
+                <w:sz w:val="18"/>
+                <w:szCs w:val="18"/>
+              </w:rPr>
+              <w:t xml:space="preserve">38.9%</w:t>
+            </w:r>
+          </w:p>
+        </w:tc>
+        <w:tc>
+          <w:tcPr>
+            <w:tcW w:type="dxa" w:w="1310"/>
+            <w:tcMar>
+              <w:top w:type="dxa" w:w="40"/>
+              <w:left w:type="dxa" w:w="60"/>
+              <w:bottom w:type="dxa" w:w="40"/>
+              <w:right w:type="dxa" w:w="60"/>
+            </w:tcMar>
+          </w:tcPr>
+          <w:p>
+            <w:pPr>
+              <w:jc w:val="right"/>
+            </w:pPr>
+            <w:r>
+              <w:rPr>
+                <w:rFonts w:ascii="Times New Roman" w:cs="Times New Roman" w:eastAsia="Times New Roman" w:hAnsi="Times New Roman"/>
+                <w:b w:val="false"/>
+                <w:bCs w:val="false"/>
+                <w:i w:val="false"/>
+                <w:iCs w:val="false"/>
+                <w:sz w:val="18"/>
+                <w:szCs w:val="18"/>
+              </w:rPr>
+              <w:t xml:space="preserve">57.9%</w:t>
+            </w:r>
+          </w:p>
+        </w:tc>
+        <w:tc>
+          <w:tcPr>
+            <w:tcW w:type="dxa" w:w="1312"/>
+            <w:tcMar>
+              <w:top w:type="dxa" w:w="40"/>
+              <w:left w:type="dxa" w:w="60"/>
+              <w:bottom w:type="dxa" w:w="40"/>
+              <w:right w:type="dxa" w:w="60"/>
+            </w:tcMar>
+          </w:tcPr>
+          <w:p>
+            <w:pPr>
+              <w:jc w:val="right"/>
+            </w:pPr>
+            <w:r>
+              <w:rPr>
+                <w:rFonts w:ascii="Times New Roman" w:cs="Times New Roman" w:eastAsia="Times New Roman" w:hAnsi="Times New Roman"/>
+                <w:b w:val="false"/>
+                <w:bCs w:val="false"/>
+                <w:i w:val="false"/>
+                <w:iCs w:val="false"/>
+                <w:sz w:val="18"/>
+                <w:szCs w:val="18"/>
+              </w:rPr>
+              <w:t xml:space="preserve">7.3%</w:t>
+            </w:r>
+          </w:p>
+        </w:tc>
+      </w:tr>
+      <w:tr>
+        <w:trPr>
+          <w:tblHeader w:val="false"/>
+        </w:trPr>
+        <w:tc>
+          <w:tcPr>
+            <w:tcW w:type="dxa" w:w="2808"/>
+            <w:tcMar>
+              <w:top w:type="dxa" w:w="40"/>
+              <w:left w:type="dxa" w:w="60"/>
+              <w:bottom w:type="dxa" w:w="40"/>
+              <w:right w:type="dxa" w:w="60"/>
+            </w:tcMar>
+          </w:tcPr>
+          <w:p>
+            <w:pPr>
+              <w:jc w:val="left"/>
+            </w:pPr>
+            <w:r>
+              <w:rPr>
+                <w:rFonts w:ascii="Times New Roman" w:cs="Times New Roman" w:eastAsia="Times New Roman" w:hAnsi="Times New Roman"/>
+                <w:b w:val="false"/>
+                <w:bCs w:val="false"/>
+                <w:i w:val="false"/>
+                <w:iCs w:val="false"/>
+                <w:sz w:val="18"/>
+                <w:szCs w:val="18"/>
+              </w:rPr>
+              <w:t xml:space="preserve">Industrial mixed use, housing allowed (Denver I-MX)</w:t>
+            </w:r>
+          </w:p>
+        </w:tc>
+        <w:tc>
+          <w:tcPr>
+            <w:tcW w:type="dxa" w:w="1310"/>
+            <w:tcMar>
+              <w:top w:type="dxa" w:w="40"/>
+              <w:left w:type="dxa" w:w="60"/>
+              <w:bottom w:type="dxa" w:w="40"/>
+              <w:right w:type="dxa" w:w="60"/>
+            </w:tcMar>
+          </w:tcPr>
+          <w:p>
+            <w:pPr>
+              <w:jc w:val="right"/>
+            </w:pPr>
+            <w:r>
+              <w:rPr>
+                <w:rFonts w:ascii="Times New Roman" w:cs="Times New Roman" w:eastAsia="Times New Roman" w:hAnsi="Times New Roman"/>
+                <w:b w:val="false"/>
+                <w:bCs w:val="false"/>
+                <w:i w:val="false"/>
+                <w:iCs w:val="false"/>
+                <w:sz w:val="18"/>
+                <w:szCs w:val="18"/>
+              </w:rPr>
+              <w:t xml:space="preserve">11.8%</w:t>
+            </w:r>
+          </w:p>
+        </w:tc>
+        <w:tc>
+          <w:tcPr>
+            <w:tcW w:type="dxa" w:w="1310"/>
+            <w:tcMar>
+              <w:top w:type="dxa" w:w="40"/>
+              <w:left w:type="dxa" w:w="60"/>
+              <w:bottom w:type="dxa" w:w="40"/>
+              <w:right w:type="dxa" w:w="60"/>
+            </w:tcMar>
+          </w:tcPr>
+          <w:p>
+            <w:pPr>
+              <w:jc w:val="right"/>
+            </w:pPr>
+            <w:r>
+              <w:rPr>
+                <w:rFonts w:ascii="Times New Roman" w:cs="Times New Roman" w:eastAsia="Times New Roman" w:hAnsi="Times New Roman"/>
+                <w:b w:val="false"/>
+                <w:bCs w:val="false"/>
+                <w:i w:val="false"/>
+                <w:iCs w:val="false"/>
+                <w:sz w:val="18"/>
+                <w:szCs w:val="18"/>
+              </w:rPr>
+              <w:t xml:space="preserve">2.6%</w:t>
+            </w:r>
+          </w:p>
+        </w:tc>
+        <w:tc>
+          <w:tcPr>
+            <w:tcW w:type="dxa" w:w="1310"/>
+            <w:tcMar>
+              <w:top w:type="dxa" w:w="40"/>
+              <w:left w:type="dxa" w:w="60"/>
+              <w:bottom w:type="dxa" w:w="40"/>
+              <w:right w:type="dxa" w:w="60"/>
+            </w:tcMar>
+          </w:tcPr>
+          <w:p>
+            <w:pPr>
+              <w:jc w:val="right"/>
+            </w:pPr>
+            <w:r>
+              <w:rPr>
+                <w:rFonts w:ascii="Times New Roman" w:cs="Times New Roman" w:eastAsia="Times New Roman" w:hAnsi="Times New Roman"/>
+                <w:b w:val="false"/>
+                <w:bCs w:val="false"/>
+                <w:i w:val="false"/>
+                <w:iCs w:val="false"/>
+                <w:sz w:val="18"/>
+                <w:szCs w:val="18"/>
+              </w:rPr>
+              <w:t xml:space="preserve">13.5%</w:t>
+            </w:r>
+          </w:p>
+        </w:tc>
+        <w:tc>
+          <w:tcPr>
+            <w:tcW w:type="dxa" w:w="1310"/>
+            <w:tcMar>
+              <w:top w:type="dxa" w:w="40"/>
+              <w:left w:type="dxa" w:w="60"/>
+              <w:bottom w:type="dxa" w:w="40"/>
+              <w:right w:type="dxa" w:w="60"/>
+            </w:tcMar>
+          </w:tcPr>
+          <w:p>
+            <w:pPr>
+              <w:jc w:val="right"/>
+            </w:pPr>
+            <w:r>
+              <w:rPr>
+                <w:rFonts w:ascii="Times New Roman" w:cs="Times New Roman" w:eastAsia="Times New Roman" w:hAnsi="Times New Roman"/>
+                <w:b w:val="false"/>
+                <w:bCs w:val="false"/>
+                <w:i w:val="false"/>
+                <w:iCs w:val="false"/>
+                <w:sz w:val="18"/>
+                <w:szCs w:val="18"/>
+              </w:rPr>
+              <w:t xml:space="preserve">1.8%</w:t>
+            </w:r>
+          </w:p>
+        </w:tc>
+        <w:tc>
+          <w:tcPr>
+            <w:tcW w:type="dxa" w:w="1312"/>
+            <w:tcMar>
+              <w:top w:type="dxa" w:w="40"/>
+              <w:left w:type="dxa" w:w="60"/>
+              <w:bottom w:type="dxa" w:w="40"/>
+              <w:right w:type="dxa" w:w="60"/>
+            </w:tcMar>
+          </w:tcPr>
+          <w:p>
+            <w:pPr>
+              <w:jc w:val="right"/>
+            </w:pPr>
+            <w:r>
+              <w:rPr>
+                <w:rFonts w:ascii="Times New Roman" w:cs="Times New Roman" w:eastAsia="Times New Roman" w:hAnsi="Times New Roman"/>
+                <w:b w:val="false"/>
+                <w:bCs w:val="false"/>
+                <w:i w:val="false"/>
+                <w:iCs w:val="false"/>
+                <w:sz w:val="18"/>
+                <w:szCs w:val="18"/>
+              </w:rPr>
+              <w:t xml:space="preserve">8.5%</w:t>
+            </w:r>
+          </w:p>
+        </w:tc>
+      </w:tr>
+      <w:tr>
+        <w:trPr>
+          <w:tblHeader w:val="false"/>
+        </w:trPr>
+        <w:tc>
+          <w:tcPr>
+            <w:tcW w:type="dxa" w:w="2808"/>
+            <w:tcMar>
+              <w:top w:type="dxa" w:w="40"/>
+              <w:left w:type="dxa" w:w="60"/>
+              <w:bottom w:type="dxa" w:w="40"/>
+              <w:right w:type="dxa" w:w="60"/>
+            </w:tcMar>
+          </w:tcPr>
+          <w:p>
+            <w:pPr>
+              <w:jc w:val="left"/>
+            </w:pPr>
+            <w:r>
+              <w:rPr>
+                <w:rFonts w:ascii="Times New Roman" w:cs="Times New Roman" w:eastAsia="Times New Roman" w:hAnsi="Times New Roman"/>
+                <w:b w:val="false"/>
+                <w:bCs w:val="false"/>
+                <w:i w:val="false"/>
+                <w:iCs w:val="false"/>
+                <w:sz w:val="18"/>
+                <w:szCs w:val="18"/>
+              </w:rPr>
+              <w:t xml:space="preserve">Other mixed use with housing</w:t>
+            </w:r>
+          </w:p>
+        </w:tc>
+        <w:tc>
+          <w:tcPr>
+            <w:tcW w:type="dxa" w:w="1310"/>
+            <w:tcMar>
+              <w:top w:type="dxa" w:w="40"/>
+              <w:left w:type="dxa" w:w="60"/>
+              <w:bottom w:type="dxa" w:w="40"/>
+              <w:right w:type="dxa" w:w="60"/>
+            </w:tcMar>
+          </w:tcPr>
+          <w:p>
+            <w:pPr>
+              <w:jc w:val="right"/>
+            </w:pPr>
+            <w:r>
+              <w:rPr>
+                <w:rFonts w:ascii="Times New Roman" w:cs="Times New Roman" w:eastAsia="Times New Roman" w:hAnsi="Times New Roman"/>
+                <w:b w:val="false"/>
+                <w:bCs w:val="false"/>
+                <w:i w:val="false"/>
+                <w:iCs w:val="false"/>
+                <w:sz w:val="18"/>
+                <w:szCs w:val="18"/>
+              </w:rPr>
+              <w:t xml:space="preserve">23.8%</w:t>
+            </w:r>
+          </w:p>
+        </w:tc>
+        <w:tc>
+          <w:tcPr>
+            <w:tcW w:type="dxa" w:w="1310"/>
+            <w:tcMar>
+              <w:top w:type="dxa" w:w="40"/>
+              <w:left w:type="dxa" w:w="60"/>
+              <w:bottom w:type="dxa" w:w="40"/>
+              <w:right w:type="dxa" w:w="60"/>
+            </w:tcMar>
+          </w:tcPr>
+          <w:p>
+            <w:pPr>
+              <w:jc w:val="right"/>
+            </w:pPr>
+            <w:r>
+              <w:rPr>
+                <w:rFonts w:ascii="Times New Roman" w:cs="Times New Roman" w:eastAsia="Times New Roman" w:hAnsi="Times New Roman"/>
+                <w:b w:val="false"/>
+                <w:bCs w:val="false"/>
+                <w:i w:val="false"/>
+                <w:iCs w:val="false"/>
+                <w:sz w:val="18"/>
+                <w:szCs w:val="18"/>
+              </w:rPr>
+              <w:t xml:space="preserve">16.5%</w:t>
+            </w:r>
+          </w:p>
+        </w:tc>
+        <w:tc>
+          <w:tcPr>
+            <w:tcW w:type="dxa" w:w="1310"/>
+            <w:tcMar>
+              <w:top w:type="dxa" w:w="40"/>
+              <w:left w:type="dxa" w:w="60"/>
+              <w:bottom w:type="dxa" w:w="40"/>
+              <w:right w:type="dxa" w:w="60"/>
+            </w:tcMar>
+          </w:tcPr>
+          <w:p>
+            <w:pPr>
+              <w:jc w:val="right"/>
+            </w:pPr>
+            <w:r>
+              <w:rPr>
+                <w:rFonts w:ascii="Times New Roman" w:cs="Times New Roman" w:eastAsia="Times New Roman" w:hAnsi="Times New Roman"/>
+                <w:b w:val="false"/>
+                <w:bCs w:val="false"/>
+                <w:i w:val="false"/>
+                <w:iCs w:val="false"/>
+                <w:sz w:val="18"/>
+                <w:szCs w:val="18"/>
+              </w:rPr>
+              <w:t xml:space="preserve">33.6%</w:t>
+            </w:r>
+          </w:p>
+        </w:tc>
+        <w:tc>
+          <w:tcPr>
+            <w:tcW w:type="dxa" w:w="1310"/>
+            <w:tcMar>
+              <w:top w:type="dxa" w:w="40"/>
+              <w:left w:type="dxa" w:w="60"/>
+              <w:bottom w:type="dxa" w:w="40"/>
+              <w:right w:type="dxa" w:w="60"/>
+            </w:tcMar>
+          </w:tcPr>
+          <w:p>
+            <w:pPr>
+              <w:jc w:val="right"/>
+            </w:pPr>
+            <w:r>
+              <w:rPr>
+                <w:rFonts w:ascii="Times New Roman" w:cs="Times New Roman" w:eastAsia="Times New Roman" w:hAnsi="Times New Roman"/>
+                <w:b w:val="false"/>
+                <w:bCs w:val="false"/>
+                <w:i w:val="false"/>
+                <w:iCs w:val="false"/>
+                <w:sz w:val="18"/>
+                <w:szCs w:val="18"/>
+              </w:rPr>
+              <w:t xml:space="preserve">16.2%</w:t>
+            </w:r>
+          </w:p>
+        </w:tc>
+        <w:tc>
+          <w:tcPr>
+            <w:tcW w:type="dxa" w:w="1312"/>
+            <w:tcMar>
+              <w:top w:type="dxa" w:w="40"/>
+              <w:left w:type="dxa" w:w="60"/>
+              <w:bottom w:type="dxa" w:w="40"/>
+              <w:right w:type="dxa" w:w="60"/>
+            </w:tcMar>
+          </w:tcPr>
+          <w:p>
+            <w:pPr>
+              <w:jc w:val="right"/>
+            </w:pPr>
+            <w:r>
+              <w:rPr>
+                <w:rFonts w:ascii="Times New Roman" w:cs="Times New Roman" w:eastAsia="Times New Roman" w:hAnsi="Times New Roman"/>
+                <w:b w:val="false"/>
+                <w:bCs w:val="false"/>
+                <w:i w:val="false"/>
+                <w:iCs w:val="false"/>
+                <w:sz w:val="18"/>
+                <w:szCs w:val="18"/>
+              </w:rPr>
+              <w:t xml:space="preserve">69.6%</w:t>
+            </w:r>
+          </w:p>
+        </w:tc>
+      </w:tr>
+      <w:tr>
+        <w:trPr>
+          <w:tblHeader w:val="false"/>
+        </w:trPr>
+        <w:tc>
+          <w:tcPr>
+            <w:tcW w:type="dxa" w:w="2808"/>
+            <w:tcMar>
+              <w:top w:type="dxa" w:w="40"/>
+              <w:left w:type="dxa" w:w="60"/>
+              <w:bottom w:type="dxa" w:w="40"/>
+              <w:right w:type="dxa" w:w="60"/>
+            </w:tcMar>
+          </w:tcPr>
+          <w:p>
+            <w:pPr>
+              <w:jc w:val="left"/>
+            </w:pPr>
+            <w:r>
+              <w:rPr>
+                <w:rFonts w:ascii="Times New Roman" w:cs="Times New Roman" w:eastAsia="Times New Roman" w:hAnsi="Times New Roman"/>
+                <w:b w:val="false"/>
+                <w:bCs w:val="false"/>
+                <w:i w:val="false"/>
+                <w:iCs w:val="false"/>
+                <w:sz w:val="18"/>
+                <w:szCs w:val="18"/>
+              </w:rPr>
+              <w:t xml:space="preserve">Residential</w:t>
+            </w:r>
+          </w:p>
+        </w:tc>
+        <w:tc>
+          <w:tcPr>
+            <w:tcW w:type="dxa" w:w="1310"/>
+            <w:tcMar>
+              <w:top w:type="dxa" w:w="40"/>
+              <w:left w:type="dxa" w:w="60"/>
+              <w:bottom w:type="dxa" w:w="40"/>
+              <w:right w:type="dxa" w:w="60"/>
+            </w:tcMar>
+          </w:tcPr>
+          <w:p>
+            <w:pPr>
+              <w:jc w:val="right"/>
+            </w:pPr>
+            <w:r>
+              <w:rPr>
+                <w:rFonts w:ascii="Times New Roman" w:cs="Times New Roman" w:eastAsia="Times New Roman" w:hAnsi="Times New Roman"/>
+                <w:b w:val="false"/>
+                <w:bCs w:val="false"/>
+                <w:i w:val="false"/>
+                <w:iCs w:val="false"/>
+                <w:sz w:val="18"/>
+                <w:szCs w:val="18"/>
+              </w:rPr>
+              <w:t xml:space="preserve">6.3%</w:t>
+            </w:r>
+          </w:p>
+        </w:tc>
+        <w:tc>
+          <w:tcPr>
+            <w:tcW w:type="dxa" w:w="1310"/>
+            <w:tcMar>
+              <w:top w:type="dxa" w:w="40"/>
+              <w:left w:type="dxa" w:w="60"/>
+              <w:bottom w:type="dxa" w:w="40"/>
+              <w:right w:type="dxa" w:w="60"/>
+            </w:tcMar>
+          </w:tcPr>
+          <w:p>
+            <w:pPr>
+              <w:jc w:val="right"/>
+            </w:pPr>
+            <w:r>
+              <w:rPr>
+                <w:rFonts w:ascii="Times New Roman" w:cs="Times New Roman" w:eastAsia="Times New Roman" w:hAnsi="Times New Roman"/>
+                <w:b w:val="false"/>
+                <w:bCs w:val="false"/>
+                <w:i w:val="false"/>
+                <w:iCs w:val="false"/>
+                <w:sz w:val="18"/>
+                <w:szCs w:val="18"/>
+              </w:rPr>
+              <w:t xml:space="preserve">11.8%</w:t>
+            </w:r>
+          </w:p>
+        </w:tc>
+        <w:tc>
+          <w:tcPr>
+            <w:tcW w:type="dxa" w:w="1310"/>
+            <w:tcMar>
+              <w:top w:type="dxa" w:w="40"/>
+              <w:left w:type="dxa" w:w="60"/>
+              <w:bottom w:type="dxa" w:w="40"/>
+              <w:right w:type="dxa" w:w="60"/>
+            </w:tcMar>
+          </w:tcPr>
+          <w:p>
+            <w:pPr>
+              <w:jc w:val="right"/>
+            </w:pPr>
+            <w:r>
+              <w:rPr>
+                <w:rFonts w:ascii="Times New Roman" w:cs="Times New Roman" w:eastAsia="Times New Roman" w:hAnsi="Times New Roman"/>
+                <w:b w:val="false"/>
+                <w:bCs w:val="false"/>
+                <w:i w:val="false"/>
+                <w:iCs w:val="false"/>
+                <w:sz w:val="18"/>
+                <w:szCs w:val="18"/>
+              </w:rPr>
+              <w:t xml:space="preserve">11.3%</w:t>
+            </w:r>
+          </w:p>
+        </w:tc>
+        <w:tc>
+          <w:tcPr>
+            <w:tcW w:type="dxa" w:w="1310"/>
+            <w:tcMar>
+              <w:top w:type="dxa" w:w="40"/>
+              <w:left w:type="dxa" w:w="60"/>
+              <w:bottom w:type="dxa" w:w="40"/>
+              <w:right w:type="dxa" w:w="60"/>
+            </w:tcMar>
+          </w:tcPr>
+          <w:p>
+            <w:pPr>
+              <w:jc w:val="right"/>
+            </w:pPr>
+            <w:r>
+              <w:rPr>
+                <w:rFonts w:ascii="Times New Roman" w:cs="Times New Roman" w:eastAsia="Times New Roman" w:hAnsi="Times New Roman"/>
+                <w:b w:val="false"/>
+                <w:bCs w:val="false"/>
+                <w:i w:val="false"/>
+                <w:iCs w:val="false"/>
+                <w:sz w:val="18"/>
+                <w:szCs w:val="18"/>
+              </w:rPr>
+              <w:t xml:space="preserve">18.3%</w:t>
+            </w:r>
+          </w:p>
+        </w:tc>
+        <w:tc>
+          <w:tcPr>
+            <w:tcW w:type="dxa" w:w="1312"/>
+            <w:tcMar>
+              <w:top w:type="dxa" w:w="40"/>
+              <w:left w:type="dxa" w:w="60"/>
+              <w:bottom w:type="dxa" w:w="40"/>
+              <w:right w:type="dxa" w:w="60"/>
+            </w:tcMar>
+          </w:tcPr>
+          <w:p>
+            <w:pPr>
+              <w:jc w:val="right"/>
+            </w:pPr>
+            <w:r>
+              <w:rPr>
+                <w:rFonts w:ascii="Times New Roman" w:cs="Times New Roman" w:eastAsia="Times New Roman" w:hAnsi="Times New Roman"/>
+                <w:b w:val="false"/>
+                <w:bCs w:val="false"/>
+                <w:i w:val="false"/>
+                <w:iCs w:val="false"/>
+                <w:sz w:val="18"/>
+                <w:szCs w:val="18"/>
+              </w:rPr>
+              <w:t xml:space="preserve">10.4%</w:t>
+            </w:r>
+          </w:p>
+        </w:tc>
+      </w:tr>
+      <w:tr>
+        <w:trPr>
+          <w:tblHeader w:val="false"/>
+        </w:trPr>
+        <w:tc>
+          <w:tcPr>
+            <w:tcW w:type="dxa" w:w="2808"/>
+            <w:tcMar>
+              <w:top w:type="dxa" w:w="40"/>
+              <w:left w:type="dxa" w:w="60"/>
+              <w:bottom w:type="dxa" w:w="40"/>
+              <w:right w:type="dxa" w:w="60"/>
+            </w:tcMar>
+          </w:tcPr>
+          <w:p>
+            <w:pPr>
+              <w:jc w:val="left"/>
+            </w:pPr>
+            <w:r>
+              <w:rPr>
+                <w:rFonts w:ascii="Times New Roman" w:cs="Times New Roman" w:eastAsia="Times New Roman" w:hAnsi="Times New Roman"/>
+                <w:b w:val="false"/>
+                <w:bCs w:val="false"/>
+                <w:i w:val="false"/>
+                <w:iCs w:val="false"/>
+                <w:sz w:val="18"/>
+                <w:szCs w:val="18"/>
+              </w:rPr>
+              <w:t xml:space="preserve">Commercial</w:t>
+            </w:r>
+          </w:p>
+        </w:tc>
+        <w:tc>
+          <w:tcPr>
+            <w:tcW w:type="dxa" w:w="1310"/>
+            <w:tcMar>
+              <w:top w:type="dxa" w:w="40"/>
+              <w:left w:type="dxa" w:w="60"/>
+              <w:bottom w:type="dxa" w:w="40"/>
+              <w:right w:type="dxa" w:w="60"/>
+            </w:tcMar>
+          </w:tcPr>
+          <w:p>
+            <w:pPr>
+              <w:jc w:val="right"/>
+            </w:pPr>
+            <w:r>
+              <w:rPr>
+                <w:rFonts w:ascii="Times New Roman" w:cs="Times New Roman" w:eastAsia="Times New Roman" w:hAnsi="Times New Roman"/>
+                <w:b w:val="false"/>
+                <w:bCs w:val="false"/>
+                <w:i w:val="false"/>
+                <w:iCs w:val="false"/>
+                <w:sz w:val="18"/>
+                <w:szCs w:val="18"/>
+              </w:rPr>
+              <w:t xml:space="preserve">0.2%</w:t>
+            </w:r>
+          </w:p>
+        </w:tc>
+        <w:tc>
+          <w:tcPr>
+            <w:tcW w:type="dxa" w:w="1310"/>
+            <w:tcMar>
+              <w:top w:type="dxa" w:w="40"/>
+              <w:left w:type="dxa" w:w="60"/>
+              <w:bottom w:type="dxa" w:w="40"/>
+              <w:right w:type="dxa" w:w="60"/>
+            </w:tcMar>
+          </w:tcPr>
+          <w:p>
+            <w:pPr>
+              <w:jc w:val="right"/>
+            </w:pPr>
+            <w:r>
+              <w:rPr>
+                <w:rFonts w:ascii="Times New Roman" w:cs="Times New Roman" w:eastAsia="Times New Roman" w:hAnsi="Times New Roman"/>
+                <w:b w:val="false"/>
+                <w:bCs w:val="false"/>
+                <w:i w:val="false"/>
+                <w:iCs w:val="false"/>
+                <w:sz w:val="18"/>
+                <w:szCs w:val="18"/>
+              </w:rPr>
+              <w:t xml:space="preserve">0.9%</w:t>
+            </w:r>
+          </w:p>
+        </w:tc>
+        <w:tc>
+          <w:tcPr>
+            <w:tcW w:type="dxa" w:w="1310"/>
+            <w:tcMar>
+              <w:top w:type="dxa" w:w="40"/>
+              <w:left w:type="dxa" w:w="60"/>
+              <w:bottom w:type="dxa" w:w="40"/>
+              <w:right w:type="dxa" w:w="60"/>
+            </w:tcMar>
+          </w:tcPr>
+          <w:p>
+            <w:pPr>
+              <w:jc w:val="right"/>
+            </w:pPr>
+            <w:r>
+              <w:rPr>
+                <w:rFonts w:ascii="Times New Roman" w:cs="Times New Roman" w:eastAsia="Times New Roman" w:hAnsi="Times New Roman"/>
+                <w:b w:val="false"/>
+                <w:bCs w:val="false"/>
+                <w:i w:val="false"/>
+                <w:iCs w:val="false"/>
+                <w:sz w:val="18"/>
+                <w:szCs w:val="18"/>
+              </w:rPr>
+              <w:t xml:space="preserve">1.1%</w:t>
+            </w:r>
+          </w:p>
+        </w:tc>
+        <w:tc>
+          <w:tcPr>
+            <w:tcW w:type="dxa" w:w="1310"/>
+            <w:tcMar>
+              <w:top w:type="dxa" w:w="40"/>
+              <w:left w:type="dxa" w:w="60"/>
+              <w:bottom w:type="dxa" w:w="40"/>
+              <w:right w:type="dxa" w:w="60"/>
+            </w:tcMar>
+          </w:tcPr>
+          <w:p>
+            <w:pPr>
+              <w:jc w:val="right"/>
+            </w:pPr>
+            <w:r>
+              <w:rPr>
+                <w:rFonts w:ascii="Times New Roman" w:cs="Times New Roman" w:eastAsia="Times New Roman" w:hAnsi="Times New Roman"/>
+                <w:b w:val="false"/>
+                <w:bCs w:val="false"/>
+                <w:i w:val="false"/>
+                <w:iCs w:val="false"/>
+                <w:sz w:val="18"/>
+                <w:szCs w:val="18"/>
+              </w:rPr>
+              <w:t xml:space="preserve">5.0%</w:t>
+            </w:r>
+          </w:p>
+        </w:tc>
+        <w:tc>
+          <w:tcPr>
+            <w:tcW w:type="dxa" w:w="1312"/>
+            <w:tcMar>
+              <w:top w:type="dxa" w:w="40"/>
+              <w:left w:type="dxa" w:w="60"/>
+              <w:bottom w:type="dxa" w:w="40"/>
+              <w:right w:type="dxa" w:w="60"/>
+            </w:tcMar>
+          </w:tcPr>
+          <w:p>
+            <w:pPr>
+              <w:jc w:val="right"/>
+            </w:pPr>
+            <w:r>
+              <w:rPr>
+                <w:rFonts w:ascii="Times New Roman" w:cs="Times New Roman" w:eastAsia="Times New Roman" w:hAnsi="Times New Roman"/>
+                <w:b w:val="false"/>
+                <w:bCs w:val="false"/>
+                <w:i w:val="false"/>
+                <w:iCs w:val="false"/>
+                <w:sz w:val="18"/>
+                <w:szCs w:val="18"/>
+              </w:rPr>
+              <w:t xml:space="preserve">0.9%</w:t>
+            </w:r>
+          </w:p>
+        </w:tc>
+      </w:tr>
+      <w:tr>
+        <w:trPr>
+          <w:tblHeader w:val="false"/>
+        </w:trPr>
+        <w:tc>
+          <w:tcPr>
+            <w:tcW w:type="dxa" w:w="2808"/>
+            <w:tcMar>
+              <w:top w:type="dxa" w:w="40"/>
+              <w:left w:type="dxa" w:w="60"/>
+              <w:bottom w:type="dxa" w:w="40"/>
+              <w:right w:type="dxa" w:w="60"/>
+            </w:tcMar>
+          </w:tcPr>
+          <w:p>
+            <w:pPr>
+              <w:jc w:val="left"/>
+            </w:pPr>
+            <w:r>
+              <w:rPr>
+                <w:rFonts w:ascii="Times New Roman" w:cs="Times New Roman" w:eastAsia="Times New Roman" w:hAnsi="Times New Roman"/>
+                <w:b w:val="false"/>
+                <w:bCs w:val="false"/>
+                <w:i w:val="false"/>
+                <w:iCs w:val="false"/>
+                <w:sz w:val="18"/>
+                <w:szCs w:val="18"/>
+              </w:rPr>
+              <w:t xml:space="preserve">Open space, civic, other</w:t>
+            </w:r>
+          </w:p>
+        </w:tc>
+        <w:tc>
+          <w:tcPr>
+            <w:tcW w:type="dxa" w:w="1310"/>
+            <w:tcMar>
+              <w:top w:type="dxa" w:w="40"/>
+              <w:left w:type="dxa" w:w="60"/>
+              <w:bottom w:type="dxa" w:w="40"/>
+              <w:right w:type="dxa" w:w="60"/>
+            </w:tcMar>
+          </w:tcPr>
+          <w:p>
+            <w:pPr>
+              <w:jc w:val="right"/>
+            </w:pPr>
+            <w:r>
+              <w:rPr>
+                <w:rFonts w:ascii="Times New Roman" w:cs="Times New Roman" w:eastAsia="Times New Roman" w:hAnsi="Times New Roman"/>
+                <w:b w:val="false"/>
+                <w:bCs w:val="false"/>
+                <w:i w:val="false"/>
+                <w:iCs w:val="false"/>
+                <w:sz w:val="18"/>
+                <w:szCs w:val="18"/>
+              </w:rPr>
+              <w:t xml:space="preserve">7.3%</w:t>
+            </w:r>
+          </w:p>
+        </w:tc>
+        <w:tc>
+          <w:tcPr>
+            <w:tcW w:type="dxa" w:w="1310"/>
+            <w:tcMar>
+              <w:top w:type="dxa" w:w="40"/>
+              <w:left w:type="dxa" w:w="60"/>
+              <w:bottom w:type="dxa" w:w="40"/>
+              <w:right w:type="dxa" w:w="60"/>
+            </w:tcMar>
+          </w:tcPr>
+          <w:p>
+            <w:pPr>
+              <w:jc w:val="right"/>
+            </w:pPr>
+            <w:r>
+              <w:rPr>
+                <w:rFonts w:ascii="Times New Roman" w:cs="Times New Roman" w:eastAsia="Times New Roman" w:hAnsi="Times New Roman"/>
+                <w:b w:val="false"/>
+                <w:bCs w:val="false"/>
+                <w:i w:val="false"/>
+                <w:iCs w:val="false"/>
+                <w:sz w:val="18"/>
+                <w:szCs w:val="18"/>
+              </w:rPr>
+              <w:t xml:space="preserve">8.3%</w:t>
+            </w:r>
+          </w:p>
+        </w:tc>
+        <w:tc>
+          <w:tcPr>
+            <w:tcW w:type="dxa" w:w="1310"/>
+            <w:tcMar>
+              <w:top w:type="dxa" w:w="40"/>
+              <w:left w:type="dxa" w:w="60"/>
+              <w:bottom w:type="dxa" w:w="40"/>
+              <w:right w:type="dxa" w:w="60"/>
+            </w:tcMar>
+          </w:tcPr>
+          <w:p>
+            <w:pPr>
+              <w:jc w:val="right"/>
+            </w:pPr>
+            <w:r>
+              <w:rPr>
+                <w:rFonts w:ascii="Times New Roman" w:cs="Times New Roman" w:eastAsia="Times New Roman" w:hAnsi="Times New Roman"/>
+                <w:b w:val="false"/>
+                <w:bCs w:val="false"/>
+                <w:i w:val="false"/>
+                <w:iCs w:val="false"/>
+                <w:sz w:val="18"/>
+                <w:szCs w:val="18"/>
+              </w:rPr>
+              <w:t xml:space="preserve">1.7%</w:t>
+            </w:r>
+          </w:p>
+        </w:tc>
+        <w:tc>
+          <w:tcPr>
+            <w:tcW w:type="dxa" w:w="1310"/>
+            <w:tcMar>
+              <w:top w:type="dxa" w:w="40"/>
+              <w:left w:type="dxa" w:w="60"/>
+              <w:bottom w:type="dxa" w:w="40"/>
+              <w:right w:type="dxa" w:w="60"/>
+            </w:tcMar>
+          </w:tcPr>
+          <w:p>
+            <w:pPr>
+              <w:jc w:val="right"/>
+            </w:pPr>
+            <w:r>
+              <w:rPr>
+                <w:rFonts w:ascii="Times New Roman" w:cs="Times New Roman" w:eastAsia="Times New Roman" w:hAnsi="Times New Roman"/>
+                <w:b w:val="false"/>
+                <w:bCs w:val="false"/>
+                <w:i w:val="false"/>
+                <w:iCs w:val="false"/>
+                <w:sz w:val="18"/>
+                <w:szCs w:val="18"/>
+              </w:rPr>
+              <w:t xml:space="preserve">0.7%</w:t>
+            </w:r>
+          </w:p>
+        </w:tc>
+        <w:tc>
+          <w:tcPr>
+            <w:tcW w:type="dxa" w:w="1312"/>
+            <w:tcMar>
+              <w:top w:type="dxa" w:w="40"/>
+              <w:left w:type="dxa" w:w="60"/>
+              <w:bottom w:type="dxa" w:w="40"/>
+              <w:right w:type="dxa" w:w="60"/>
+            </w:tcMar>
+          </w:tcPr>
+          <w:p>
+            <w:pPr>
+              <w:jc w:val="right"/>
+            </w:pPr>
+            <w:r>
+              <w:rPr>
+                <w:rFonts w:ascii="Times New Roman" w:cs="Times New Roman" w:eastAsia="Times New Roman" w:hAnsi="Times New Roman"/>
+                <w:b w:val="false"/>
+                <w:bCs w:val="false"/>
+                <w:i w:val="false"/>
+                <w:iCs w:val="false"/>
+                <w:sz w:val="18"/>
+                <w:szCs w:val="18"/>
+              </w:rPr>
+              <w:t xml:space="preserve">3.2%</w:t>
+            </w:r>
+          </w:p>
+        </w:tc>
+      </w:tr>
+    </w:tbl>
+    <w:p>
+      <w:pPr>
+        <w:spacing w:after="120"/>
+      </w:pPr>
+    </w:p>
+    <w:p>
+      <w:pPr>
+        <w:spacing w:after="160" w:line="360"/>
+        <w:jc w:val="both"/>
+      </w:pPr>
+      <w:r>
+        <w:rPr>
+          <w:rFonts w:ascii="Times New Roman" w:cs="Times New Roman" w:eastAsia="Times New Roman" w:hAnsi="Times New Roman"/>
+          <w:b w:val="false"/>
+          <w:bCs w:val="false"/>
+          <w:i w:val="false"/>
+          <w:iCs w:val="false"/>
+          <w:sz w:val="24"/>
+          <w:szCs w:val="24"/>
+        </w:rPr>
+        <w:t xml:space="preserve">Shares of each 1929 district's land and of each set of sites by their zoning on 3 October 2023. Sites are street-located hazardous-sector sites; the suburban column covers the study tracts outside the City and County of Denver.</w:t>
       </w:r>
     </w:p>
     <w:p>
@@ -37531,6 +38837,29 @@
     </w:p>
     <w:p>
       <w:pPr>
+        <w:pStyle w:val="ListParagraph"/>
+        <w:numPr>
+          <w:ilvl w:val="0"/>
+          <w:numId w:val="4"/>
+        </w:numPr>
+        <w:spacing w:after="120" w:line="340"/>
+        <w:jc w:val="both"/>
+      </w:pPr>
+      <w:r>
+        <w:rPr>
+          <w:rFonts w:ascii="Times New Roman" w:cs="Times New Roman" w:eastAsia="Times New Roman" w:hAnsi="Times New Roman"/>
+          <w:b w:val="false"/>
+          <w:bCs w:val="false"/>
+          <w:i w:val="false"/>
+          <w:iCs w:val="false"/>
+          <w:sz w:val="24"/>
+          <w:szCs w:val="24"/>
+        </w:rPr>
+        <w:t xml:space="preserve">Makarewicz, C. (2023) Denver-metro zoning layer, 3 October 2023, compiled for the National Zoning Atlas. Denver: University of Colorado Denver.</w:t>
+      </w:r>
+    </w:p>
+    <w:p>
+      <w:pPr>
         <w:spacing w:after="160" w:line="360"/>
         <w:jc w:val="both"/>
       </w:pPr>

</xml_diff>

<commit_message>
1944 zoning compared with 1929; spatial-unit notes; chart label fixes
</commit_message>
<xml_diff>
--- a/paper/Before_and_After_the_Map_manuscript.docx
+++ b/paper/Before_and_After_the_Map_manuscript.docx
@@ -481,7 +481,7 @@
           <w:sz w:val="24"/>
           <w:szCs w:val="24"/>
         </w:rPr>
-        <w:t xml:space="preserve"> as revised to January 1929 (Denver Public Library, CG4314 .D4 G44 1929), a monochrome hatched map: a texture classifier labelled 32-pixel cells of the scan as Industrial A, Industrial B or Commercial by hatch orientation and density, and the result was georeferenced from 13 of 16 candidate control points (street intersections and park corners) resolved to TIGER road intersections (affine fit in UTM 13N, RMSE 25 m). Residence E and Industrial A share a hatch and are separated only by the absence of lot lines, the classification's main uncertainty. The map sheet does not cover the whole of the 1938 graded area; zoning shares are computed only for land on the sheet, and units less than half on it are left missing. The library's other edition, the same map revised to April 1944, was registered to the 1929 scan by a ten-point affine fit; it is a darker print of the same plate and the classifier cannot be calibrated across the two, but side-by-side inspection of the Platte, Globeville, Sun Valley and Elyria districts shows the same industrial hatching in 1944 as in 1929, so the 1929 layer is used as the zoning in force throughout 1925–44. Today's land use is the City and County of Denver assessor parcel layer (property class, current zone district, dwelling units, year built), matched to the nearest parcel within 40 m of each site (median 10 m). Regulatory status is from EPA FRS, TRI, SEMS and RCRA and Colorado's VCUP and environmental-covenant registers, matched by location (40–75 m), address or name; "no match" means no record in those searched inventories, not an absence of contamination or of assessment.</w:t>
+        <w:t xml:space="preserve"> as revised to January 1929 (Denver Public Library, CG4314 .D4 G44 1929), a monochrome hatched map: a texture classifier labelled 32-pixel cells of the scan as Industrial A, Industrial B or Commercial by hatch orientation and density, and the result was georeferenced from 13 of 16 candidate control points (street intersections and park corners) resolved to TIGER road intersections (affine fit in UTM 13N, RMSE 25 m). Residence E and Industrial A share a hatch and are separated only by the absence of lot lines, the classification's main uncertainty. The map sheet does not cover the whole of the 1938 graded area; zoning shares are computed only for land on the sheet, and units less than half on it are left missing. The library's other edition, the same map revised to April 1944, was registered to the 1929 scan by a ten-point affine fit and compared with it cell by cell. One texture classifier trained on the 1929 labels was applied to both scans; every cluster of disagreement of about a city block or more (118 of 226 clusters) was inspected on side-by-side crops of the two scans, and only districts visibly redrawn were accepted (8 areas). Most disagreements came from the darker 1944 print rather than from redrawn districts; changes smaller than a block, and amendments coloured by hand on the 1944 copy, are not included. Today's land use is the City and County of Denver assessor parcel layer (property class, current zone district, dwelling units, year built), matched to the nearest parcel within 40 m of each site (median 10 m). Regulatory status is from EPA FRS, TRI, SEMS and RCRA and Colorado's VCUP and environmental-covenant registers, matched by location (40–75 m), address or name; "no match" means no record in those searched inventories, not an absence of contamination or of assessment.</w:t>
       </w:r>
     </w:p>
     <w:p>
@@ -11127,6 +11127,36 @@
       <w:pPr>
         <w:spacing w:after="120"/>
       </w:pPr>
+    </w:p>
+    <w:p>
+      <w:pPr>
+        <w:spacing w:after="160" w:line="360"/>
+        <w:jc w:val="both"/>
+      </w:pPr>
+      <w:r>
+        <w:rPr>
+          <w:rFonts w:ascii="Times New Roman" w:cs="Times New Roman" w:eastAsia="Times New Roman" w:hAnsi="Times New Roman"/>
+          <w:b/>
+          <w:bCs/>
+          <w:i w:val="false"/>
+          <w:iCs w:val="false"/>
+          <w:sz w:val="24"/>
+          <w:szCs w:val="24"/>
+        </w:rPr>
+        <w:t xml:space="preserve">1929 to 1944.</w:t>
+      </w:r>
+      <w:r>
+        <w:rPr>
+          <w:rFonts w:ascii="Times New Roman" w:cs="Times New Roman" w:eastAsia="Times New Roman" w:hAnsi="Times New Roman"/>
+          <w:b w:val="false"/>
+          <w:bCs w:val="false"/>
+          <w:i w:val="false"/>
+          <w:iCs w:val="false"/>
+          <w:sz w:val="24"/>
+          <w:szCs w:val="24"/>
+        </w:rPr>
+        <w:t xml:space="preserve"> The districts barely moved across the years of the HOLC survey. Between the January 1929 and April 1944 revisions no industrial district was added. About 0.47 km² of Industrial A (2% of it) was redrawn: as commercial districts near W 41st Avenue, as business blocks in River North (Brighton Boulevard and 36th Street) and by the rail yards near E 40th Avenue, and as apartment blocks (Residence D) in two small areas. On the land both sheets cover, the share of D land zoned industrial went from 16.2% to 15.9%, and of C land from 1.6% to 1.5%. The zoning the appraisers saw in 1938 was in substance the zoning of 1929, and it was not extended into the areas they graded D by 1944.</w:t>
+      </w:r>
     </w:p>
     <w:p>
       <w:pPr>

</xml_diff>

<commit_message>
Zoning 1929 to today; 2023 layer credited with link to request form
</commit_message>
<xml_diff>
--- a/paper/Before_and_After_the_Map_manuscript.docx
+++ b/paper/Before_and_After_the_Map_manuscript.docx
@@ -37880,6 +37880,2938 @@
           <w:szCs w:val="24"/>
         </w:rPr>
         <w:t xml:space="preserve">Shares of each 1929 district's land and of each set of sites by their zoning on 3 October 2023. Sites are street-located hazardous-sector sites; the suburban column covers the study tracts outside the City and County of Denver.</w:t>
+      </w:r>
+    </w:p>
+    <w:p>
+      <w:pPr>
+        <w:spacing w:after="160" w:line="360"/>
+        <w:jc w:val="both"/>
+      </w:pPr>
+      <w:r>
+        <w:rPr>
+          <w:rFonts w:ascii="Times New Roman" w:cs="Times New Roman" w:eastAsia="Times New Roman" w:hAnsi="Times New Roman"/>
+          <w:b/>
+          <w:bCs/>
+          <w:i w:val="false"/>
+          <w:iCs w:val="false"/>
+          <w:sz w:val="24"/>
+          <w:szCs w:val="24"/>
+        </w:rPr>
+        <w:t xml:space="preserve">Zoning, 1929 to today.</w:t>
+      </w:r>
+      <w:r>
+        <w:rPr>
+          <w:rFonts w:ascii="Times New Roman" w:cs="Times New Roman" w:eastAsia="Times New Roman" w:hAnsi="Times New Roman"/>
+          <w:b w:val="false"/>
+          <w:bCs w:val="false"/>
+          <w:i w:val="false"/>
+          <w:iCs w:val="false"/>
+          <w:sz w:val="24"/>
+          <w:szCs w:val="24"/>
+        </w:rPr>
+        <w:t xml:space="preserve"> Four zoning maps of Denver exist in digital form: the 1925 ordinance as amended to 1929 and to 1944, the 2023 National Zoning Atlas layer, and the city's official zoning map today, which records for every district the year of the ordinance that last zoned it. The 1956 ordinance's map has not been digitised, so the series has a gap between 1944 and 2023. On the 202 km² that both historical sheets cover within the City and County of Denver, the share of land zoned industrial was 14.0% in 1929, 13.8% in 1944, 10.6% in 2023 and 10.4% today, with another 2.5% now in industrial mixed-use districts that allow housing. Industrial zoning has always been a D-grade matter: 16.3% of D land was zoned industrial in 1929, 16.1% in 1944 and 12.2% today (17.5% including I-MX), against at most 1.7% of A, B or C land then and none now.</w:t>
+      </w:r>
+    </w:p>
+    <w:p>
+      <w:pPr>
+        <w:spacing w:after="160" w:line="360"/>
+        <w:jc w:val="both"/>
+      </w:pPr>
+      <w:r>
+        <w:rPr>
+          <w:rFonts w:ascii="Times New Roman" w:cs="Times New Roman" w:eastAsia="Times New Roman" w:hAnsi="Times New Roman"/>
+          <w:b w:val="false"/>
+          <w:bCs w:val="false"/>
+          <w:i w:val="false"/>
+          <w:iCs w:val="false"/>
+          <w:sz w:val="24"/>
+          <w:szCs w:val="24"/>
+        </w:rPr>
+        <w:t xml:space="preserve">The contraction came late. Of the 28.3 km² zoned industrial in 1929, 51% is still zoned industrial, 11% is industrial mixed use, 18% commercial or mixed use, 10% residential and 10% open space, civic land or planned unit developments. For the 13.8 km² no longer zoned industrial, the ordinance that last zoned the land passed before 2000 for under 3% of it, in 2000–09 for 12.5%, in the 2010 citywide remapping for 53%, and after 2010 for 32%. Because the city layer keeps only the latest ordinance, earlier rezonings are hidden, and land recoded in 2010 may have left industrial zoning at any time after 1944; the date is therefore an upper bound. The sites follow the land. Of the 910 hazardous-sector sites of 1965–92 on the land both sheets cover, 44% stood in an industrial district in 1929 and 35% do today, while 61% now stand where housing is allowed; of the 319 pre-1960 trades, 26% and 7%, with housing allowed on 88%.</w:t>
+      </w:r>
+    </w:p>
+    <w:p>
+      <w:pPr>
+        <w:spacing w:after="80" w:before="240"/>
+      </w:pPr>
+      <w:r>
+        <w:rPr>
+          <w:rFonts w:ascii="Times New Roman" w:cs="Times New Roman" w:eastAsia="Times New Roman" w:hAnsi="Times New Roman"/>
+          <w:b/>
+          <w:bCs/>
+          <w:sz w:val="20"/>
+          <w:szCs w:val="20"/>
+        </w:rPr>
+        <w:t xml:space="preserve">Table 18. Land and sites zoned industrial, 1929–today</w:t>
+      </w:r>
+    </w:p>
+    <w:tbl>
+      <w:tblPr>
+        <w:tblW w:type="dxa" w:w="9360"/>
+        <w:tblBorders>
+          <w:top w:val="single" w:sz="6"/>
+          <w:left w:val="none"/>
+          <w:bottom w:val="single" w:sz="6"/>
+          <w:right w:val="none"/>
+          <w:insideH w:val="single" w:color="BBBBBB" w:sz="2"/>
+          <w:insideV w:val="none"/>
+        </w:tblBorders>
+      </w:tblPr>
+      <w:tblGrid>
+        <w:gridCol w:w="2808"/>
+        <w:gridCol w:w="1638"/>
+        <w:gridCol w:w="1638"/>
+        <w:gridCol w:w="1638"/>
+        <w:gridCol w:w="1638"/>
+      </w:tblGrid>
+      <w:tr>
+        <w:trPr>
+          <w:tblHeader/>
+        </w:trPr>
+        <w:tc>
+          <w:tcPr>
+            <w:tcW w:type="dxa" w:w="2808"/>
+            <w:shd w:fill="EDEDED" w:color="auto" w:val="clear"/>
+            <w:tcMar>
+              <w:top w:type="dxa" w:w="40"/>
+              <w:left w:type="dxa" w:w="60"/>
+              <w:bottom w:type="dxa" w:w="40"/>
+              <w:right w:type="dxa" w:w="60"/>
+            </w:tcMar>
+          </w:tcPr>
+          <w:p>
+            <w:pPr>
+              <w:jc w:val="left"/>
+            </w:pPr>
+            <w:r>
+              <w:rPr>
+                <w:rFonts w:ascii="Times New Roman" w:cs="Times New Roman" w:eastAsia="Times New Roman" w:hAnsi="Times New Roman"/>
+                <w:b/>
+                <w:bCs/>
+                <w:i w:val="false"/>
+                <w:iCs w:val="false"/>
+                <w:sz w:val="18"/>
+                <w:szCs w:val="18"/>
+              </w:rPr>
+              <w:t xml:space="preserve">zoned industrial (housing not allowed)</w:t>
+            </w:r>
+          </w:p>
+        </w:tc>
+        <w:tc>
+          <w:tcPr>
+            <w:tcW w:type="dxa" w:w="1638"/>
+            <w:shd w:fill="EDEDED" w:color="auto" w:val="clear"/>
+            <w:tcMar>
+              <w:top w:type="dxa" w:w="40"/>
+              <w:left w:type="dxa" w:w="60"/>
+              <w:bottom w:type="dxa" w:w="40"/>
+              <w:right w:type="dxa" w:w="60"/>
+            </w:tcMar>
+          </w:tcPr>
+          <w:p>
+            <w:pPr>
+              <w:jc w:val="right"/>
+            </w:pPr>
+            <w:r>
+              <w:rPr>
+                <w:rFonts w:ascii="Times New Roman" w:cs="Times New Roman" w:eastAsia="Times New Roman" w:hAnsi="Times New Roman"/>
+                <w:b/>
+                <w:bCs/>
+                <w:i w:val="false"/>
+                <w:iCs w:val="false"/>
+                <w:sz w:val="18"/>
+                <w:szCs w:val="18"/>
+              </w:rPr>
+              <w:t xml:space="preserve">1929</w:t>
+            </w:r>
+          </w:p>
+        </w:tc>
+        <w:tc>
+          <w:tcPr>
+            <w:tcW w:type="dxa" w:w="1638"/>
+            <w:shd w:fill="EDEDED" w:color="auto" w:val="clear"/>
+            <w:tcMar>
+              <w:top w:type="dxa" w:w="40"/>
+              <w:left w:type="dxa" w:w="60"/>
+              <w:bottom w:type="dxa" w:w="40"/>
+              <w:right w:type="dxa" w:w="60"/>
+            </w:tcMar>
+          </w:tcPr>
+          <w:p>
+            <w:pPr>
+              <w:jc w:val="right"/>
+            </w:pPr>
+            <w:r>
+              <w:rPr>
+                <w:rFonts w:ascii="Times New Roman" w:cs="Times New Roman" w:eastAsia="Times New Roman" w:hAnsi="Times New Roman"/>
+                <w:b/>
+                <w:bCs/>
+                <w:i w:val="false"/>
+                <w:iCs w:val="false"/>
+                <w:sz w:val="18"/>
+                <w:szCs w:val="18"/>
+              </w:rPr>
+              <w:t xml:space="preserve">1944</w:t>
+            </w:r>
+          </w:p>
+        </w:tc>
+        <w:tc>
+          <w:tcPr>
+            <w:tcW w:type="dxa" w:w="1638"/>
+            <w:shd w:fill="EDEDED" w:color="auto" w:val="clear"/>
+            <w:tcMar>
+              <w:top w:type="dxa" w:w="40"/>
+              <w:left w:type="dxa" w:w="60"/>
+              <w:bottom w:type="dxa" w:w="40"/>
+              <w:right w:type="dxa" w:w="60"/>
+            </w:tcMar>
+          </w:tcPr>
+          <w:p>
+            <w:pPr>
+              <w:jc w:val="right"/>
+            </w:pPr>
+            <w:r>
+              <w:rPr>
+                <w:rFonts w:ascii="Times New Roman" w:cs="Times New Roman" w:eastAsia="Times New Roman" w:hAnsi="Times New Roman"/>
+                <w:b/>
+                <w:bCs/>
+                <w:i w:val="false"/>
+                <w:iCs w:val="false"/>
+                <w:sz w:val="18"/>
+                <w:szCs w:val="18"/>
+              </w:rPr>
+              <w:t xml:space="preserve">2023</w:t>
+            </w:r>
+          </w:p>
+        </w:tc>
+        <w:tc>
+          <w:tcPr>
+            <w:tcW w:type="dxa" w:w="1638"/>
+            <w:shd w:fill="EDEDED" w:color="auto" w:val="clear"/>
+            <w:tcMar>
+              <w:top w:type="dxa" w:w="40"/>
+              <w:left w:type="dxa" w:w="60"/>
+              <w:bottom w:type="dxa" w:w="40"/>
+              <w:right w:type="dxa" w:w="60"/>
+            </w:tcMar>
+          </w:tcPr>
+          <w:p>
+            <w:pPr>
+              <w:jc w:val="right"/>
+            </w:pPr>
+            <w:r>
+              <w:rPr>
+                <w:rFonts w:ascii="Times New Roman" w:cs="Times New Roman" w:eastAsia="Times New Roman" w:hAnsi="Times New Roman"/>
+                <w:b/>
+                <w:bCs/>
+                <w:i w:val="false"/>
+                <w:iCs w:val="false"/>
+                <w:sz w:val="18"/>
+                <w:szCs w:val="18"/>
+              </w:rPr>
+              <w:t xml:space="preserve">today</w:t>
+            </w:r>
+          </w:p>
+        </w:tc>
+      </w:tr>
+      <w:tr>
+        <w:trPr>
+          <w:tblHeader w:val="false"/>
+        </w:trPr>
+        <w:tc>
+          <w:tcPr>
+            <w:tcW w:type="dxa" w:w="2808"/>
+            <w:tcMar>
+              <w:top w:type="dxa" w:w="40"/>
+              <w:left w:type="dxa" w:w="60"/>
+              <w:bottom w:type="dxa" w:w="40"/>
+              <w:right w:type="dxa" w:w="60"/>
+            </w:tcMar>
+          </w:tcPr>
+          <w:p>
+            <w:pPr>
+              <w:jc w:val="left"/>
+            </w:pPr>
+            <w:r>
+              <w:rPr>
+                <w:rFonts w:ascii="Times New Roman" w:cs="Times New Roman" w:eastAsia="Times New Roman" w:hAnsi="Times New Roman"/>
+                <w:b w:val="false"/>
+                <w:bCs w:val="false"/>
+                <w:i w:val="false"/>
+                <w:iCs w:val="false"/>
+                <w:sz w:val="18"/>
+                <w:szCs w:val="18"/>
+              </w:rPr>
+              <w:t xml:space="preserve">land mapped in 1929 and 1944 (202 km²)</w:t>
+            </w:r>
+          </w:p>
+        </w:tc>
+        <w:tc>
+          <w:tcPr>
+            <w:tcW w:type="dxa" w:w="1638"/>
+            <w:tcMar>
+              <w:top w:type="dxa" w:w="40"/>
+              <w:left w:type="dxa" w:w="60"/>
+              <w:bottom w:type="dxa" w:w="40"/>
+              <w:right w:type="dxa" w:w="60"/>
+            </w:tcMar>
+          </w:tcPr>
+          <w:p>
+            <w:pPr>
+              <w:jc w:val="right"/>
+            </w:pPr>
+            <w:r>
+              <w:rPr>
+                <w:rFonts w:ascii="Times New Roman" w:cs="Times New Roman" w:eastAsia="Times New Roman" w:hAnsi="Times New Roman"/>
+                <w:b w:val="false"/>
+                <w:bCs w:val="false"/>
+                <w:i w:val="false"/>
+                <w:iCs w:val="false"/>
+                <w:sz w:val="18"/>
+                <w:szCs w:val="18"/>
+              </w:rPr>
+              <w:t xml:space="preserve">14.0%</w:t>
+            </w:r>
+          </w:p>
+        </w:tc>
+        <w:tc>
+          <w:tcPr>
+            <w:tcW w:type="dxa" w:w="1638"/>
+            <w:tcMar>
+              <w:top w:type="dxa" w:w="40"/>
+              <w:left w:type="dxa" w:w="60"/>
+              <w:bottom w:type="dxa" w:w="40"/>
+              <w:right w:type="dxa" w:w="60"/>
+            </w:tcMar>
+          </w:tcPr>
+          <w:p>
+            <w:pPr>
+              <w:jc w:val="right"/>
+            </w:pPr>
+            <w:r>
+              <w:rPr>
+                <w:rFonts w:ascii="Times New Roman" w:cs="Times New Roman" w:eastAsia="Times New Roman" w:hAnsi="Times New Roman"/>
+                <w:b w:val="false"/>
+                <w:bCs w:val="false"/>
+                <w:i w:val="false"/>
+                <w:iCs w:val="false"/>
+                <w:sz w:val="18"/>
+                <w:szCs w:val="18"/>
+              </w:rPr>
+              <w:t xml:space="preserve">13.8%</w:t>
+            </w:r>
+          </w:p>
+        </w:tc>
+        <w:tc>
+          <w:tcPr>
+            <w:tcW w:type="dxa" w:w="1638"/>
+            <w:tcMar>
+              <w:top w:type="dxa" w:w="40"/>
+              <w:left w:type="dxa" w:w="60"/>
+              <w:bottom w:type="dxa" w:w="40"/>
+              <w:right w:type="dxa" w:w="60"/>
+            </w:tcMar>
+          </w:tcPr>
+          <w:p>
+            <w:pPr>
+              <w:jc w:val="right"/>
+            </w:pPr>
+            <w:r>
+              <w:rPr>
+                <w:rFonts w:ascii="Times New Roman" w:cs="Times New Roman" w:eastAsia="Times New Roman" w:hAnsi="Times New Roman"/>
+                <w:b w:val="false"/>
+                <w:bCs w:val="false"/>
+                <w:i w:val="false"/>
+                <w:iCs w:val="false"/>
+                <w:sz w:val="18"/>
+                <w:szCs w:val="18"/>
+              </w:rPr>
+              <w:t xml:space="preserve">10.6%</w:t>
+            </w:r>
+          </w:p>
+        </w:tc>
+        <w:tc>
+          <w:tcPr>
+            <w:tcW w:type="dxa" w:w="1638"/>
+            <w:tcMar>
+              <w:top w:type="dxa" w:w="40"/>
+              <w:left w:type="dxa" w:w="60"/>
+              <w:bottom w:type="dxa" w:w="40"/>
+              <w:right w:type="dxa" w:w="60"/>
+            </w:tcMar>
+          </w:tcPr>
+          <w:p>
+            <w:pPr>
+              <w:jc w:val="right"/>
+            </w:pPr>
+            <w:r>
+              <w:rPr>
+                <w:rFonts w:ascii="Times New Roman" w:cs="Times New Roman" w:eastAsia="Times New Roman" w:hAnsi="Times New Roman"/>
+                <w:b w:val="false"/>
+                <w:bCs w:val="false"/>
+                <w:i w:val="false"/>
+                <w:iCs w:val="false"/>
+                <w:sz w:val="18"/>
+                <w:szCs w:val="18"/>
+              </w:rPr>
+              <w:t xml:space="preserve">10.4%</w:t>
+            </w:r>
+          </w:p>
+        </w:tc>
+      </w:tr>
+      <w:tr>
+        <w:trPr>
+          <w:tblHeader w:val="false"/>
+        </w:trPr>
+        <w:tc>
+          <w:tcPr>
+            <w:tcW w:type="dxa" w:w="2808"/>
+            <w:tcMar>
+              <w:top w:type="dxa" w:w="40"/>
+              <w:left w:type="dxa" w:w="60"/>
+              <w:bottom w:type="dxa" w:w="40"/>
+              <w:right w:type="dxa" w:w="60"/>
+            </w:tcMar>
+          </w:tcPr>
+          <w:p>
+            <w:pPr>
+              <w:jc w:val="left"/>
+            </w:pPr>
+            <w:r>
+              <w:rPr>
+                <w:rFonts w:ascii="Times New Roman" w:cs="Times New Roman" w:eastAsia="Times New Roman" w:hAnsi="Times New Roman"/>
+                <w:b w:val="false"/>
+                <w:bCs w:val="false"/>
+                <w:i w:val="false"/>
+                <w:iCs w:val="false"/>
+                <w:sz w:val="18"/>
+                <w:szCs w:val="18"/>
+              </w:rPr>
+              <w:t xml:space="preserve">HOLC D land (25.3 km²)</w:t>
+            </w:r>
+          </w:p>
+        </w:tc>
+        <w:tc>
+          <w:tcPr>
+            <w:tcW w:type="dxa" w:w="1638"/>
+            <w:tcMar>
+              <w:top w:type="dxa" w:w="40"/>
+              <w:left w:type="dxa" w:w="60"/>
+              <w:bottom w:type="dxa" w:w="40"/>
+              <w:right w:type="dxa" w:w="60"/>
+            </w:tcMar>
+          </w:tcPr>
+          <w:p>
+            <w:pPr>
+              <w:jc w:val="right"/>
+            </w:pPr>
+            <w:r>
+              <w:rPr>
+                <w:rFonts w:ascii="Times New Roman" w:cs="Times New Roman" w:eastAsia="Times New Roman" w:hAnsi="Times New Roman"/>
+                <w:b w:val="false"/>
+                <w:bCs w:val="false"/>
+                <w:i w:val="false"/>
+                <w:iCs w:val="false"/>
+                <w:sz w:val="18"/>
+                <w:szCs w:val="18"/>
+              </w:rPr>
+              <w:t xml:space="preserve">16.3%</w:t>
+            </w:r>
+          </w:p>
+        </w:tc>
+        <w:tc>
+          <w:tcPr>
+            <w:tcW w:type="dxa" w:w="1638"/>
+            <w:tcMar>
+              <w:top w:type="dxa" w:w="40"/>
+              <w:left w:type="dxa" w:w="60"/>
+              <w:bottom w:type="dxa" w:w="40"/>
+              <w:right w:type="dxa" w:w="60"/>
+            </w:tcMar>
+          </w:tcPr>
+          <w:p>
+            <w:pPr>
+              <w:jc w:val="right"/>
+            </w:pPr>
+            <w:r>
+              <w:rPr>
+                <w:rFonts w:ascii="Times New Roman" w:cs="Times New Roman" w:eastAsia="Times New Roman" w:hAnsi="Times New Roman"/>
+                <w:b w:val="false"/>
+                <w:bCs w:val="false"/>
+                <w:i w:val="false"/>
+                <w:iCs w:val="false"/>
+                <w:sz w:val="18"/>
+                <w:szCs w:val="18"/>
+              </w:rPr>
+              <w:t xml:space="preserve">16.1%</w:t>
+            </w:r>
+          </w:p>
+        </w:tc>
+        <w:tc>
+          <w:tcPr>
+            <w:tcW w:type="dxa" w:w="1638"/>
+            <w:tcMar>
+              <w:top w:type="dxa" w:w="40"/>
+              <w:left w:type="dxa" w:w="60"/>
+              <w:bottom w:type="dxa" w:w="40"/>
+              <w:right w:type="dxa" w:w="60"/>
+            </w:tcMar>
+          </w:tcPr>
+          <w:p>
+            <w:pPr>
+              <w:jc w:val="right"/>
+            </w:pPr>
+            <w:r>
+              <w:rPr>
+                <w:rFonts w:ascii="Times New Roman" w:cs="Times New Roman" w:eastAsia="Times New Roman" w:hAnsi="Times New Roman"/>
+                <w:b w:val="false"/>
+                <w:bCs w:val="false"/>
+                <w:i w:val="false"/>
+                <w:iCs w:val="false"/>
+                <w:sz w:val="18"/>
+                <w:szCs w:val="18"/>
+              </w:rPr>
+              <w:t xml:space="preserve">12.4%</w:t>
+            </w:r>
+          </w:p>
+        </w:tc>
+        <w:tc>
+          <w:tcPr>
+            <w:tcW w:type="dxa" w:w="1638"/>
+            <w:tcMar>
+              <w:top w:type="dxa" w:w="40"/>
+              <w:left w:type="dxa" w:w="60"/>
+              <w:bottom w:type="dxa" w:w="40"/>
+              <w:right w:type="dxa" w:w="60"/>
+            </w:tcMar>
+          </w:tcPr>
+          <w:p>
+            <w:pPr>
+              <w:jc w:val="right"/>
+            </w:pPr>
+            <w:r>
+              <w:rPr>
+                <w:rFonts w:ascii="Times New Roman" w:cs="Times New Roman" w:eastAsia="Times New Roman" w:hAnsi="Times New Roman"/>
+                <w:b w:val="false"/>
+                <w:bCs w:val="false"/>
+                <w:i w:val="false"/>
+                <w:iCs w:val="false"/>
+                <w:sz w:val="18"/>
+                <w:szCs w:val="18"/>
+              </w:rPr>
+              <w:t xml:space="preserve">12.2%</w:t>
+            </w:r>
+          </w:p>
+        </w:tc>
+      </w:tr>
+      <w:tr>
+        <w:trPr>
+          <w:tblHeader w:val="false"/>
+        </w:trPr>
+        <w:tc>
+          <w:tcPr>
+            <w:tcW w:type="dxa" w:w="2808"/>
+            <w:tcMar>
+              <w:top w:type="dxa" w:w="40"/>
+              <w:left w:type="dxa" w:w="60"/>
+              <w:bottom w:type="dxa" w:w="40"/>
+              <w:right w:type="dxa" w:w="60"/>
+            </w:tcMar>
+          </w:tcPr>
+          <w:p>
+            <w:pPr>
+              <w:jc w:val="left"/>
+            </w:pPr>
+            <w:r>
+              <w:rPr>
+                <w:rFonts w:ascii="Times New Roman" w:cs="Times New Roman" w:eastAsia="Times New Roman" w:hAnsi="Times New Roman"/>
+                <w:b w:val="false"/>
+                <w:bCs w:val="false"/>
+                <w:i w:val="false"/>
+                <w:iCs w:val="false"/>
+                <w:sz w:val="18"/>
+                <w:szCs w:val="18"/>
+              </w:rPr>
+              <w:t xml:space="preserve">HOLC A, B and C land (54.0 km²)</w:t>
+            </w:r>
+          </w:p>
+        </w:tc>
+        <w:tc>
+          <w:tcPr>
+            <w:tcW w:type="dxa" w:w="1638"/>
+            <w:tcMar>
+              <w:top w:type="dxa" w:w="40"/>
+              <w:left w:type="dxa" w:w="60"/>
+              <w:bottom w:type="dxa" w:w="40"/>
+              <w:right w:type="dxa" w:w="60"/>
+            </w:tcMar>
+          </w:tcPr>
+          <w:p>
+            <w:pPr>
+              <w:jc w:val="right"/>
+            </w:pPr>
+            <w:r>
+              <w:rPr>
+                <w:rFonts w:ascii="Times New Roman" w:cs="Times New Roman" w:eastAsia="Times New Roman" w:hAnsi="Times New Roman"/>
+                <w:b w:val="false"/>
+                <w:bCs w:val="false"/>
+                <w:i w:val="false"/>
+                <w:iCs w:val="false"/>
+                <w:sz w:val="18"/>
+                <w:szCs w:val="18"/>
+              </w:rPr>
+              <w:t xml:space="preserve">0.2–1.7%</w:t>
+            </w:r>
+          </w:p>
+        </w:tc>
+        <w:tc>
+          <w:tcPr>
+            <w:tcW w:type="dxa" w:w="1638"/>
+            <w:tcMar>
+              <w:top w:type="dxa" w:w="40"/>
+              <w:left w:type="dxa" w:w="60"/>
+              <w:bottom w:type="dxa" w:w="40"/>
+              <w:right w:type="dxa" w:w="60"/>
+            </w:tcMar>
+          </w:tcPr>
+          <w:p>
+            <w:pPr>
+              <w:jc w:val="right"/>
+            </w:pPr>
+            <w:r>
+              <w:rPr>
+                <w:rFonts w:ascii="Times New Roman" w:cs="Times New Roman" w:eastAsia="Times New Roman" w:hAnsi="Times New Roman"/>
+                <w:b w:val="false"/>
+                <w:bCs w:val="false"/>
+                <w:i w:val="false"/>
+                <w:iCs w:val="false"/>
+                <w:sz w:val="18"/>
+                <w:szCs w:val="18"/>
+              </w:rPr>
+              <w:t xml:space="preserve">0.2–1.6%</w:t>
+            </w:r>
+          </w:p>
+        </w:tc>
+        <w:tc>
+          <w:tcPr>
+            <w:tcW w:type="dxa" w:w="1638"/>
+            <w:tcMar>
+              <w:top w:type="dxa" w:w="40"/>
+              <w:left w:type="dxa" w:w="60"/>
+              <w:bottom w:type="dxa" w:w="40"/>
+              <w:right w:type="dxa" w:w="60"/>
+            </w:tcMar>
+          </w:tcPr>
+          <w:p>
+            <w:pPr>
+              <w:jc w:val="right"/>
+            </w:pPr>
+            <w:r>
+              <w:rPr>
+                <w:rFonts w:ascii="Times New Roman" w:cs="Times New Roman" w:eastAsia="Times New Roman" w:hAnsi="Times New Roman"/>
+                <w:b w:val="false"/>
+                <w:bCs w:val="false"/>
+                <w:i w:val="false"/>
+                <w:iCs w:val="false"/>
+                <w:sz w:val="18"/>
+                <w:szCs w:val="18"/>
+              </w:rPr>
+              <w:t xml:space="preserve">0%</w:t>
+            </w:r>
+          </w:p>
+        </w:tc>
+        <w:tc>
+          <w:tcPr>
+            <w:tcW w:type="dxa" w:w="1638"/>
+            <w:tcMar>
+              <w:top w:type="dxa" w:w="40"/>
+              <w:left w:type="dxa" w:w="60"/>
+              <w:bottom w:type="dxa" w:w="40"/>
+              <w:right w:type="dxa" w:w="60"/>
+            </w:tcMar>
+          </w:tcPr>
+          <w:p>
+            <w:pPr>
+              <w:jc w:val="right"/>
+            </w:pPr>
+            <w:r>
+              <w:rPr>
+                <w:rFonts w:ascii="Times New Roman" w:cs="Times New Roman" w:eastAsia="Times New Roman" w:hAnsi="Times New Roman"/>
+                <w:b w:val="false"/>
+                <w:bCs w:val="false"/>
+                <w:i w:val="false"/>
+                <w:iCs w:val="false"/>
+                <w:sz w:val="18"/>
+                <w:szCs w:val="18"/>
+              </w:rPr>
+              <w:t xml:space="preserve">0%</w:t>
+            </w:r>
+          </w:p>
+        </w:tc>
+      </w:tr>
+      <w:tr>
+        <w:trPr>
+          <w:tblHeader w:val="false"/>
+        </w:trPr>
+        <w:tc>
+          <w:tcPr>
+            <w:tcW w:type="dxa" w:w="2808"/>
+            <w:tcMar>
+              <w:top w:type="dxa" w:w="40"/>
+              <w:left w:type="dxa" w:w="60"/>
+              <w:bottom w:type="dxa" w:w="40"/>
+              <w:right w:type="dxa" w:w="60"/>
+            </w:tcMar>
+          </w:tcPr>
+          <w:p>
+            <w:pPr>
+              <w:jc w:val="left"/>
+            </w:pPr>
+            <w:r>
+              <w:rPr>
+                <w:rFonts w:ascii="Times New Roman" w:cs="Times New Roman" w:eastAsia="Times New Roman" w:hAnsi="Times New Roman"/>
+                <w:b w:val="false"/>
+                <w:bCs w:val="false"/>
+                <w:i w:val="false"/>
+                <w:iCs w:val="false"/>
+                <w:sz w:val="18"/>
+                <w:szCs w:val="18"/>
+              </w:rPr>
+              <w:t xml:space="preserve">hazardous-sector sites 1965–92 (n = 910)</w:t>
+            </w:r>
+          </w:p>
+        </w:tc>
+        <w:tc>
+          <w:tcPr>
+            <w:tcW w:type="dxa" w:w="1638"/>
+            <w:tcMar>
+              <w:top w:type="dxa" w:w="40"/>
+              <w:left w:type="dxa" w:w="60"/>
+              <w:bottom w:type="dxa" w:w="40"/>
+              <w:right w:type="dxa" w:w="60"/>
+            </w:tcMar>
+          </w:tcPr>
+          <w:p>
+            <w:pPr>
+              <w:jc w:val="right"/>
+            </w:pPr>
+            <w:r>
+              <w:rPr>
+                <w:rFonts w:ascii="Times New Roman" w:cs="Times New Roman" w:eastAsia="Times New Roman" w:hAnsi="Times New Roman"/>
+                <w:b w:val="false"/>
+                <w:bCs w:val="false"/>
+                <w:i w:val="false"/>
+                <w:iCs w:val="false"/>
+                <w:sz w:val="18"/>
+                <w:szCs w:val="18"/>
+              </w:rPr>
+              <w:t xml:space="preserve">44.2%</w:t>
+            </w:r>
+          </w:p>
+        </w:tc>
+        <w:tc>
+          <w:tcPr>
+            <w:tcW w:type="dxa" w:w="1638"/>
+            <w:tcMar>
+              <w:top w:type="dxa" w:w="40"/>
+              <w:left w:type="dxa" w:w="60"/>
+              <w:bottom w:type="dxa" w:w="40"/>
+              <w:right w:type="dxa" w:w="60"/>
+            </w:tcMar>
+          </w:tcPr>
+          <w:p>
+            <w:pPr>
+              <w:jc w:val="right"/>
+            </w:pPr>
+            <w:r>
+              <w:rPr>
+                <w:rFonts w:ascii="Times New Roman" w:cs="Times New Roman" w:eastAsia="Times New Roman" w:hAnsi="Times New Roman"/>
+                <w:b w:val="false"/>
+                <w:bCs w:val="false"/>
+                <w:i w:val="false"/>
+                <w:iCs w:val="false"/>
+                <w:sz w:val="18"/>
+                <w:szCs w:val="18"/>
+              </w:rPr>
+              <w:t xml:space="preserve">43.2%</w:t>
+            </w:r>
+          </w:p>
+        </w:tc>
+        <w:tc>
+          <w:tcPr>
+            <w:tcW w:type="dxa" w:w="1638"/>
+            <w:tcMar>
+              <w:top w:type="dxa" w:w="40"/>
+              <w:left w:type="dxa" w:w="60"/>
+              <w:bottom w:type="dxa" w:w="40"/>
+              <w:right w:type="dxa" w:w="60"/>
+            </w:tcMar>
+          </w:tcPr>
+          <w:p>
+            <w:pPr>
+              <w:jc w:val="right"/>
+            </w:pPr>
+            <w:r>
+              <w:rPr>
+                <w:rFonts w:ascii="Times New Roman" w:cs="Times New Roman" w:eastAsia="Times New Roman" w:hAnsi="Times New Roman"/>
+                <w:b w:val="false"/>
+                <w:bCs w:val="false"/>
+                <w:i w:val="false"/>
+                <w:iCs w:val="false"/>
+                <w:sz w:val="18"/>
+                <w:szCs w:val="18"/>
+              </w:rPr>
+              <w:t xml:space="preserve">35.5%</w:t>
+            </w:r>
+          </w:p>
+        </w:tc>
+        <w:tc>
+          <w:tcPr>
+            <w:tcW w:type="dxa" w:w="1638"/>
+            <w:tcMar>
+              <w:top w:type="dxa" w:w="40"/>
+              <w:left w:type="dxa" w:w="60"/>
+              <w:bottom w:type="dxa" w:w="40"/>
+              <w:right w:type="dxa" w:w="60"/>
+            </w:tcMar>
+          </w:tcPr>
+          <w:p>
+            <w:pPr>
+              <w:jc w:val="right"/>
+            </w:pPr>
+            <w:r>
+              <w:rPr>
+                <w:rFonts w:ascii="Times New Roman" w:cs="Times New Roman" w:eastAsia="Times New Roman" w:hAnsi="Times New Roman"/>
+                <w:b w:val="false"/>
+                <w:bCs w:val="false"/>
+                <w:i w:val="false"/>
+                <w:iCs w:val="false"/>
+                <w:sz w:val="18"/>
+                <w:szCs w:val="18"/>
+              </w:rPr>
+              <w:t xml:space="preserve">35.3%</w:t>
+            </w:r>
+          </w:p>
+        </w:tc>
+      </w:tr>
+      <w:tr>
+        <w:trPr>
+          <w:tblHeader w:val="false"/>
+        </w:trPr>
+        <w:tc>
+          <w:tcPr>
+            <w:tcW w:type="dxa" w:w="2808"/>
+            <w:tcMar>
+              <w:top w:type="dxa" w:w="40"/>
+              <w:left w:type="dxa" w:w="60"/>
+              <w:bottom w:type="dxa" w:w="40"/>
+              <w:right w:type="dxa" w:w="60"/>
+            </w:tcMar>
+          </w:tcPr>
+          <w:p>
+            <w:pPr>
+              <w:jc w:val="left"/>
+            </w:pPr>
+            <w:r>
+              <w:rPr>
+                <w:rFonts w:ascii="Times New Roman" w:cs="Times New Roman" w:eastAsia="Times New Roman" w:hAnsi="Times New Roman"/>
+                <w:b w:val="false"/>
+                <w:bCs w:val="false"/>
+                <w:i w:val="false"/>
+                <w:iCs w:val="false"/>
+                <w:sz w:val="18"/>
+                <w:szCs w:val="18"/>
+              </w:rPr>
+              <w:t xml:space="preserve">hazardous trades before 1960 (n = 319)</w:t>
+            </w:r>
+          </w:p>
+        </w:tc>
+        <w:tc>
+          <w:tcPr>
+            <w:tcW w:type="dxa" w:w="1638"/>
+            <w:tcMar>
+              <w:top w:type="dxa" w:w="40"/>
+              <w:left w:type="dxa" w:w="60"/>
+              <w:bottom w:type="dxa" w:w="40"/>
+              <w:right w:type="dxa" w:w="60"/>
+            </w:tcMar>
+          </w:tcPr>
+          <w:p>
+            <w:pPr>
+              <w:jc w:val="right"/>
+            </w:pPr>
+            <w:r>
+              <w:rPr>
+                <w:rFonts w:ascii="Times New Roman" w:cs="Times New Roman" w:eastAsia="Times New Roman" w:hAnsi="Times New Roman"/>
+                <w:b w:val="false"/>
+                <w:bCs w:val="false"/>
+                <w:i w:val="false"/>
+                <w:iCs w:val="false"/>
+                <w:sz w:val="18"/>
+                <w:szCs w:val="18"/>
+              </w:rPr>
+              <w:t xml:space="preserve">26.3%</w:t>
+            </w:r>
+          </w:p>
+        </w:tc>
+        <w:tc>
+          <w:tcPr>
+            <w:tcW w:type="dxa" w:w="1638"/>
+            <w:tcMar>
+              <w:top w:type="dxa" w:w="40"/>
+              <w:left w:type="dxa" w:w="60"/>
+              <w:bottom w:type="dxa" w:w="40"/>
+              <w:right w:type="dxa" w:w="60"/>
+            </w:tcMar>
+          </w:tcPr>
+          <w:p>
+            <w:pPr>
+              <w:jc w:val="right"/>
+            </w:pPr>
+            <w:r>
+              <w:rPr>
+                <w:rFonts w:ascii="Times New Roman" w:cs="Times New Roman" w:eastAsia="Times New Roman" w:hAnsi="Times New Roman"/>
+                <w:b w:val="false"/>
+                <w:bCs w:val="false"/>
+                <w:i w:val="false"/>
+                <w:iCs w:val="false"/>
+                <w:sz w:val="18"/>
+                <w:szCs w:val="18"/>
+              </w:rPr>
+              <w:t xml:space="preserve">25.7%</w:t>
+            </w:r>
+          </w:p>
+        </w:tc>
+        <w:tc>
+          <w:tcPr>
+            <w:tcW w:type="dxa" w:w="1638"/>
+            <w:tcMar>
+              <w:top w:type="dxa" w:w="40"/>
+              <w:left w:type="dxa" w:w="60"/>
+              <w:bottom w:type="dxa" w:w="40"/>
+              <w:right w:type="dxa" w:w="60"/>
+            </w:tcMar>
+          </w:tcPr>
+          <w:p>
+            <w:pPr>
+              <w:jc w:val="right"/>
+            </w:pPr>
+            <w:r>
+              <w:rPr>
+                <w:rFonts w:ascii="Times New Roman" w:cs="Times New Roman" w:eastAsia="Times New Roman" w:hAnsi="Times New Roman"/>
+                <w:b w:val="false"/>
+                <w:bCs w:val="false"/>
+                <w:i w:val="false"/>
+                <w:iCs w:val="false"/>
+                <w:sz w:val="18"/>
+                <w:szCs w:val="18"/>
+              </w:rPr>
+              <w:t xml:space="preserve">7.2%</w:t>
+            </w:r>
+          </w:p>
+        </w:tc>
+        <w:tc>
+          <w:tcPr>
+            <w:tcW w:type="dxa" w:w="1638"/>
+            <w:tcMar>
+              <w:top w:type="dxa" w:w="40"/>
+              <w:left w:type="dxa" w:w="60"/>
+              <w:bottom w:type="dxa" w:w="40"/>
+              <w:right w:type="dxa" w:w="60"/>
+            </w:tcMar>
+          </w:tcPr>
+          <w:p>
+            <w:pPr>
+              <w:jc w:val="right"/>
+            </w:pPr>
+            <w:r>
+              <w:rPr>
+                <w:rFonts w:ascii="Times New Roman" w:cs="Times New Roman" w:eastAsia="Times New Roman" w:hAnsi="Times New Roman"/>
+                <w:b w:val="false"/>
+                <w:bCs w:val="false"/>
+                <w:i w:val="false"/>
+                <w:iCs w:val="false"/>
+                <w:sz w:val="18"/>
+                <w:szCs w:val="18"/>
+              </w:rPr>
+              <w:t xml:space="preserve">7.2%</w:t>
+            </w:r>
+          </w:p>
+        </w:tc>
+      </w:tr>
+    </w:tbl>
+    <w:p>
+      <w:pPr>
+        <w:spacing w:after="120"/>
+      </w:pPr>
+    </w:p>
+    <w:p>
+      <w:pPr>
+        <w:spacing w:after="160" w:line="360"/>
+        <w:jc w:val="both"/>
+      </w:pPr>
+      <w:r>
+        <w:rPr>
+          <w:rFonts w:ascii="Times New Roman" w:cs="Times New Roman" w:eastAsia="Times New Roman" w:hAnsi="Times New Roman"/>
+          <w:b w:val="false"/>
+          <w:bCs w:val="false"/>
+          <w:i w:val="false"/>
+          <w:iCs w:val="false"/>
+          <w:sz w:val="24"/>
+          <w:szCs w:val="24"/>
+        </w:rPr>
+        <w:t xml:space="preserve">Share of each unit within the part of the City and County of Denver covered by both the 1929 and 1944 map sheets. Today = the city's zoning map; 2023 = the National Zoning Atlas layer.</w:t>
+      </w:r>
+    </w:p>
+    <w:p>
+      <w:pPr>
+        <w:spacing w:after="160" w:line="360"/>
+        <w:jc w:val="both"/>
+      </w:pPr>
+      <w:r>
+        <w:rPr>
+          <w:rFonts w:ascii="Times New Roman" w:cs="Times New Roman" w:eastAsia="Times New Roman" w:hAnsi="Times New Roman"/>
+          <w:b w:val="false"/>
+          <w:bCs w:val="false"/>
+          <w:i w:val="false"/>
+          <w:iCs w:val="false"/>
+          <w:sz w:val="24"/>
+          <w:szCs w:val="24"/>
+        </w:rPr>
+        <w:t xml:space="preserve">Where industrial zoning was removed, the population changed. Among the 105 study tracts lying at least half on both sheets, the ten with a fifth or more of their land zoned industrial in 1929 and today were 41% Hispanic in 1970, 49% in 1990 and 44% in 2020. The seven whose industrial zoning has since been removed were 39%, 45% and 25% Hispanic; their Black share fell from 26% to 7% and their poverty rate from 33% to 14% between 1990 and 2020, and their owner-occupied share from 47% to 33%. Industrial zoning that remains still sits beside the Hispanic neighbourhoods of the 1970s; where it has been lifted, those neighbourhoods have largely been replaced. These are descriptions of places, not estimates of what rezoning caused.</w:t>
+      </w:r>
+    </w:p>
+    <w:p>
+      <w:pPr>
+        <w:spacing w:after="80" w:before="240"/>
+      </w:pPr>
+      <w:r>
+        <w:rPr>
+          <w:rFonts w:ascii="Times New Roman" w:cs="Times New Roman" w:eastAsia="Times New Roman" w:hAnsi="Times New Roman"/>
+          <w:b/>
+          <w:bCs/>
+          <w:sz w:val="20"/>
+          <w:szCs w:val="20"/>
+        </w:rPr>
+        <w:t xml:space="preserve">Table 19. Tracts zoned industrial in 1929 and today: composition 1970–2020</w:t>
+      </w:r>
+    </w:p>
+    <w:tbl>
+      <w:tblPr>
+        <w:tblW w:type="dxa" w:w="9360"/>
+        <w:tblBorders>
+          <w:top w:val="single" w:sz="6"/>
+          <w:left w:val="none"/>
+          <w:bottom w:val="single" w:sz="6"/>
+          <w:right w:val="none"/>
+          <w:insideH w:val="single" w:color="BBBBBB" w:sz="2"/>
+          <w:insideV w:val="none"/>
+        </w:tblBorders>
+      </w:tblPr>
+      <w:tblGrid>
+        <w:gridCol w:w="2059"/>
+        <w:gridCol w:w="1216"/>
+        <w:gridCol w:w="1216"/>
+        <w:gridCol w:w="1216"/>
+        <w:gridCol w:w="1216"/>
+        <w:gridCol w:w="1216"/>
+        <w:gridCol w:w="1221"/>
+      </w:tblGrid>
+      <w:tr>
+        <w:trPr>
+          <w:tblHeader/>
+        </w:trPr>
+        <w:tc>
+          <w:tcPr>
+            <w:tcW w:type="dxa" w:w="2059"/>
+            <w:shd w:fill="EDEDED" w:color="auto" w:val="clear"/>
+            <w:tcMar>
+              <w:top w:type="dxa" w:w="40"/>
+              <w:left w:type="dxa" w:w="60"/>
+              <w:bottom w:type="dxa" w:w="40"/>
+              <w:right w:type="dxa" w:w="60"/>
+            </w:tcMar>
+          </w:tcPr>
+          <w:p>
+            <w:pPr>
+              <w:jc w:val="left"/>
+            </w:pPr>
+            <w:r>
+              <w:rPr>
+                <w:rFonts w:ascii="Times New Roman" w:cs="Times New Roman" w:eastAsia="Times New Roman" w:hAnsi="Times New Roman"/>
+                <w:b/>
+                <w:bCs/>
+                <w:i w:val="false"/>
+                <w:iCs w:val="false"/>
+                <w:sz w:val="16"/>
+                <w:szCs w:val="16"/>
+              </w:rPr>
+              <w:t xml:space="preserve">tracts (2010)</w:t>
+            </w:r>
+          </w:p>
+        </w:tc>
+        <w:tc>
+          <w:tcPr>
+            <w:tcW w:type="dxa" w:w="1216"/>
+            <w:shd w:fill="EDEDED" w:color="auto" w:val="clear"/>
+            <w:tcMar>
+              <w:top w:type="dxa" w:w="40"/>
+              <w:left w:type="dxa" w:w="60"/>
+              <w:bottom w:type="dxa" w:w="40"/>
+              <w:right w:type="dxa" w:w="60"/>
+            </w:tcMar>
+          </w:tcPr>
+          <w:p>
+            <w:pPr>
+              <w:jc w:val="right"/>
+            </w:pPr>
+            <w:r>
+              <w:rPr>
+                <w:rFonts w:ascii="Times New Roman" w:cs="Times New Roman" w:eastAsia="Times New Roman" w:hAnsi="Times New Roman"/>
+                <w:b/>
+                <w:bCs/>
+                <w:i w:val="false"/>
+                <w:iCs w:val="false"/>
+                <w:sz w:val="16"/>
+                <w:szCs w:val="16"/>
+              </w:rPr>
+              <w:t xml:space="preserve">n</w:t>
+            </w:r>
+          </w:p>
+        </w:tc>
+        <w:tc>
+          <w:tcPr>
+            <w:tcW w:type="dxa" w:w="1216"/>
+            <w:shd w:fill="EDEDED" w:color="auto" w:val="clear"/>
+            <w:tcMar>
+              <w:top w:type="dxa" w:w="40"/>
+              <w:left w:type="dxa" w:w="60"/>
+              <w:bottom w:type="dxa" w:w="40"/>
+              <w:right w:type="dxa" w:w="60"/>
+            </w:tcMar>
+          </w:tcPr>
+          <w:p>
+            <w:pPr>
+              <w:jc w:val="right"/>
+            </w:pPr>
+            <w:r>
+              <w:rPr>
+                <w:rFonts w:ascii="Times New Roman" w:cs="Times New Roman" w:eastAsia="Times New Roman" w:hAnsi="Times New Roman"/>
+                <w:b/>
+                <w:bCs/>
+                <w:i w:val="false"/>
+                <w:iCs w:val="false"/>
+                <w:sz w:val="16"/>
+                <w:szCs w:val="16"/>
+              </w:rPr>
+              <w:t xml:space="preserve">census</w:t>
+            </w:r>
+          </w:p>
+        </w:tc>
+        <w:tc>
+          <w:tcPr>
+            <w:tcW w:type="dxa" w:w="1216"/>
+            <w:shd w:fill="EDEDED" w:color="auto" w:val="clear"/>
+            <w:tcMar>
+              <w:top w:type="dxa" w:w="40"/>
+              <w:left w:type="dxa" w:w="60"/>
+              <w:bottom w:type="dxa" w:w="40"/>
+              <w:right w:type="dxa" w:w="60"/>
+            </w:tcMar>
+          </w:tcPr>
+          <w:p>
+            <w:pPr>
+              <w:jc w:val="right"/>
+            </w:pPr>
+            <w:r>
+              <w:rPr>
+                <w:rFonts w:ascii="Times New Roman" w:cs="Times New Roman" w:eastAsia="Times New Roman" w:hAnsi="Times New Roman"/>
+                <w:b/>
+                <w:bCs/>
+                <w:i w:val="false"/>
+                <w:iCs w:val="false"/>
+                <w:sz w:val="16"/>
+                <w:szCs w:val="16"/>
+              </w:rPr>
+              <w:t xml:space="preserve">% Hispanic</w:t>
+            </w:r>
+          </w:p>
+        </w:tc>
+        <w:tc>
+          <w:tcPr>
+            <w:tcW w:type="dxa" w:w="1216"/>
+            <w:shd w:fill="EDEDED" w:color="auto" w:val="clear"/>
+            <w:tcMar>
+              <w:top w:type="dxa" w:w="40"/>
+              <w:left w:type="dxa" w:w="60"/>
+              <w:bottom w:type="dxa" w:w="40"/>
+              <w:right w:type="dxa" w:w="60"/>
+            </w:tcMar>
+          </w:tcPr>
+          <w:p>
+            <w:pPr>
+              <w:jc w:val="right"/>
+            </w:pPr>
+            <w:r>
+              <w:rPr>
+                <w:rFonts w:ascii="Times New Roman" w:cs="Times New Roman" w:eastAsia="Times New Roman" w:hAnsi="Times New Roman"/>
+                <w:b/>
+                <w:bCs/>
+                <w:i w:val="false"/>
+                <w:iCs w:val="false"/>
+                <w:sz w:val="16"/>
+                <w:szCs w:val="16"/>
+              </w:rPr>
+              <w:t xml:space="preserve">% Black</w:t>
+            </w:r>
+          </w:p>
+        </w:tc>
+        <w:tc>
+          <w:tcPr>
+            <w:tcW w:type="dxa" w:w="1216"/>
+            <w:shd w:fill="EDEDED" w:color="auto" w:val="clear"/>
+            <w:tcMar>
+              <w:top w:type="dxa" w:w="40"/>
+              <w:left w:type="dxa" w:w="60"/>
+              <w:bottom w:type="dxa" w:w="40"/>
+              <w:right w:type="dxa" w:w="60"/>
+            </w:tcMar>
+          </w:tcPr>
+          <w:p>
+            <w:pPr>
+              <w:jc w:val="right"/>
+            </w:pPr>
+            <w:r>
+              <w:rPr>
+                <w:rFonts w:ascii="Times New Roman" w:cs="Times New Roman" w:eastAsia="Times New Roman" w:hAnsi="Times New Roman"/>
+                <w:b/>
+                <w:bCs/>
+                <w:i w:val="false"/>
+                <w:iCs w:val="false"/>
+                <w:sz w:val="16"/>
+                <w:szCs w:val="16"/>
+              </w:rPr>
+              <w:t xml:space="preserve">% in poverty</w:t>
+            </w:r>
+          </w:p>
+        </w:tc>
+        <w:tc>
+          <w:tcPr>
+            <w:tcW w:type="dxa" w:w="1221"/>
+            <w:shd w:fill="EDEDED" w:color="auto" w:val="clear"/>
+            <w:tcMar>
+              <w:top w:type="dxa" w:w="40"/>
+              <w:left w:type="dxa" w:w="60"/>
+              <w:bottom w:type="dxa" w:w="40"/>
+              <w:right w:type="dxa" w:w="60"/>
+            </w:tcMar>
+          </w:tcPr>
+          <w:p>
+            <w:pPr>
+              <w:jc w:val="right"/>
+            </w:pPr>
+            <w:r>
+              <w:rPr>
+                <w:rFonts w:ascii="Times New Roman" w:cs="Times New Roman" w:eastAsia="Times New Roman" w:hAnsi="Times New Roman"/>
+                <w:b/>
+                <w:bCs/>
+                <w:i w:val="false"/>
+                <w:iCs w:val="false"/>
+                <w:sz w:val="16"/>
+                <w:szCs w:val="16"/>
+              </w:rPr>
+              <w:t xml:space="preserve">% owner-occupied</w:t>
+            </w:r>
+          </w:p>
+        </w:tc>
+      </w:tr>
+      <w:tr>
+        <w:trPr>
+          <w:tblHeader w:val="false"/>
+        </w:trPr>
+        <w:tc>
+          <w:tcPr>
+            <w:tcW w:type="dxa" w:w="2059"/>
+            <w:tcMar>
+              <w:top w:type="dxa" w:w="40"/>
+              <w:left w:type="dxa" w:w="60"/>
+              <w:bottom w:type="dxa" w:w="40"/>
+              <w:right w:type="dxa" w:w="60"/>
+            </w:tcMar>
+          </w:tcPr>
+          <w:p>
+            <w:pPr>
+              <w:jc w:val="left"/>
+            </w:pPr>
+            <w:r>
+              <w:rPr>
+                <w:rFonts w:ascii="Times New Roman" w:cs="Times New Roman" w:eastAsia="Times New Roman" w:hAnsi="Times New Roman"/>
+                <w:b w:val="false"/>
+                <w:bCs w:val="false"/>
+                <w:i w:val="false"/>
+                <w:iCs w:val="false"/>
+                <w:sz w:val="16"/>
+                <w:szCs w:val="16"/>
+              </w:rPr>
+              <w:t xml:space="preserve">industrial in 1929 and today</w:t>
+            </w:r>
+          </w:p>
+        </w:tc>
+        <w:tc>
+          <w:tcPr>
+            <w:tcW w:type="dxa" w:w="1216"/>
+            <w:tcMar>
+              <w:top w:type="dxa" w:w="40"/>
+              <w:left w:type="dxa" w:w="60"/>
+              <w:bottom w:type="dxa" w:w="40"/>
+              <w:right w:type="dxa" w:w="60"/>
+            </w:tcMar>
+          </w:tcPr>
+          <w:p>
+            <w:pPr>
+              <w:jc w:val="right"/>
+            </w:pPr>
+            <w:r>
+              <w:rPr>
+                <w:rFonts w:ascii="Times New Roman" w:cs="Times New Roman" w:eastAsia="Times New Roman" w:hAnsi="Times New Roman"/>
+                <w:b w:val="false"/>
+                <w:bCs w:val="false"/>
+                <w:i w:val="false"/>
+                <w:iCs w:val="false"/>
+                <w:sz w:val="16"/>
+                <w:szCs w:val="16"/>
+              </w:rPr>
+              <w:t xml:space="preserve">10</w:t>
+            </w:r>
+          </w:p>
+        </w:tc>
+        <w:tc>
+          <w:tcPr>
+            <w:tcW w:type="dxa" w:w="1216"/>
+            <w:tcMar>
+              <w:top w:type="dxa" w:w="40"/>
+              <w:left w:type="dxa" w:w="60"/>
+              <w:bottom w:type="dxa" w:w="40"/>
+              <w:right w:type="dxa" w:w="60"/>
+            </w:tcMar>
+          </w:tcPr>
+          <w:p>
+            <w:pPr>
+              <w:jc w:val="right"/>
+            </w:pPr>
+            <w:r>
+              <w:rPr>
+                <w:rFonts w:ascii="Times New Roman" w:cs="Times New Roman" w:eastAsia="Times New Roman" w:hAnsi="Times New Roman"/>
+                <w:b w:val="false"/>
+                <w:bCs w:val="false"/>
+                <w:i w:val="false"/>
+                <w:iCs w:val="false"/>
+                <w:sz w:val="16"/>
+                <w:szCs w:val="16"/>
+              </w:rPr>
+              <w:t xml:space="preserve">1970</w:t>
+            </w:r>
+          </w:p>
+        </w:tc>
+        <w:tc>
+          <w:tcPr>
+            <w:tcW w:type="dxa" w:w="1216"/>
+            <w:tcMar>
+              <w:top w:type="dxa" w:w="40"/>
+              <w:left w:type="dxa" w:w="60"/>
+              <w:bottom w:type="dxa" w:w="40"/>
+              <w:right w:type="dxa" w:w="60"/>
+            </w:tcMar>
+          </w:tcPr>
+          <w:p>
+            <w:pPr>
+              <w:jc w:val="right"/>
+            </w:pPr>
+            <w:r>
+              <w:rPr>
+                <w:rFonts w:ascii="Times New Roman" w:cs="Times New Roman" w:eastAsia="Times New Roman" w:hAnsi="Times New Roman"/>
+                <w:b w:val="false"/>
+                <w:bCs w:val="false"/>
+                <w:i w:val="false"/>
+                <w:iCs w:val="false"/>
+                <w:sz w:val="16"/>
+                <w:szCs w:val="16"/>
+              </w:rPr>
+              <w:t xml:space="preserve">41.2</w:t>
+            </w:r>
+          </w:p>
+        </w:tc>
+        <w:tc>
+          <w:tcPr>
+            <w:tcW w:type="dxa" w:w="1216"/>
+            <w:tcMar>
+              <w:top w:type="dxa" w:w="40"/>
+              <w:left w:type="dxa" w:w="60"/>
+              <w:bottom w:type="dxa" w:w="40"/>
+              <w:right w:type="dxa" w:w="60"/>
+            </w:tcMar>
+          </w:tcPr>
+          <w:p>
+            <w:pPr>
+              <w:jc w:val="right"/>
+            </w:pPr>
+            <w:r>
+              <w:rPr>
+                <w:rFonts w:ascii="Times New Roman" w:cs="Times New Roman" w:eastAsia="Times New Roman" w:hAnsi="Times New Roman"/>
+                <w:b w:val="false"/>
+                <w:bCs w:val="false"/>
+                <w:i w:val="false"/>
+                <w:iCs w:val="false"/>
+                <w:sz w:val="16"/>
+                <w:szCs w:val="16"/>
+              </w:rPr>
+              <w:t xml:space="preserve">21.2</w:t>
+            </w:r>
+          </w:p>
+        </w:tc>
+        <w:tc>
+          <w:tcPr>
+            <w:tcW w:type="dxa" w:w="1216"/>
+            <w:tcMar>
+              <w:top w:type="dxa" w:w="40"/>
+              <w:left w:type="dxa" w:w="60"/>
+              <w:bottom w:type="dxa" w:w="40"/>
+              <w:right w:type="dxa" w:w="60"/>
+            </w:tcMar>
+          </w:tcPr>
+          <w:p>
+            <w:pPr>
+              <w:jc w:val="right"/>
+            </w:pPr>
+            <w:r>
+              <w:rPr>
+                <w:rFonts w:ascii="Times New Roman" w:cs="Times New Roman" w:eastAsia="Times New Roman" w:hAnsi="Times New Roman"/>
+                <w:b w:val="false"/>
+                <w:bCs w:val="false"/>
+                <w:i w:val="false"/>
+                <w:iCs w:val="false"/>
+                <w:sz w:val="16"/>
+                <w:szCs w:val="16"/>
+              </w:rPr>
+              <w:t xml:space="preserve">26.3</w:t>
+            </w:r>
+          </w:p>
+        </w:tc>
+        <w:tc>
+          <w:tcPr>
+            <w:tcW w:type="dxa" w:w="1221"/>
+            <w:tcMar>
+              <w:top w:type="dxa" w:w="40"/>
+              <w:left w:type="dxa" w:w="60"/>
+              <w:bottom w:type="dxa" w:w="40"/>
+              <w:right w:type="dxa" w:w="60"/>
+            </w:tcMar>
+          </w:tcPr>
+          <w:p>
+            <w:pPr>
+              <w:jc w:val="right"/>
+            </w:pPr>
+            <w:r>
+              <w:rPr>
+                <w:rFonts w:ascii="Times New Roman" w:cs="Times New Roman" w:eastAsia="Times New Roman" w:hAnsi="Times New Roman"/>
+                <w:b w:val="false"/>
+                <w:bCs w:val="false"/>
+                <w:i w:val="false"/>
+                <w:iCs w:val="false"/>
+                <w:sz w:val="16"/>
+                <w:szCs w:val="16"/>
+              </w:rPr>
+              <w:t xml:space="preserve">45.7</w:t>
+            </w:r>
+          </w:p>
+        </w:tc>
+      </w:tr>
+      <w:tr>
+        <w:trPr>
+          <w:tblHeader w:val="false"/>
+        </w:trPr>
+        <w:tc>
+          <w:tcPr>
+            <w:tcW w:type="dxa" w:w="2059"/>
+            <w:tcMar>
+              <w:top w:type="dxa" w:w="40"/>
+              <w:left w:type="dxa" w:w="60"/>
+              <w:bottom w:type="dxa" w:w="40"/>
+              <w:right w:type="dxa" w:w="60"/>
+            </w:tcMar>
+          </w:tcPr>
+          <w:p>
+            <w:pPr>
+              <w:jc w:val="left"/>
+            </w:pPr>
+          </w:p>
+        </w:tc>
+        <w:tc>
+          <w:tcPr>
+            <w:tcW w:type="dxa" w:w="1216"/>
+            <w:tcMar>
+              <w:top w:type="dxa" w:w="40"/>
+              <w:left w:type="dxa" w:w="60"/>
+              <w:bottom w:type="dxa" w:w="40"/>
+              <w:right w:type="dxa" w:w="60"/>
+            </w:tcMar>
+          </w:tcPr>
+          <w:p>
+            <w:pPr>
+              <w:jc w:val="right"/>
+            </w:pPr>
+          </w:p>
+        </w:tc>
+        <w:tc>
+          <w:tcPr>
+            <w:tcW w:type="dxa" w:w="1216"/>
+            <w:tcMar>
+              <w:top w:type="dxa" w:w="40"/>
+              <w:left w:type="dxa" w:w="60"/>
+              <w:bottom w:type="dxa" w:w="40"/>
+              <w:right w:type="dxa" w:w="60"/>
+            </w:tcMar>
+          </w:tcPr>
+          <w:p>
+            <w:pPr>
+              <w:jc w:val="right"/>
+            </w:pPr>
+            <w:r>
+              <w:rPr>
+                <w:rFonts w:ascii="Times New Roman" w:cs="Times New Roman" w:eastAsia="Times New Roman" w:hAnsi="Times New Roman"/>
+                <w:b w:val="false"/>
+                <w:bCs w:val="false"/>
+                <w:i w:val="false"/>
+                <w:iCs w:val="false"/>
+                <w:sz w:val="16"/>
+                <w:szCs w:val="16"/>
+              </w:rPr>
+              <w:t xml:space="preserve">1990</w:t>
+            </w:r>
+          </w:p>
+        </w:tc>
+        <w:tc>
+          <w:tcPr>
+            <w:tcW w:type="dxa" w:w="1216"/>
+            <w:tcMar>
+              <w:top w:type="dxa" w:w="40"/>
+              <w:left w:type="dxa" w:w="60"/>
+              <w:bottom w:type="dxa" w:w="40"/>
+              <w:right w:type="dxa" w:w="60"/>
+            </w:tcMar>
+          </w:tcPr>
+          <w:p>
+            <w:pPr>
+              <w:jc w:val="right"/>
+            </w:pPr>
+            <w:r>
+              <w:rPr>
+                <w:rFonts w:ascii="Times New Roman" w:cs="Times New Roman" w:eastAsia="Times New Roman" w:hAnsi="Times New Roman"/>
+                <w:b w:val="false"/>
+                <w:bCs w:val="false"/>
+                <w:i w:val="false"/>
+                <w:iCs w:val="false"/>
+                <w:sz w:val="16"/>
+                <w:szCs w:val="16"/>
+              </w:rPr>
+              <w:t xml:space="preserve">49.4</w:t>
+            </w:r>
+          </w:p>
+        </w:tc>
+        <w:tc>
+          <w:tcPr>
+            <w:tcW w:type="dxa" w:w="1216"/>
+            <w:tcMar>
+              <w:top w:type="dxa" w:w="40"/>
+              <w:left w:type="dxa" w:w="60"/>
+              <w:bottom w:type="dxa" w:w="40"/>
+              <w:right w:type="dxa" w:w="60"/>
+            </w:tcMar>
+          </w:tcPr>
+          <w:p>
+            <w:pPr>
+              <w:jc w:val="right"/>
+            </w:pPr>
+            <w:r>
+              <w:rPr>
+                <w:rFonts w:ascii="Times New Roman" w:cs="Times New Roman" w:eastAsia="Times New Roman" w:hAnsi="Times New Roman"/>
+                <w:b w:val="false"/>
+                <w:bCs w:val="false"/>
+                <w:i w:val="false"/>
+                <w:iCs w:val="false"/>
+                <w:sz w:val="16"/>
+                <w:szCs w:val="16"/>
+              </w:rPr>
+              <w:t xml:space="preserve">22.3</w:t>
+            </w:r>
+          </w:p>
+        </w:tc>
+        <w:tc>
+          <w:tcPr>
+            <w:tcW w:type="dxa" w:w="1216"/>
+            <w:tcMar>
+              <w:top w:type="dxa" w:w="40"/>
+              <w:left w:type="dxa" w:w="60"/>
+              <w:bottom w:type="dxa" w:w="40"/>
+              <w:right w:type="dxa" w:w="60"/>
+            </w:tcMar>
+          </w:tcPr>
+          <w:p>
+            <w:pPr>
+              <w:jc w:val="right"/>
+            </w:pPr>
+            <w:r>
+              <w:rPr>
+                <w:rFonts w:ascii="Times New Roman" w:cs="Times New Roman" w:eastAsia="Times New Roman" w:hAnsi="Times New Roman"/>
+                <w:b w:val="false"/>
+                <w:bCs w:val="false"/>
+                <w:i w:val="false"/>
+                <w:iCs w:val="false"/>
+                <w:sz w:val="16"/>
+                <w:szCs w:val="16"/>
+              </w:rPr>
+              <w:t xml:space="preserve">35.7</w:t>
+            </w:r>
+          </w:p>
+        </w:tc>
+        <w:tc>
+          <w:tcPr>
+            <w:tcW w:type="dxa" w:w="1221"/>
+            <w:tcMar>
+              <w:top w:type="dxa" w:w="40"/>
+              <w:left w:type="dxa" w:w="60"/>
+              <w:bottom w:type="dxa" w:w="40"/>
+              <w:right w:type="dxa" w:w="60"/>
+            </w:tcMar>
+          </w:tcPr>
+          <w:p>
+            <w:pPr>
+              <w:jc w:val="right"/>
+            </w:pPr>
+            <w:r>
+              <w:rPr>
+                <w:rFonts w:ascii="Times New Roman" w:cs="Times New Roman" w:eastAsia="Times New Roman" w:hAnsi="Times New Roman"/>
+                <w:b w:val="false"/>
+                <w:bCs w:val="false"/>
+                <w:i w:val="false"/>
+                <w:iCs w:val="false"/>
+                <w:sz w:val="16"/>
+                <w:szCs w:val="16"/>
+              </w:rPr>
+              <w:t xml:space="preserve">47.0</w:t>
+            </w:r>
+          </w:p>
+        </w:tc>
+      </w:tr>
+      <w:tr>
+        <w:trPr>
+          <w:tblHeader w:val="false"/>
+        </w:trPr>
+        <w:tc>
+          <w:tcPr>
+            <w:tcW w:type="dxa" w:w="2059"/>
+            <w:tcMar>
+              <w:top w:type="dxa" w:w="40"/>
+              <w:left w:type="dxa" w:w="60"/>
+              <w:bottom w:type="dxa" w:w="40"/>
+              <w:right w:type="dxa" w:w="60"/>
+            </w:tcMar>
+          </w:tcPr>
+          <w:p>
+            <w:pPr>
+              <w:jc w:val="left"/>
+            </w:pPr>
+          </w:p>
+        </w:tc>
+        <w:tc>
+          <w:tcPr>
+            <w:tcW w:type="dxa" w:w="1216"/>
+            <w:tcMar>
+              <w:top w:type="dxa" w:w="40"/>
+              <w:left w:type="dxa" w:w="60"/>
+              <w:bottom w:type="dxa" w:w="40"/>
+              <w:right w:type="dxa" w:w="60"/>
+            </w:tcMar>
+          </w:tcPr>
+          <w:p>
+            <w:pPr>
+              <w:jc w:val="right"/>
+            </w:pPr>
+          </w:p>
+        </w:tc>
+        <w:tc>
+          <w:tcPr>
+            <w:tcW w:type="dxa" w:w="1216"/>
+            <w:tcMar>
+              <w:top w:type="dxa" w:w="40"/>
+              <w:left w:type="dxa" w:w="60"/>
+              <w:bottom w:type="dxa" w:w="40"/>
+              <w:right w:type="dxa" w:w="60"/>
+            </w:tcMar>
+          </w:tcPr>
+          <w:p>
+            <w:pPr>
+              <w:jc w:val="right"/>
+            </w:pPr>
+            <w:r>
+              <w:rPr>
+                <w:rFonts w:ascii="Times New Roman" w:cs="Times New Roman" w:eastAsia="Times New Roman" w:hAnsi="Times New Roman"/>
+                <w:b w:val="false"/>
+                <w:bCs w:val="false"/>
+                <w:i w:val="false"/>
+                <w:iCs w:val="false"/>
+                <w:sz w:val="16"/>
+                <w:szCs w:val="16"/>
+              </w:rPr>
+              <w:t xml:space="preserve">2020</w:t>
+            </w:r>
+          </w:p>
+        </w:tc>
+        <w:tc>
+          <w:tcPr>
+            <w:tcW w:type="dxa" w:w="1216"/>
+            <w:tcMar>
+              <w:top w:type="dxa" w:w="40"/>
+              <w:left w:type="dxa" w:w="60"/>
+              <w:bottom w:type="dxa" w:w="40"/>
+              <w:right w:type="dxa" w:w="60"/>
+            </w:tcMar>
+          </w:tcPr>
+          <w:p>
+            <w:pPr>
+              <w:jc w:val="right"/>
+            </w:pPr>
+            <w:r>
+              <w:rPr>
+                <w:rFonts w:ascii="Times New Roman" w:cs="Times New Roman" w:eastAsia="Times New Roman" w:hAnsi="Times New Roman"/>
+                <w:b w:val="false"/>
+                <w:bCs w:val="false"/>
+                <w:i w:val="false"/>
+                <w:iCs w:val="false"/>
+                <w:sz w:val="16"/>
+                <w:szCs w:val="16"/>
+              </w:rPr>
+              <w:t xml:space="preserve">43.6</w:t>
+            </w:r>
+          </w:p>
+        </w:tc>
+        <w:tc>
+          <w:tcPr>
+            <w:tcW w:type="dxa" w:w="1216"/>
+            <w:tcMar>
+              <w:top w:type="dxa" w:w="40"/>
+              <w:left w:type="dxa" w:w="60"/>
+              <w:bottom w:type="dxa" w:w="40"/>
+              <w:right w:type="dxa" w:w="60"/>
+            </w:tcMar>
+          </w:tcPr>
+          <w:p>
+            <w:pPr>
+              <w:jc w:val="right"/>
+            </w:pPr>
+            <w:r>
+              <w:rPr>
+                <w:rFonts w:ascii="Times New Roman" w:cs="Times New Roman" w:eastAsia="Times New Roman" w:hAnsi="Times New Roman"/>
+                <w:b w:val="false"/>
+                <w:bCs w:val="false"/>
+                <w:i w:val="false"/>
+                <w:iCs w:val="false"/>
+                <w:sz w:val="16"/>
+                <w:szCs w:val="16"/>
+              </w:rPr>
+              <w:t xml:space="preserve">13.9</w:t>
+            </w:r>
+          </w:p>
+        </w:tc>
+        <w:tc>
+          <w:tcPr>
+            <w:tcW w:type="dxa" w:w="1216"/>
+            <w:tcMar>
+              <w:top w:type="dxa" w:w="40"/>
+              <w:left w:type="dxa" w:w="60"/>
+              <w:bottom w:type="dxa" w:w="40"/>
+              <w:right w:type="dxa" w:w="60"/>
+            </w:tcMar>
+          </w:tcPr>
+          <w:p>
+            <w:pPr>
+              <w:jc w:val="right"/>
+            </w:pPr>
+            <w:r>
+              <w:rPr>
+                <w:rFonts w:ascii="Times New Roman" w:cs="Times New Roman" w:eastAsia="Times New Roman" w:hAnsi="Times New Roman"/>
+                <w:b w:val="false"/>
+                <w:bCs w:val="false"/>
+                <w:i w:val="false"/>
+                <w:iCs w:val="false"/>
+                <w:sz w:val="16"/>
+                <w:szCs w:val="16"/>
+              </w:rPr>
+              <w:t xml:space="preserve">21.3</w:t>
+            </w:r>
+          </w:p>
+        </w:tc>
+        <w:tc>
+          <w:tcPr>
+            <w:tcW w:type="dxa" w:w="1221"/>
+            <w:tcMar>
+              <w:top w:type="dxa" w:w="40"/>
+              <w:left w:type="dxa" w:w="60"/>
+              <w:bottom w:type="dxa" w:w="40"/>
+              <w:right w:type="dxa" w:w="60"/>
+            </w:tcMar>
+          </w:tcPr>
+          <w:p>
+            <w:pPr>
+              <w:jc w:val="right"/>
+            </w:pPr>
+            <w:r>
+              <w:rPr>
+                <w:rFonts w:ascii="Times New Roman" w:cs="Times New Roman" w:eastAsia="Times New Roman" w:hAnsi="Times New Roman"/>
+                <w:b w:val="false"/>
+                <w:bCs w:val="false"/>
+                <w:i w:val="false"/>
+                <w:iCs w:val="false"/>
+                <w:sz w:val="16"/>
+                <w:szCs w:val="16"/>
+              </w:rPr>
+              <w:t xml:space="preserve">43.1</w:t>
+            </w:r>
+          </w:p>
+        </w:tc>
+      </w:tr>
+      <w:tr>
+        <w:trPr>
+          <w:tblHeader w:val="false"/>
+        </w:trPr>
+        <w:tc>
+          <w:tcPr>
+            <w:tcW w:type="dxa" w:w="2059"/>
+            <w:tcMar>
+              <w:top w:type="dxa" w:w="40"/>
+              <w:left w:type="dxa" w:w="60"/>
+              <w:bottom w:type="dxa" w:w="40"/>
+              <w:right w:type="dxa" w:w="60"/>
+            </w:tcMar>
+          </w:tcPr>
+          <w:p>
+            <w:pPr>
+              <w:jc w:val="left"/>
+            </w:pPr>
+            <w:r>
+              <w:rPr>
+                <w:rFonts w:ascii="Times New Roman" w:cs="Times New Roman" w:eastAsia="Times New Roman" w:hAnsi="Times New Roman"/>
+                <w:b w:val="false"/>
+                <w:bCs w:val="false"/>
+                <w:i w:val="false"/>
+                <w:iCs w:val="false"/>
+                <w:sz w:val="16"/>
+                <w:szCs w:val="16"/>
+              </w:rPr>
+              <w:t xml:space="preserve">industrial in 1929, not today</w:t>
+            </w:r>
+          </w:p>
+        </w:tc>
+        <w:tc>
+          <w:tcPr>
+            <w:tcW w:type="dxa" w:w="1216"/>
+            <w:tcMar>
+              <w:top w:type="dxa" w:w="40"/>
+              <w:left w:type="dxa" w:w="60"/>
+              <w:bottom w:type="dxa" w:w="40"/>
+              <w:right w:type="dxa" w:w="60"/>
+            </w:tcMar>
+          </w:tcPr>
+          <w:p>
+            <w:pPr>
+              <w:jc w:val="right"/>
+            </w:pPr>
+            <w:r>
+              <w:rPr>
+                <w:rFonts w:ascii="Times New Roman" w:cs="Times New Roman" w:eastAsia="Times New Roman" w:hAnsi="Times New Roman"/>
+                <w:b w:val="false"/>
+                <w:bCs w:val="false"/>
+                <w:i w:val="false"/>
+                <w:iCs w:val="false"/>
+                <w:sz w:val="16"/>
+                <w:szCs w:val="16"/>
+              </w:rPr>
+              <w:t xml:space="preserve">7</w:t>
+            </w:r>
+          </w:p>
+        </w:tc>
+        <w:tc>
+          <w:tcPr>
+            <w:tcW w:type="dxa" w:w="1216"/>
+            <w:tcMar>
+              <w:top w:type="dxa" w:w="40"/>
+              <w:left w:type="dxa" w:w="60"/>
+              <w:bottom w:type="dxa" w:w="40"/>
+              <w:right w:type="dxa" w:w="60"/>
+            </w:tcMar>
+          </w:tcPr>
+          <w:p>
+            <w:pPr>
+              <w:jc w:val="right"/>
+            </w:pPr>
+            <w:r>
+              <w:rPr>
+                <w:rFonts w:ascii="Times New Roman" w:cs="Times New Roman" w:eastAsia="Times New Roman" w:hAnsi="Times New Roman"/>
+                <w:b w:val="false"/>
+                <w:bCs w:val="false"/>
+                <w:i w:val="false"/>
+                <w:iCs w:val="false"/>
+                <w:sz w:val="16"/>
+                <w:szCs w:val="16"/>
+              </w:rPr>
+              <w:t xml:space="preserve">1970</w:t>
+            </w:r>
+          </w:p>
+        </w:tc>
+        <w:tc>
+          <w:tcPr>
+            <w:tcW w:type="dxa" w:w="1216"/>
+            <w:tcMar>
+              <w:top w:type="dxa" w:w="40"/>
+              <w:left w:type="dxa" w:w="60"/>
+              <w:bottom w:type="dxa" w:w="40"/>
+              <w:right w:type="dxa" w:w="60"/>
+            </w:tcMar>
+          </w:tcPr>
+          <w:p>
+            <w:pPr>
+              <w:jc w:val="right"/>
+            </w:pPr>
+            <w:r>
+              <w:rPr>
+                <w:rFonts w:ascii="Times New Roman" w:cs="Times New Roman" w:eastAsia="Times New Roman" w:hAnsi="Times New Roman"/>
+                <w:b w:val="false"/>
+                <w:bCs w:val="false"/>
+                <w:i w:val="false"/>
+                <w:iCs w:val="false"/>
+                <w:sz w:val="16"/>
+                <w:szCs w:val="16"/>
+              </w:rPr>
+              <w:t xml:space="preserve">39.4</w:t>
+            </w:r>
+          </w:p>
+        </w:tc>
+        <w:tc>
+          <w:tcPr>
+            <w:tcW w:type="dxa" w:w="1216"/>
+            <w:tcMar>
+              <w:top w:type="dxa" w:w="40"/>
+              <w:left w:type="dxa" w:w="60"/>
+              <w:bottom w:type="dxa" w:w="40"/>
+              <w:right w:type="dxa" w:w="60"/>
+            </w:tcMar>
+          </w:tcPr>
+          <w:p>
+            <w:pPr>
+              <w:jc w:val="right"/>
+            </w:pPr>
+            <w:r>
+              <w:rPr>
+                <w:rFonts w:ascii="Times New Roman" w:cs="Times New Roman" w:eastAsia="Times New Roman" w:hAnsi="Times New Roman"/>
+                <w:b w:val="false"/>
+                <w:bCs w:val="false"/>
+                <w:i w:val="false"/>
+                <w:iCs w:val="false"/>
+                <w:sz w:val="16"/>
+                <w:szCs w:val="16"/>
+              </w:rPr>
+              <w:t xml:space="preserve">28.8</w:t>
+            </w:r>
+          </w:p>
+        </w:tc>
+        <w:tc>
+          <w:tcPr>
+            <w:tcW w:type="dxa" w:w="1216"/>
+            <w:tcMar>
+              <w:top w:type="dxa" w:w="40"/>
+              <w:left w:type="dxa" w:w="60"/>
+              <w:bottom w:type="dxa" w:w="40"/>
+              <w:right w:type="dxa" w:w="60"/>
+            </w:tcMar>
+          </w:tcPr>
+          <w:p>
+            <w:pPr>
+              <w:jc w:val="right"/>
+            </w:pPr>
+            <w:r>
+              <w:rPr>
+                <w:rFonts w:ascii="Times New Roman" w:cs="Times New Roman" w:eastAsia="Times New Roman" w:hAnsi="Times New Roman"/>
+                <w:b w:val="false"/>
+                <w:bCs w:val="false"/>
+                <w:i w:val="false"/>
+                <w:iCs w:val="false"/>
+                <w:sz w:val="16"/>
+                <w:szCs w:val="16"/>
+              </w:rPr>
+              <w:t xml:space="preserve">28.5</w:t>
+            </w:r>
+          </w:p>
+        </w:tc>
+        <w:tc>
+          <w:tcPr>
+            <w:tcW w:type="dxa" w:w="1221"/>
+            <w:tcMar>
+              <w:top w:type="dxa" w:w="40"/>
+              <w:left w:type="dxa" w:w="60"/>
+              <w:bottom w:type="dxa" w:w="40"/>
+              <w:right w:type="dxa" w:w="60"/>
+            </w:tcMar>
+          </w:tcPr>
+          <w:p>
+            <w:pPr>
+              <w:jc w:val="right"/>
+            </w:pPr>
+            <w:r>
+              <w:rPr>
+                <w:rFonts w:ascii="Times New Roman" w:cs="Times New Roman" w:eastAsia="Times New Roman" w:hAnsi="Times New Roman"/>
+                <w:b w:val="false"/>
+                <w:bCs w:val="false"/>
+                <w:i w:val="false"/>
+                <w:iCs w:val="false"/>
+                <w:sz w:val="16"/>
+                <w:szCs w:val="16"/>
+              </w:rPr>
+              <w:t xml:space="preserve">44.5</w:t>
+            </w:r>
+          </w:p>
+        </w:tc>
+      </w:tr>
+      <w:tr>
+        <w:trPr>
+          <w:tblHeader w:val="false"/>
+        </w:trPr>
+        <w:tc>
+          <w:tcPr>
+            <w:tcW w:type="dxa" w:w="2059"/>
+            <w:tcMar>
+              <w:top w:type="dxa" w:w="40"/>
+              <w:left w:type="dxa" w:w="60"/>
+              <w:bottom w:type="dxa" w:w="40"/>
+              <w:right w:type="dxa" w:w="60"/>
+            </w:tcMar>
+          </w:tcPr>
+          <w:p>
+            <w:pPr>
+              <w:jc w:val="left"/>
+            </w:pPr>
+          </w:p>
+        </w:tc>
+        <w:tc>
+          <w:tcPr>
+            <w:tcW w:type="dxa" w:w="1216"/>
+            <w:tcMar>
+              <w:top w:type="dxa" w:w="40"/>
+              <w:left w:type="dxa" w:w="60"/>
+              <w:bottom w:type="dxa" w:w="40"/>
+              <w:right w:type="dxa" w:w="60"/>
+            </w:tcMar>
+          </w:tcPr>
+          <w:p>
+            <w:pPr>
+              <w:jc w:val="right"/>
+            </w:pPr>
+          </w:p>
+        </w:tc>
+        <w:tc>
+          <w:tcPr>
+            <w:tcW w:type="dxa" w:w="1216"/>
+            <w:tcMar>
+              <w:top w:type="dxa" w:w="40"/>
+              <w:left w:type="dxa" w:w="60"/>
+              <w:bottom w:type="dxa" w:w="40"/>
+              <w:right w:type="dxa" w:w="60"/>
+            </w:tcMar>
+          </w:tcPr>
+          <w:p>
+            <w:pPr>
+              <w:jc w:val="right"/>
+            </w:pPr>
+            <w:r>
+              <w:rPr>
+                <w:rFonts w:ascii="Times New Roman" w:cs="Times New Roman" w:eastAsia="Times New Roman" w:hAnsi="Times New Roman"/>
+                <w:b w:val="false"/>
+                <w:bCs w:val="false"/>
+                <w:i w:val="false"/>
+                <w:iCs w:val="false"/>
+                <w:sz w:val="16"/>
+                <w:szCs w:val="16"/>
+              </w:rPr>
+              <w:t xml:space="preserve">1990</w:t>
+            </w:r>
+          </w:p>
+        </w:tc>
+        <w:tc>
+          <w:tcPr>
+            <w:tcW w:type="dxa" w:w="1216"/>
+            <w:tcMar>
+              <w:top w:type="dxa" w:w="40"/>
+              <w:left w:type="dxa" w:w="60"/>
+              <w:bottom w:type="dxa" w:w="40"/>
+              <w:right w:type="dxa" w:w="60"/>
+            </w:tcMar>
+          </w:tcPr>
+          <w:p>
+            <w:pPr>
+              <w:jc w:val="right"/>
+            </w:pPr>
+            <w:r>
+              <w:rPr>
+                <w:rFonts w:ascii="Times New Roman" w:cs="Times New Roman" w:eastAsia="Times New Roman" w:hAnsi="Times New Roman"/>
+                <w:b w:val="false"/>
+                <w:bCs w:val="false"/>
+                <w:i w:val="false"/>
+                <w:iCs w:val="false"/>
+                <w:sz w:val="16"/>
+                <w:szCs w:val="16"/>
+              </w:rPr>
+              <w:t xml:space="preserve">45.0</w:t>
+            </w:r>
+          </w:p>
+        </w:tc>
+        <w:tc>
+          <w:tcPr>
+            <w:tcW w:type="dxa" w:w="1216"/>
+            <w:tcMar>
+              <w:top w:type="dxa" w:w="40"/>
+              <w:left w:type="dxa" w:w="60"/>
+              <w:bottom w:type="dxa" w:w="40"/>
+              <w:right w:type="dxa" w:w="60"/>
+            </w:tcMar>
+          </w:tcPr>
+          <w:p>
+            <w:pPr>
+              <w:jc w:val="right"/>
+            </w:pPr>
+            <w:r>
+              <w:rPr>
+                <w:rFonts w:ascii="Times New Roman" w:cs="Times New Roman" w:eastAsia="Times New Roman" w:hAnsi="Times New Roman"/>
+                <w:b w:val="false"/>
+                <w:bCs w:val="false"/>
+                <w:i w:val="false"/>
+                <w:iCs w:val="false"/>
+                <w:sz w:val="16"/>
+                <w:szCs w:val="16"/>
+              </w:rPr>
+              <w:t xml:space="preserve">26.2</w:t>
+            </w:r>
+          </w:p>
+        </w:tc>
+        <w:tc>
+          <w:tcPr>
+            <w:tcW w:type="dxa" w:w="1216"/>
+            <w:tcMar>
+              <w:top w:type="dxa" w:w="40"/>
+              <w:left w:type="dxa" w:w="60"/>
+              <w:bottom w:type="dxa" w:w="40"/>
+              <w:right w:type="dxa" w:w="60"/>
+            </w:tcMar>
+          </w:tcPr>
+          <w:p>
+            <w:pPr>
+              <w:jc w:val="right"/>
+            </w:pPr>
+            <w:r>
+              <w:rPr>
+                <w:rFonts w:ascii="Times New Roman" w:cs="Times New Roman" w:eastAsia="Times New Roman" w:hAnsi="Times New Roman"/>
+                <w:b w:val="false"/>
+                <w:bCs w:val="false"/>
+                <w:i w:val="false"/>
+                <w:iCs w:val="false"/>
+                <w:sz w:val="16"/>
+                <w:szCs w:val="16"/>
+              </w:rPr>
+              <w:t xml:space="preserve">33.3</w:t>
+            </w:r>
+          </w:p>
+        </w:tc>
+        <w:tc>
+          <w:tcPr>
+            <w:tcW w:type="dxa" w:w="1221"/>
+            <w:tcMar>
+              <w:top w:type="dxa" w:w="40"/>
+              <w:left w:type="dxa" w:w="60"/>
+              <w:bottom w:type="dxa" w:w="40"/>
+              <w:right w:type="dxa" w:w="60"/>
+            </w:tcMar>
+          </w:tcPr>
+          <w:p>
+            <w:pPr>
+              <w:jc w:val="right"/>
+            </w:pPr>
+            <w:r>
+              <w:rPr>
+                <w:rFonts w:ascii="Times New Roman" w:cs="Times New Roman" w:eastAsia="Times New Roman" w:hAnsi="Times New Roman"/>
+                <w:b w:val="false"/>
+                <w:bCs w:val="false"/>
+                <w:i w:val="false"/>
+                <w:iCs w:val="false"/>
+                <w:sz w:val="16"/>
+                <w:szCs w:val="16"/>
+              </w:rPr>
+              <w:t xml:space="preserve">46.7</w:t>
+            </w:r>
+          </w:p>
+        </w:tc>
+      </w:tr>
+      <w:tr>
+        <w:trPr>
+          <w:tblHeader w:val="false"/>
+        </w:trPr>
+        <w:tc>
+          <w:tcPr>
+            <w:tcW w:type="dxa" w:w="2059"/>
+            <w:tcMar>
+              <w:top w:type="dxa" w:w="40"/>
+              <w:left w:type="dxa" w:w="60"/>
+              <w:bottom w:type="dxa" w:w="40"/>
+              <w:right w:type="dxa" w:w="60"/>
+            </w:tcMar>
+          </w:tcPr>
+          <w:p>
+            <w:pPr>
+              <w:jc w:val="left"/>
+            </w:pPr>
+          </w:p>
+        </w:tc>
+        <w:tc>
+          <w:tcPr>
+            <w:tcW w:type="dxa" w:w="1216"/>
+            <w:tcMar>
+              <w:top w:type="dxa" w:w="40"/>
+              <w:left w:type="dxa" w:w="60"/>
+              <w:bottom w:type="dxa" w:w="40"/>
+              <w:right w:type="dxa" w:w="60"/>
+            </w:tcMar>
+          </w:tcPr>
+          <w:p>
+            <w:pPr>
+              <w:jc w:val="right"/>
+            </w:pPr>
+          </w:p>
+        </w:tc>
+        <w:tc>
+          <w:tcPr>
+            <w:tcW w:type="dxa" w:w="1216"/>
+            <w:tcMar>
+              <w:top w:type="dxa" w:w="40"/>
+              <w:left w:type="dxa" w:w="60"/>
+              <w:bottom w:type="dxa" w:w="40"/>
+              <w:right w:type="dxa" w:w="60"/>
+            </w:tcMar>
+          </w:tcPr>
+          <w:p>
+            <w:pPr>
+              <w:jc w:val="right"/>
+            </w:pPr>
+            <w:r>
+              <w:rPr>
+                <w:rFonts w:ascii="Times New Roman" w:cs="Times New Roman" w:eastAsia="Times New Roman" w:hAnsi="Times New Roman"/>
+                <w:b w:val="false"/>
+                <w:bCs w:val="false"/>
+                <w:i w:val="false"/>
+                <w:iCs w:val="false"/>
+                <w:sz w:val="16"/>
+                <w:szCs w:val="16"/>
+              </w:rPr>
+              <w:t xml:space="preserve">2020</w:t>
+            </w:r>
+          </w:p>
+        </w:tc>
+        <w:tc>
+          <w:tcPr>
+            <w:tcW w:type="dxa" w:w="1216"/>
+            <w:tcMar>
+              <w:top w:type="dxa" w:w="40"/>
+              <w:left w:type="dxa" w:w="60"/>
+              <w:bottom w:type="dxa" w:w="40"/>
+              <w:right w:type="dxa" w:w="60"/>
+            </w:tcMar>
+          </w:tcPr>
+          <w:p>
+            <w:pPr>
+              <w:jc w:val="right"/>
+            </w:pPr>
+            <w:r>
+              <w:rPr>
+                <w:rFonts w:ascii="Times New Roman" w:cs="Times New Roman" w:eastAsia="Times New Roman" w:hAnsi="Times New Roman"/>
+                <w:b w:val="false"/>
+                <w:bCs w:val="false"/>
+                <w:i w:val="false"/>
+                <w:iCs w:val="false"/>
+                <w:sz w:val="16"/>
+                <w:szCs w:val="16"/>
+              </w:rPr>
+              <w:t xml:space="preserve">25.2</w:t>
+            </w:r>
+          </w:p>
+        </w:tc>
+        <w:tc>
+          <w:tcPr>
+            <w:tcW w:type="dxa" w:w="1216"/>
+            <w:tcMar>
+              <w:top w:type="dxa" w:w="40"/>
+              <w:left w:type="dxa" w:w="60"/>
+              <w:bottom w:type="dxa" w:w="40"/>
+              <w:right w:type="dxa" w:w="60"/>
+            </w:tcMar>
+          </w:tcPr>
+          <w:p>
+            <w:pPr>
+              <w:jc w:val="right"/>
+            </w:pPr>
+            <w:r>
+              <w:rPr>
+                <w:rFonts w:ascii="Times New Roman" w:cs="Times New Roman" w:eastAsia="Times New Roman" w:hAnsi="Times New Roman"/>
+                <w:b w:val="false"/>
+                <w:bCs w:val="false"/>
+                <w:i w:val="false"/>
+                <w:iCs w:val="false"/>
+                <w:sz w:val="16"/>
+                <w:szCs w:val="16"/>
+              </w:rPr>
+              <w:t xml:space="preserve">6.6</w:t>
+            </w:r>
+          </w:p>
+        </w:tc>
+        <w:tc>
+          <w:tcPr>
+            <w:tcW w:type="dxa" w:w="1216"/>
+            <w:tcMar>
+              <w:top w:type="dxa" w:w="40"/>
+              <w:left w:type="dxa" w:w="60"/>
+              <w:bottom w:type="dxa" w:w="40"/>
+              <w:right w:type="dxa" w:w="60"/>
+            </w:tcMar>
+          </w:tcPr>
+          <w:p>
+            <w:pPr>
+              <w:jc w:val="right"/>
+            </w:pPr>
+            <w:r>
+              <w:rPr>
+                <w:rFonts w:ascii="Times New Roman" w:cs="Times New Roman" w:eastAsia="Times New Roman" w:hAnsi="Times New Roman"/>
+                <w:b w:val="false"/>
+                <w:bCs w:val="false"/>
+                <w:i w:val="false"/>
+                <w:iCs w:val="false"/>
+                <w:sz w:val="16"/>
+                <w:szCs w:val="16"/>
+              </w:rPr>
+              <w:t xml:space="preserve">13.7</w:t>
+            </w:r>
+          </w:p>
+        </w:tc>
+        <w:tc>
+          <w:tcPr>
+            <w:tcW w:type="dxa" w:w="1221"/>
+            <w:tcMar>
+              <w:top w:type="dxa" w:w="40"/>
+              <w:left w:type="dxa" w:w="60"/>
+              <w:bottom w:type="dxa" w:w="40"/>
+              <w:right w:type="dxa" w:w="60"/>
+            </w:tcMar>
+          </w:tcPr>
+          <w:p>
+            <w:pPr>
+              <w:jc w:val="right"/>
+            </w:pPr>
+            <w:r>
+              <w:rPr>
+                <w:rFonts w:ascii="Times New Roman" w:cs="Times New Roman" w:eastAsia="Times New Roman" w:hAnsi="Times New Roman"/>
+                <w:b w:val="false"/>
+                <w:bCs w:val="false"/>
+                <w:i w:val="false"/>
+                <w:iCs w:val="false"/>
+                <w:sz w:val="16"/>
+                <w:szCs w:val="16"/>
+              </w:rPr>
+              <w:t xml:space="preserve">32.8</w:t>
+            </w:r>
+          </w:p>
+        </w:tc>
+      </w:tr>
+      <w:tr>
+        <w:trPr>
+          <w:tblHeader w:val="false"/>
+        </w:trPr>
+        <w:tc>
+          <w:tcPr>
+            <w:tcW w:type="dxa" w:w="2059"/>
+            <w:tcMar>
+              <w:top w:type="dxa" w:w="40"/>
+              <w:left w:type="dxa" w:w="60"/>
+              <w:bottom w:type="dxa" w:w="40"/>
+              <w:right w:type="dxa" w:w="60"/>
+            </w:tcMar>
+          </w:tcPr>
+          <w:p>
+            <w:pPr>
+              <w:jc w:val="left"/>
+            </w:pPr>
+            <w:r>
+              <w:rPr>
+                <w:rFonts w:ascii="Times New Roman" w:cs="Times New Roman" w:eastAsia="Times New Roman" w:hAnsi="Times New Roman"/>
+                <w:b w:val="false"/>
+                <w:bCs w:val="false"/>
+                <w:i w:val="false"/>
+                <w:iCs w:val="false"/>
+                <w:sz w:val="16"/>
+                <w:szCs w:val="16"/>
+              </w:rPr>
+              <w:t xml:space="preserve">neither</w:t>
+            </w:r>
+          </w:p>
+        </w:tc>
+        <w:tc>
+          <w:tcPr>
+            <w:tcW w:type="dxa" w:w="1216"/>
+            <w:tcMar>
+              <w:top w:type="dxa" w:w="40"/>
+              <w:left w:type="dxa" w:w="60"/>
+              <w:bottom w:type="dxa" w:w="40"/>
+              <w:right w:type="dxa" w:w="60"/>
+            </w:tcMar>
+          </w:tcPr>
+          <w:p>
+            <w:pPr>
+              <w:jc w:val="right"/>
+            </w:pPr>
+            <w:r>
+              <w:rPr>
+                <w:rFonts w:ascii="Times New Roman" w:cs="Times New Roman" w:eastAsia="Times New Roman" w:hAnsi="Times New Roman"/>
+                <w:b w:val="false"/>
+                <w:bCs w:val="false"/>
+                <w:i w:val="false"/>
+                <w:iCs w:val="false"/>
+                <w:sz w:val="16"/>
+                <w:szCs w:val="16"/>
+              </w:rPr>
+              <w:t xml:space="preserve">87</w:t>
+            </w:r>
+          </w:p>
+        </w:tc>
+        <w:tc>
+          <w:tcPr>
+            <w:tcW w:type="dxa" w:w="1216"/>
+            <w:tcMar>
+              <w:top w:type="dxa" w:w="40"/>
+              <w:left w:type="dxa" w:w="60"/>
+              <w:bottom w:type="dxa" w:w="40"/>
+              <w:right w:type="dxa" w:w="60"/>
+            </w:tcMar>
+          </w:tcPr>
+          <w:p>
+            <w:pPr>
+              <w:jc w:val="right"/>
+            </w:pPr>
+            <w:r>
+              <w:rPr>
+                <w:rFonts w:ascii="Times New Roman" w:cs="Times New Roman" w:eastAsia="Times New Roman" w:hAnsi="Times New Roman"/>
+                <w:b w:val="false"/>
+                <w:bCs w:val="false"/>
+                <w:i w:val="false"/>
+                <w:iCs w:val="false"/>
+                <w:sz w:val="16"/>
+                <w:szCs w:val="16"/>
+              </w:rPr>
+              <w:t xml:space="preserve">1970</w:t>
+            </w:r>
+          </w:p>
+        </w:tc>
+        <w:tc>
+          <w:tcPr>
+            <w:tcW w:type="dxa" w:w="1216"/>
+            <w:tcMar>
+              <w:top w:type="dxa" w:w="40"/>
+              <w:left w:type="dxa" w:w="60"/>
+              <w:bottom w:type="dxa" w:w="40"/>
+              <w:right w:type="dxa" w:w="60"/>
+            </w:tcMar>
+          </w:tcPr>
+          <w:p>
+            <w:pPr>
+              <w:jc w:val="right"/>
+            </w:pPr>
+            <w:r>
+              <w:rPr>
+                <w:rFonts w:ascii="Times New Roman" w:cs="Times New Roman" w:eastAsia="Times New Roman" w:hAnsi="Times New Roman"/>
+                <w:b w:val="false"/>
+                <w:bCs w:val="false"/>
+                <w:i w:val="false"/>
+                <w:iCs w:val="false"/>
+                <w:sz w:val="16"/>
+                <w:szCs w:val="16"/>
+              </w:rPr>
+              <w:t xml:space="preserve">14.4</w:t>
+            </w:r>
+          </w:p>
+        </w:tc>
+        <w:tc>
+          <w:tcPr>
+            <w:tcW w:type="dxa" w:w="1216"/>
+            <w:tcMar>
+              <w:top w:type="dxa" w:w="40"/>
+              <w:left w:type="dxa" w:w="60"/>
+              <w:bottom w:type="dxa" w:w="40"/>
+              <w:right w:type="dxa" w:w="60"/>
+            </w:tcMar>
+          </w:tcPr>
+          <w:p>
+            <w:pPr>
+              <w:jc w:val="right"/>
+            </w:pPr>
+            <w:r>
+              <w:rPr>
+                <w:rFonts w:ascii="Times New Roman" w:cs="Times New Roman" w:eastAsia="Times New Roman" w:hAnsi="Times New Roman"/>
+                <w:b w:val="false"/>
+                <w:bCs w:val="false"/>
+                <w:i w:val="false"/>
+                <w:iCs w:val="false"/>
+                <w:sz w:val="16"/>
+                <w:szCs w:val="16"/>
+              </w:rPr>
+              <w:t xml:space="preserve">7.4</w:t>
+            </w:r>
+          </w:p>
+        </w:tc>
+        <w:tc>
+          <w:tcPr>
+            <w:tcW w:type="dxa" w:w="1216"/>
+            <w:tcMar>
+              <w:top w:type="dxa" w:w="40"/>
+              <w:left w:type="dxa" w:w="60"/>
+              <w:bottom w:type="dxa" w:w="40"/>
+              <w:right w:type="dxa" w:w="60"/>
+            </w:tcMar>
+          </w:tcPr>
+          <w:p>
+            <w:pPr>
+              <w:jc w:val="right"/>
+            </w:pPr>
+            <w:r>
+              <w:rPr>
+                <w:rFonts w:ascii="Times New Roman" w:cs="Times New Roman" w:eastAsia="Times New Roman" w:hAnsi="Times New Roman"/>
+                <w:b w:val="false"/>
+                <w:bCs w:val="false"/>
+                <w:i w:val="false"/>
+                <w:iCs w:val="false"/>
+                <w:sz w:val="16"/>
+                <w:szCs w:val="16"/>
+              </w:rPr>
+              <w:t xml:space="preserve">12.7</w:t>
+            </w:r>
+          </w:p>
+        </w:tc>
+        <w:tc>
+          <w:tcPr>
+            <w:tcW w:type="dxa" w:w="1221"/>
+            <w:tcMar>
+              <w:top w:type="dxa" w:w="40"/>
+              <w:left w:type="dxa" w:w="60"/>
+              <w:bottom w:type="dxa" w:w="40"/>
+              <w:right w:type="dxa" w:w="60"/>
+            </w:tcMar>
+          </w:tcPr>
+          <w:p>
+            <w:pPr>
+              <w:jc w:val="right"/>
+            </w:pPr>
+            <w:r>
+              <w:rPr>
+                <w:rFonts w:ascii="Times New Roman" w:cs="Times New Roman" w:eastAsia="Times New Roman" w:hAnsi="Times New Roman"/>
+                <w:b w:val="false"/>
+                <w:bCs w:val="false"/>
+                <w:i w:val="false"/>
+                <w:iCs w:val="false"/>
+                <w:sz w:val="16"/>
+                <w:szCs w:val="16"/>
+              </w:rPr>
+              <w:t xml:space="preserve">52.6</w:t>
+            </w:r>
+          </w:p>
+        </w:tc>
+      </w:tr>
+      <w:tr>
+        <w:trPr>
+          <w:tblHeader w:val="false"/>
+        </w:trPr>
+        <w:tc>
+          <w:tcPr>
+            <w:tcW w:type="dxa" w:w="2059"/>
+            <w:tcMar>
+              <w:top w:type="dxa" w:w="40"/>
+              <w:left w:type="dxa" w:w="60"/>
+              <w:bottom w:type="dxa" w:w="40"/>
+              <w:right w:type="dxa" w:w="60"/>
+            </w:tcMar>
+          </w:tcPr>
+          <w:p>
+            <w:pPr>
+              <w:jc w:val="left"/>
+            </w:pPr>
+          </w:p>
+        </w:tc>
+        <w:tc>
+          <w:tcPr>
+            <w:tcW w:type="dxa" w:w="1216"/>
+            <w:tcMar>
+              <w:top w:type="dxa" w:w="40"/>
+              <w:left w:type="dxa" w:w="60"/>
+              <w:bottom w:type="dxa" w:w="40"/>
+              <w:right w:type="dxa" w:w="60"/>
+            </w:tcMar>
+          </w:tcPr>
+          <w:p>
+            <w:pPr>
+              <w:jc w:val="right"/>
+            </w:pPr>
+          </w:p>
+        </w:tc>
+        <w:tc>
+          <w:tcPr>
+            <w:tcW w:type="dxa" w:w="1216"/>
+            <w:tcMar>
+              <w:top w:type="dxa" w:w="40"/>
+              <w:left w:type="dxa" w:w="60"/>
+              <w:bottom w:type="dxa" w:w="40"/>
+              <w:right w:type="dxa" w:w="60"/>
+            </w:tcMar>
+          </w:tcPr>
+          <w:p>
+            <w:pPr>
+              <w:jc w:val="right"/>
+            </w:pPr>
+            <w:r>
+              <w:rPr>
+                <w:rFonts w:ascii="Times New Roman" w:cs="Times New Roman" w:eastAsia="Times New Roman" w:hAnsi="Times New Roman"/>
+                <w:b w:val="false"/>
+                <w:bCs w:val="false"/>
+                <w:i w:val="false"/>
+                <w:iCs w:val="false"/>
+                <w:sz w:val="16"/>
+                <w:szCs w:val="16"/>
+              </w:rPr>
+              <w:t xml:space="preserve">1990</w:t>
+            </w:r>
+          </w:p>
+        </w:tc>
+        <w:tc>
+          <w:tcPr>
+            <w:tcW w:type="dxa" w:w="1216"/>
+            <w:tcMar>
+              <w:top w:type="dxa" w:w="40"/>
+              <w:left w:type="dxa" w:w="60"/>
+              <w:bottom w:type="dxa" w:w="40"/>
+              <w:right w:type="dxa" w:w="60"/>
+            </w:tcMar>
+          </w:tcPr>
+          <w:p>
+            <w:pPr>
+              <w:jc w:val="right"/>
+            </w:pPr>
+            <w:r>
+              <w:rPr>
+                <w:rFonts w:ascii="Times New Roman" w:cs="Times New Roman" w:eastAsia="Times New Roman" w:hAnsi="Times New Roman"/>
+                <w:b w:val="false"/>
+                <w:bCs w:val="false"/>
+                <w:i w:val="false"/>
+                <w:iCs w:val="false"/>
+                <w:sz w:val="16"/>
+                <w:szCs w:val="16"/>
+              </w:rPr>
+              <w:t xml:space="preserve">23.3</w:t>
+            </w:r>
+          </w:p>
+        </w:tc>
+        <w:tc>
+          <w:tcPr>
+            <w:tcW w:type="dxa" w:w="1216"/>
+            <w:tcMar>
+              <w:top w:type="dxa" w:w="40"/>
+              <w:left w:type="dxa" w:w="60"/>
+              <w:bottom w:type="dxa" w:w="40"/>
+              <w:right w:type="dxa" w:w="60"/>
+            </w:tcMar>
+          </w:tcPr>
+          <w:p>
+            <w:pPr>
+              <w:jc w:val="right"/>
+            </w:pPr>
+            <w:r>
+              <w:rPr>
+                <w:rFonts w:ascii="Times New Roman" w:cs="Times New Roman" w:eastAsia="Times New Roman" w:hAnsi="Times New Roman"/>
+                <w:b w:val="false"/>
+                <w:bCs w:val="false"/>
+                <w:i w:val="false"/>
+                <w:iCs w:val="false"/>
+                <w:sz w:val="16"/>
+                <w:szCs w:val="16"/>
+              </w:rPr>
+              <w:t xml:space="preserve">10.4</w:t>
+            </w:r>
+          </w:p>
+        </w:tc>
+        <w:tc>
+          <w:tcPr>
+            <w:tcW w:type="dxa" w:w="1216"/>
+            <w:tcMar>
+              <w:top w:type="dxa" w:w="40"/>
+              <w:left w:type="dxa" w:w="60"/>
+              <w:bottom w:type="dxa" w:w="40"/>
+              <w:right w:type="dxa" w:w="60"/>
+            </w:tcMar>
+          </w:tcPr>
+          <w:p>
+            <w:pPr>
+              <w:jc w:val="right"/>
+            </w:pPr>
+            <w:r>
+              <w:rPr>
+                <w:rFonts w:ascii="Times New Roman" w:cs="Times New Roman" w:eastAsia="Times New Roman" w:hAnsi="Times New Roman"/>
+                <w:b w:val="false"/>
+                <w:bCs w:val="false"/>
+                <w:i w:val="false"/>
+                <w:iCs w:val="false"/>
+                <w:sz w:val="16"/>
+                <w:szCs w:val="16"/>
+              </w:rPr>
+              <w:t xml:space="preserve">17.6</w:t>
+            </w:r>
+          </w:p>
+        </w:tc>
+        <w:tc>
+          <w:tcPr>
+            <w:tcW w:type="dxa" w:w="1221"/>
+            <w:tcMar>
+              <w:top w:type="dxa" w:w="40"/>
+              <w:left w:type="dxa" w:w="60"/>
+              <w:bottom w:type="dxa" w:w="40"/>
+              <w:right w:type="dxa" w:w="60"/>
+            </w:tcMar>
+          </w:tcPr>
+          <w:p>
+            <w:pPr>
+              <w:jc w:val="right"/>
+            </w:pPr>
+            <w:r>
+              <w:rPr>
+                <w:rFonts w:ascii="Times New Roman" w:cs="Times New Roman" w:eastAsia="Times New Roman" w:hAnsi="Times New Roman"/>
+                <w:b w:val="false"/>
+                <w:bCs w:val="false"/>
+                <w:i w:val="false"/>
+                <w:iCs w:val="false"/>
+                <w:sz w:val="16"/>
+                <w:szCs w:val="16"/>
+              </w:rPr>
+              <w:t xml:space="preserve">49.2</w:t>
+            </w:r>
+          </w:p>
+        </w:tc>
+      </w:tr>
+      <w:tr>
+        <w:trPr>
+          <w:tblHeader w:val="false"/>
+        </w:trPr>
+        <w:tc>
+          <w:tcPr>
+            <w:tcW w:type="dxa" w:w="2059"/>
+            <w:tcMar>
+              <w:top w:type="dxa" w:w="40"/>
+              <w:left w:type="dxa" w:w="60"/>
+              <w:bottom w:type="dxa" w:w="40"/>
+              <w:right w:type="dxa" w:w="60"/>
+            </w:tcMar>
+          </w:tcPr>
+          <w:p>
+            <w:pPr>
+              <w:jc w:val="left"/>
+            </w:pPr>
+          </w:p>
+        </w:tc>
+        <w:tc>
+          <w:tcPr>
+            <w:tcW w:type="dxa" w:w="1216"/>
+            <w:tcMar>
+              <w:top w:type="dxa" w:w="40"/>
+              <w:left w:type="dxa" w:w="60"/>
+              <w:bottom w:type="dxa" w:w="40"/>
+              <w:right w:type="dxa" w:w="60"/>
+            </w:tcMar>
+          </w:tcPr>
+          <w:p>
+            <w:pPr>
+              <w:jc w:val="right"/>
+            </w:pPr>
+          </w:p>
+        </w:tc>
+        <w:tc>
+          <w:tcPr>
+            <w:tcW w:type="dxa" w:w="1216"/>
+            <w:tcMar>
+              <w:top w:type="dxa" w:w="40"/>
+              <w:left w:type="dxa" w:w="60"/>
+              <w:bottom w:type="dxa" w:w="40"/>
+              <w:right w:type="dxa" w:w="60"/>
+            </w:tcMar>
+          </w:tcPr>
+          <w:p>
+            <w:pPr>
+              <w:jc w:val="right"/>
+            </w:pPr>
+            <w:r>
+              <w:rPr>
+                <w:rFonts w:ascii="Times New Roman" w:cs="Times New Roman" w:eastAsia="Times New Roman" w:hAnsi="Times New Roman"/>
+                <w:b w:val="false"/>
+                <w:bCs w:val="false"/>
+                <w:i w:val="false"/>
+                <w:iCs w:val="false"/>
+                <w:sz w:val="16"/>
+                <w:szCs w:val="16"/>
+              </w:rPr>
+              <w:t xml:space="preserve">2020</w:t>
+            </w:r>
+          </w:p>
+        </w:tc>
+        <w:tc>
+          <w:tcPr>
+            <w:tcW w:type="dxa" w:w="1216"/>
+            <w:tcMar>
+              <w:top w:type="dxa" w:w="40"/>
+              <w:left w:type="dxa" w:w="60"/>
+              <w:bottom w:type="dxa" w:w="40"/>
+              <w:right w:type="dxa" w:w="60"/>
+            </w:tcMar>
+          </w:tcPr>
+          <w:p>
+            <w:pPr>
+              <w:jc w:val="right"/>
+            </w:pPr>
+            <w:r>
+              <w:rPr>
+                <w:rFonts w:ascii="Times New Roman" w:cs="Times New Roman" w:eastAsia="Times New Roman" w:hAnsi="Times New Roman"/>
+                <w:b w:val="false"/>
+                <w:bCs w:val="false"/>
+                <w:i w:val="false"/>
+                <w:iCs w:val="false"/>
+                <w:sz w:val="16"/>
+                <w:szCs w:val="16"/>
+              </w:rPr>
+              <w:t xml:space="preserve">23.7</w:t>
+            </w:r>
+          </w:p>
+        </w:tc>
+        <w:tc>
+          <w:tcPr>
+            <w:tcW w:type="dxa" w:w="1216"/>
+            <w:tcMar>
+              <w:top w:type="dxa" w:w="40"/>
+              <w:left w:type="dxa" w:w="60"/>
+              <w:bottom w:type="dxa" w:w="40"/>
+              <w:right w:type="dxa" w:w="60"/>
+            </w:tcMar>
+          </w:tcPr>
+          <w:p>
+            <w:pPr>
+              <w:jc w:val="right"/>
+            </w:pPr>
+            <w:r>
+              <w:rPr>
+                <w:rFonts w:ascii="Times New Roman" w:cs="Times New Roman" w:eastAsia="Times New Roman" w:hAnsi="Times New Roman"/>
+                <w:b w:val="false"/>
+                <w:bCs w:val="false"/>
+                <w:i w:val="false"/>
+                <w:iCs w:val="false"/>
+                <w:sz w:val="16"/>
+                <w:szCs w:val="16"/>
+              </w:rPr>
+              <w:t xml:space="preserve">5.8</w:t>
+            </w:r>
+          </w:p>
+        </w:tc>
+        <w:tc>
+          <w:tcPr>
+            <w:tcW w:type="dxa" w:w="1216"/>
+            <w:tcMar>
+              <w:top w:type="dxa" w:w="40"/>
+              <w:left w:type="dxa" w:w="60"/>
+              <w:bottom w:type="dxa" w:w="40"/>
+              <w:right w:type="dxa" w:w="60"/>
+            </w:tcMar>
+          </w:tcPr>
+          <w:p>
+            <w:pPr>
+              <w:jc w:val="right"/>
+            </w:pPr>
+            <w:r>
+              <w:rPr>
+                <w:rFonts w:ascii="Times New Roman" w:cs="Times New Roman" w:eastAsia="Times New Roman" w:hAnsi="Times New Roman"/>
+                <w:b w:val="false"/>
+                <w:bCs w:val="false"/>
+                <w:i w:val="false"/>
+                <w:iCs w:val="false"/>
+                <w:sz w:val="16"/>
+                <w:szCs w:val="16"/>
+              </w:rPr>
+              <w:t xml:space="preserve">11.6</w:t>
+            </w:r>
+          </w:p>
+        </w:tc>
+        <w:tc>
+          <w:tcPr>
+            <w:tcW w:type="dxa" w:w="1221"/>
+            <w:tcMar>
+              <w:top w:type="dxa" w:w="40"/>
+              <w:left w:type="dxa" w:w="60"/>
+              <w:bottom w:type="dxa" w:w="40"/>
+              <w:right w:type="dxa" w:w="60"/>
+            </w:tcMar>
+          </w:tcPr>
+          <w:p>
+            <w:pPr>
+              <w:jc w:val="right"/>
+            </w:pPr>
+            <w:r>
+              <w:rPr>
+                <w:rFonts w:ascii="Times New Roman" w:cs="Times New Roman" w:eastAsia="Times New Roman" w:hAnsi="Times New Roman"/>
+                <w:b w:val="false"/>
+                <w:bCs w:val="false"/>
+                <w:i w:val="false"/>
+                <w:iCs w:val="false"/>
+                <w:sz w:val="16"/>
+                <w:szCs w:val="16"/>
+              </w:rPr>
+              <w:t xml:space="preserve">51.6</w:t>
+            </w:r>
+          </w:p>
+        </w:tc>
+      </w:tr>
+    </w:tbl>
+    <w:p>
+      <w:pPr>
+        <w:spacing w:after="120"/>
+      </w:pPr>
+    </w:p>
+    <w:p>
+      <w:pPr>
+        <w:spacing w:after="160" w:line="360"/>
+        <w:jc w:val="both"/>
+      </w:pPr>
+      <w:r>
+        <w:rPr>
+          <w:rFonts w:ascii="Times New Roman" w:cs="Times New Roman" w:eastAsia="Times New Roman" w:hAnsi="Times New Roman"/>
+          <w:b w:val="false"/>
+          <w:bCs w:val="false"/>
+          <w:i w:val="false"/>
+          <w:iCs w:val="false"/>
+          <w:sz w:val="24"/>
+          <w:szCs w:val="24"/>
+        </w:rPr>
+        <w:t xml:space="preserve">2010 tracts within 10 km of downtown, at least half within both historical map sheets and Denver County, with 200+ residents; industrial = 20% or more of the tract's land in industrial districts. One tract became industrial after 1929 and is not shown. Population-weighted means.</w:t>
       </w:r>
     </w:p>
     <w:p>
@@ -38885,7 +41817,30 @@
           <w:sz w:val="24"/>
           <w:szCs w:val="24"/>
         </w:rPr>
-        <w:t xml:space="preserve">Makarewicz, C. (2023) Denver-metro zoning layer, 3 October 2023, compiled for the National Zoning Atlas. Denver: University of Colorado Denver.</w:t>
+        <w:t xml:space="preserve">Makarewicz, C. (2023) Denver-metro zoning layer, 3 October 2023, compiled for the National Zoning Atlas. Denver: University of Colorado Denver. Available on request through https://storymaps.arcgis.com/stories/adb86c7ab2624e95a84566fecb8a6f6d.</w:t>
+      </w:r>
+    </w:p>
+    <w:p>
+      <w:pPr>
+        <w:pStyle w:val="ListParagraph"/>
+        <w:numPr>
+          <w:ilvl w:val="0"/>
+          <w:numId w:val="4"/>
+        </w:numPr>
+        <w:spacing w:after="120" w:line="340"/>
+        <w:jc w:val="both"/>
+      </w:pPr>
+      <w:r>
+        <w:rPr>
+          <w:rFonts w:ascii="Times New Roman" w:cs="Times New Roman" w:eastAsia="Times New Roman" w:hAnsi="Times New Roman"/>
+          <w:b w:val="false"/>
+          <w:bCs w:val="false"/>
+          <w:i w:val="false"/>
+          <w:iCs w:val="false"/>
+          <w:sz w:val="24"/>
+          <w:szCs w:val="24"/>
+        </w:rPr>
+        <w:t xml:space="preserve">City and County of Denver, Zoning (open-data layer CCD_Zoning; zone districts with the year of the last zoning ordinance), downloaded October 2026.</w:t>
       </w:r>
     </w:p>
     <w:p>

</xml_diff>

<commit_message>
Land use 1937-1997, freeways, block-level mortality
</commit_message>
<xml_diff>
--- a/paper/Before_and_After_the_Map_manuscript.docx
+++ b/paper/Before_and_After_the_Map_manuscript.docx
@@ -34462,6 +34462,975 @@
     </w:p>
     <w:p>
       <w:pPr>
+        <w:spacing w:after="160" w:line="360"/>
+        <w:jc w:val="both"/>
+      </w:pPr>
+      <w:r>
+        <w:rPr>
+          <w:rFonts w:ascii="Times New Roman" w:cs="Times New Roman" w:eastAsia="Times New Roman" w:hAnsi="Times New Roman"/>
+          <w:b/>
+          <w:bCs/>
+          <w:i w:val="false"/>
+          <w:iCs w:val="false"/>
+          <w:sz w:val="24"/>
+          <w:szCs w:val="24"/>
+        </w:rPr>
+        <w:t xml:space="preserve">Land use and freeways, 1937–1997.</w:t>
+      </w:r>
+      <w:r>
+        <w:rPr>
+          <w:rFonts w:ascii="Times New Roman" w:cs="Times New Roman" w:eastAsia="Times New Roman" w:hAnsi="Times New Roman"/>
+          <w:b w:val="false"/>
+          <w:bCs w:val="false"/>
+          <w:i w:val="false"/>
+          <w:iCs w:val="false"/>
+          <w:sz w:val="24"/>
+          <w:szCs w:val="24"/>
+        </w:rPr>
+        <w:t xml:space="preserve"> The directories place firms and the zoning maps record what was allowed; the U.S. Geological Survey's historical land-use maps of the northern Front Range record what the land was used for, interpreted by hand from aerial photographs of 1937, 1957, 1977 and 1997 at 1 m with a minimum mapping unit of about a hectare (Drummond et al. 2019). Grouped into eight categories and summarised on 10 m cells, they show that industrial land use was concentrated in D areas before the HOLC map: 5.3% of D land was in industrial use in 1937, against at most 0.5% of A, B or C land, and 9.0% by 1977. (Ibsen et al. 2025, using the same maps, report about a quarter of D land as industrial in 1937; recomputed from the 1 m rasters on the Mapping Inequality D polygons, the area-weighted share is 5.4%, so the difference lies in how the grades are summarised.) Zoning ran ahead of use. In 1937 two-thirds of the city's industrial land lay in the 1929 industrial districts, but only 19% of those districts was in industrial use; the share reached 38% by 1977, so most of the zoned land filled in after the HOLC map rather than before it. The maps also offer an independent check on the inventory, since they were drawn without reference to the directories: within 30 m, 47% of the 1965–92 sites on a current regulatory inventory stood on land the interpreters marked industrial in 1977, against 21% of the sites on no inventory, consistent with the parcel evidence (Section 6) that many of the latter were small shops on mixed blocks.</w:t>
+      </w:r>
+    </w:p>
+    <w:p>
+      <w:pPr>
+        <w:spacing w:after="160" w:line="360"/>
+        <w:jc w:val="both"/>
+      </w:pPr>
+      <w:r>
+        <w:rPr>
+          <w:rFonts w:ascii="Times New Roman" w:cs="Times New Roman" w:eastAsia="Times New Roman" w:hAnsi="Times New Roman"/>
+          <w:b w:val="false"/>
+          <w:bCs w:val="false"/>
+          <w:i w:val="false"/>
+          <w:iCs w:val="false"/>
+          <w:sz w:val="24"/>
+          <w:szCs w:val="24"/>
+        </w:rPr>
+        <w:t xml:space="preserve">Freeways added a second, later industrial geography. Dated alignments from OpenHistoricalMap, checked against the NBER/FHWA interstate opening dates (Baum-Snow 2007; I-25 opened to interstate standard in Denver County in 1958–1965, I-70 in 1965–1968), put 133 km of freeway in the study area by 1970. Freeways built in 1950–1979 ran 0.74 km per km² through D land, against 0.17 in C, 0.04 in B and none in A, and 17% of D land lies within 250 m of one. A quarter of their length crossed the 1929 industrial districts, which were 12% of the mapped land, and two-thirds crossed residence and business districts. The 34 study tracts they cut through were already more Hispanic in 1960 (13% against 7.5% elsewhere) and lost more population afterwards (92% of their 1950 population in 1990, against 99%).</w:t>
+      </w:r>
+    </w:p>
+    <w:p>
+      <w:pPr>
+        <w:spacing w:after="80" w:before="240"/>
+      </w:pPr>
+      <w:r>
+        <w:rPr>
+          <w:rFonts w:ascii="Times New Roman" w:cs="Times New Roman" w:eastAsia="Times New Roman" w:hAnsi="Times New Roman"/>
+          <w:b/>
+          <w:bCs/>
+          <w:sz w:val="20"/>
+          <w:szCs w:val="20"/>
+        </w:rPr>
+        <w:t xml:space="preserve">Table 15. Land use and freeways by 1938 HOLC grade, 1937–1979</w:t>
+      </w:r>
+    </w:p>
+    <w:tbl>
+      <w:tblPr>
+        <w:tblW w:type="dxa" w:w="9360"/>
+        <w:tblBorders>
+          <w:top w:val="single" w:sz="6"/>
+          <w:left w:val="none"/>
+          <w:bottom w:val="single" w:sz="6"/>
+          <w:right w:val="none"/>
+          <w:insideH w:val="single" w:color="BBBBBB" w:sz="2"/>
+          <w:insideV w:val="none"/>
+        </w:tblBorders>
+      </w:tblPr>
+      <w:tblGrid>
+        <w:gridCol w:w="2808"/>
+        <w:gridCol w:w="1638"/>
+        <w:gridCol w:w="1638"/>
+        <w:gridCol w:w="1638"/>
+        <w:gridCol w:w="1638"/>
+      </w:tblGrid>
+      <w:tr>
+        <w:trPr>
+          <w:tblHeader/>
+        </w:trPr>
+        <w:tc>
+          <w:tcPr>
+            <w:tcW w:type="dxa" w:w="2808"/>
+            <w:shd w:fill="EDEDED" w:color="auto" w:val="clear"/>
+            <w:tcMar>
+              <w:top w:type="dxa" w:w="40"/>
+              <w:left w:type="dxa" w:w="60"/>
+              <w:bottom w:type="dxa" w:w="40"/>
+              <w:right w:type="dxa" w:w="60"/>
+            </w:tcMar>
+          </w:tcPr>
+          <w:p>
+            <w:pPr>
+              <w:jc w:val="left"/>
+            </w:pPr>
+          </w:p>
+        </w:tc>
+        <w:tc>
+          <w:tcPr>
+            <w:tcW w:type="dxa" w:w="1638"/>
+            <w:shd w:fill="EDEDED" w:color="auto" w:val="clear"/>
+            <w:tcMar>
+              <w:top w:type="dxa" w:w="40"/>
+              <w:left w:type="dxa" w:w="60"/>
+              <w:bottom w:type="dxa" w:w="40"/>
+              <w:right w:type="dxa" w:w="60"/>
+            </w:tcMar>
+          </w:tcPr>
+          <w:p>
+            <w:pPr>
+              <w:jc w:val="right"/>
+            </w:pPr>
+            <w:r>
+              <w:rPr>
+                <w:rFonts w:ascii="Times New Roman" w:cs="Times New Roman" w:eastAsia="Times New Roman" w:hAnsi="Times New Roman"/>
+                <w:b/>
+                <w:bCs/>
+                <w:i w:val="false"/>
+                <w:iCs w:val="false"/>
+                <w:sz w:val="18"/>
+                <w:szCs w:val="18"/>
+              </w:rPr>
+              <w:t xml:space="preserve">A</w:t>
+            </w:r>
+          </w:p>
+        </w:tc>
+        <w:tc>
+          <w:tcPr>
+            <w:tcW w:type="dxa" w:w="1638"/>
+            <w:shd w:fill="EDEDED" w:color="auto" w:val="clear"/>
+            <w:tcMar>
+              <w:top w:type="dxa" w:w="40"/>
+              <w:left w:type="dxa" w:w="60"/>
+              <w:bottom w:type="dxa" w:w="40"/>
+              <w:right w:type="dxa" w:w="60"/>
+            </w:tcMar>
+          </w:tcPr>
+          <w:p>
+            <w:pPr>
+              <w:jc w:val="right"/>
+            </w:pPr>
+            <w:r>
+              <w:rPr>
+                <w:rFonts w:ascii="Times New Roman" w:cs="Times New Roman" w:eastAsia="Times New Roman" w:hAnsi="Times New Roman"/>
+                <w:b/>
+                <w:bCs/>
+                <w:i w:val="false"/>
+                <w:iCs w:val="false"/>
+                <w:sz w:val="18"/>
+                <w:szCs w:val="18"/>
+              </w:rPr>
+              <w:t xml:space="preserve">B</w:t>
+            </w:r>
+          </w:p>
+        </w:tc>
+        <w:tc>
+          <w:tcPr>
+            <w:tcW w:type="dxa" w:w="1638"/>
+            <w:shd w:fill="EDEDED" w:color="auto" w:val="clear"/>
+            <w:tcMar>
+              <w:top w:type="dxa" w:w="40"/>
+              <w:left w:type="dxa" w:w="60"/>
+              <w:bottom w:type="dxa" w:w="40"/>
+              <w:right w:type="dxa" w:w="60"/>
+            </w:tcMar>
+          </w:tcPr>
+          <w:p>
+            <w:pPr>
+              <w:jc w:val="right"/>
+            </w:pPr>
+            <w:r>
+              <w:rPr>
+                <w:rFonts w:ascii="Times New Roman" w:cs="Times New Roman" w:eastAsia="Times New Roman" w:hAnsi="Times New Roman"/>
+                <w:b/>
+                <w:bCs/>
+                <w:i w:val="false"/>
+                <w:iCs w:val="false"/>
+                <w:sz w:val="18"/>
+                <w:szCs w:val="18"/>
+              </w:rPr>
+              <w:t xml:space="preserve">C</w:t>
+            </w:r>
+          </w:p>
+        </w:tc>
+        <w:tc>
+          <w:tcPr>
+            <w:tcW w:type="dxa" w:w="1638"/>
+            <w:shd w:fill="EDEDED" w:color="auto" w:val="clear"/>
+            <w:tcMar>
+              <w:top w:type="dxa" w:w="40"/>
+              <w:left w:type="dxa" w:w="60"/>
+              <w:bottom w:type="dxa" w:w="40"/>
+              <w:right w:type="dxa" w:w="60"/>
+            </w:tcMar>
+          </w:tcPr>
+          <w:p>
+            <w:pPr>
+              <w:jc w:val="right"/>
+            </w:pPr>
+            <w:r>
+              <w:rPr>
+                <w:rFonts w:ascii="Times New Roman" w:cs="Times New Roman" w:eastAsia="Times New Roman" w:hAnsi="Times New Roman"/>
+                <w:b/>
+                <w:bCs/>
+                <w:i w:val="false"/>
+                <w:iCs w:val="false"/>
+                <w:sz w:val="18"/>
+                <w:szCs w:val="18"/>
+              </w:rPr>
+              <w:t xml:space="preserve">D</w:t>
+            </w:r>
+          </w:p>
+        </w:tc>
+      </w:tr>
+      <w:tr>
+        <w:trPr>
+          <w:tblHeader w:val="false"/>
+        </w:trPr>
+        <w:tc>
+          <w:tcPr>
+            <w:tcW w:type="dxa" w:w="2808"/>
+            <w:tcMar>
+              <w:top w:type="dxa" w:w="40"/>
+              <w:left w:type="dxa" w:w="60"/>
+              <w:bottom w:type="dxa" w:w="40"/>
+              <w:right w:type="dxa" w:w="60"/>
+            </w:tcMar>
+          </w:tcPr>
+          <w:p>
+            <w:pPr>
+              <w:jc w:val="left"/>
+            </w:pPr>
+            <w:r>
+              <w:rPr>
+                <w:rFonts w:ascii="Times New Roman" w:cs="Times New Roman" w:eastAsia="Times New Roman" w:hAnsi="Times New Roman"/>
+                <w:b w:val="false"/>
+                <w:bCs w:val="false"/>
+                <w:i w:val="false"/>
+                <w:iCs w:val="false"/>
+                <w:sz w:val="18"/>
+                <w:szCs w:val="18"/>
+              </w:rPr>
+              <w:t xml:space="preserve">industrial land use, 1937 (% of grade)</w:t>
+            </w:r>
+          </w:p>
+        </w:tc>
+        <w:tc>
+          <w:tcPr>
+            <w:tcW w:type="dxa" w:w="1638"/>
+            <w:tcMar>
+              <w:top w:type="dxa" w:w="40"/>
+              <w:left w:type="dxa" w:w="60"/>
+              <w:bottom w:type="dxa" w:w="40"/>
+              <w:right w:type="dxa" w:w="60"/>
+            </w:tcMar>
+          </w:tcPr>
+          <w:p>
+            <w:pPr>
+              <w:jc w:val="right"/>
+            </w:pPr>
+            <w:r>
+              <w:rPr>
+                <w:rFonts w:ascii="Times New Roman" w:cs="Times New Roman" w:eastAsia="Times New Roman" w:hAnsi="Times New Roman"/>
+                <w:b w:val="false"/>
+                <w:bCs w:val="false"/>
+                <w:i w:val="false"/>
+                <w:iCs w:val="false"/>
+                <w:sz w:val="18"/>
+                <w:szCs w:val="18"/>
+              </w:rPr>
+              <w:t xml:space="preserve">0.3</w:t>
+            </w:r>
+          </w:p>
+        </w:tc>
+        <w:tc>
+          <w:tcPr>
+            <w:tcW w:type="dxa" w:w="1638"/>
+            <w:tcMar>
+              <w:top w:type="dxa" w:w="40"/>
+              <w:left w:type="dxa" w:w="60"/>
+              <w:bottom w:type="dxa" w:w="40"/>
+              <w:right w:type="dxa" w:w="60"/>
+            </w:tcMar>
+          </w:tcPr>
+          <w:p>
+            <w:pPr>
+              <w:jc w:val="right"/>
+            </w:pPr>
+            <w:r>
+              <w:rPr>
+                <w:rFonts w:ascii="Times New Roman" w:cs="Times New Roman" w:eastAsia="Times New Roman" w:hAnsi="Times New Roman"/>
+                <w:b w:val="false"/>
+                <w:bCs w:val="false"/>
+                <w:i w:val="false"/>
+                <w:iCs w:val="false"/>
+                <w:sz w:val="18"/>
+                <w:szCs w:val="18"/>
+              </w:rPr>
+              <w:t xml:space="preserve">0.0</w:t>
+            </w:r>
+          </w:p>
+        </w:tc>
+        <w:tc>
+          <w:tcPr>
+            <w:tcW w:type="dxa" w:w="1638"/>
+            <w:tcMar>
+              <w:top w:type="dxa" w:w="40"/>
+              <w:left w:type="dxa" w:w="60"/>
+              <w:bottom w:type="dxa" w:w="40"/>
+              <w:right w:type="dxa" w:w="60"/>
+            </w:tcMar>
+          </w:tcPr>
+          <w:p>
+            <w:pPr>
+              <w:jc w:val="right"/>
+            </w:pPr>
+            <w:r>
+              <w:rPr>
+                <w:rFonts w:ascii="Times New Roman" w:cs="Times New Roman" w:eastAsia="Times New Roman" w:hAnsi="Times New Roman"/>
+                <w:b w:val="false"/>
+                <w:bCs w:val="false"/>
+                <w:i w:val="false"/>
+                <w:iCs w:val="false"/>
+                <w:sz w:val="18"/>
+                <w:szCs w:val="18"/>
+              </w:rPr>
+              <w:t xml:space="preserve">0.5</w:t>
+            </w:r>
+          </w:p>
+        </w:tc>
+        <w:tc>
+          <w:tcPr>
+            <w:tcW w:type="dxa" w:w="1638"/>
+            <w:tcMar>
+              <w:top w:type="dxa" w:w="40"/>
+              <w:left w:type="dxa" w:w="60"/>
+              <w:bottom w:type="dxa" w:w="40"/>
+              <w:right w:type="dxa" w:w="60"/>
+            </w:tcMar>
+          </w:tcPr>
+          <w:p>
+            <w:pPr>
+              <w:jc w:val="right"/>
+            </w:pPr>
+            <w:r>
+              <w:rPr>
+                <w:rFonts w:ascii="Times New Roman" w:cs="Times New Roman" w:eastAsia="Times New Roman" w:hAnsi="Times New Roman"/>
+                <w:b w:val="false"/>
+                <w:bCs w:val="false"/>
+                <w:i w:val="false"/>
+                <w:iCs w:val="false"/>
+                <w:sz w:val="18"/>
+                <w:szCs w:val="18"/>
+              </w:rPr>
+              <w:t xml:space="preserve">5.3</w:t>
+            </w:r>
+          </w:p>
+        </w:tc>
+      </w:tr>
+      <w:tr>
+        <w:trPr>
+          <w:tblHeader w:val="false"/>
+        </w:trPr>
+        <w:tc>
+          <w:tcPr>
+            <w:tcW w:type="dxa" w:w="2808"/>
+            <w:tcMar>
+              <w:top w:type="dxa" w:w="40"/>
+              <w:left w:type="dxa" w:w="60"/>
+              <w:bottom w:type="dxa" w:w="40"/>
+              <w:right w:type="dxa" w:w="60"/>
+            </w:tcMar>
+          </w:tcPr>
+          <w:p>
+            <w:pPr>
+              <w:jc w:val="left"/>
+            </w:pPr>
+            <w:r>
+              <w:rPr>
+                <w:rFonts w:ascii="Times New Roman" w:cs="Times New Roman" w:eastAsia="Times New Roman" w:hAnsi="Times New Roman"/>
+                <w:b w:val="false"/>
+                <w:bCs w:val="false"/>
+                <w:i w:val="false"/>
+                <w:iCs w:val="false"/>
+                <w:sz w:val="18"/>
+                <w:szCs w:val="18"/>
+              </w:rPr>
+              <w:t xml:space="preserve">industrial land use, 1977 (% of grade)</w:t>
+            </w:r>
+          </w:p>
+        </w:tc>
+        <w:tc>
+          <w:tcPr>
+            <w:tcW w:type="dxa" w:w="1638"/>
+            <w:tcMar>
+              <w:top w:type="dxa" w:w="40"/>
+              <w:left w:type="dxa" w:w="60"/>
+              <w:bottom w:type="dxa" w:w="40"/>
+              <w:right w:type="dxa" w:w="60"/>
+            </w:tcMar>
+          </w:tcPr>
+          <w:p>
+            <w:pPr>
+              <w:jc w:val="right"/>
+            </w:pPr>
+            <w:r>
+              <w:rPr>
+                <w:rFonts w:ascii="Times New Roman" w:cs="Times New Roman" w:eastAsia="Times New Roman" w:hAnsi="Times New Roman"/>
+                <w:b w:val="false"/>
+                <w:bCs w:val="false"/>
+                <w:i w:val="false"/>
+                <w:iCs w:val="false"/>
+                <w:sz w:val="18"/>
+                <w:szCs w:val="18"/>
+              </w:rPr>
+              <w:t xml:space="preserve">0.0</w:t>
+            </w:r>
+          </w:p>
+        </w:tc>
+        <w:tc>
+          <w:tcPr>
+            <w:tcW w:type="dxa" w:w="1638"/>
+            <w:tcMar>
+              <w:top w:type="dxa" w:w="40"/>
+              <w:left w:type="dxa" w:w="60"/>
+              <w:bottom w:type="dxa" w:w="40"/>
+              <w:right w:type="dxa" w:w="60"/>
+            </w:tcMar>
+          </w:tcPr>
+          <w:p>
+            <w:pPr>
+              <w:jc w:val="right"/>
+            </w:pPr>
+            <w:r>
+              <w:rPr>
+                <w:rFonts w:ascii="Times New Roman" w:cs="Times New Roman" w:eastAsia="Times New Roman" w:hAnsi="Times New Roman"/>
+                <w:b w:val="false"/>
+                <w:bCs w:val="false"/>
+                <w:i w:val="false"/>
+                <w:iCs w:val="false"/>
+                <w:sz w:val="18"/>
+                <w:szCs w:val="18"/>
+              </w:rPr>
+              <w:t xml:space="preserve">0.0</w:t>
+            </w:r>
+          </w:p>
+        </w:tc>
+        <w:tc>
+          <w:tcPr>
+            <w:tcW w:type="dxa" w:w="1638"/>
+            <w:tcMar>
+              <w:top w:type="dxa" w:w="40"/>
+              <w:left w:type="dxa" w:w="60"/>
+              <w:bottom w:type="dxa" w:w="40"/>
+              <w:right w:type="dxa" w:w="60"/>
+            </w:tcMar>
+          </w:tcPr>
+          <w:p>
+            <w:pPr>
+              <w:jc w:val="right"/>
+            </w:pPr>
+            <w:r>
+              <w:rPr>
+                <w:rFonts w:ascii="Times New Roman" w:cs="Times New Roman" w:eastAsia="Times New Roman" w:hAnsi="Times New Roman"/>
+                <w:b w:val="false"/>
+                <w:bCs w:val="false"/>
+                <w:i w:val="false"/>
+                <w:iCs w:val="false"/>
+                <w:sz w:val="18"/>
+                <w:szCs w:val="18"/>
+              </w:rPr>
+              <w:t xml:space="preserve">0.1</w:t>
+            </w:r>
+          </w:p>
+        </w:tc>
+        <w:tc>
+          <w:tcPr>
+            <w:tcW w:type="dxa" w:w="1638"/>
+            <w:tcMar>
+              <w:top w:type="dxa" w:w="40"/>
+              <w:left w:type="dxa" w:w="60"/>
+              <w:bottom w:type="dxa" w:w="40"/>
+              <w:right w:type="dxa" w:w="60"/>
+            </w:tcMar>
+          </w:tcPr>
+          <w:p>
+            <w:pPr>
+              <w:jc w:val="right"/>
+            </w:pPr>
+            <w:r>
+              <w:rPr>
+                <w:rFonts w:ascii="Times New Roman" w:cs="Times New Roman" w:eastAsia="Times New Roman" w:hAnsi="Times New Roman"/>
+                <w:b w:val="false"/>
+                <w:bCs w:val="false"/>
+                <w:i w:val="false"/>
+                <w:iCs w:val="false"/>
+                <w:sz w:val="18"/>
+                <w:szCs w:val="18"/>
+              </w:rPr>
+              <w:t xml:space="preserve">9.0</w:t>
+            </w:r>
+          </w:p>
+        </w:tc>
+      </w:tr>
+      <w:tr>
+        <w:trPr>
+          <w:tblHeader w:val="false"/>
+        </w:trPr>
+        <w:tc>
+          <w:tcPr>
+            <w:tcW w:type="dxa" w:w="2808"/>
+            <w:tcMar>
+              <w:top w:type="dxa" w:w="40"/>
+              <w:left w:type="dxa" w:w="60"/>
+              <w:bottom w:type="dxa" w:w="40"/>
+              <w:right w:type="dxa" w:w="60"/>
+            </w:tcMar>
+          </w:tcPr>
+          <w:p>
+            <w:pPr>
+              <w:jc w:val="left"/>
+            </w:pPr>
+            <w:r>
+              <w:rPr>
+                <w:rFonts w:ascii="Times New Roman" w:cs="Times New Roman" w:eastAsia="Times New Roman" w:hAnsi="Times New Roman"/>
+                <w:b w:val="false"/>
+                <w:bCs w:val="false"/>
+                <w:i w:val="false"/>
+                <w:iCs w:val="false"/>
+                <w:sz w:val="18"/>
+                <w:szCs w:val="18"/>
+              </w:rPr>
+              <w:t xml:space="preserve">single-family residential, 1937 (% of grade)</w:t>
+            </w:r>
+          </w:p>
+        </w:tc>
+        <w:tc>
+          <w:tcPr>
+            <w:tcW w:type="dxa" w:w="1638"/>
+            <w:tcMar>
+              <w:top w:type="dxa" w:w="40"/>
+              <w:left w:type="dxa" w:w="60"/>
+              <w:bottom w:type="dxa" w:w="40"/>
+              <w:right w:type="dxa" w:w="60"/>
+            </w:tcMar>
+          </w:tcPr>
+          <w:p>
+            <w:pPr>
+              <w:jc w:val="right"/>
+            </w:pPr>
+            <w:r>
+              <w:rPr>
+                <w:rFonts w:ascii="Times New Roman" w:cs="Times New Roman" w:eastAsia="Times New Roman" w:hAnsi="Times New Roman"/>
+                <w:b w:val="false"/>
+                <w:bCs w:val="false"/>
+                <w:i w:val="false"/>
+                <w:iCs w:val="false"/>
+                <w:sz w:val="18"/>
+                <w:szCs w:val="18"/>
+              </w:rPr>
+              <w:t xml:space="preserve">60.3</w:t>
+            </w:r>
+          </w:p>
+        </w:tc>
+        <w:tc>
+          <w:tcPr>
+            <w:tcW w:type="dxa" w:w="1638"/>
+            <w:tcMar>
+              <w:top w:type="dxa" w:w="40"/>
+              <w:left w:type="dxa" w:w="60"/>
+              <w:bottom w:type="dxa" w:w="40"/>
+              <w:right w:type="dxa" w:w="60"/>
+            </w:tcMar>
+          </w:tcPr>
+          <w:p>
+            <w:pPr>
+              <w:jc w:val="right"/>
+            </w:pPr>
+            <w:r>
+              <w:rPr>
+                <w:rFonts w:ascii="Times New Roman" w:cs="Times New Roman" w:eastAsia="Times New Roman" w:hAnsi="Times New Roman"/>
+                <w:b w:val="false"/>
+                <w:bCs w:val="false"/>
+                <w:i w:val="false"/>
+                <w:iCs w:val="false"/>
+                <w:sz w:val="18"/>
+                <w:szCs w:val="18"/>
+              </w:rPr>
+              <w:t xml:space="preserve">77.8</w:t>
+            </w:r>
+          </w:p>
+        </w:tc>
+        <w:tc>
+          <w:tcPr>
+            <w:tcW w:type="dxa" w:w="1638"/>
+            <w:tcMar>
+              <w:top w:type="dxa" w:w="40"/>
+              <w:left w:type="dxa" w:w="60"/>
+              <w:bottom w:type="dxa" w:w="40"/>
+              <w:right w:type="dxa" w:w="60"/>
+            </w:tcMar>
+          </w:tcPr>
+          <w:p>
+            <w:pPr>
+              <w:jc w:val="right"/>
+            </w:pPr>
+            <w:r>
+              <w:rPr>
+                <w:rFonts w:ascii="Times New Roman" w:cs="Times New Roman" w:eastAsia="Times New Roman" w:hAnsi="Times New Roman"/>
+                <w:b w:val="false"/>
+                <w:bCs w:val="false"/>
+                <w:i w:val="false"/>
+                <w:iCs w:val="false"/>
+                <w:sz w:val="18"/>
+                <w:szCs w:val="18"/>
+              </w:rPr>
+              <w:t xml:space="preserve">69.9</w:t>
+            </w:r>
+          </w:p>
+        </w:tc>
+        <w:tc>
+          <w:tcPr>
+            <w:tcW w:type="dxa" w:w="1638"/>
+            <w:tcMar>
+              <w:top w:type="dxa" w:w="40"/>
+              <w:left w:type="dxa" w:w="60"/>
+              <w:bottom w:type="dxa" w:w="40"/>
+              <w:right w:type="dxa" w:w="60"/>
+            </w:tcMar>
+          </w:tcPr>
+          <w:p>
+            <w:pPr>
+              <w:jc w:val="right"/>
+            </w:pPr>
+            <w:r>
+              <w:rPr>
+                <w:rFonts w:ascii="Times New Roman" w:cs="Times New Roman" w:eastAsia="Times New Roman" w:hAnsi="Times New Roman"/>
+                <w:b w:val="false"/>
+                <w:bCs w:val="false"/>
+                <w:i w:val="false"/>
+                <w:iCs w:val="false"/>
+                <w:sz w:val="18"/>
+                <w:szCs w:val="18"/>
+              </w:rPr>
+              <w:t xml:space="preserve">46.6</w:t>
+            </w:r>
+          </w:p>
+        </w:tc>
+      </w:tr>
+      <w:tr>
+        <w:trPr>
+          <w:tblHeader w:val="false"/>
+        </w:trPr>
+        <w:tc>
+          <w:tcPr>
+            <w:tcW w:type="dxa" w:w="2808"/>
+            <w:tcMar>
+              <w:top w:type="dxa" w:w="40"/>
+              <w:left w:type="dxa" w:w="60"/>
+              <w:bottom w:type="dxa" w:w="40"/>
+              <w:right w:type="dxa" w:w="60"/>
+            </w:tcMar>
+          </w:tcPr>
+          <w:p>
+            <w:pPr>
+              <w:jc w:val="left"/>
+            </w:pPr>
+            <w:r>
+              <w:rPr>
+                <w:rFonts w:ascii="Times New Roman" w:cs="Times New Roman" w:eastAsia="Times New Roman" w:hAnsi="Times New Roman"/>
+                <w:b w:val="false"/>
+                <w:bCs w:val="false"/>
+                <w:i w:val="false"/>
+                <w:iCs w:val="false"/>
+                <w:sz w:val="18"/>
+                <w:szCs w:val="18"/>
+              </w:rPr>
+              <w:t xml:space="preserve">freeway built 1950–1979 (km per km²)</w:t>
+            </w:r>
+          </w:p>
+        </w:tc>
+        <w:tc>
+          <w:tcPr>
+            <w:tcW w:type="dxa" w:w="1638"/>
+            <w:tcMar>
+              <w:top w:type="dxa" w:w="40"/>
+              <w:left w:type="dxa" w:w="60"/>
+              <w:bottom w:type="dxa" w:w="40"/>
+              <w:right w:type="dxa" w:w="60"/>
+            </w:tcMar>
+          </w:tcPr>
+          <w:p>
+            <w:pPr>
+              <w:jc w:val="right"/>
+            </w:pPr>
+            <w:r>
+              <w:rPr>
+                <w:rFonts w:ascii="Times New Roman" w:cs="Times New Roman" w:eastAsia="Times New Roman" w:hAnsi="Times New Roman"/>
+                <w:b w:val="false"/>
+                <w:bCs w:val="false"/>
+                <w:i w:val="false"/>
+                <w:iCs w:val="false"/>
+                <w:sz w:val="18"/>
+                <w:szCs w:val="18"/>
+              </w:rPr>
+              <w:t xml:space="preserve">0.00</w:t>
+            </w:r>
+          </w:p>
+        </w:tc>
+        <w:tc>
+          <w:tcPr>
+            <w:tcW w:type="dxa" w:w="1638"/>
+            <w:tcMar>
+              <w:top w:type="dxa" w:w="40"/>
+              <w:left w:type="dxa" w:w="60"/>
+              <w:bottom w:type="dxa" w:w="40"/>
+              <w:right w:type="dxa" w:w="60"/>
+            </w:tcMar>
+          </w:tcPr>
+          <w:p>
+            <w:pPr>
+              <w:jc w:val="right"/>
+            </w:pPr>
+            <w:r>
+              <w:rPr>
+                <w:rFonts w:ascii="Times New Roman" w:cs="Times New Roman" w:eastAsia="Times New Roman" w:hAnsi="Times New Roman"/>
+                <w:b w:val="false"/>
+                <w:bCs w:val="false"/>
+                <w:i w:val="false"/>
+                <w:iCs w:val="false"/>
+                <w:sz w:val="18"/>
+                <w:szCs w:val="18"/>
+              </w:rPr>
+              <w:t xml:space="preserve">0.04</w:t>
+            </w:r>
+          </w:p>
+        </w:tc>
+        <w:tc>
+          <w:tcPr>
+            <w:tcW w:type="dxa" w:w="1638"/>
+            <w:tcMar>
+              <w:top w:type="dxa" w:w="40"/>
+              <w:left w:type="dxa" w:w="60"/>
+              <w:bottom w:type="dxa" w:w="40"/>
+              <w:right w:type="dxa" w:w="60"/>
+            </w:tcMar>
+          </w:tcPr>
+          <w:p>
+            <w:pPr>
+              <w:jc w:val="right"/>
+            </w:pPr>
+            <w:r>
+              <w:rPr>
+                <w:rFonts w:ascii="Times New Roman" w:cs="Times New Roman" w:eastAsia="Times New Roman" w:hAnsi="Times New Roman"/>
+                <w:b w:val="false"/>
+                <w:bCs w:val="false"/>
+                <w:i w:val="false"/>
+                <w:iCs w:val="false"/>
+                <w:sz w:val="18"/>
+                <w:szCs w:val="18"/>
+              </w:rPr>
+              <w:t xml:space="preserve">0.17</w:t>
+            </w:r>
+          </w:p>
+        </w:tc>
+        <w:tc>
+          <w:tcPr>
+            <w:tcW w:type="dxa" w:w="1638"/>
+            <w:tcMar>
+              <w:top w:type="dxa" w:w="40"/>
+              <w:left w:type="dxa" w:w="60"/>
+              <w:bottom w:type="dxa" w:w="40"/>
+              <w:right w:type="dxa" w:w="60"/>
+            </w:tcMar>
+          </w:tcPr>
+          <w:p>
+            <w:pPr>
+              <w:jc w:val="right"/>
+            </w:pPr>
+            <w:r>
+              <w:rPr>
+                <w:rFonts w:ascii="Times New Roman" w:cs="Times New Roman" w:eastAsia="Times New Roman" w:hAnsi="Times New Roman"/>
+                <w:b w:val="false"/>
+                <w:bCs w:val="false"/>
+                <w:i w:val="false"/>
+                <w:iCs w:val="false"/>
+                <w:sz w:val="18"/>
+                <w:szCs w:val="18"/>
+              </w:rPr>
+              <w:t xml:space="preserve">0.74</w:t>
+            </w:r>
+          </w:p>
+        </w:tc>
+      </w:tr>
+      <w:tr>
+        <w:trPr>
+          <w:tblHeader w:val="false"/>
+        </w:trPr>
+        <w:tc>
+          <w:tcPr>
+            <w:tcW w:type="dxa" w:w="2808"/>
+            <w:tcMar>
+              <w:top w:type="dxa" w:w="40"/>
+              <w:left w:type="dxa" w:w="60"/>
+              <w:bottom w:type="dxa" w:w="40"/>
+              <w:right w:type="dxa" w:w="60"/>
+            </w:tcMar>
+          </w:tcPr>
+          <w:p>
+            <w:pPr>
+              <w:jc w:val="left"/>
+            </w:pPr>
+            <w:r>
+              <w:rPr>
+                <w:rFonts w:ascii="Times New Roman" w:cs="Times New Roman" w:eastAsia="Times New Roman" w:hAnsi="Times New Roman"/>
+                <w:b w:val="false"/>
+                <w:bCs w:val="false"/>
+                <w:i w:val="false"/>
+                <w:iCs w:val="false"/>
+                <w:sz w:val="18"/>
+                <w:szCs w:val="18"/>
+              </w:rPr>
+              <w:t xml:space="preserve">land within 250 m of such a freeway (%)</w:t>
+            </w:r>
+          </w:p>
+        </w:tc>
+        <w:tc>
+          <w:tcPr>
+            <w:tcW w:type="dxa" w:w="1638"/>
+            <w:tcMar>
+              <w:top w:type="dxa" w:w="40"/>
+              <w:left w:type="dxa" w:w="60"/>
+              <w:bottom w:type="dxa" w:w="40"/>
+              <w:right w:type="dxa" w:w="60"/>
+            </w:tcMar>
+          </w:tcPr>
+          <w:p>
+            <w:pPr>
+              <w:jc w:val="right"/>
+            </w:pPr>
+            <w:r>
+              <w:rPr>
+                <w:rFonts w:ascii="Times New Roman" w:cs="Times New Roman" w:eastAsia="Times New Roman" w:hAnsi="Times New Roman"/>
+                <w:b w:val="false"/>
+                <w:bCs w:val="false"/>
+                <w:i w:val="false"/>
+                <w:iCs w:val="false"/>
+                <w:sz w:val="18"/>
+                <w:szCs w:val="18"/>
+              </w:rPr>
+              <w:t xml:space="preserve">0.0</w:t>
+            </w:r>
+          </w:p>
+        </w:tc>
+        <w:tc>
+          <w:tcPr>
+            <w:tcW w:type="dxa" w:w="1638"/>
+            <w:tcMar>
+              <w:top w:type="dxa" w:w="40"/>
+              <w:left w:type="dxa" w:w="60"/>
+              <w:bottom w:type="dxa" w:w="40"/>
+              <w:right w:type="dxa" w:w="60"/>
+            </w:tcMar>
+          </w:tcPr>
+          <w:p>
+            <w:pPr>
+              <w:jc w:val="right"/>
+            </w:pPr>
+            <w:r>
+              <w:rPr>
+                <w:rFonts w:ascii="Times New Roman" w:cs="Times New Roman" w:eastAsia="Times New Roman" w:hAnsi="Times New Roman"/>
+                <w:b w:val="false"/>
+                <w:bCs w:val="false"/>
+                <w:i w:val="false"/>
+                <w:iCs w:val="false"/>
+                <w:sz w:val="18"/>
+                <w:szCs w:val="18"/>
+              </w:rPr>
+              <w:t xml:space="preserve">1.8</w:t>
+            </w:r>
+          </w:p>
+        </w:tc>
+        <w:tc>
+          <w:tcPr>
+            <w:tcW w:type="dxa" w:w="1638"/>
+            <w:tcMar>
+              <w:top w:type="dxa" w:w="40"/>
+              <w:left w:type="dxa" w:w="60"/>
+              <w:bottom w:type="dxa" w:w="40"/>
+              <w:right w:type="dxa" w:w="60"/>
+            </w:tcMar>
+          </w:tcPr>
+          <w:p>
+            <w:pPr>
+              <w:jc w:val="right"/>
+            </w:pPr>
+            <w:r>
+              <w:rPr>
+                <w:rFonts w:ascii="Times New Roman" w:cs="Times New Roman" w:eastAsia="Times New Roman" w:hAnsi="Times New Roman"/>
+                <w:b w:val="false"/>
+                <w:bCs w:val="false"/>
+                <w:i w:val="false"/>
+                <w:iCs w:val="false"/>
+                <w:sz w:val="18"/>
+                <w:szCs w:val="18"/>
+              </w:rPr>
+              <w:t xml:space="preserve">4.7</w:t>
+            </w:r>
+          </w:p>
+        </w:tc>
+        <w:tc>
+          <w:tcPr>
+            <w:tcW w:type="dxa" w:w="1638"/>
+            <w:tcMar>
+              <w:top w:type="dxa" w:w="40"/>
+              <w:left w:type="dxa" w:w="60"/>
+              <w:bottom w:type="dxa" w:w="40"/>
+              <w:right w:type="dxa" w:w="60"/>
+            </w:tcMar>
+          </w:tcPr>
+          <w:p>
+            <w:pPr>
+              <w:jc w:val="right"/>
+            </w:pPr>
+            <w:r>
+              <w:rPr>
+                <w:rFonts w:ascii="Times New Roman" w:cs="Times New Roman" w:eastAsia="Times New Roman" w:hAnsi="Times New Roman"/>
+                <w:b w:val="false"/>
+                <w:bCs w:val="false"/>
+                <w:i w:val="false"/>
+                <w:iCs w:val="false"/>
+                <w:sz w:val="18"/>
+                <w:szCs w:val="18"/>
+              </w:rPr>
+              <w:t xml:space="preserve">17.2</w:t>
+            </w:r>
+          </w:p>
+        </w:tc>
+      </w:tr>
+    </w:tbl>
+    <w:p>
+      <w:pPr>
+        <w:spacing w:after="120"/>
+      </w:pPr>
+    </w:p>
+    <w:p>
+      <w:pPr>
+        <w:spacing w:after="160" w:line="360"/>
+        <w:jc w:val="both"/>
+      </w:pPr>
+      <w:r>
+        <w:rPr>
+          <w:rFonts w:ascii="Times New Roman" w:cs="Times New Roman" w:eastAsia="Times New Roman" w:hAnsi="Times New Roman"/>
+          <w:b w:val="false"/>
+          <w:bCs w:val="false"/>
+          <w:i w:val="false"/>
+          <w:iCs w:val="false"/>
+          <w:sz w:val="24"/>
+          <w:szCs w:val="24"/>
+        </w:rPr>
+        <w:t xml:space="preserve">Land use from the USGS historical land-use maps (Drummond et al. 2019), 10 m cells, mapped land only; freeways from OpenHistoricalMap. HOLC areas as in Section 4.</w:t>
+      </w:r>
+    </w:p>
+    <w:p>
+      <w:pPr>
         <w:pStyle w:val="Heading1"/>
         <w:spacing w:after="160" w:before="360"/>
       </w:pPr>
@@ -34537,7 +35506,7 @@
           <w:sz w:val="20"/>
           <w:szCs w:val="20"/>
         </w:rPr>
-        <w:t xml:space="preserve">Table 15. Current parcel use of former hazardous sites, City and County of Denver</w:t>
+        <w:t xml:space="preserve">Table 16. Current parcel use of former hazardous sites, City and County of Denver</w:t>
       </w:r>
     </w:p>
     <w:tbl>
@@ -35486,7 +36455,7 @@
           <w:sz w:val="20"/>
           <w:szCs w:val="20"/>
         </w:rPr>
-        <w:t xml:space="preserve">Table 16. Current use of the 1965–1992 sites by decade of last listing</w:t>
+        <w:t xml:space="preserve">Table 17. Current use of the 1965–1992 sites by decade of last listing</w:t>
       </w:r>
     </w:p>
     <w:tbl>
@@ -36618,7 +37587,7 @@
           <w:sz w:val="20"/>
           <w:szCs w:val="20"/>
         </w:rPr>
-        <w:t xml:space="preserve">Table 17. Zoning in 2023 of the 1929 industrial districts and of the former hazardous sites</w:t>
+        <w:t xml:space="preserve">Table 18. Zoning in 2023 of the 1929 industrial districts and of the former hazardous sites</w:t>
       </w:r>
     </w:p>
     <w:tbl>
@@ -37942,7 +38911,7 @@
           <w:sz w:val="20"/>
           <w:szCs w:val="20"/>
         </w:rPr>
-        <w:t xml:space="preserve">Table 18. Land and sites zoned industrial, 1929–today</w:t>
+        <w:t xml:space="preserve">Table 19. Land and sites zoned industrial, 1929–today</w:t>
       </w:r>
     </w:p>
     <w:tbl>
@@ -38893,7 +39862,7 @@
           <w:sz w:val="20"/>
           <w:szCs w:val="20"/>
         </w:rPr>
-        <w:t xml:space="preserve">Table 19. Tracts zoned industrial in 1929 and today: composition 1970–2020</w:t>
+        <w:t xml:space="preserve">Table 20. Tracts zoned industrial in 1929 and today: composition 1970–2020</w:t>
       </w:r>
     </w:p>
     <w:tbl>
@@ -41845,6 +42814,170 @@
     </w:p>
     <w:p>
       <w:pPr>
+        <w:pStyle w:val="ListParagraph"/>
+        <w:numPr>
+          <w:ilvl w:val="0"/>
+          <w:numId w:val="4"/>
+        </w:numPr>
+        <w:spacing w:after="120" w:line="340"/>
+        <w:jc w:val="both"/>
+      </w:pPr>
+      <w:r>
+        <w:rPr>
+          <w:rFonts w:ascii="Times New Roman" w:cs="Times New Roman" w:eastAsia="Times New Roman" w:hAnsi="Times New Roman"/>
+          <w:b w:val="false"/>
+          <w:bCs w:val="false"/>
+          <w:i w:val="false"/>
+          <w:iCs w:val="false"/>
+          <w:sz w:val="24"/>
+          <w:szCs w:val="24"/>
+        </w:rPr>
+        <w:t xml:space="preserve">Baum-Snow, N. (2007) Did highways cause suburbanization? </w:t>
+      </w:r>
+      <w:r>
+        <w:rPr>
+          <w:rFonts w:ascii="Times New Roman" w:cs="Times New Roman" w:eastAsia="Times New Roman" w:hAnsi="Times New Roman"/>
+          <w:b w:val="false"/>
+          <w:bCs w:val="false"/>
+          <w:i/>
+          <w:iCs/>
+          <w:sz w:val="24"/>
+          <w:szCs w:val="24"/>
+        </w:rPr>
+        <w:t xml:space="preserve">Quarterly Journal of Economics</w:t>
+      </w:r>
+      <w:r>
+        <w:rPr>
+          <w:rFonts w:ascii="Times New Roman" w:cs="Times New Roman" w:eastAsia="Times New Roman" w:hAnsi="Times New Roman"/>
+          <w:b w:val="false"/>
+          <w:bCs w:val="false"/>
+          <w:i w:val="false"/>
+          <w:iCs w:val="false"/>
+          <w:sz w:val="24"/>
+          <w:szCs w:val="24"/>
+        </w:rPr>
+        <w:t xml:space="preserve"> 122(2): 775–805. Interstate opening data via NBER, Transportation Economics in the 21st Century highway data.</w:t>
+      </w:r>
+    </w:p>
+    <w:p>
+      <w:pPr>
+        <w:pStyle w:val="ListParagraph"/>
+        <w:numPr>
+          <w:ilvl w:val="0"/>
+          <w:numId w:val="4"/>
+        </w:numPr>
+        <w:spacing w:after="120" w:line="340"/>
+        <w:jc w:val="both"/>
+      </w:pPr>
+      <w:r>
+        <w:rPr>
+          <w:rFonts w:ascii="Times New Roman" w:cs="Times New Roman" w:eastAsia="Times New Roman" w:hAnsi="Times New Roman"/>
+          <w:b w:val="false"/>
+          <w:bCs w:val="false"/>
+          <w:i w:val="false"/>
+          <w:iCs w:val="false"/>
+          <w:sz w:val="24"/>
+          <w:szCs w:val="24"/>
+        </w:rPr>
+        <w:t xml:space="preserve">Drummond, M. A., Stier, M. P. and Diffendorfer, J. E. (2019) Historical land use and land cover for assessing the northern Colorado Front Range urban landscape. </w:t>
+      </w:r>
+      <w:r>
+        <w:rPr>
+          <w:rFonts w:ascii="Times New Roman" w:cs="Times New Roman" w:eastAsia="Times New Roman" w:hAnsi="Times New Roman"/>
+          <w:b w:val="false"/>
+          <w:bCs w:val="false"/>
+          <w:i/>
+          <w:iCs/>
+          <w:sz w:val="24"/>
+          <w:szCs w:val="24"/>
+        </w:rPr>
+        <w:t xml:space="preserve">Journal of Maps</w:t>
+      </w:r>
+      <w:r>
+        <w:rPr>
+          <w:rFonts w:ascii="Times New Roman" w:cs="Times New Roman" w:eastAsia="Times New Roman" w:hAnsi="Times New Roman"/>
+          <w:b w:val="false"/>
+          <w:bCs w:val="false"/>
+          <w:i w:val="false"/>
+          <w:iCs w:val="false"/>
+          <w:sz w:val="24"/>
+          <w:szCs w:val="24"/>
+        </w:rPr>
+        <w:t xml:space="preserve"> 15(2): 89–93; data release https://doi.org/10.5066/P995RGC9.</w:t>
+      </w:r>
+    </w:p>
+    <w:p>
+      <w:pPr>
+        <w:pStyle w:val="ListParagraph"/>
+        <w:numPr>
+          <w:ilvl w:val="0"/>
+          <w:numId w:val="4"/>
+        </w:numPr>
+        <w:spacing w:after="120" w:line="340"/>
+        <w:jc w:val="both"/>
+      </w:pPr>
+      <w:r>
+        <w:rPr>
+          <w:rFonts w:ascii="Times New Roman" w:cs="Times New Roman" w:eastAsia="Times New Roman" w:hAnsi="Times New Roman"/>
+          <w:b w:val="false"/>
+          <w:bCs w:val="false"/>
+          <w:i w:val="false"/>
+          <w:iCs w:val="false"/>
+          <w:sz w:val="24"/>
+          <w:szCs w:val="24"/>
+        </w:rPr>
+        <w:t xml:space="preserve">Ibsen, P. C., Bierbrauer, A., Corro, L. M., Ancona, Z. H., Drummond, M., Bagstad, K. J. and Diffendorfer, J. E. (2025) Land-use and socioeconomic time-series reveal legacy of redlining on present-day gentrification within a growing United States city. </w:t>
+      </w:r>
+      <w:r>
+        <w:rPr>
+          <w:rFonts w:ascii="Times New Roman" w:cs="Times New Roman" w:eastAsia="Times New Roman" w:hAnsi="Times New Roman"/>
+          <w:b w:val="false"/>
+          <w:bCs w:val="false"/>
+          <w:i/>
+          <w:iCs/>
+          <w:sz w:val="24"/>
+          <w:szCs w:val="24"/>
+        </w:rPr>
+        <w:t xml:space="preserve">PLoS ONE</w:t>
+      </w:r>
+      <w:r>
+        <w:rPr>
+          <w:rFonts w:ascii="Times New Roman" w:cs="Times New Roman" w:eastAsia="Times New Roman" w:hAnsi="Times New Roman"/>
+          <w:b w:val="false"/>
+          <w:bCs w:val="false"/>
+          <w:i w:val="false"/>
+          <w:iCs w:val="false"/>
+          <w:sz w:val="24"/>
+          <w:szCs w:val="24"/>
+        </w:rPr>
+        <w:t xml:space="preserve"> 20(3): e0317988.</w:t>
+      </w:r>
+    </w:p>
+    <w:p>
+      <w:pPr>
+        <w:pStyle w:val="ListParagraph"/>
+        <w:numPr>
+          <w:ilvl w:val="0"/>
+          <w:numId w:val="4"/>
+        </w:numPr>
+        <w:spacing w:after="120" w:line="340"/>
+        <w:jc w:val="both"/>
+      </w:pPr>
+      <w:r>
+        <w:rPr>
+          <w:rFonts w:ascii="Times New Roman" w:cs="Times New Roman" w:eastAsia="Times New Roman" w:hAnsi="Times New Roman"/>
+          <w:b w:val="false"/>
+          <w:bCs w:val="false"/>
+          <w:i w:val="false"/>
+          <w:iCs w:val="false"/>
+          <w:sz w:val="24"/>
+          <w:szCs w:val="24"/>
+        </w:rPr>
+        <w:t xml:space="preserve">OpenHistoricalMap contributors, dated road alignments (openhistoricalmap.org), downloaded October 2026.</w:t>
+      </w:r>
+    </w:p>
+    <w:p>
+      <w:pPr>
         <w:spacing w:after="160" w:line="360"/>
         <w:jc w:val="both"/>
       </w:pPr>

</xml_diff>

<commit_message>
Freeway before-and-after comparison; paper Section 7 mortality
</commit_message>
<xml_diff>
--- a/paper/Before_and_After_the_Map_manuscript.docx
+++ b/paper/Before_and_After_the_Map_manuscript.docx
@@ -176,7 +176,7 @@
           <w:sz w:val="24"/>
           <w:szCs w:val="24"/>
         </w:rPr>
-        <w:t xml:space="preserve">The argument runs in three steps, each with its own section of evidence. Section 3 uses the complete-count censuses of 1880–1940, aggregated to reconstructed enumeration districts, to describe who lived beside the hazardous trades in each decade before the instruments of the 1920s and 1930s existed. Section 4 brings in the 1925 zoning ordinance and the 1938 HOLC map and asks, in the design of Aaronson, Hartley and Mazumder (2021), whether the map created the pattern or recorded it, using the map's own boundaries as the comparison and controlling for rail and for what the city had already zoned. Section 4 ends with descriptive sequences on fixed geographies — which came first in each place, industry or its neighbours, and whether anything changed when the zoning or the map arrived. Section 5 carries the analysis onto census tracts from 1950 to 2020, where the group beside industry changes. Section 6 asks what became of the sites themselves, matching every one to the parcel that stands there today. Section 7 draws the steps together and sets out what the evidence can and cannot support.</w:t>
+        <w:t xml:space="preserve">The argument runs in three steps, each with its own section of evidence. Section 3 uses the complete-count censuses of 1880–1940, aggregated to reconstructed enumeration districts, to describe who lived beside the hazardous trades in each decade before the instruments of the 1920s and 1930s existed. Section 4 brings in the 1925 zoning ordinance and the 1938 HOLC map and asks, in the design of Aaronson, Hartley and Mazumder (2021), whether the map created the pattern or recorded it, using the map's own boundaries as the comparison and controlling for rail and for what the city had already zoned. Section 4 ends with descriptive sequences on fixed geographies — which came first in each place, industry or its neighbours, and whether anything changed when the zoning or the map arrived. Section 5 carries the analysis onto census tracts from 1950 to 2020, where the group beside industry changes. Section 6 asks what became of the sites themselves, matching every one to the parcel that stands there today, and Section 7 asks whether they are associated with mortality now. Section 8 draws the steps together and sets out what the evidence can and cannot support.</w:t>
       </w:r>
     </w:p>
     <w:p>
@@ -34505,7 +34505,7 @@
           <w:sz w:val="24"/>
           <w:szCs w:val="24"/>
         </w:rPr>
-        <w:t xml:space="preserve">Freeways added a second, later industrial geography. Dated alignments from OpenHistoricalMap, checked against the NBER/FHWA interstate opening dates (Baum-Snow 2007; I-25 opened to interstate standard in Denver County in 1958–1965, I-70 in 1965–1968), put 133 km of freeway in the study area by 1970. Freeways built in 1950–1979 ran 0.74 km per km² through D land, against 0.17 in C, 0.04 in B and none in A, and 17% of D land lies within 250 m of one. A quarter of their length crossed the 1929 industrial districts, which were 12% of the mapped land, and two-thirds crossed residence and business districts. The 34 study tracts they cut through were already more Hispanic in 1960 (13% against 7.5% elsewhere) and lost more population afterwards (92% of their 1950 population in 1990, against 99%).</w:t>
+        <w:t xml:space="preserve">Freeways added a second, later industrial geography. Dated alignments from OpenHistoricalMap, checked against the NBER/FHWA interstate opening dates (Baum-Snow 2007; I-25 opened to interstate standard in Denver County in 1958–1965, I-70 in 1965–1968), put 133 km of freeway in the study area by 1970. Freeways built in 1950–1979 ran 0.74 km per km² through D land, against 0.17 in C, 0.04 in B and none in A, and 17% of D land lies within 250 m of one. A quarter of their length crossed the 1929 industrial districts, which were 12% of the mapped land, and two-thirds crossed residence and business districts. The 34 study tracts they cut through were already more Hispanic in 1960 (13% against 7.5% elsewhere) and lost more population afterwards (92% of their 1950 population in 1990, against 99%). To see what followed the openings rather than what preceded them, each of the 48 study tracts with a freeway opened within 250 m in 1950–1979 was lined up on its own opening year, and its population-weighted gap from tracts with no freeway within 1 km was traced from the last census before the opening; most of these openings fell in 1951–1968. Against inner tracts at a similar distance from downtown (within 5.8 km, 34 tracts), the freeway tracts' Hispanic share rose from about 1 point above theirs at the last census before opening to 17 points above two decades later and 25 points above four decades later; their white share went from 8 points above to 6 below; the owner-occupancy gap narrowed from 16 to 9 points; and poverty, first measured in 1970, went from 5 points below to 4 above. Population fell in both groups, and less in the freeway tracts (to 85% of the pre-opening count after four decades, against 70%). Against all tracts with no nearby freeway the direction is the same (Hispanic gap from 2 to 22 points, white from 5 to −8, poverty from 1 to 7). This is a comparison of trends, not a causal estimate: the routes were chosen through places already changing, and the owner-occupancy gap was already shrinking in the decades before opening. What it does show is that the neighbourhoods beside the new freeways became steadily more Hispanic and poorer than comparable inner neighbourhoods, while keeping more of their residents.</w:t>
       </w:r>
     </w:p>
     <w:p>
@@ -41797,7 +41797,940 @@
           <w:sz w:val="26"/>
           <w:szCs w:val="26"/>
         </w:rPr>
-        <w:t xml:space="preserve">7. Discussion and conclusion</w:t>
+        <w:t xml:space="preserve">7. Historical hazardous sites and mortality today</w:t>
+      </w:r>
+    </w:p>
+    <w:p>
+      <w:pPr>
+        <w:spacing w:after="160" w:line="360"/>
+        <w:jc w:val="both"/>
+      </w:pPr>
+      <w:r>
+        <w:rPr>
+          <w:rFonts w:ascii="Times New Roman" w:cs="Times New Roman" w:eastAsia="Times New Roman" w:hAnsi="Times New Roman"/>
+          <w:b w:val="false"/>
+          <w:bCs w:val="false"/>
+          <w:i w:val="false"/>
+          <w:iCs w:val="false"/>
+          <w:sz w:val="24"/>
+          <w:szCs w:val="24"/>
+        </w:rPr>
+        <w:t xml:space="preserve">The last question is whether the historical sites matter for health now. Natural-cause and all-cause deaths in 2015–2019 from Colorado death records were assigned to the 2010 census block of residence (95% of deaths matched a 2010 block) and modelled for every Colorado block with at least 100 person-years (59,293 blocks in 1,241 tracts; 132,051 natural-cause deaths) and separately for the Denver study area (10,395 blocks in 184 tracts; 24,399 natural-cause deaths). Negative binomial models with county fixed effects, an offset for person-years and standard errors clustered by tract control for the block's age structure (the share aged 65 and over and its square, and the share under 5, from the 2010 census), population density and mean PM2.5 in 2015–2019; for the tract's poverty, Hispanic, Black and owner-occupied shares in 2020; and for the EnviroScreen low-income, education, linguistic-isolation and hazardous-waste and Superfund proximity indicators. Exposure is a Gaussian kernel density (500 m bandwidth, 2 km cutoff) around each block, standardised, for five sets of points: the 1965–92 hazardous-sector sites that appear in a current regulatory inventory ("known"), those that appear in none ("hidden"), the street-level pre-1960 hazardous trades, current TRI and cleanup sites, and, as a placebo, manufacturers outside the hazardous sectors. The death records are restricted and remain with the author; only model estimates are reported.</w:t>
+      </w:r>
+    </w:p>
+    <w:p>
+      <w:pPr>
+        <w:spacing w:after="80" w:before="240"/>
+      </w:pPr>
+      <w:r>
+        <w:rPr>
+          <w:rFonts w:ascii="Times New Roman" w:cs="Times New Roman" w:eastAsia="Times New Roman" w:hAnsi="Times New Roman"/>
+          <w:b/>
+          <w:bCs/>
+          <w:sz w:val="20"/>
+          <w:szCs w:val="20"/>
+        </w:rPr>
+        <w:t xml:space="preserve">Table 21. Historical hazardous sites and mortality, 2015–2019: rate ratios per SD of exposure</w:t>
+      </w:r>
+    </w:p>
+    <w:tbl>
+      <w:tblPr>
+        <w:tblW w:type="dxa" w:w="9360"/>
+        <w:tblBorders>
+          <w:top w:val="single" w:sz="6"/>
+          <w:left w:val="none"/>
+          <w:bottom w:val="single" w:sz="6"/>
+          <w:right w:val="none"/>
+          <w:insideH w:val="single" w:color="BBBBBB" w:sz="2"/>
+          <w:insideV w:val="none"/>
+        </w:tblBorders>
+      </w:tblPr>
+      <w:tblGrid>
+        <w:gridCol w:w="2808"/>
+        <w:gridCol w:w="2184"/>
+        <w:gridCol w:w="2184"/>
+        <w:gridCol w:w="2184"/>
+      </w:tblGrid>
+      <w:tr>
+        <w:trPr>
+          <w:tblHeader/>
+        </w:trPr>
+        <w:tc>
+          <w:tcPr>
+            <w:tcW w:type="dxa" w:w="2808"/>
+            <w:shd w:fill="EDEDED" w:color="auto" w:val="clear"/>
+            <w:tcMar>
+              <w:top w:type="dxa" w:w="40"/>
+              <w:left w:type="dxa" w:w="60"/>
+              <w:bottom w:type="dxa" w:w="40"/>
+              <w:right w:type="dxa" w:w="60"/>
+            </w:tcMar>
+          </w:tcPr>
+          <w:p>
+            <w:pPr>
+              <w:jc w:val="left"/>
+            </w:pPr>
+            <w:r>
+              <w:rPr>
+                <w:rFonts w:ascii="Times New Roman" w:cs="Times New Roman" w:eastAsia="Times New Roman" w:hAnsi="Times New Roman"/>
+                <w:b/>
+                <w:bCs/>
+                <w:i w:val="false"/>
+                <w:iCs w:val="false"/>
+                <w:sz w:val="18"/>
+                <w:szCs w:val="18"/>
+              </w:rPr>
+              <w:t xml:space="preserve">site exposure (per SD of kernel density)</w:t>
+            </w:r>
+          </w:p>
+        </w:tc>
+        <w:tc>
+          <w:tcPr>
+            <w:tcW w:type="dxa" w:w="2184"/>
+            <w:shd w:fill="EDEDED" w:color="auto" w:val="clear"/>
+            <w:tcMar>
+              <w:top w:type="dxa" w:w="40"/>
+              <w:left w:type="dxa" w:w="60"/>
+              <w:bottom w:type="dxa" w:w="40"/>
+              <w:right w:type="dxa" w:w="60"/>
+            </w:tcMar>
+          </w:tcPr>
+          <w:p>
+            <w:pPr>
+              <w:jc w:val="right"/>
+            </w:pPr>
+            <w:r>
+              <w:rPr>
+                <w:rFonts w:ascii="Times New Roman" w:cs="Times New Roman" w:eastAsia="Times New Roman" w:hAnsi="Times New Roman"/>
+                <w:b/>
+                <w:bCs/>
+                <w:i w:val="false"/>
+                <w:iCs w:val="false"/>
+                <w:sz w:val="18"/>
+                <w:szCs w:val="18"/>
+              </w:rPr>
+              <w:t xml:space="preserve">Colorado, natural causes</w:t>
+            </w:r>
+          </w:p>
+        </w:tc>
+        <w:tc>
+          <w:tcPr>
+            <w:tcW w:type="dxa" w:w="2184"/>
+            <w:shd w:fill="EDEDED" w:color="auto" w:val="clear"/>
+            <w:tcMar>
+              <w:top w:type="dxa" w:w="40"/>
+              <w:left w:type="dxa" w:w="60"/>
+              <w:bottom w:type="dxa" w:w="40"/>
+              <w:right w:type="dxa" w:w="60"/>
+            </w:tcMar>
+          </w:tcPr>
+          <w:p>
+            <w:pPr>
+              <w:jc w:val="right"/>
+            </w:pPr>
+            <w:r>
+              <w:rPr>
+                <w:rFonts w:ascii="Times New Roman" w:cs="Times New Roman" w:eastAsia="Times New Roman" w:hAnsi="Times New Roman"/>
+                <w:b/>
+                <w:bCs/>
+                <w:i w:val="false"/>
+                <w:iCs w:val="false"/>
+                <w:sz w:val="18"/>
+                <w:szCs w:val="18"/>
+              </w:rPr>
+              <w:t xml:space="preserve">Colorado, all causes</w:t>
+            </w:r>
+          </w:p>
+        </w:tc>
+        <w:tc>
+          <w:tcPr>
+            <w:tcW w:type="dxa" w:w="2184"/>
+            <w:shd w:fill="EDEDED" w:color="auto" w:val="clear"/>
+            <w:tcMar>
+              <w:top w:type="dxa" w:w="40"/>
+              <w:left w:type="dxa" w:w="60"/>
+              <w:bottom w:type="dxa" w:w="40"/>
+              <w:right w:type="dxa" w:w="60"/>
+            </w:tcMar>
+          </w:tcPr>
+          <w:p>
+            <w:pPr>
+              <w:jc w:val="right"/>
+            </w:pPr>
+            <w:r>
+              <w:rPr>
+                <w:rFonts w:ascii="Times New Roman" w:cs="Times New Roman" w:eastAsia="Times New Roman" w:hAnsi="Times New Roman"/>
+                <w:b/>
+                <w:bCs/>
+                <w:i w:val="false"/>
+                <w:iCs w:val="false"/>
+                <w:sz w:val="18"/>
+                <w:szCs w:val="18"/>
+              </w:rPr>
+              <w:t xml:space="preserve">Denver study area, natural causes</w:t>
+            </w:r>
+          </w:p>
+        </w:tc>
+      </w:tr>
+      <w:tr>
+        <w:trPr>
+          <w:tblHeader w:val="false"/>
+        </w:trPr>
+        <w:tc>
+          <w:tcPr>
+            <w:tcW w:type="dxa" w:w="2808"/>
+            <w:tcMar>
+              <w:top w:type="dxa" w:w="40"/>
+              <w:left w:type="dxa" w:w="60"/>
+              <w:bottom w:type="dxa" w:w="40"/>
+              <w:right w:type="dxa" w:w="60"/>
+            </w:tcMar>
+          </w:tcPr>
+          <w:p>
+            <w:pPr>
+              <w:jc w:val="left"/>
+            </w:pPr>
+            <w:r>
+              <w:rPr>
+                <w:rFonts w:ascii="Times New Roman" w:cs="Times New Roman" w:eastAsia="Times New Roman" w:hAnsi="Times New Roman"/>
+                <w:b w:val="false"/>
+                <w:bCs w:val="false"/>
+                <w:i w:val="false"/>
+                <w:iCs w:val="false"/>
+                <w:sz w:val="18"/>
+                <w:szCs w:val="18"/>
+              </w:rPr>
+              <w:t xml:space="preserve">known historical sites</w:t>
+            </w:r>
+          </w:p>
+        </w:tc>
+        <w:tc>
+          <w:tcPr>
+            <w:tcW w:type="dxa" w:w="2184"/>
+            <w:tcMar>
+              <w:top w:type="dxa" w:w="40"/>
+              <w:left w:type="dxa" w:w="60"/>
+              <w:bottom w:type="dxa" w:w="40"/>
+              <w:right w:type="dxa" w:w="60"/>
+            </w:tcMar>
+          </w:tcPr>
+          <w:p>
+            <w:pPr>
+              <w:jc w:val="right"/>
+            </w:pPr>
+            <w:r>
+              <w:rPr>
+                <w:rFonts w:ascii="Times New Roman" w:cs="Times New Roman" w:eastAsia="Times New Roman" w:hAnsi="Times New Roman"/>
+                <w:b w:val="false"/>
+                <w:bCs w:val="false"/>
+                <w:i w:val="false"/>
+                <w:iCs w:val="false"/>
+                <w:sz w:val="18"/>
+                <w:szCs w:val="18"/>
+              </w:rPr>
+              <w:t xml:space="preserve">1.054 (1.015–1.094)</w:t>
+            </w:r>
+          </w:p>
+        </w:tc>
+        <w:tc>
+          <w:tcPr>
+            <w:tcW w:type="dxa" w:w="2184"/>
+            <w:tcMar>
+              <w:top w:type="dxa" w:w="40"/>
+              <w:left w:type="dxa" w:w="60"/>
+              <w:bottom w:type="dxa" w:w="40"/>
+              <w:right w:type="dxa" w:w="60"/>
+            </w:tcMar>
+          </w:tcPr>
+          <w:p>
+            <w:pPr>
+              <w:jc w:val="right"/>
+            </w:pPr>
+            <w:r>
+              <w:rPr>
+                <w:rFonts w:ascii="Times New Roman" w:cs="Times New Roman" w:eastAsia="Times New Roman" w:hAnsi="Times New Roman"/>
+                <w:b w:val="false"/>
+                <w:bCs w:val="false"/>
+                <w:i w:val="false"/>
+                <w:iCs w:val="false"/>
+                <w:sz w:val="18"/>
+                <w:szCs w:val="18"/>
+              </w:rPr>
+              <w:t xml:space="preserve">1.057 (1.020–1.096)</w:t>
+            </w:r>
+          </w:p>
+        </w:tc>
+        <w:tc>
+          <w:tcPr>
+            <w:tcW w:type="dxa" w:w="2184"/>
+            <w:tcMar>
+              <w:top w:type="dxa" w:w="40"/>
+              <w:left w:type="dxa" w:w="60"/>
+              <w:bottom w:type="dxa" w:w="40"/>
+              <w:right w:type="dxa" w:w="60"/>
+            </w:tcMar>
+          </w:tcPr>
+          <w:p>
+            <w:pPr>
+              <w:jc w:val="right"/>
+            </w:pPr>
+            <w:r>
+              <w:rPr>
+                <w:rFonts w:ascii="Times New Roman" w:cs="Times New Roman" w:eastAsia="Times New Roman" w:hAnsi="Times New Roman"/>
+                <w:b w:val="false"/>
+                <w:bCs w:val="false"/>
+                <w:i w:val="false"/>
+                <w:iCs w:val="false"/>
+                <w:sz w:val="18"/>
+                <w:szCs w:val="18"/>
+              </w:rPr>
+              <w:t xml:space="preserve">1.089 (0.997–1.190)</w:t>
+            </w:r>
+          </w:p>
+        </w:tc>
+      </w:tr>
+      <w:tr>
+        <w:trPr>
+          <w:tblHeader w:val="false"/>
+        </w:trPr>
+        <w:tc>
+          <w:tcPr>
+            <w:tcW w:type="dxa" w:w="2808"/>
+            <w:tcMar>
+              <w:top w:type="dxa" w:w="40"/>
+              <w:left w:type="dxa" w:w="60"/>
+              <w:bottom w:type="dxa" w:w="40"/>
+              <w:right w:type="dxa" w:w="60"/>
+            </w:tcMar>
+          </w:tcPr>
+          <w:p>
+            <w:pPr>
+              <w:jc w:val="left"/>
+            </w:pPr>
+            <w:r>
+              <w:rPr>
+                <w:rFonts w:ascii="Times New Roman" w:cs="Times New Roman" w:eastAsia="Times New Roman" w:hAnsi="Times New Roman"/>
+                <w:b w:val="false"/>
+                <w:bCs w:val="false"/>
+                <w:i w:val="false"/>
+                <w:iCs w:val="false"/>
+                <w:sz w:val="18"/>
+                <w:szCs w:val="18"/>
+              </w:rPr>
+              <w:t xml:space="preserve">known historical sites, placebo also in the model</w:t>
+            </w:r>
+          </w:p>
+        </w:tc>
+        <w:tc>
+          <w:tcPr>
+            <w:tcW w:type="dxa" w:w="2184"/>
+            <w:tcMar>
+              <w:top w:type="dxa" w:w="40"/>
+              <w:left w:type="dxa" w:w="60"/>
+              <w:bottom w:type="dxa" w:w="40"/>
+              <w:right w:type="dxa" w:w="60"/>
+            </w:tcMar>
+          </w:tcPr>
+          <w:p>
+            <w:pPr>
+              <w:jc w:val="right"/>
+            </w:pPr>
+            <w:r>
+              <w:rPr>
+                <w:rFonts w:ascii="Times New Roman" w:cs="Times New Roman" w:eastAsia="Times New Roman" w:hAnsi="Times New Roman"/>
+                <w:b w:val="false"/>
+                <w:bCs w:val="false"/>
+                <w:i w:val="false"/>
+                <w:iCs w:val="false"/>
+                <w:sz w:val="18"/>
+                <w:szCs w:val="18"/>
+              </w:rPr>
+              <w:t xml:space="preserve">1.050 (1.009–1.091)</w:t>
+            </w:r>
+          </w:p>
+        </w:tc>
+        <w:tc>
+          <w:tcPr>
+            <w:tcW w:type="dxa" w:w="2184"/>
+            <w:tcMar>
+              <w:top w:type="dxa" w:w="40"/>
+              <w:left w:type="dxa" w:w="60"/>
+              <w:bottom w:type="dxa" w:w="40"/>
+              <w:right w:type="dxa" w:w="60"/>
+            </w:tcMar>
+          </w:tcPr>
+          <w:p>
+            <w:pPr>
+              <w:jc w:val="right"/>
+            </w:pPr>
+            <w:r>
+              <w:rPr>
+                <w:rFonts w:ascii="Times New Roman" w:cs="Times New Roman" w:eastAsia="Times New Roman" w:hAnsi="Times New Roman"/>
+                <w:b w:val="false"/>
+                <w:bCs w:val="false"/>
+                <w:i w:val="false"/>
+                <w:iCs w:val="false"/>
+                <w:sz w:val="18"/>
+                <w:szCs w:val="18"/>
+              </w:rPr>
+              <w:t xml:space="preserve">1.052 (1.013–1.093)</w:t>
+            </w:r>
+          </w:p>
+        </w:tc>
+        <w:tc>
+          <w:tcPr>
+            <w:tcW w:type="dxa" w:w="2184"/>
+            <w:tcMar>
+              <w:top w:type="dxa" w:w="40"/>
+              <w:left w:type="dxa" w:w="60"/>
+              <w:bottom w:type="dxa" w:w="40"/>
+              <w:right w:type="dxa" w:w="60"/>
+            </w:tcMar>
+          </w:tcPr>
+          <w:p>
+            <w:pPr>
+              <w:jc w:val="right"/>
+            </w:pPr>
+            <w:r>
+              <w:rPr>
+                <w:rFonts w:ascii="Times New Roman" w:cs="Times New Roman" w:eastAsia="Times New Roman" w:hAnsi="Times New Roman"/>
+                <w:b w:val="false"/>
+                <w:bCs w:val="false"/>
+                <w:i w:val="false"/>
+                <w:iCs w:val="false"/>
+                <w:sz w:val="18"/>
+                <w:szCs w:val="18"/>
+              </w:rPr>
+              <w:t xml:space="preserve">1.084 (0.986–1.191)</w:t>
+            </w:r>
+          </w:p>
+        </w:tc>
+      </w:tr>
+      <w:tr>
+        <w:trPr>
+          <w:tblHeader w:val="false"/>
+        </w:trPr>
+        <w:tc>
+          <w:tcPr>
+            <w:tcW w:type="dxa" w:w="2808"/>
+            <w:tcMar>
+              <w:top w:type="dxa" w:w="40"/>
+              <w:left w:type="dxa" w:w="60"/>
+              <w:bottom w:type="dxa" w:w="40"/>
+              <w:right w:type="dxa" w:w="60"/>
+            </w:tcMar>
+          </w:tcPr>
+          <w:p>
+            <w:pPr>
+              <w:jc w:val="left"/>
+            </w:pPr>
+            <w:r>
+              <w:rPr>
+                <w:rFonts w:ascii="Times New Roman" w:cs="Times New Roman" w:eastAsia="Times New Roman" w:hAnsi="Times New Roman"/>
+                <w:b w:val="false"/>
+                <w:bCs w:val="false"/>
+                <w:i w:val="false"/>
+                <w:iCs w:val="false"/>
+                <w:sz w:val="18"/>
+                <w:szCs w:val="18"/>
+              </w:rPr>
+              <w:t xml:space="preserve">hidden sites</w:t>
+            </w:r>
+          </w:p>
+        </w:tc>
+        <w:tc>
+          <w:tcPr>
+            <w:tcW w:type="dxa" w:w="2184"/>
+            <w:tcMar>
+              <w:top w:type="dxa" w:w="40"/>
+              <w:left w:type="dxa" w:w="60"/>
+              <w:bottom w:type="dxa" w:w="40"/>
+              <w:right w:type="dxa" w:w="60"/>
+            </w:tcMar>
+          </w:tcPr>
+          <w:p>
+            <w:pPr>
+              <w:jc w:val="right"/>
+            </w:pPr>
+            <w:r>
+              <w:rPr>
+                <w:rFonts w:ascii="Times New Roman" w:cs="Times New Roman" w:eastAsia="Times New Roman" w:hAnsi="Times New Roman"/>
+                <w:b w:val="false"/>
+                <w:bCs w:val="false"/>
+                <w:i w:val="false"/>
+                <w:iCs w:val="false"/>
+                <w:sz w:val="18"/>
+                <w:szCs w:val="18"/>
+              </w:rPr>
+              <w:t xml:space="preserve">1.006 (0.978–1.035)</w:t>
+            </w:r>
+          </w:p>
+        </w:tc>
+        <w:tc>
+          <w:tcPr>
+            <w:tcW w:type="dxa" w:w="2184"/>
+            <w:tcMar>
+              <w:top w:type="dxa" w:w="40"/>
+              <w:left w:type="dxa" w:w="60"/>
+              <w:bottom w:type="dxa" w:w="40"/>
+              <w:right w:type="dxa" w:w="60"/>
+            </w:tcMar>
+          </w:tcPr>
+          <w:p>
+            <w:pPr>
+              <w:jc w:val="right"/>
+            </w:pPr>
+            <w:r>
+              <w:rPr>
+                <w:rFonts w:ascii="Times New Roman" w:cs="Times New Roman" w:eastAsia="Times New Roman" w:hAnsi="Times New Roman"/>
+                <w:b w:val="false"/>
+                <w:bCs w:val="false"/>
+                <w:i w:val="false"/>
+                <w:iCs w:val="false"/>
+                <w:sz w:val="18"/>
+                <w:szCs w:val="18"/>
+              </w:rPr>
+              <w:t xml:space="preserve">1.008 (0.980–1.036)</w:t>
+            </w:r>
+          </w:p>
+        </w:tc>
+        <w:tc>
+          <w:tcPr>
+            <w:tcW w:type="dxa" w:w="2184"/>
+            <w:tcMar>
+              <w:top w:type="dxa" w:w="40"/>
+              <w:left w:type="dxa" w:w="60"/>
+              <w:bottom w:type="dxa" w:w="40"/>
+              <w:right w:type="dxa" w:w="60"/>
+            </w:tcMar>
+          </w:tcPr>
+          <w:p>
+            <w:pPr>
+              <w:jc w:val="right"/>
+            </w:pPr>
+            <w:r>
+              <w:rPr>
+                <w:rFonts w:ascii="Times New Roman" w:cs="Times New Roman" w:eastAsia="Times New Roman" w:hAnsi="Times New Roman"/>
+                <w:b w:val="false"/>
+                <w:bCs w:val="false"/>
+                <w:i w:val="false"/>
+                <w:iCs w:val="false"/>
+                <w:sz w:val="18"/>
+                <w:szCs w:val="18"/>
+              </w:rPr>
+              <w:t xml:space="preserve">1.002 (0.955–1.052)</w:t>
+            </w:r>
+          </w:p>
+        </w:tc>
+      </w:tr>
+      <w:tr>
+        <w:trPr>
+          <w:tblHeader w:val="false"/>
+        </w:trPr>
+        <w:tc>
+          <w:tcPr>
+            <w:tcW w:type="dxa" w:w="2808"/>
+            <w:tcMar>
+              <w:top w:type="dxa" w:w="40"/>
+              <w:left w:type="dxa" w:w="60"/>
+              <w:bottom w:type="dxa" w:w="40"/>
+              <w:right w:type="dxa" w:w="60"/>
+            </w:tcMar>
+          </w:tcPr>
+          <w:p>
+            <w:pPr>
+              <w:jc w:val="left"/>
+            </w:pPr>
+            <w:r>
+              <w:rPr>
+                <w:rFonts w:ascii="Times New Roman" w:cs="Times New Roman" w:eastAsia="Times New Roman" w:hAnsi="Times New Roman"/>
+                <w:b w:val="false"/>
+                <w:bCs w:val="false"/>
+                <w:i w:val="false"/>
+                <w:iCs w:val="false"/>
+                <w:sz w:val="18"/>
+                <w:szCs w:val="18"/>
+              </w:rPr>
+              <w:t xml:space="preserve">hidden sites, high-confidence only</w:t>
+            </w:r>
+          </w:p>
+        </w:tc>
+        <w:tc>
+          <w:tcPr>
+            <w:tcW w:type="dxa" w:w="2184"/>
+            <w:tcMar>
+              <w:top w:type="dxa" w:w="40"/>
+              <w:left w:type="dxa" w:w="60"/>
+              <w:bottom w:type="dxa" w:w="40"/>
+              <w:right w:type="dxa" w:w="60"/>
+            </w:tcMar>
+          </w:tcPr>
+          <w:p>
+            <w:pPr>
+              <w:jc w:val="right"/>
+            </w:pPr>
+            <w:r>
+              <w:rPr>
+                <w:rFonts w:ascii="Times New Roman" w:cs="Times New Roman" w:eastAsia="Times New Roman" w:hAnsi="Times New Roman"/>
+                <w:b w:val="false"/>
+                <w:bCs w:val="false"/>
+                <w:i w:val="false"/>
+                <w:iCs w:val="false"/>
+                <w:sz w:val="18"/>
+                <w:szCs w:val="18"/>
+              </w:rPr>
+              <w:t xml:space="preserve">1.001 (0.974–1.030)</w:t>
+            </w:r>
+          </w:p>
+        </w:tc>
+        <w:tc>
+          <w:tcPr>
+            <w:tcW w:type="dxa" w:w="2184"/>
+            <w:tcMar>
+              <w:top w:type="dxa" w:w="40"/>
+              <w:left w:type="dxa" w:w="60"/>
+              <w:bottom w:type="dxa" w:w="40"/>
+              <w:right w:type="dxa" w:w="60"/>
+            </w:tcMar>
+          </w:tcPr>
+          <w:p>
+            <w:pPr>
+              <w:jc w:val="right"/>
+            </w:pPr>
+            <w:r>
+              <w:rPr>
+                <w:rFonts w:ascii="Times New Roman" w:cs="Times New Roman" w:eastAsia="Times New Roman" w:hAnsi="Times New Roman"/>
+                <w:b w:val="false"/>
+                <w:bCs w:val="false"/>
+                <w:i w:val="false"/>
+                <w:iCs w:val="false"/>
+                <w:sz w:val="18"/>
+                <w:szCs w:val="18"/>
+              </w:rPr>
+              <w:t xml:space="preserve">1.006 (0.980–1.034)</w:t>
+            </w:r>
+          </w:p>
+        </w:tc>
+        <w:tc>
+          <w:tcPr>
+            <w:tcW w:type="dxa" w:w="2184"/>
+            <w:tcMar>
+              <w:top w:type="dxa" w:w="40"/>
+              <w:left w:type="dxa" w:w="60"/>
+              <w:bottom w:type="dxa" w:w="40"/>
+              <w:right w:type="dxa" w:w="60"/>
+            </w:tcMar>
+          </w:tcPr>
+          <w:p>
+            <w:pPr>
+              <w:jc w:val="right"/>
+            </w:pPr>
+            <w:r>
+              <w:rPr>
+                <w:rFonts w:ascii="Times New Roman" w:cs="Times New Roman" w:eastAsia="Times New Roman" w:hAnsi="Times New Roman"/>
+                <w:b w:val="false"/>
+                <w:bCs w:val="false"/>
+                <w:i w:val="false"/>
+                <w:iCs w:val="false"/>
+                <w:sz w:val="18"/>
+                <w:szCs w:val="18"/>
+              </w:rPr>
+              <w:t xml:space="preserve">0.984 (0.933–1.036)</w:t>
+            </w:r>
+          </w:p>
+        </w:tc>
+      </w:tr>
+      <w:tr>
+        <w:trPr>
+          <w:tblHeader w:val="false"/>
+        </w:trPr>
+        <w:tc>
+          <w:tcPr>
+            <w:tcW w:type="dxa" w:w="2808"/>
+            <w:tcMar>
+              <w:top w:type="dxa" w:w="40"/>
+              <w:left w:type="dxa" w:w="60"/>
+              <w:bottom w:type="dxa" w:w="40"/>
+              <w:right w:type="dxa" w:w="60"/>
+            </w:tcMar>
+          </w:tcPr>
+          <w:p>
+            <w:pPr>
+              <w:jc w:val="left"/>
+            </w:pPr>
+            <w:r>
+              <w:rPr>
+                <w:rFonts w:ascii="Times New Roman" w:cs="Times New Roman" w:eastAsia="Times New Roman" w:hAnsi="Times New Roman"/>
+                <w:b w:val="false"/>
+                <w:bCs w:val="false"/>
+                <w:i w:val="false"/>
+                <w:iCs w:val="false"/>
+                <w:sz w:val="18"/>
+                <w:szCs w:val="18"/>
+              </w:rPr>
+              <w:t xml:space="preserve">pre-1960 hazardous trades</w:t>
+            </w:r>
+          </w:p>
+        </w:tc>
+        <w:tc>
+          <w:tcPr>
+            <w:tcW w:type="dxa" w:w="2184"/>
+            <w:tcMar>
+              <w:top w:type="dxa" w:w="40"/>
+              <w:left w:type="dxa" w:w="60"/>
+              <w:bottom w:type="dxa" w:w="40"/>
+              <w:right w:type="dxa" w:w="60"/>
+            </w:tcMar>
+          </w:tcPr>
+          <w:p>
+            <w:pPr>
+              <w:jc w:val="right"/>
+            </w:pPr>
+            <w:r>
+              <w:rPr>
+                <w:rFonts w:ascii="Times New Roman" w:cs="Times New Roman" w:eastAsia="Times New Roman" w:hAnsi="Times New Roman"/>
+                <w:b w:val="false"/>
+                <w:bCs w:val="false"/>
+                <w:i w:val="false"/>
+                <w:iCs w:val="false"/>
+                <w:sz w:val="18"/>
+                <w:szCs w:val="18"/>
+              </w:rPr>
+              <w:t xml:space="preserve">0.937 (0.903–0.973)</w:t>
+            </w:r>
+          </w:p>
+        </w:tc>
+        <w:tc>
+          <w:tcPr>
+            <w:tcW w:type="dxa" w:w="2184"/>
+            <w:tcMar>
+              <w:top w:type="dxa" w:w="40"/>
+              <w:left w:type="dxa" w:w="60"/>
+              <w:bottom w:type="dxa" w:w="40"/>
+              <w:right w:type="dxa" w:w="60"/>
+            </w:tcMar>
+          </w:tcPr>
+          <w:p>
+            <w:pPr>
+              <w:jc w:val="right"/>
+            </w:pPr>
+            <w:r>
+              <w:rPr>
+                <w:rFonts w:ascii="Times New Roman" w:cs="Times New Roman" w:eastAsia="Times New Roman" w:hAnsi="Times New Roman"/>
+                <w:b w:val="false"/>
+                <w:bCs w:val="false"/>
+                <w:i w:val="false"/>
+                <w:iCs w:val="false"/>
+                <w:sz w:val="18"/>
+                <w:szCs w:val="18"/>
+              </w:rPr>
+              <w:t xml:space="preserve">0.950 (0.917–0.983)</w:t>
+            </w:r>
+          </w:p>
+        </w:tc>
+        <w:tc>
+          <w:tcPr>
+            <w:tcW w:type="dxa" w:w="2184"/>
+            <w:tcMar>
+              <w:top w:type="dxa" w:w="40"/>
+              <w:left w:type="dxa" w:w="60"/>
+              <w:bottom w:type="dxa" w:w="40"/>
+              <w:right w:type="dxa" w:w="60"/>
+            </w:tcMar>
+          </w:tcPr>
+          <w:p>
+            <w:pPr>
+              <w:jc w:val="right"/>
+            </w:pPr>
+            <w:r>
+              <w:rPr>
+                <w:rFonts w:ascii="Times New Roman" w:cs="Times New Roman" w:eastAsia="Times New Roman" w:hAnsi="Times New Roman"/>
+                <w:b w:val="false"/>
+                <w:bCs w:val="false"/>
+                <w:i w:val="false"/>
+                <w:iCs w:val="false"/>
+                <w:sz w:val="18"/>
+                <w:szCs w:val="18"/>
+              </w:rPr>
+              <w:t xml:space="preserve">0.955 (0.881–1.034)</w:t>
+            </w:r>
+          </w:p>
+        </w:tc>
+      </w:tr>
+      <w:tr>
+        <w:trPr>
+          <w:tblHeader w:val="false"/>
+        </w:trPr>
+        <w:tc>
+          <w:tcPr>
+            <w:tcW w:type="dxa" w:w="2808"/>
+            <w:tcMar>
+              <w:top w:type="dxa" w:w="40"/>
+              <w:left w:type="dxa" w:w="60"/>
+              <w:bottom w:type="dxa" w:w="40"/>
+              <w:right w:type="dxa" w:w="60"/>
+            </w:tcMar>
+          </w:tcPr>
+          <w:p>
+            <w:pPr>
+              <w:jc w:val="left"/>
+            </w:pPr>
+            <w:r>
+              <w:rPr>
+                <w:rFonts w:ascii="Times New Roman" w:cs="Times New Roman" w:eastAsia="Times New Roman" w:hAnsi="Times New Roman"/>
+                <w:b w:val="false"/>
+                <w:bCs w:val="false"/>
+                <w:i w:val="false"/>
+                <w:iCs w:val="false"/>
+                <w:sz w:val="18"/>
+                <w:szCs w:val="18"/>
+              </w:rPr>
+              <w:t xml:space="preserve">placebo: non-hazardous manufacturers, alone</w:t>
+            </w:r>
+          </w:p>
+        </w:tc>
+        <w:tc>
+          <w:tcPr>
+            <w:tcW w:type="dxa" w:w="2184"/>
+            <w:tcMar>
+              <w:top w:type="dxa" w:w="40"/>
+              <w:left w:type="dxa" w:w="60"/>
+              <w:bottom w:type="dxa" w:w="40"/>
+              <w:right w:type="dxa" w:w="60"/>
+            </w:tcMar>
+          </w:tcPr>
+          <w:p>
+            <w:pPr>
+              <w:jc w:val="right"/>
+            </w:pPr>
+            <w:r>
+              <w:rPr>
+                <w:rFonts w:ascii="Times New Roman" w:cs="Times New Roman" w:eastAsia="Times New Roman" w:hAnsi="Times New Roman"/>
+                <w:b w:val="false"/>
+                <w:bCs w:val="false"/>
+                <w:i w:val="false"/>
+                <w:iCs w:val="false"/>
+                <w:sz w:val="18"/>
+                <w:szCs w:val="18"/>
+              </w:rPr>
+              <w:t xml:space="preserve">1.031 (1.000–1.064)</w:t>
+            </w:r>
+          </w:p>
+        </w:tc>
+        <w:tc>
+          <w:tcPr>
+            <w:tcW w:type="dxa" w:w="2184"/>
+            <w:tcMar>
+              <w:top w:type="dxa" w:w="40"/>
+              <w:left w:type="dxa" w:w="60"/>
+              <w:bottom w:type="dxa" w:w="40"/>
+              <w:right w:type="dxa" w:w="60"/>
+            </w:tcMar>
+          </w:tcPr>
+          <w:p>
+            <w:pPr>
+              <w:jc w:val="right"/>
+            </w:pPr>
+            <w:r>
+              <w:rPr>
+                <w:rFonts w:ascii="Times New Roman" w:cs="Times New Roman" w:eastAsia="Times New Roman" w:hAnsi="Times New Roman"/>
+                <w:b w:val="false"/>
+                <w:bCs w:val="false"/>
+                <w:i w:val="false"/>
+                <w:iCs w:val="false"/>
+                <w:sz w:val="18"/>
+                <w:szCs w:val="18"/>
+              </w:rPr>
+              <w:t xml:space="preserve">1.036 (1.005–1.067)</w:t>
+            </w:r>
+          </w:p>
+        </w:tc>
+        <w:tc>
+          <w:tcPr>
+            <w:tcW w:type="dxa" w:w="2184"/>
+            <w:tcMar>
+              <w:top w:type="dxa" w:w="40"/>
+              <w:left w:type="dxa" w:w="60"/>
+              <w:bottom w:type="dxa" w:w="40"/>
+              <w:right w:type="dxa" w:w="60"/>
+            </w:tcMar>
+          </w:tcPr>
+          <w:p>
+            <w:pPr>
+              <w:jc w:val="right"/>
+            </w:pPr>
+            <w:r>
+              <w:rPr>
+                <w:rFonts w:ascii="Times New Roman" w:cs="Times New Roman" w:eastAsia="Times New Roman" w:hAnsi="Times New Roman"/>
+                <w:b w:val="false"/>
+                <w:bCs w:val="false"/>
+                <w:i w:val="false"/>
+                <w:iCs w:val="false"/>
+                <w:sz w:val="18"/>
+                <w:szCs w:val="18"/>
+              </w:rPr>
+              <w:t xml:space="preserve">1.037 (0.972–1.107)</w:t>
+            </w:r>
+          </w:p>
+        </w:tc>
+      </w:tr>
+    </w:tbl>
+    <w:p>
+      <w:pPr>
+        <w:spacing w:after="120"/>
+      </w:pPr>
+    </w:p>
+    <w:p>
+      <w:pPr>
+        <w:spacing w:after="160" w:line="360"/>
+        <w:jc w:val="both"/>
+      </w:pPr>
+      <w:r>
+        <w:rPr>
+          <w:rFonts w:ascii="Times New Roman" w:cs="Times New Roman" w:eastAsia="Times New Roman" w:hAnsi="Times New Roman"/>
+          <w:b w:val="false"/>
+          <w:bCs w:val="false"/>
+          <w:i w:val="false"/>
+          <w:iCs w:val="false"/>
+          <w:sz w:val="24"/>
+          <w:szCs w:val="24"/>
+        </w:rPr>
+        <w:t xml:space="preserve">Rate ratios (95% CI) for deaths in 2015–2019. Known and hidden sites are estimated together with current TRI and cleanup sites; the pre-1960 row adds the pre-1960 trades to that model; the placebo row is a model with TRI, cleanup and the placebo only.</w:t>
+      </w:r>
+    </w:p>
+    <w:p>
+      <w:pPr>
+        <w:spacing w:after="160" w:line="360"/>
+        <w:jc w:val="both"/>
+      </w:pPr>
+      <w:r>
+        <w:rPr>
+          <w:rFonts w:ascii="Times New Roman" w:cs="Times New Roman" w:eastAsia="Times New Roman" w:hAnsi="Times New Roman"/>
+          <w:b w:val="false"/>
+          <w:bCs w:val="false"/>
+          <w:i w:val="false"/>
+          <w:iCs w:val="false"/>
+          <w:sz w:val="24"/>
+          <w:szCs w:val="24"/>
+        </w:rPr>
+        <w:t xml:space="preserve">Blocks near the known historical sites have about 5% higher mortality per standard deviation of exposure statewide, after the controls and after the current TRI and cleanup sites, and about 9% higher in the Denver study area, where the interval reaches 1. The association holds with the placebo in the model. Blocks near the hidden sites show none, and neither does the high-confidence subset. Two readings fit these results. The known sites were the larger and longer-lived operations, which is why they entered the inventories; nearly half of them stood on land the aerial-photograph interpreters marked industrial in 1977, against a fifth of the hidden sites (Section 5), most of which were small shops on mixed blocks. And part of the known-site association may reflect industrial neighbourhoods as such rather than the hazardous sectors: the placebo alone is borderline (1.031, 1.000–1.064), although with both in the model it falls to 1.016 while the known sites keep 1.050. The inverse association of the pre-1960 trades most likely reflects what else characterises the old urban core in which they stood, including the redevelopment and turnover described in Section 6, rather than a protective effect. These are associations across places in one period: residence at death is not lifetime exposure, a kernel density ignores what each site handled and for how long, and the controls cannot rule out residual confounding.</w:t>
+      </w:r>
+    </w:p>
+    <w:p>
+      <w:pPr>
+        <w:pStyle w:val="Heading1"/>
+        <w:spacing w:after="160" w:before="360"/>
+      </w:pPr>
+      <w:r>
+        <w:rPr>
+          <w:rFonts w:ascii="Times New Roman" w:cs="Times New Roman" w:eastAsia="Times New Roman" w:hAnsi="Times New Roman"/>
+          <w:b/>
+          <w:bCs/>
+          <w:color w:val="000000"/>
+          <w:sz w:val="26"/>
+          <w:szCs w:val="26"/>
+        </w:rPr>
+        <w:t xml:space="preserve">8. Discussion and conclusion</w:t>
       </w:r>
     </w:p>
     <w:p>

</xml_diff>

<commit_message>
CenSoc 1940 linkage and rebuilt-sites mortality; paper Section 7
</commit_message>
<xml_diff>
--- a/paper/Before_and_After_the_Map_manuscript.docx
+++ b/paper/Before_and_After_the_Map_manuscript.docx
@@ -176,7 +176,7 @@
           <w:sz w:val="24"/>
           <w:szCs w:val="24"/>
         </w:rPr>
-        <w:t xml:space="preserve">The argument runs in three steps, each with its own section of evidence. Section 3 uses the complete-count censuses of 1880–1940, aggregated to reconstructed enumeration districts, to describe who lived beside the hazardous trades in each decade before the instruments of the 1920s and 1930s existed. Section 4 brings in the 1925 zoning ordinance and the 1938 HOLC map and asks, in the design of Aaronson, Hartley and Mazumder (2021), whether the map created the pattern or recorded it, using the map's own boundaries as the comparison and controlling for rail and for what the city had already zoned. Section 4 ends with descriptive sequences on fixed geographies — which came first in each place, industry or its neighbours, and whether anything changed when the zoning or the map arrived. Section 5 carries the analysis onto census tracts from 1950 to 2020, where the group beside industry changes. Section 6 asks what became of the sites themselves, matching every one to the parcel that stands there today, and Section 7 asks whether they are associated with mortality now. Section 8 draws the steps together and sets out what the evidence can and cannot support.</w:t>
+        <w:t xml:space="preserve">The argument runs in three steps, each with its own section of evidence. Section 3 uses the complete-count censuses of 1880–1940, aggregated to reconstructed enumeration districts, to describe who lived beside the hazardous trades in each decade before the instruments of the 1920s and 1930s existed. Section 4 brings in the 1925 zoning ordinance and the 1938 HOLC map and asks, in the design of Aaronson, Hartley and Mazumder (2021), whether the map created the pattern or recorded it, using the map's own boundaries as the comparison and controlling for rail and for what the city had already zoned. Section 4 ends with descriptive sequences on fixed geographies — which came first in each place, industry or its neighbours, and whether anything changed when the zoning or the map arrived. Section 5 carries the analysis onto census tracts from 1950 to 2020, where the group beside industry changes. Section 6 asks what became of the sites themselves, matching every one to the parcel that stands there today, and Section 7 asks whether they are associated with mortality: among residents today, before and after the sites were rebuilt, and among Denver residents of 1940 followed to their deaths. Section 8 draws the steps together and sets out what the evidence can and cannot support.</w:t>
       </w:r>
     </w:p>
     <w:p>
@@ -41797,7 +41797,7 @@
           <w:sz w:val="26"/>
           <w:szCs w:val="26"/>
         </w:rPr>
-        <w:t xml:space="preserve">7. Historical hazardous sites and mortality today</w:t>
+        <w:t xml:space="preserve">7. Historical hazardous sites and mortality</w:t>
       </w:r>
     </w:p>
     <w:p>
@@ -42714,6 +42714,1452 @@
           <w:szCs w:val="24"/>
         </w:rPr>
         <w:t xml:space="preserve">Blocks near the known historical sites have about 5% higher mortality per standard deviation of exposure statewide, after the controls and after the current TRI and cleanup sites, and about 9% higher in the Denver study area, where the interval reaches 1. The association holds with the placebo in the model. Blocks near the hidden sites show none, and neither does the high-confidence subset. Two readings fit these results. The known sites were the larger and longer-lived operations, which is why they entered the inventories; nearly half of them stood on land the aerial-photograph interpreters marked industrial in 1977, against a fifth of the hidden sites (Section 5), most of which were small shops on mixed blocks. And part of the known-site association may reflect industrial neighbourhoods as such rather than the hazardous sectors: the placebo alone is borderline (1.031, 1.000–1.064), although with both in the model it falls to 1.016 while the known sites keep 1.050. The inverse association of the pre-1960 trades most likely reflects what else characterises the old urban core in which they stood, including the redevelopment and turnover described in Section 6, rather than a protective effect. These are associations across places in one period: residence at death is not lifetime exposure, a kernel density ignores what each site handled and for how long, and the controls cannot rule out residual confounding.</w:t>
+      </w:r>
+    </w:p>
+    <w:p>
+      <w:pPr>
+        <w:spacing w:after="160" w:line="360"/>
+        <w:jc w:val="both"/>
+      </w:pPr>
+      <w:r>
+        <w:rPr>
+          <w:rFonts w:ascii="Times New Roman" w:cs="Times New Roman" w:eastAsia="Times New Roman" w:hAnsi="Times New Roman"/>
+          <w:b/>
+          <w:bCs/>
+          <w:i w:val="false"/>
+          <w:iCs w:val="false"/>
+          <w:sz w:val="24"/>
+          <w:szCs w:val="24"/>
+        </w:rPr>
+        <w:t xml:space="preserve">Before and after the sites were rebuilt.</w:t>
+      </w:r>
+      <w:r>
+        <w:rPr>
+          <w:rFonts w:ascii="Times New Roman" w:cs="Times New Roman" w:eastAsia="Times New Roman" w:hAnsi="Times New Roman"/>
+          <w:b w:val="false"/>
+          <w:bCs w:val="false"/>
+          <w:i w:val="false"/>
+          <w:iCs w:val="false"/>
+          <w:sz w:val="24"/>
+          <w:szCs w:val="24"/>
+        </w:rPr>
+        <w:t xml:space="preserve"> If the old works mattered, mortality nearby should fall once a site is rebuilt. The same death records cover 2000–2019, so a block-year panel for the Denver study area (about 200,000 block-years) was built with each block's population that year. A site counts as rebuilt from the year its parcel's present structure was built, when that is after its last directory listing (Section 6); in 2000–2019 that happened to 22 hidden sites, 58 known sites and 37 pre-1960 trades. Poisson models with block and year fixed effects, a population offset and yearly PM2.5 compare each block with itself as nearby sites went from standing to rebuilt. Per standard deviation of nearby sites still standing, natural-cause mortality was no different: 1.01 (0.84–1.22) for hidden sites, 1.01 (0.73–1.41) for known sites and 1.11 (0.83–1.48) for pre-1960 trades. Around the first rebuild within 400 m (966 blocks, against 3,457 blocks near sites that stood throughout), mortality was 14% higher four or more years before the rebuild (1.14, 1.01–1.28) and 15% higher two years before (1.15, 1.02–1.30) than in the year before it, and level with that year afterwards. The fall therefore came before the new building, which fits the turnover that precedes redevelopment better than an effect of the site itself; rebuilding also brings younger residents, whose age the offset does not capture.</w:t>
+      </w:r>
+    </w:p>
+    <w:p>
+      <w:pPr>
+        <w:spacing w:after="160" w:line="360"/>
+        <w:jc w:val="both"/>
+      </w:pPr>
+      <w:r>
+        <w:rPr>
+          <w:rFonts w:ascii="Times New Roman" w:cs="Times New Roman" w:eastAsia="Times New Roman" w:hAnsi="Times New Roman"/>
+          <w:b/>
+          <w:bCs/>
+          <w:i w:val="false"/>
+          <w:iCs w:val="false"/>
+          <w:sz w:val="24"/>
+          <w:szCs w:val="24"/>
+        </w:rPr>
+        <w:t xml:space="preserve">Where people lived in 1940 and how long they lived.</w:t>
+      </w:r>
+      <w:r>
+        <w:rPr>
+          <w:rFonts w:ascii="Times New Roman" w:cs="Times New Roman" w:eastAsia="Times New Roman" w:hAnsi="Times New Roman"/>
+          <w:b w:val="false"/>
+          <w:bCs w:val="false"/>
+          <w:i w:val="false"/>
+          <w:iCs w:val="false"/>
+          <w:sz w:val="24"/>
+          <w:szCs w:val="24"/>
+        </w:rPr>
+        <w:t xml:space="preserve"> The 2015–2019 association is with residence at death. CenSoc links the 1940 complete-count census to Social Security death records (Breen, Osborne and Goldstein 2023): the CenSoc-DMF file covers men dying in 1975–2020 and CenSoc-Numident men and women dying in 1988–2005. Because the Brown address files carry the same person identifier as the census, each linked Denver resident of 1940 could be placed at their 1940 street address: 9,769 men in the DMF file and 14,936 people in the Numident file, of whom 8,390 and 13,376 lived in households (not institutions) and entered the models. At that address were measured the 1929 zoning district, the share of land within 250 m in industrial use in 1937 (Section 5), the hazardous trades listed in the directories up to 1940, the HOLC grade, and the 1965–92 sites. Age at death was modelled by least squares with birth-year fixed effects (and sex in the Numident file) and CenSoc's weights, following CenSoc's guidance for these truncated windows, first alone and then with 1940 controls: race, Hispanic origin, foreign birth (Mexico separately), birth in Colorado, a move in 1935–40, and the household's tenure, rent or home value (quintile within tenure), the head's schooling and occupational standing. Errors are clustered by 1940 enumeration district. Commercial land within 250 m is the placebo: busy, central land that is not industrial.</w:t>
+      </w:r>
+    </w:p>
+    <w:p>
+      <w:pPr>
+        <w:spacing w:after="80" w:before="240"/>
+      </w:pPr>
+      <w:r>
+        <w:rPr>
+          <w:rFonts w:ascii="Times New Roman" w:cs="Times New Roman" w:eastAsia="Times New Roman" w:hAnsi="Times New Roman"/>
+          <w:b/>
+          <w:bCs/>
+          <w:sz w:val="20"/>
+          <w:szCs w:val="20"/>
+        </w:rPr>
+        <w:t xml:space="preserve">Table 22. Exposure at the 1940 address and age at death: Denver residents of 1940 linked to Social Security death records (CenSoc)</w:t>
+      </w:r>
+    </w:p>
+    <w:tbl>
+      <w:tblPr>
+        <w:tblW w:type="dxa" w:w="9360"/>
+        <w:tblBorders>
+          <w:top w:val="single" w:sz="6"/>
+          <w:left w:val="none"/>
+          <w:bottom w:val="single" w:sz="6"/>
+          <w:right w:val="none"/>
+          <w:insideH w:val="single" w:color="BBBBBB" w:sz="2"/>
+          <w:insideV w:val="none"/>
+        </w:tblBorders>
+      </w:tblPr>
+      <w:tblGrid>
+        <w:gridCol w:w="2808"/>
+        <w:gridCol w:w="1638"/>
+        <w:gridCol w:w="1638"/>
+        <w:gridCol w:w="1638"/>
+        <w:gridCol w:w="1638"/>
+      </w:tblGrid>
+      <w:tr>
+        <w:trPr>
+          <w:tblHeader/>
+        </w:trPr>
+        <w:tc>
+          <w:tcPr>
+            <w:tcW w:type="dxa" w:w="2808"/>
+            <w:shd w:fill="EDEDED" w:color="auto" w:val="clear"/>
+            <w:tcMar>
+              <w:top w:type="dxa" w:w="40"/>
+              <w:left w:type="dxa" w:w="60"/>
+              <w:bottom w:type="dxa" w:w="40"/>
+              <w:right w:type="dxa" w:w="60"/>
+            </w:tcMar>
+          </w:tcPr>
+          <w:p>
+            <w:pPr>
+              <w:jc w:val="left"/>
+            </w:pPr>
+            <w:r>
+              <w:rPr>
+                <w:rFonts w:ascii="Times New Roman" w:cs="Times New Roman" w:eastAsia="Times New Roman" w:hAnsi="Times New Roman"/>
+                <w:b/>
+                <w:bCs/>
+                <w:i w:val="false"/>
+                <w:iCs w:val="false"/>
+                <w:sz w:val="18"/>
+                <w:szCs w:val="18"/>
+              </w:rPr>
+              <w:t xml:space="preserve">exposure at the 1940 address</w:t>
+            </w:r>
+          </w:p>
+        </w:tc>
+        <w:tc>
+          <w:tcPr>
+            <w:tcW w:type="dxa" w:w="1638"/>
+            <w:shd w:fill="EDEDED" w:color="auto" w:val="clear"/>
+            <w:tcMar>
+              <w:top w:type="dxa" w:w="40"/>
+              <w:left w:type="dxa" w:w="60"/>
+              <w:bottom w:type="dxa" w:w="40"/>
+              <w:right w:type="dxa" w:w="60"/>
+            </w:tcMar>
+          </w:tcPr>
+          <w:p>
+            <w:pPr>
+              <w:jc w:val="right"/>
+            </w:pPr>
+            <w:r>
+              <w:rPr>
+                <w:rFonts w:ascii="Times New Roman" w:cs="Times New Roman" w:eastAsia="Times New Roman" w:hAnsi="Times New Roman"/>
+                <w:b/>
+                <w:bCs/>
+                <w:i w:val="false"/>
+                <w:iCs w:val="false"/>
+                <w:sz w:val="18"/>
+                <w:szCs w:val="18"/>
+              </w:rPr>
+              <w:t xml:space="preserve">men, deaths 1975–2020: birth year only</w:t>
+            </w:r>
+          </w:p>
+        </w:tc>
+        <w:tc>
+          <w:tcPr>
+            <w:tcW w:type="dxa" w:w="1638"/>
+            <w:shd w:fill="EDEDED" w:color="auto" w:val="clear"/>
+            <w:tcMar>
+              <w:top w:type="dxa" w:w="40"/>
+              <w:left w:type="dxa" w:w="60"/>
+              <w:bottom w:type="dxa" w:w="40"/>
+              <w:right w:type="dxa" w:w="60"/>
+            </w:tcMar>
+          </w:tcPr>
+          <w:p>
+            <w:pPr>
+              <w:jc w:val="right"/>
+            </w:pPr>
+            <w:r>
+              <w:rPr>
+                <w:rFonts w:ascii="Times New Roman" w:cs="Times New Roman" w:eastAsia="Times New Roman" w:hAnsi="Times New Roman"/>
+                <w:b/>
+                <w:bCs/>
+                <w:i w:val="false"/>
+                <w:iCs w:val="false"/>
+                <w:sz w:val="18"/>
+                <w:szCs w:val="18"/>
+              </w:rPr>
+              <w:t xml:space="preserve">men, deaths 1975–2020: with 1940 controls</w:t>
+            </w:r>
+          </w:p>
+        </w:tc>
+        <w:tc>
+          <w:tcPr>
+            <w:tcW w:type="dxa" w:w="1638"/>
+            <w:shd w:fill="EDEDED" w:color="auto" w:val="clear"/>
+            <w:tcMar>
+              <w:top w:type="dxa" w:w="40"/>
+              <w:left w:type="dxa" w:w="60"/>
+              <w:bottom w:type="dxa" w:w="40"/>
+              <w:right w:type="dxa" w:w="60"/>
+            </w:tcMar>
+          </w:tcPr>
+          <w:p>
+            <w:pPr>
+              <w:jc w:val="right"/>
+            </w:pPr>
+            <w:r>
+              <w:rPr>
+                <w:rFonts w:ascii="Times New Roman" w:cs="Times New Roman" w:eastAsia="Times New Roman" w:hAnsi="Times New Roman"/>
+                <w:b/>
+                <w:bCs/>
+                <w:i w:val="false"/>
+                <w:iCs w:val="false"/>
+                <w:sz w:val="18"/>
+                <w:szCs w:val="18"/>
+              </w:rPr>
+              <w:t xml:space="preserve">men and women, deaths 1988–2005: birth year and sex only</w:t>
+            </w:r>
+          </w:p>
+        </w:tc>
+        <w:tc>
+          <w:tcPr>
+            <w:tcW w:type="dxa" w:w="1638"/>
+            <w:shd w:fill="EDEDED" w:color="auto" w:val="clear"/>
+            <w:tcMar>
+              <w:top w:type="dxa" w:w="40"/>
+              <w:left w:type="dxa" w:w="60"/>
+              <w:bottom w:type="dxa" w:w="40"/>
+              <w:right w:type="dxa" w:w="60"/>
+            </w:tcMar>
+          </w:tcPr>
+          <w:p>
+            <w:pPr>
+              <w:jc w:val="right"/>
+            </w:pPr>
+            <w:r>
+              <w:rPr>
+                <w:rFonts w:ascii="Times New Roman" w:cs="Times New Roman" w:eastAsia="Times New Roman" w:hAnsi="Times New Roman"/>
+                <w:b/>
+                <w:bCs/>
+                <w:i w:val="false"/>
+                <w:iCs w:val="false"/>
+                <w:sz w:val="18"/>
+                <w:szCs w:val="18"/>
+              </w:rPr>
+              <w:t xml:space="preserve">men and women, deaths 1988–2005: with 1940 controls</w:t>
+            </w:r>
+          </w:p>
+        </w:tc>
+      </w:tr>
+      <w:tr>
+        <w:trPr>
+          <w:tblHeader w:val="false"/>
+        </w:trPr>
+        <w:tc>
+          <w:tcPr>
+            <w:tcW w:type="dxa" w:w="2808"/>
+            <w:tcMar>
+              <w:top w:type="dxa" w:w="40"/>
+              <w:left w:type="dxa" w:w="60"/>
+              <w:bottom w:type="dxa" w:w="40"/>
+              <w:right w:type="dxa" w:w="60"/>
+            </w:tcMar>
+          </w:tcPr>
+          <w:p>
+            <w:pPr>
+              <w:jc w:val="left"/>
+            </w:pPr>
+            <w:r>
+              <w:rPr>
+                <w:rFonts w:ascii="Times New Roman" w:cs="Times New Roman" w:eastAsia="Times New Roman" w:hAnsi="Times New Roman"/>
+                <w:b w:val="false"/>
+                <w:bCs w:val="false"/>
+                <w:i w:val="false"/>
+                <w:iCs w:val="false"/>
+                <w:sz w:val="18"/>
+                <w:szCs w:val="18"/>
+              </w:rPr>
+              <w:t xml:space="preserve">1929 industrial district (vs residence or commercial)</w:t>
+            </w:r>
+          </w:p>
+        </w:tc>
+        <w:tc>
+          <w:tcPr>
+            <w:tcW w:type="dxa" w:w="1638"/>
+            <w:tcMar>
+              <w:top w:type="dxa" w:w="40"/>
+              <w:left w:type="dxa" w:w="60"/>
+              <w:bottom w:type="dxa" w:w="40"/>
+              <w:right w:type="dxa" w:w="60"/>
+            </w:tcMar>
+          </w:tcPr>
+          <w:p>
+            <w:pPr>
+              <w:jc w:val="right"/>
+            </w:pPr>
+            <w:r>
+              <w:rPr>
+                <w:rFonts w:ascii="Times New Roman" w:cs="Times New Roman" w:eastAsia="Times New Roman" w:hAnsi="Times New Roman"/>
+                <w:b w:val="false"/>
+                <w:bCs w:val="false"/>
+                <w:i w:val="false"/>
+                <w:iCs w:val="false"/>
+                <w:sz w:val="18"/>
+                <w:szCs w:val="18"/>
+              </w:rPr>
+              <w:t xml:space="preserve">−1.58 (−2.48 to −0.67)</w:t>
+            </w:r>
+          </w:p>
+        </w:tc>
+        <w:tc>
+          <w:tcPr>
+            <w:tcW w:type="dxa" w:w="1638"/>
+            <w:tcMar>
+              <w:top w:type="dxa" w:w="40"/>
+              <w:left w:type="dxa" w:w="60"/>
+              <w:bottom w:type="dxa" w:w="40"/>
+              <w:right w:type="dxa" w:w="60"/>
+            </w:tcMar>
+          </w:tcPr>
+          <w:p>
+            <w:pPr>
+              <w:jc w:val="right"/>
+            </w:pPr>
+            <w:r>
+              <w:rPr>
+                <w:rFonts w:ascii="Times New Roman" w:cs="Times New Roman" w:eastAsia="Times New Roman" w:hAnsi="Times New Roman"/>
+                <w:b w:val="false"/>
+                <w:bCs w:val="false"/>
+                <w:i w:val="false"/>
+                <w:iCs w:val="false"/>
+                <w:sz w:val="18"/>
+                <w:szCs w:val="18"/>
+              </w:rPr>
+              <w:t xml:space="preserve">−0.98 (−1.88 to −0.09)</w:t>
+            </w:r>
+          </w:p>
+        </w:tc>
+        <w:tc>
+          <w:tcPr>
+            <w:tcW w:type="dxa" w:w="1638"/>
+            <w:tcMar>
+              <w:top w:type="dxa" w:w="40"/>
+              <w:left w:type="dxa" w:w="60"/>
+              <w:bottom w:type="dxa" w:w="40"/>
+              <w:right w:type="dxa" w:w="60"/>
+            </w:tcMar>
+          </w:tcPr>
+          <w:p>
+            <w:pPr>
+              <w:jc w:val="right"/>
+            </w:pPr>
+            <w:r>
+              <w:rPr>
+                <w:rFonts w:ascii="Times New Roman" w:cs="Times New Roman" w:eastAsia="Times New Roman" w:hAnsi="Times New Roman"/>
+                <w:b w:val="false"/>
+                <w:bCs w:val="false"/>
+                <w:i w:val="false"/>
+                <w:iCs w:val="false"/>
+                <w:sz w:val="18"/>
+                <w:szCs w:val="18"/>
+              </w:rPr>
+              <w:t xml:space="preserve">−0.07 (−0.55 to 0.41)</w:t>
+            </w:r>
+          </w:p>
+        </w:tc>
+        <w:tc>
+          <w:tcPr>
+            <w:tcW w:type="dxa" w:w="1638"/>
+            <w:tcMar>
+              <w:top w:type="dxa" w:w="40"/>
+              <w:left w:type="dxa" w:w="60"/>
+              <w:bottom w:type="dxa" w:w="40"/>
+              <w:right w:type="dxa" w:w="60"/>
+            </w:tcMar>
+          </w:tcPr>
+          <w:p>
+            <w:pPr>
+              <w:jc w:val="right"/>
+            </w:pPr>
+            <w:r>
+              <w:rPr>
+                <w:rFonts w:ascii="Times New Roman" w:cs="Times New Roman" w:eastAsia="Times New Roman" w:hAnsi="Times New Roman"/>
+                <w:b w:val="false"/>
+                <w:bCs w:val="false"/>
+                <w:i w:val="false"/>
+                <w:iCs w:val="false"/>
+                <w:sz w:val="18"/>
+                <w:szCs w:val="18"/>
+              </w:rPr>
+              <w:t xml:space="preserve">0.10 (−0.39 to 0.59)</w:t>
+            </w:r>
+          </w:p>
+        </w:tc>
+      </w:tr>
+      <w:tr>
+        <w:trPr>
+          <w:tblHeader w:val="false"/>
+        </w:trPr>
+        <w:tc>
+          <w:tcPr>
+            <w:tcW w:type="dxa" w:w="2808"/>
+            <w:tcMar>
+              <w:top w:type="dxa" w:w="40"/>
+              <w:left w:type="dxa" w:w="60"/>
+              <w:bottom w:type="dxa" w:w="40"/>
+              <w:right w:type="dxa" w:w="60"/>
+            </w:tcMar>
+          </w:tcPr>
+          <w:p>
+            <w:pPr>
+              <w:jc w:val="left"/>
+            </w:pPr>
+            <w:r>
+              <w:rPr>
+                <w:rFonts w:ascii="Times New Roman" w:cs="Times New Roman" w:eastAsia="Times New Roman" w:hAnsi="Times New Roman"/>
+                <w:b w:val="false"/>
+                <w:bCs w:val="false"/>
+                <w:i w:val="false"/>
+                <w:iCs w:val="false"/>
+                <w:sz w:val="18"/>
+                <w:szCs w:val="18"/>
+              </w:rPr>
+              <w:t xml:space="preserve">industrial land within 250 m, 1937 (per 10 points)</w:t>
+            </w:r>
+          </w:p>
+        </w:tc>
+        <w:tc>
+          <w:tcPr>
+            <w:tcW w:type="dxa" w:w="1638"/>
+            <w:tcMar>
+              <w:top w:type="dxa" w:w="40"/>
+              <w:left w:type="dxa" w:w="60"/>
+              <w:bottom w:type="dxa" w:w="40"/>
+              <w:right w:type="dxa" w:w="60"/>
+            </w:tcMar>
+          </w:tcPr>
+          <w:p>
+            <w:pPr>
+              <w:jc w:val="right"/>
+            </w:pPr>
+            <w:r>
+              <w:rPr>
+                <w:rFonts w:ascii="Times New Roman" w:cs="Times New Roman" w:eastAsia="Times New Roman" w:hAnsi="Times New Roman"/>
+                <w:b w:val="false"/>
+                <w:bCs w:val="false"/>
+                <w:i w:val="false"/>
+                <w:iCs w:val="false"/>
+                <w:sz w:val="18"/>
+                <w:szCs w:val="18"/>
+              </w:rPr>
+              <w:t xml:space="preserve">−0.34 (−0.51 to −0.18)</w:t>
+            </w:r>
+          </w:p>
+        </w:tc>
+        <w:tc>
+          <w:tcPr>
+            <w:tcW w:type="dxa" w:w="1638"/>
+            <w:tcMar>
+              <w:top w:type="dxa" w:w="40"/>
+              <w:left w:type="dxa" w:w="60"/>
+              <w:bottom w:type="dxa" w:w="40"/>
+              <w:right w:type="dxa" w:w="60"/>
+            </w:tcMar>
+          </w:tcPr>
+          <w:p>
+            <w:pPr>
+              <w:jc w:val="right"/>
+            </w:pPr>
+            <w:r>
+              <w:rPr>
+                <w:rFonts w:ascii="Times New Roman" w:cs="Times New Roman" w:eastAsia="Times New Roman" w:hAnsi="Times New Roman"/>
+                <w:b w:val="false"/>
+                <w:bCs w:val="false"/>
+                <w:i w:val="false"/>
+                <w:iCs w:val="false"/>
+                <w:sz w:val="18"/>
+                <w:szCs w:val="18"/>
+              </w:rPr>
+              <w:t xml:space="preserve">−0.20 (−0.36 to −0.04)</w:t>
+            </w:r>
+          </w:p>
+        </w:tc>
+        <w:tc>
+          <w:tcPr>
+            <w:tcW w:type="dxa" w:w="1638"/>
+            <w:tcMar>
+              <w:top w:type="dxa" w:w="40"/>
+              <w:left w:type="dxa" w:w="60"/>
+              <w:bottom w:type="dxa" w:w="40"/>
+              <w:right w:type="dxa" w:w="60"/>
+            </w:tcMar>
+          </w:tcPr>
+          <w:p>
+            <w:pPr>
+              <w:jc w:val="right"/>
+            </w:pPr>
+            <w:r>
+              <w:rPr>
+                <w:rFonts w:ascii="Times New Roman" w:cs="Times New Roman" w:eastAsia="Times New Roman" w:hAnsi="Times New Roman"/>
+                <w:b w:val="false"/>
+                <w:bCs w:val="false"/>
+                <w:i w:val="false"/>
+                <w:iCs w:val="false"/>
+                <w:sz w:val="18"/>
+                <w:szCs w:val="18"/>
+              </w:rPr>
+              <w:t xml:space="preserve">−0.06 (−0.14 to 0.03)</w:t>
+            </w:r>
+          </w:p>
+        </w:tc>
+        <w:tc>
+          <w:tcPr>
+            <w:tcW w:type="dxa" w:w="1638"/>
+            <w:tcMar>
+              <w:top w:type="dxa" w:w="40"/>
+              <w:left w:type="dxa" w:w="60"/>
+              <w:bottom w:type="dxa" w:w="40"/>
+              <w:right w:type="dxa" w:w="60"/>
+            </w:tcMar>
+          </w:tcPr>
+          <w:p>
+            <w:pPr>
+              <w:jc w:val="right"/>
+            </w:pPr>
+            <w:r>
+              <w:rPr>
+                <w:rFonts w:ascii="Times New Roman" w:cs="Times New Roman" w:eastAsia="Times New Roman" w:hAnsi="Times New Roman"/>
+                <w:b w:val="false"/>
+                <w:bCs w:val="false"/>
+                <w:i w:val="false"/>
+                <w:iCs w:val="false"/>
+                <w:sz w:val="18"/>
+                <w:szCs w:val="18"/>
+              </w:rPr>
+              <w:t xml:space="preserve">−0.01 (−0.10 to 0.08)</w:t>
+            </w:r>
+          </w:p>
+        </w:tc>
+      </w:tr>
+      <w:tr>
+        <w:trPr>
+          <w:tblHeader w:val="false"/>
+        </w:trPr>
+        <w:tc>
+          <w:tcPr>
+            <w:tcW w:type="dxa" w:w="2808"/>
+            <w:tcMar>
+              <w:top w:type="dxa" w:w="40"/>
+              <w:left w:type="dxa" w:w="60"/>
+              <w:bottom w:type="dxa" w:w="40"/>
+              <w:right w:type="dxa" w:w="60"/>
+            </w:tcMar>
+          </w:tcPr>
+          <w:p>
+            <w:pPr>
+              <w:jc w:val="left"/>
+            </w:pPr>
+            <w:r>
+              <w:rPr>
+                <w:rFonts w:ascii="Times New Roman" w:cs="Times New Roman" w:eastAsia="Times New Roman" w:hAnsi="Times New Roman"/>
+                <w:b w:val="false"/>
+                <w:bCs w:val="false"/>
+                <w:i w:val="false"/>
+                <w:iCs w:val="false"/>
+                <w:sz w:val="18"/>
+                <w:szCs w:val="18"/>
+              </w:rPr>
+              <w:t xml:space="preserve">hazardous trade listed by 1940 within 500 m</w:t>
+            </w:r>
+          </w:p>
+        </w:tc>
+        <w:tc>
+          <w:tcPr>
+            <w:tcW w:type="dxa" w:w="1638"/>
+            <w:tcMar>
+              <w:top w:type="dxa" w:w="40"/>
+              <w:left w:type="dxa" w:w="60"/>
+              <w:bottom w:type="dxa" w:w="40"/>
+              <w:right w:type="dxa" w:w="60"/>
+            </w:tcMar>
+          </w:tcPr>
+          <w:p>
+            <w:pPr>
+              <w:jc w:val="right"/>
+            </w:pPr>
+            <w:r>
+              <w:rPr>
+                <w:rFonts w:ascii="Times New Roman" w:cs="Times New Roman" w:eastAsia="Times New Roman" w:hAnsi="Times New Roman"/>
+                <w:b w:val="false"/>
+                <w:bCs w:val="false"/>
+                <w:i w:val="false"/>
+                <w:iCs w:val="false"/>
+                <w:sz w:val="18"/>
+                <w:szCs w:val="18"/>
+              </w:rPr>
+              <w:t xml:space="preserve">−0.94 (−1.45 to −0.44)</w:t>
+            </w:r>
+          </w:p>
+        </w:tc>
+        <w:tc>
+          <w:tcPr>
+            <w:tcW w:type="dxa" w:w="1638"/>
+            <w:tcMar>
+              <w:top w:type="dxa" w:w="40"/>
+              <w:left w:type="dxa" w:w="60"/>
+              <w:bottom w:type="dxa" w:w="40"/>
+              <w:right w:type="dxa" w:w="60"/>
+            </w:tcMar>
+          </w:tcPr>
+          <w:p>
+            <w:pPr>
+              <w:jc w:val="right"/>
+            </w:pPr>
+            <w:r>
+              <w:rPr>
+                <w:rFonts w:ascii="Times New Roman" w:cs="Times New Roman" w:eastAsia="Times New Roman" w:hAnsi="Times New Roman"/>
+                <w:b w:val="false"/>
+                <w:bCs w:val="false"/>
+                <w:i w:val="false"/>
+                <w:iCs w:val="false"/>
+                <w:sz w:val="18"/>
+                <w:szCs w:val="18"/>
+              </w:rPr>
+              <w:t xml:space="preserve">−0.50 (−1.05 to 0.05)</w:t>
+            </w:r>
+          </w:p>
+        </w:tc>
+        <w:tc>
+          <w:tcPr>
+            <w:tcW w:type="dxa" w:w="1638"/>
+            <w:tcMar>
+              <w:top w:type="dxa" w:w="40"/>
+              <w:left w:type="dxa" w:w="60"/>
+              <w:bottom w:type="dxa" w:w="40"/>
+              <w:right w:type="dxa" w:w="60"/>
+            </w:tcMar>
+          </w:tcPr>
+          <w:p>
+            <w:pPr>
+              <w:jc w:val="right"/>
+            </w:pPr>
+            <w:r>
+              <w:rPr>
+                <w:rFonts w:ascii="Times New Roman" w:cs="Times New Roman" w:eastAsia="Times New Roman" w:hAnsi="Times New Roman"/>
+                <w:b w:val="false"/>
+                <w:bCs w:val="false"/>
+                <w:i w:val="false"/>
+                <w:iCs w:val="false"/>
+                <w:sz w:val="18"/>
+                <w:szCs w:val="18"/>
+              </w:rPr>
+              <w:t xml:space="preserve">−0.19 (−0.40 to 0.03)</w:t>
+            </w:r>
+          </w:p>
+        </w:tc>
+        <w:tc>
+          <w:tcPr>
+            <w:tcW w:type="dxa" w:w="1638"/>
+            <w:tcMar>
+              <w:top w:type="dxa" w:w="40"/>
+              <w:left w:type="dxa" w:w="60"/>
+              <w:bottom w:type="dxa" w:w="40"/>
+              <w:right w:type="dxa" w:w="60"/>
+            </w:tcMar>
+          </w:tcPr>
+          <w:p>
+            <w:pPr>
+              <w:jc w:val="right"/>
+            </w:pPr>
+            <w:r>
+              <w:rPr>
+                <w:rFonts w:ascii="Times New Roman" w:cs="Times New Roman" w:eastAsia="Times New Roman" w:hAnsi="Times New Roman"/>
+                <w:b w:val="false"/>
+                <w:bCs w:val="false"/>
+                <w:i w:val="false"/>
+                <w:iCs w:val="false"/>
+                <w:sz w:val="18"/>
+                <w:szCs w:val="18"/>
+              </w:rPr>
+              <w:t xml:space="preserve">−0.05 (−0.26 to 0.17)</w:t>
+            </w:r>
+          </w:p>
+        </w:tc>
+      </w:tr>
+      <w:tr>
+        <w:trPr>
+          <w:tblHeader w:val="false"/>
+        </w:trPr>
+        <w:tc>
+          <w:tcPr>
+            <w:tcW w:type="dxa" w:w="2808"/>
+            <w:tcMar>
+              <w:top w:type="dxa" w:w="40"/>
+              <w:left w:type="dxa" w:w="60"/>
+              <w:bottom w:type="dxa" w:w="40"/>
+              <w:right w:type="dxa" w:w="60"/>
+            </w:tcMar>
+          </w:tcPr>
+          <w:p>
+            <w:pPr>
+              <w:jc w:val="left"/>
+            </w:pPr>
+            <w:r>
+              <w:rPr>
+                <w:rFonts w:ascii="Times New Roman" w:cs="Times New Roman" w:eastAsia="Times New Roman" w:hAnsi="Times New Roman"/>
+                <w:b w:val="false"/>
+                <w:bCs w:val="false"/>
+                <w:i w:val="false"/>
+                <w:iCs w:val="false"/>
+                <w:sz w:val="18"/>
+                <w:szCs w:val="18"/>
+              </w:rPr>
+              <w:t xml:space="preserve">hazardous trades listed by 1940, kernel (per SD)</w:t>
+            </w:r>
+          </w:p>
+        </w:tc>
+        <w:tc>
+          <w:tcPr>
+            <w:tcW w:type="dxa" w:w="1638"/>
+            <w:tcMar>
+              <w:top w:type="dxa" w:w="40"/>
+              <w:left w:type="dxa" w:w="60"/>
+              <w:bottom w:type="dxa" w:w="40"/>
+              <w:right w:type="dxa" w:w="60"/>
+            </w:tcMar>
+          </w:tcPr>
+          <w:p>
+            <w:pPr>
+              <w:jc w:val="right"/>
+            </w:pPr>
+            <w:r>
+              <w:rPr>
+                <w:rFonts w:ascii="Times New Roman" w:cs="Times New Roman" w:eastAsia="Times New Roman" w:hAnsi="Times New Roman"/>
+                <w:b w:val="false"/>
+                <w:bCs w:val="false"/>
+                <w:i w:val="false"/>
+                <w:iCs w:val="false"/>
+                <w:sz w:val="18"/>
+                <w:szCs w:val="18"/>
+              </w:rPr>
+              <w:t xml:space="preserve">−0.11 (−0.39 to 0.16)</w:t>
+            </w:r>
+          </w:p>
+        </w:tc>
+        <w:tc>
+          <w:tcPr>
+            <w:tcW w:type="dxa" w:w="1638"/>
+            <w:tcMar>
+              <w:top w:type="dxa" w:w="40"/>
+              <w:left w:type="dxa" w:w="60"/>
+              <w:bottom w:type="dxa" w:w="40"/>
+              <w:right w:type="dxa" w:w="60"/>
+            </w:tcMar>
+          </w:tcPr>
+          <w:p>
+            <w:pPr>
+              <w:jc w:val="right"/>
+            </w:pPr>
+            <w:r>
+              <w:rPr>
+                <w:rFonts w:ascii="Times New Roman" w:cs="Times New Roman" w:eastAsia="Times New Roman" w:hAnsi="Times New Roman"/>
+                <w:b w:val="false"/>
+                <w:bCs w:val="false"/>
+                <w:i w:val="false"/>
+                <w:iCs w:val="false"/>
+                <w:sz w:val="18"/>
+                <w:szCs w:val="18"/>
+              </w:rPr>
+              <w:t xml:space="preserve">0.09 (−0.17 to 0.36)</w:t>
+            </w:r>
+          </w:p>
+        </w:tc>
+        <w:tc>
+          <w:tcPr>
+            <w:tcW w:type="dxa" w:w="1638"/>
+            <w:tcMar>
+              <w:top w:type="dxa" w:w="40"/>
+              <w:left w:type="dxa" w:w="60"/>
+              <w:bottom w:type="dxa" w:w="40"/>
+              <w:right w:type="dxa" w:w="60"/>
+            </w:tcMar>
+          </w:tcPr>
+          <w:p>
+            <w:pPr>
+              <w:jc w:val="right"/>
+            </w:pPr>
+            <w:r>
+              <w:rPr>
+                <w:rFonts w:ascii="Times New Roman" w:cs="Times New Roman" w:eastAsia="Times New Roman" w:hAnsi="Times New Roman"/>
+                <w:b w:val="false"/>
+                <w:bCs w:val="false"/>
+                <w:i w:val="false"/>
+                <w:iCs w:val="false"/>
+                <w:sz w:val="18"/>
+                <w:szCs w:val="18"/>
+              </w:rPr>
+              <w:t xml:space="preserve">−0.08 (−0.21 to 0.05)</w:t>
+            </w:r>
+          </w:p>
+        </w:tc>
+        <w:tc>
+          <w:tcPr>
+            <w:tcW w:type="dxa" w:w="1638"/>
+            <w:tcMar>
+              <w:top w:type="dxa" w:w="40"/>
+              <w:left w:type="dxa" w:w="60"/>
+              <w:bottom w:type="dxa" w:w="40"/>
+              <w:right w:type="dxa" w:w="60"/>
+            </w:tcMar>
+          </w:tcPr>
+          <w:p>
+            <w:pPr>
+              <w:jc w:val="right"/>
+            </w:pPr>
+            <w:r>
+              <w:rPr>
+                <w:rFonts w:ascii="Times New Roman" w:cs="Times New Roman" w:eastAsia="Times New Roman" w:hAnsi="Times New Roman"/>
+                <w:b w:val="false"/>
+                <w:bCs w:val="false"/>
+                <w:i w:val="false"/>
+                <w:iCs w:val="false"/>
+                <w:sz w:val="18"/>
+                <w:szCs w:val="18"/>
+              </w:rPr>
+              <w:t xml:space="preserve">−0.02 (−0.14 to 0.10)</w:t>
+            </w:r>
+          </w:p>
+        </w:tc>
+      </w:tr>
+      <w:tr>
+        <w:trPr>
+          <w:tblHeader w:val="false"/>
+        </w:trPr>
+        <w:tc>
+          <w:tcPr>
+            <w:tcW w:type="dxa" w:w="2808"/>
+            <w:tcMar>
+              <w:top w:type="dxa" w:w="40"/>
+              <w:left w:type="dxa" w:w="60"/>
+              <w:bottom w:type="dxa" w:w="40"/>
+              <w:right w:type="dxa" w:w="60"/>
+            </w:tcMar>
+          </w:tcPr>
+          <w:p>
+            <w:pPr>
+              <w:jc w:val="left"/>
+            </w:pPr>
+            <w:r>
+              <w:rPr>
+                <w:rFonts w:ascii="Times New Roman" w:cs="Times New Roman" w:eastAsia="Times New Roman" w:hAnsi="Times New Roman"/>
+                <w:b w:val="false"/>
+                <w:bCs w:val="false"/>
+                <w:i w:val="false"/>
+                <w:iCs w:val="false"/>
+                <w:sz w:val="18"/>
+                <w:szCs w:val="18"/>
+              </w:rPr>
+              <w:t xml:space="preserve">placebo: commercial land within 250 m, 1937 (per 10 points)</w:t>
+            </w:r>
+          </w:p>
+        </w:tc>
+        <w:tc>
+          <w:tcPr>
+            <w:tcW w:type="dxa" w:w="1638"/>
+            <w:tcMar>
+              <w:top w:type="dxa" w:w="40"/>
+              <w:left w:type="dxa" w:w="60"/>
+              <w:bottom w:type="dxa" w:w="40"/>
+              <w:right w:type="dxa" w:w="60"/>
+            </w:tcMar>
+          </w:tcPr>
+          <w:p>
+            <w:pPr>
+              <w:jc w:val="right"/>
+            </w:pPr>
+            <w:r>
+              <w:rPr>
+                <w:rFonts w:ascii="Times New Roman" w:cs="Times New Roman" w:eastAsia="Times New Roman" w:hAnsi="Times New Roman"/>
+                <w:b w:val="false"/>
+                <w:bCs w:val="false"/>
+                <w:i w:val="false"/>
+                <w:iCs w:val="false"/>
+                <w:sz w:val="18"/>
+                <w:szCs w:val="18"/>
+              </w:rPr>
+              <w:t xml:space="preserve">−0.01 (−0.11 to 0.09)</w:t>
+            </w:r>
+          </w:p>
+        </w:tc>
+        <w:tc>
+          <w:tcPr>
+            <w:tcW w:type="dxa" w:w="1638"/>
+            <w:tcMar>
+              <w:top w:type="dxa" w:w="40"/>
+              <w:left w:type="dxa" w:w="60"/>
+              <w:bottom w:type="dxa" w:w="40"/>
+              <w:right w:type="dxa" w:w="60"/>
+            </w:tcMar>
+          </w:tcPr>
+          <w:p>
+            <w:pPr>
+              <w:jc w:val="right"/>
+            </w:pPr>
+            <w:r>
+              <w:rPr>
+                <w:rFonts w:ascii="Times New Roman" w:cs="Times New Roman" w:eastAsia="Times New Roman" w:hAnsi="Times New Roman"/>
+                <w:b w:val="false"/>
+                <w:bCs w:val="false"/>
+                <w:i w:val="false"/>
+                <w:iCs w:val="false"/>
+                <w:sz w:val="18"/>
+                <w:szCs w:val="18"/>
+              </w:rPr>
+              <w:t xml:space="preserve">0.08 (−0.03 to 0.18)</w:t>
+            </w:r>
+          </w:p>
+        </w:tc>
+        <w:tc>
+          <w:tcPr>
+            <w:tcW w:type="dxa" w:w="1638"/>
+            <w:tcMar>
+              <w:top w:type="dxa" w:w="40"/>
+              <w:left w:type="dxa" w:w="60"/>
+              <w:bottom w:type="dxa" w:w="40"/>
+              <w:right w:type="dxa" w:w="60"/>
+            </w:tcMar>
+          </w:tcPr>
+          <w:p>
+            <w:pPr>
+              <w:jc w:val="right"/>
+            </w:pPr>
+            <w:r>
+              <w:rPr>
+                <w:rFonts w:ascii="Times New Roman" w:cs="Times New Roman" w:eastAsia="Times New Roman" w:hAnsi="Times New Roman"/>
+                <w:b w:val="false"/>
+                <w:bCs w:val="false"/>
+                <w:i w:val="false"/>
+                <w:iCs w:val="false"/>
+                <w:sz w:val="18"/>
+                <w:szCs w:val="18"/>
+              </w:rPr>
+              <w:t xml:space="preserve">−0.02 (−0.06 to 0.02)</w:t>
+            </w:r>
+          </w:p>
+        </w:tc>
+        <w:tc>
+          <w:tcPr>
+            <w:tcW w:type="dxa" w:w="1638"/>
+            <w:tcMar>
+              <w:top w:type="dxa" w:w="40"/>
+              <w:left w:type="dxa" w:w="60"/>
+              <w:bottom w:type="dxa" w:w="40"/>
+              <w:right w:type="dxa" w:w="60"/>
+            </w:tcMar>
+          </w:tcPr>
+          <w:p>
+            <w:pPr>
+              <w:jc w:val="right"/>
+            </w:pPr>
+            <w:r>
+              <w:rPr>
+                <w:rFonts w:ascii="Times New Roman" w:cs="Times New Roman" w:eastAsia="Times New Roman" w:hAnsi="Times New Roman"/>
+                <w:b w:val="false"/>
+                <w:bCs w:val="false"/>
+                <w:i w:val="false"/>
+                <w:iCs w:val="false"/>
+                <w:sz w:val="18"/>
+                <w:szCs w:val="18"/>
+              </w:rPr>
+              <w:t xml:space="preserve">0.00 (−0.04 to 0.04)</w:t>
+            </w:r>
+          </w:p>
+        </w:tc>
+      </w:tr>
+      <w:tr>
+        <w:trPr>
+          <w:tblHeader w:val="false"/>
+        </w:trPr>
+        <w:tc>
+          <w:tcPr>
+            <w:tcW w:type="dxa" w:w="2808"/>
+            <w:tcMar>
+              <w:top w:type="dxa" w:w="40"/>
+              <w:left w:type="dxa" w:w="60"/>
+              <w:bottom w:type="dxa" w:w="40"/>
+              <w:right w:type="dxa" w:w="60"/>
+            </w:tcMar>
+          </w:tcPr>
+          <w:p>
+            <w:pPr>
+              <w:jc w:val="left"/>
+            </w:pPr>
+            <w:r>
+              <w:rPr>
+                <w:rFonts w:ascii="Times New Roman" w:cs="Times New Roman" w:eastAsia="Times New Roman" w:hAnsi="Times New Roman"/>
+                <w:b w:val="false"/>
+                <w:bCs w:val="false"/>
+                <w:i w:val="false"/>
+                <w:iCs w:val="false"/>
+                <w:sz w:val="18"/>
+                <w:szCs w:val="18"/>
+              </w:rPr>
+              <w:t xml:space="preserve">HOLC grade D (vs A or B)</w:t>
+            </w:r>
+          </w:p>
+        </w:tc>
+        <w:tc>
+          <w:tcPr>
+            <w:tcW w:type="dxa" w:w="1638"/>
+            <w:tcMar>
+              <w:top w:type="dxa" w:w="40"/>
+              <w:left w:type="dxa" w:w="60"/>
+              <w:bottom w:type="dxa" w:w="40"/>
+              <w:right w:type="dxa" w:w="60"/>
+            </w:tcMar>
+          </w:tcPr>
+          <w:p>
+            <w:pPr>
+              <w:jc w:val="right"/>
+            </w:pPr>
+            <w:r>
+              <w:rPr>
+                <w:rFonts w:ascii="Times New Roman" w:cs="Times New Roman" w:eastAsia="Times New Roman" w:hAnsi="Times New Roman"/>
+                <w:b w:val="false"/>
+                <w:bCs w:val="false"/>
+                <w:i w:val="false"/>
+                <w:iCs w:val="false"/>
+                <w:sz w:val="18"/>
+                <w:szCs w:val="18"/>
+              </w:rPr>
+              <w:t xml:space="preserve">−1.29 (−2.01 to −0.58)</w:t>
+            </w:r>
+          </w:p>
+        </w:tc>
+        <w:tc>
+          <w:tcPr>
+            <w:tcW w:type="dxa" w:w="1638"/>
+            <w:tcMar>
+              <w:top w:type="dxa" w:w="40"/>
+              <w:left w:type="dxa" w:w="60"/>
+              <w:bottom w:type="dxa" w:w="40"/>
+              <w:right w:type="dxa" w:w="60"/>
+            </w:tcMar>
+          </w:tcPr>
+          <w:p>
+            <w:pPr>
+              <w:jc w:val="right"/>
+            </w:pPr>
+            <w:r>
+              <w:rPr>
+                <w:rFonts w:ascii="Times New Roman" w:cs="Times New Roman" w:eastAsia="Times New Roman" w:hAnsi="Times New Roman"/>
+                <w:b w:val="false"/>
+                <w:bCs w:val="false"/>
+                <w:i w:val="false"/>
+                <w:iCs w:val="false"/>
+                <w:sz w:val="18"/>
+                <w:szCs w:val="18"/>
+              </w:rPr>
+              <w:t xml:space="preserve">−0.30 (−1.26 to 0.65)</w:t>
+            </w:r>
+          </w:p>
+        </w:tc>
+        <w:tc>
+          <w:tcPr>
+            <w:tcW w:type="dxa" w:w="1638"/>
+            <w:tcMar>
+              <w:top w:type="dxa" w:w="40"/>
+              <w:left w:type="dxa" w:w="60"/>
+              <w:bottom w:type="dxa" w:w="40"/>
+              <w:right w:type="dxa" w:w="60"/>
+            </w:tcMar>
+          </w:tcPr>
+          <w:p>
+            <w:pPr>
+              <w:jc w:val="right"/>
+            </w:pPr>
+            <w:r>
+              <w:rPr>
+                <w:rFonts w:ascii="Times New Roman" w:cs="Times New Roman" w:eastAsia="Times New Roman" w:hAnsi="Times New Roman"/>
+                <w:b w:val="false"/>
+                <w:bCs w:val="false"/>
+                <w:i w:val="false"/>
+                <w:iCs w:val="false"/>
+                <w:sz w:val="18"/>
+                <w:szCs w:val="18"/>
+              </w:rPr>
+              <w:t xml:space="preserve">−0.46 (−0.75 to −0.17)</w:t>
+            </w:r>
+          </w:p>
+        </w:tc>
+        <w:tc>
+          <w:tcPr>
+            <w:tcW w:type="dxa" w:w="1638"/>
+            <w:tcMar>
+              <w:top w:type="dxa" w:w="40"/>
+              <w:left w:type="dxa" w:w="60"/>
+              <w:bottom w:type="dxa" w:w="40"/>
+              <w:right w:type="dxa" w:w="60"/>
+            </w:tcMar>
+          </w:tcPr>
+          <w:p>
+            <w:pPr>
+              <w:jc w:val="right"/>
+            </w:pPr>
+            <w:r>
+              <w:rPr>
+                <w:rFonts w:ascii="Times New Roman" w:cs="Times New Roman" w:eastAsia="Times New Roman" w:hAnsi="Times New Roman"/>
+                <w:b w:val="false"/>
+                <w:bCs w:val="false"/>
+                <w:i w:val="false"/>
+                <w:iCs w:val="false"/>
+                <w:sz w:val="18"/>
+                <w:szCs w:val="18"/>
+              </w:rPr>
+              <w:t xml:space="preserve">−0.23 (−0.60 to 0.15)</w:t>
+            </w:r>
+          </w:p>
+        </w:tc>
+      </w:tr>
+      <w:tr>
+        <w:trPr>
+          <w:tblHeader w:val="false"/>
+        </w:trPr>
+        <w:tc>
+          <w:tcPr>
+            <w:tcW w:type="dxa" w:w="2808"/>
+            <w:tcMar>
+              <w:top w:type="dxa" w:w="40"/>
+              <w:left w:type="dxa" w:w="60"/>
+              <w:bottom w:type="dxa" w:w="40"/>
+              <w:right w:type="dxa" w:w="60"/>
+            </w:tcMar>
+          </w:tcPr>
+          <w:p>
+            <w:pPr>
+              <w:jc w:val="left"/>
+            </w:pPr>
+            <w:r>
+              <w:rPr>
+                <w:rFonts w:ascii="Times New Roman" w:cs="Times New Roman" w:eastAsia="Times New Roman" w:hAnsi="Times New Roman"/>
+                <w:b w:val="false"/>
+                <w:bCs w:val="false"/>
+                <w:i w:val="false"/>
+                <w:iCs w:val="false"/>
+                <w:sz w:val="18"/>
+                <w:szCs w:val="18"/>
+              </w:rPr>
+              <w:t xml:space="preserve">1965–92 sites on no inventory, kernel (per SD)</w:t>
+            </w:r>
+          </w:p>
+        </w:tc>
+        <w:tc>
+          <w:tcPr>
+            <w:tcW w:type="dxa" w:w="1638"/>
+            <w:tcMar>
+              <w:top w:type="dxa" w:w="40"/>
+              <w:left w:type="dxa" w:w="60"/>
+              <w:bottom w:type="dxa" w:w="40"/>
+              <w:right w:type="dxa" w:w="60"/>
+            </w:tcMar>
+          </w:tcPr>
+          <w:p>
+            <w:pPr>
+              <w:jc w:val="right"/>
+            </w:pPr>
+            <w:r>
+              <w:rPr>
+                <w:rFonts w:ascii="Times New Roman" w:cs="Times New Roman" w:eastAsia="Times New Roman" w:hAnsi="Times New Roman"/>
+                <w:b w:val="false"/>
+                <w:bCs w:val="false"/>
+                <w:i w:val="false"/>
+                <w:iCs w:val="false"/>
+                <w:sz w:val="18"/>
+                <w:szCs w:val="18"/>
+              </w:rPr>
+              <w:t xml:space="preserve">−0.29 (−0.60 to 0.01)</w:t>
+            </w:r>
+          </w:p>
+        </w:tc>
+        <w:tc>
+          <w:tcPr>
+            <w:tcW w:type="dxa" w:w="1638"/>
+            <w:tcMar>
+              <w:top w:type="dxa" w:w="40"/>
+              <w:left w:type="dxa" w:w="60"/>
+              <w:bottom w:type="dxa" w:w="40"/>
+              <w:right w:type="dxa" w:w="60"/>
+            </w:tcMar>
+          </w:tcPr>
+          <w:p>
+            <w:pPr>
+              <w:jc w:val="right"/>
+            </w:pPr>
+            <w:r>
+              <w:rPr>
+                <w:rFonts w:ascii="Times New Roman" w:cs="Times New Roman" w:eastAsia="Times New Roman" w:hAnsi="Times New Roman"/>
+                <w:b w:val="false"/>
+                <w:bCs w:val="false"/>
+                <w:i w:val="false"/>
+                <w:iCs w:val="false"/>
+                <w:sz w:val="18"/>
+                <w:szCs w:val="18"/>
+              </w:rPr>
+              <w:t xml:space="preserve">−0.02 (−0.35 to 0.30)</w:t>
+            </w:r>
+          </w:p>
+        </w:tc>
+        <w:tc>
+          <w:tcPr>
+            <w:tcW w:type="dxa" w:w="1638"/>
+            <w:tcMar>
+              <w:top w:type="dxa" w:w="40"/>
+              <w:left w:type="dxa" w:w="60"/>
+              <w:bottom w:type="dxa" w:w="40"/>
+              <w:right w:type="dxa" w:w="60"/>
+            </w:tcMar>
+          </w:tcPr>
+          <w:p>
+            <w:pPr>
+              <w:jc w:val="right"/>
+            </w:pPr>
+            <w:r>
+              <w:rPr>
+                <w:rFonts w:ascii="Times New Roman" w:cs="Times New Roman" w:eastAsia="Times New Roman" w:hAnsi="Times New Roman"/>
+                <w:b w:val="false"/>
+                <w:bCs w:val="false"/>
+                <w:i w:val="false"/>
+                <w:iCs w:val="false"/>
+                <w:sz w:val="18"/>
+                <w:szCs w:val="18"/>
+              </w:rPr>
+              <w:t xml:space="preserve">−0.13 (−0.23 to −0.03)</w:t>
+            </w:r>
+          </w:p>
+        </w:tc>
+        <w:tc>
+          <w:tcPr>
+            <w:tcW w:type="dxa" w:w="1638"/>
+            <w:tcMar>
+              <w:top w:type="dxa" w:w="40"/>
+              <w:left w:type="dxa" w:w="60"/>
+              <w:bottom w:type="dxa" w:w="40"/>
+              <w:right w:type="dxa" w:w="60"/>
+            </w:tcMar>
+          </w:tcPr>
+          <w:p>
+            <w:pPr>
+              <w:jc w:val="right"/>
+            </w:pPr>
+            <w:r>
+              <w:rPr>
+                <w:rFonts w:ascii="Times New Roman" w:cs="Times New Roman" w:eastAsia="Times New Roman" w:hAnsi="Times New Roman"/>
+                <w:b w:val="false"/>
+                <w:bCs w:val="false"/>
+                <w:i w:val="false"/>
+                <w:iCs w:val="false"/>
+                <w:sz w:val="18"/>
+                <w:szCs w:val="18"/>
+              </w:rPr>
+              <w:t xml:space="preserve">−0.06 (−0.16 to 0.05)</w:t>
+            </w:r>
+          </w:p>
+        </w:tc>
+      </w:tr>
+      <w:tr>
+        <w:trPr>
+          <w:tblHeader w:val="false"/>
+        </w:trPr>
+        <w:tc>
+          <w:tcPr>
+            <w:tcW w:type="dxa" w:w="2808"/>
+            <w:tcMar>
+              <w:top w:type="dxa" w:w="40"/>
+              <w:left w:type="dxa" w:w="60"/>
+              <w:bottom w:type="dxa" w:w="40"/>
+              <w:right w:type="dxa" w:w="60"/>
+            </w:tcMar>
+          </w:tcPr>
+          <w:p>
+            <w:pPr>
+              <w:jc w:val="left"/>
+            </w:pPr>
+            <w:r>
+              <w:rPr>
+                <w:rFonts w:ascii="Times New Roman" w:cs="Times New Roman" w:eastAsia="Times New Roman" w:hAnsi="Times New Roman"/>
+                <w:b w:val="false"/>
+                <w:bCs w:val="false"/>
+                <w:i w:val="false"/>
+                <w:iCs w:val="false"/>
+                <w:sz w:val="18"/>
+                <w:szCs w:val="18"/>
+              </w:rPr>
+              <w:t xml:space="preserve">1965–92 sites on an inventory, kernel (per SD)</w:t>
+            </w:r>
+          </w:p>
+        </w:tc>
+        <w:tc>
+          <w:tcPr>
+            <w:tcW w:type="dxa" w:w="1638"/>
+            <w:tcMar>
+              <w:top w:type="dxa" w:w="40"/>
+              <w:left w:type="dxa" w:w="60"/>
+              <w:bottom w:type="dxa" w:w="40"/>
+              <w:right w:type="dxa" w:w="60"/>
+            </w:tcMar>
+          </w:tcPr>
+          <w:p>
+            <w:pPr>
+              <w:jc w:val="right"/>
+            </w:pPr>
+            <w:r>
+              <w:rPr>
+                <w:rFonts w:ascii="Times New Roman" w:cs="Times New Roman" w:eastAsia="Times New Roman" w:hAnsi="Times New Roman"/>
+                <w:b w:val="false"/>
+                <w:bCs w:val="false"/>
+                <w:i w:val="false"/>
+                <w:iCs w:val="false"/>
+                <w:sz w:val="18"/>
+                <w:szCs w:val="18"/>
+              </w:rPr>
+              <w:t xml:space="preserve">−0.53 (−0.84 to −0.22)</w:t>
+            </w:r>
+          </w:p>
+        </w:tc>
+        <w:tc>
+          <w:tcPr>
+            <w:tcW w:type="dxa" w:w="1638"/>
+            <w:tcMar>
+              <w:top w:type="dxa" w:w="40"/>
+              <w:left w:type="dxa" w:w="60"/>
+              <w:bottom w:type="dxa" w:w="40"/>
+              <w:right w:type="dxa" w:w="60"/>
+            </w:tcMar>
+          </w:tcPr>
+          <w:p>
+            <w:pPr>
+              <w:jc w:val="right"/>
+            </w:pPr>
+            <w:r>
+              <w:rPr>
+                <w:rFonts w:ascii="Times New Roman" w:cs="Times New Roman" w:eastAsia="Times New Roman" w:hAnsi="Times New Roman"/>
+                <w:b w:val="false"/>
+                <w:bCs w:val="false"/>
+                <w:i w:val="false"/>
+                <w:iCs w:val="false"/>
+                <w:sz w:val="18"/>
+                <w:szCs w:val="18"/>
+              </w:rPr>
+              <w:t xml:space="preserve">−0.24 (−0.62 to 0.13)</w:t>
+            </w:r>
+          </w:p>
+        </w:tc>
+        <w:tc>
+          <w:tcPr>
+            <w:tcW w:type="dxa" w:w="1638"/>
+            <w:tcMar>
+              <w:top w:type="dxa" w:w="40"/>
+              <w:left w:type="dxa" w:w="60"/>
+              <w:bottom w:type="dxa" w:w="40"/>
+              <w:right w:type="dxa" w:w="60"/>
+            </w:tcMar>
+          </w:tcPr>
+          <w:p>
+            <w:pPr>
+              <w:jc w:val="right"/>
+            </w:pPr>
+            <w:r>
+              <w:rPr>
+                <w:rFonts w:ascii="Times New Roman" w:cs="Times New Roman" w:eastAsia="Times New Roman" w:hAnsi="Times New Roman"/>
+                <w:b w:val="false"/>
+                <w:bCs w:val="false"/>
+                <w:i w:val="false"/>
+                <w:iCs w:val="false"/>
+                <w:sz w:val="18"/>
+                <w:szCs w:val="18"/>
+              </w:rPr>
+              <w:t xml:space="preserve">−0.11 (−0.20 to −0.01)</w:t>
+            </w:r>
+          </w:p>
+        </w:tc>
+        <w:tc>
+          <w:tcPr>
+            <w:tcW w:type="dxa" w:w="1638"/>
+            <w:tcMar>
+              <w:top w:type="dxa" w:w="40"/>
+              <w:left w:type="dxa" w:w="60"/>
+              <w:bottom w:type="dxa" w:w="40"/>
+              <w:right w:type="dxa" w:w="60"/>
+            </w:tcMar>
+          </w:tcPr>
+          <w:p>
+            <w:pPr>
+              <w:jc w:val="right"/>
+            </w:pPr>
+            <w:r>
+              <w:rPr>
+                <w:rFonts w:ascii="Times New Roman" w:cs="Times New Roman" w:eastAsia="Times New Roman" w:hAnsi="Times New Roman"/>
+                <w:b w:val="false"/>
+                <w:bCs w:val="false"/>
+                <w:i w:val="false"/>
+                <w:iCs w:val="false"/>
+                <w:sz w:val="18"/>
+                <w:szCs w:val="18"/>
+              </w:rPr>
+              <w:t xml:space="preserve">0.00 (−0.11 to 0.12)</w:t>
+            </w:r>
+          </w:p>
+        </w:tc>
+      </w:tr>
+    </w:tbl>
+    <w:p>
+      <w:pPr>
+        <w:spacing w:after="120"/>
+      </w:pPr>
+    </w:p>
+    <w:p>
+      <w:pPr>
+        <w:spacing w:after="160" w:line="360"/>
+        <w:jc w:val="both"/>
+      </w:pPr>
+      <w:r>
+        <w:rPr>
+          <w:rFonts w:ascii="Times New Roman" w:cs="Times New Roman" w:eastAsia="Times New Roman" w:hAnsi="Times New Roman"/>
+          <w:b w:val="false"/>
+          <w:bCs w:val="false"/>
+          <w:i w:val="false"/>
+          <w:iCs w:val="false"/>
+          <w:sz w:val="24"/>
+          <w:szCs w:val="24"/>
+        </w:rPr>
+        <w:t xml:space="preserve">Difference in age at death, in years (95% CI). Each row is a separate model; the HOLC row includes indicators for C and ungraded addresses. Men, deaths 1975–2020: CenSoc-DMF, 8,390 people; men and women, deaths 1988–2005: CenSoc-Numident, 13,376 people. Address-level exposures as in Section 5; the 1965–92 sites as in Section 6.</w:t>
+      </w:r>
+    </w:p>
+    <w:p>
+      <w:pPr>
+        <w:spacing w:after="160" w:line="360"/>
+        <w:jc w:val="both"/>
+      </w:pPr>
+      <w:r>
+        <w:rPr>
+          <w:rFonts w:ascii="Times New Roman" w:cs="Times New Roman" w:eastAsia="Times New Roman" w:hAnsi="Times New Roman"/>
+          <w:b w:val="false"/>
+          <w:bCs w:val="false"/>
+          <w:i w:val="false"/>
+          <w:iCs w:val="false"/>
+          <w:sz w:val="24"/>
+          <w:szCs w:val="24"/>
+        </w:rPr>
+        <w:t xml:space="preserve">Men who lived in 1940 in a 1929 industrial district died 1.6 years younger than other Denver men born the same year, and about a year younger once their own and their household's 1940 circumstances are held constant; each further ten points of industrial land within 250 m of the home came with 0.2 years less of life, an estimate that holds with the hazardous trades and commercial land in the same model (−0.20, −0.36 to −0.04). The placebo shows nothing. The hazardous trades themselves, measured as firms rather than land, add little once household circumstances are controlled; and the HOLC D gap, more than a year for men without controls, shrinks to a third of a year with them, so the grade mostly stands for who lived there. Two features limit the reading. Within a single 1940 enumeration district the industrial-land gradient disappears (−0.03, −0.24 to 0.18), so the difference lies between neighbourhoods and could still reflect something about them other than the industry. And the Numident file, which adds women but observes only deaths at 65 and over in 1988–2005, shows the same signs much attenuated and nothing after controls, which suggests that what differed was mainly earlier death among men. The 1965–92 sites near a 1940 address show no association once household circumstances are controlled. Read together with the block models, the historical sites are associated with mortality where they were large and industrial in character, and the hidden sites, the small shops on mixed blocks, are not associated with it on any of the three designs.</w:t>
       </w:r>
     </w:p>
     <w:p>
@@ -43812,6 +45258,53 @@
           <w:sz w:val="24"/>
           <w:szCs w:val="24"/>
         </w:rPr>
+        <w:t xml:space="preserve">Breen, C. F., Osborne, M. and Goldstein, J. R. (2023) CenSoc: public linked administrative mortality records for individuals from the 1940 census. </w:t>
+      </w:r>
+      <w:r>
+        <w:rPr>
+          <w:rFonts w:ascii="Times New Roman" w:cs="Times New Roman" w:eastAsia="Times New Roman" w:hAnsi="Times New Roman"/>
+          <w:b w:val="false"/>
+          <w:bCs w:val="false"/>
+          <w:i/>
+          <w:iCs/>
+          <w:sz w:val="24"/>
+          <w:szCs w:val="24"/>
+        </w:rPr>
+        <w:t xml:space="preserve">Scientific Data</w:t>
+      </w:r>
+      <w:r>
+        <w:rPr>
+          <w:rFonts w:ascii="Times New Roman" w:cs="Times New Roman" w:eastAsia="Times New Roman" w:hAnsi="Times New Roman"/>
+          <w:b w:val="false"/>
+          <w:bCs w:val="false"/>
+          <w:i w:val="false"/>
+          <w:iCs w:val="false"/>
+          <w:sz w:val="24"/>
+          <w:szCs w:val="24"/>
+        </w:rPr>
+        <w:t xml:space="preserve"> 10: 802.</w:t>
+      </w:r>
+    </w:p>
+    <w:p>
+      <w:pPr>
+        <w:pStyle w:val="ListParagraph"/>
+        <w:numPr>
+          <w:ilvl w:val="0"/>
+          <w:numId w:val="4"/>
+        </w:numPr>
+        <w:spacing w:after="120" w:line="340"/>
+        <w:jc w:val="both"/>
+      </w:pPr>
+      <w:r>
+        <w:rPr>
+          <w:rFonts w:ascii="Times New Roman" w:cs="Times New Roman" w:eastAsia="Times New Roman" w:hAnsi="Times New Roman"/>
+          <w:b w:val="false"/>
+          <w:bCs w:val="false"/>
+          <w:i w:val="false"/>
+          <w:iCs w:val="false"/>
+          <w:sz w:val="24"/>
+          <w:szCs w:val="24"/>
+        </w:rPr>
         <w:t xml:space="preserve">Drummond, M. A., Stier, M. P. and Diffendorfer, J. E. (2019) Historical land use and land cover for assessing the northern Colorado Front Range urban landscape. </w:t>
       </w:r>
       <w:r>

</xml_diff>

<commit_message>
CenSoc extensions, enlistment, residential histories; site and paper
</commit_message>
<xml_diff>
--- a/paper/Before_and_After_the_Map_manuscript.docx
+++ b/paper/Before_and_After_the_Map_manuscript.docx
@@ -44160,6 +44160,1162 @@
           <w:szCs w:val="24"/>
         </w:rPr>
         <w:t xml:space="preserve">Men who lived in 1940 in a 1929 industrial district died 1.6 years younger than other Denver men born the same year, and about a year younger once their own and their household's 1940 circumstances are held constant; each further ten points of industrial land within 250 m of the home came with 0.2 years less of life, an estimate that holds with the hazardous trades and commercial land in the same model (−0.20, −0.36 to −0.04). The placebo shows nothing. The hazardous trades themselves, measured as firms rather than land, add little once household circumstances are controlled; and the HOLC D gap, more than a year for men without controls, shrinks to a third of a year with them, so the grade mostly stands for who lived there. Two features limit the reading. Within a single 1940 enumeration district the industrial-land gradient disappears (−0.03, −0.24 to 0.18), so the difference lies between neighbourhoods and could still reflect something about them other than the industry. And the Numident file, which adds women but observes only deaths at 65 and over in 1988–2005, shows the same signs much attenuated and nothing after controls, which suggests that what differed was mainly earlier death among men. The 1965–92 sites near a 1940 address show no association once household circumstances are controlled. Read together with the block models, the historical sites are associated with mortality where they were large and industrial in character, and the hidden sites, the small shops on mixed blocks, are not associated with it on any of the three designs.</w:t>
+      </w:r>
+    </w:p>
+    <w:p>
+      <w:pPr>
+        <w:spacing w:after="160" w:line="360"/>
+        <w:jc w:val="both"/>
+      </w:pPr>
+      <w:r>
+        <w:rPr>
+          <w:rFonts w:ascii="Times New Roman" w:cs="Times New Roman" w:eastAsia="Times New Roman" w:hAnsi="Times New Roman"/>
+          <w:b/>
+          <w:bCs/>
+          <w:i w:val="false"/>
+          <w:iCs w:val="false"/>
+          <w:sz w:val="24"/>
+          <w:szCs w:val="24"/>
+        </w:rPr>
+        <w:t xml:space="preserve">Further checks.</w:t>
+      </w:r>
+      <w:r>
+        <w:rPr>
+          <w:rFonts w:ascii="Times New Roman" w:cs="Times New Roman" w:eastAsia="Times New Roman" w:hAnsi="Times New Roman"/>
+          <w:b w:val="false"/>
+          <w:bCs w:val="false"/>
+          <w:i w:val="false"/>
+          <w:iCs w:val="false"/>
+          <w:sz w:val="24"/>
+          <w:szCs w:val="24"/>
+        </w:rPr>
+        <w:t xml:space="preserve"> Five checks bear on how far the men's estimates can be read. (i) The gap is concentrated among men aged 15–29 in 1940: −1.62 years (−3.09 to −0.14) for a 1929 industrial district and −0.43 (−0.67 to −0.19) per ten points of industrial land, against nothing measurable for boys under 15 and a smaller, imprecise gap for men 30 and over. (ii) It is not the men's work. A job in a hazardous industry in 1940 shows no association (0.23, −0.58 to 1.04), and the address estimates hold with the man's own industry, or his household head's, in the model (industrial land −0.19, −0.35 to −0.03; hazardous trade within 500 m −0.79, −1.32 to −0.27 among men in the labour force). (iii) It is not selective out-migration or selective linkage: in the Numident file, residents of industrial addresses were as likely as others to die in the Denver area (57% and 53%), and in each death file they were linked about as often (9.4% and 10.7% of men aged 0–50 in the DMF file; 8.1% and 7.9% in the Numident file). (iv) It is driven by the white non-Hispanic majority (industrial district −1.17 years, −2.08 to −0.26); there were too few linked Hispanic and Black men to estimate their gaps. (v) The doubly-truncated Gompertz model that CenSoc recommends, fitted to men's deaths in 1975–2005, points the same way for the industrial district (hazard ratio 1.09, 0.94–1.26) and the D grade (1.12, 0.99–1.28) but is not statistically clear, and shows nothing for industrial land (0.99, 0.96–1.02). The mortality evidence for the 1940 address is therefore suggestive rather than settled. Tracing residents to their 1910–1930 Denver addresses through the IPUMS Multigenerational Longitudinal Panel did not strengthen it: neither the number of censuses lived near a hazardous trade nor a childhood address near one predicts age at death beyond the 1940 address. Nor did the freeways: the roughly 700 linked residents who lived in 1940 where a freeway was later built, or on residential land cleared by 1977, died at the same ages as their neighbours, although those addresses were far more Hispanic than the rest of the city in 1940 (15% against 4%).</w:t>
+      </w:r>
+    </w:p>
+    <w:p>
+      <w:pPr>
+        <w:spacing w:after="160" w:line="360"/>
+        <w:jc w:val="both"/>
+      </w:pPr>
+      <w:r>
+        <w:rPr>
+          <w:rFonts w:ascii="Times New Roman" w:cs="Times New Roman" w:eastAsia="Times New Roman" w:hAnsi="Times New Roman"/>
+          <w:b/>
+          <w:bCs/>
+          <w:i w:val="false"/>
+          <w:iCs w:val="false"/>
+          <w:sz w:val="24"/>
+          <w:szCs w:val="24"/>
+        </w:rPr>
+        <w:t xml:space="preserve">At enlistment.</w:t>
+      </w:r>
+      <w:r>
+        <w:rPr>
+          <w:rFonts w:ascii="Times New Roman" w:cs="Times New Roman" w:eastAsia="Times New Roman" w:hAnsi="Times New Roman"/>
+          <w:b w:val="false"/>
+          <w:bCs w:val="false"/>
+          <w:i w:val="false"/>
+          <w:iCs w:val="false"/>
+          <w:sz w:val="24"/>
+          <w:szCs w:val="24"/>
+        </w:rPr>
+        <w:t xml:space="preserve"> CenSoc also links the 1940 census to the Second World War Army enlistment records, which give schooling for every enlistee and height and weight for those who enlisted before March 1943. Among Denver men born 1905–1927 who enlisted from civilian life, the same models (with birth-year and enlistment-year effects) give the results in Table 23.</w:t>
+      </w:r>
+    </w:p>
+    <w:p>
+      <w:pPr>
+        <w:spacing w:after="80" w:before="240"/>
+      </w:pPr>
+      <w:r>
+        <w:rPr>
+          <w:rFonts w:ascii="Times New Roman" w:cs="Times New Roman" w:eastAsia="Times New Roman" w:hAnsi="Times New Roman"/>
+          <w:b/>
+          <w:bCs/>
+          <w:sz w:val="20"/>
+          <w:szCs w:val="20"/>
+        </w:rPr>
+        <w:t xml:space="preserve">Table 23. Exposure at the 1940 address and young men's schooling, height and weight at Second World War Army enlistment (CenSoc enlistment records)</w:t>
+      </w:r>
+    </w:p>
+    <w:tbl>
+      <w:tblPr>
+        <w:tblW w:type="dxa" w:w="9360"/>
+        <w:tblBorders>
+          <w:top w:val="single" w:sz="6"/>
+          <w:left w:val="none"/>
+          <w:bottom w:val="single" w:sz="6"/>
+          <w:right w:val="none"/>
+          <w:insideH w:val="single" w:color="BBBBBB" w:sz="2"/>
+          <w:insideV w:val="none"/>
+        </w:tblBorders>
+      </w:tblPr>
+      <w:tblGrid>
+        <w:gridCol w:w="2808"/>
+        <w:gridCol w:w="1638"/>
+        <w:gridCol w:w="1638"/>
+        <w:gridCol w:w="1638"/>
+        <w:gridCol w:w="1638"/>
+      </w:tblGrid>
+      <w:tr>
+        <w:trPr>
+          <w:tblHeader/>
+        </w:trPr>
+        <w:tc>
+          <w:tcPr>
+            <w:tcW w:type="dxa" w:w="2808"/>
+            <w:shd w:fill="EDEDED" w:color="auto" w:val="clear"/>
+            <w:tcMar>
+              <w:top w:type="dxa" w:w="40"/>
+              <w:left w:type="dxa" w:w="60"/>
+              <w:bottom w:type="dxa" w:w="40"/>
+              <w:right w:type="dxa" w:w="60"/>
+            </w:tcMar>
+          </w:tcPr>
+          <w:p>
+            <w:pPr>
+              <w:jc w:val="left"/>
+            </w:pPr>
+            <w:r>
+              <w:rPr>
+                <w:rFonts w:ascii="Times New Roman" w:cs="Times New Roman" w:eastAsia="Times New Roman" w:hAnsi="Times New Roman"/>
+                <w:b/>
+                <w:bCs/>
+                <w:i w:val="false"/>
+                <w:iCs w:val="false"/>
+                <w:sz w:val="18"/>
+                <w:szCs w:val="18"/>
+              </w:rPr>
+              <w:t xml:space="preserve">exposure at the 1940 address</w:t>
+            </w:r>
+          </w:p>
+        </w:tc>
+        <w:tc>
+          <w:tcPr>
+            <w:tcW w:type="dxa" w:w="1638"/>
+            <w:shd w:fill="EDEDED" w:color="auto" w:val="clear"/>
+            <w:tcMar>
+              <w:top w:type="dxa" w:w="40"/>
+              <w:left w:type="dxa" w:w="60"/>
+              <w:bottom w:type="dxa" w:w="40"/>
+              <w:right w:type="dxa" w:w="60"/>
+            </w:tcMar>
+          </w:tcPr>
+          <w:p>
+            <w:pPr>
+              <w:jc w:val="right"/>
+            </w:pPr>
+            <w:r>
+              <w:rPr>
+                <w:rFonts w:ascii="Times New Roman" w:cs="Times New Roman" w:eastAsia="Times New Roman" w:hAnsi="Times New Roman"/>
+                <w:b/>
+                <w:bCs/>
+                <w:i w:val="false"/>
+                <w:iCs w:val="false"/>
+                <w:sz w:val="18"/>
+                <w:szCs w:val="18"/>
+              </w:rPr>
+              <w:t xml:space="preserve">years of schooling</w:t>
+            </w:r>
+          </w:p>
+        </w:tc>
+        <w:tc>
+          <w:tcPr>
+            <w:tcW w:type="dxa" w:w="1638"/>
+            <w:shd w:fill="EDEDED" w:color="auto" w:val="clear"/>
+            <w:tcMar>
+              <w:top w:type="dxa" w:w="40"/>
+              <w:left w:type="dxa" w:w="60"/>
+              <w:bottom w:type="dxa" w:w="40"/>
+              <w:right w:type="dxa" w:w="60"/>
+            </w:tcMar>
+          </w:tcPr>
+          <w:p>
+            <w:pPr>
+              <w:jc w:val="right"/>
+            </w:pPr>
+            <w:r>
+              <w:rPr>
+                <w:rFonts w:ascii="Times New Roman" w:cs="Times New Roman" w:eastAsia="Times New Roman" w:hAnsi="Times New Roman"/>
+                <w:b/>
+                <w:bCs/>
+                <w:i w:val="false"/>
+                <w:iCs w:val="false"/>
+                <w:sz w:val="18"/>
+                <w:szCs w:val="18"/>
+              </w:rPr>
+              <w:t xml:space="preserve">height (inches)</w:t>
+            </w:r>
+          </w:p>
+        </w:tc>
+        <w:tc>
+          <w:tcPr>
+            <w:tcW w:type="dxa" w:w="1638"/>
+            <w:shd w:fill="EDEDED" w:color="auto" w:val="clear"/>
+            <w:tcMar>
+              <w:top w:type="dxa" w:w="40"/>
+              <w:left w:type="dxa" w:w="60"/>
+              <w:bottom w:type="dxa" w:w="40"/>
+              <w:right w:type="dxa" w:w="60"/>
+            </w:tcMar>
+          </w:tcPr>
+          <w:p>
+            <w:pPr>
+              <w:jc w:val="right"/>
+            </w:pPr>
+            <w:r>
+              <w:rPr>
+                <w:rFonts w:ascii="Times New Roman" w:cs="Times New Roman" w:eastAsia="Times New Roman" w:hAnsi="Times New Roman"/>
+                <w:b/>
+                <w:bCs/>
+                <w:i w:val="false"/>
+                <w:iCs w:val="false"/>
+                <w:sz w:val="18"/>
+                <w:szCs w:val="18"/>
+              </w:rPr>
+              <w:t xml:space="preserve">weight (pounds)</w:t>
+            </w:r>
+          </w:p>
+        </w:tc>
+        <w:tc>
+          <w:tcPr>
+            <w:tcW w:type="dxa" w:w="1638"/>
+            <w:shd w:fill="EDEDED" w:color="auto" w:val="clear"/>
+            <w:tcMar>
+              <w:top w:type="dxa" w:w="40"/>
+              <w:left w:type="dxa" w:w="60"/>
+              <w:bottom w:type="dxa" w:w="40"/>
+              <w:right w:type="dxa" w:w="60"/>
+            </w:tcMar>
+          </w:tcPr>
+          <w:p>
+            <w:pPr>
+              <w:jc w:val="right"/>
+            </w:pPr>
+            <w:r>
+              <w:rPr>
+                <w:rFonts w:ascii="Times New Roman" w:cs="Times New Roman" w:eastAsia="Times New Roman" w:hAnsi="Times New Roman"/>
+                <w:b/>
+                <w:bCs/>
+                <w:i w:val="false"/>
+                <w:iCs w:val="false"/>
+                <w:sz w:val="18"/>
+                <w:szCs w:val="18"/>
+              </w:rPr>
+              <w:t xml:space="preserve">years of schooling, boys aged 0–17 in 1940</w:t>
+            </w:r>
+          </w:p>
+        </w:tc>
+      </w:tr>
+      <w:tr>
+        <w:trPr>
+          <w:tblHeader w:val="false"/>
+        </w:trPr>
+        <w:tc>
+          <w:tcPr>
+            <w:tcW w:type="dxa" w:w="2808"/>
+            <w:tcMar>
+              <w:top w:type="dxa" w:w="40"/>
+              <w:left w:type="dxa" w:w="60"/>
+              <w:bottom w:type="dxa" w:w="40"/>
+              <w:right w:type="dxa" w:w="60"/>
+            </w:tcMar>
+          </w:tcPr>
+          <w:p>
+            <w:pPr>
+              <w:jc w:val="left"/>
+            </w:pPr>
+            <w:r>
+              <w:rPr>
+                <w:rFonts w:ascii="Times New Roman" w:cs="Times New Roman" w:eastAsia="Times New Roman" w:hAnsi="Times New Roman"/>
+                <w:b w:val="false"/>
+                <w:bCs w:val="false"/>
+                <w:i w:val="false"/>
+                <w:iCs w:val="false"/>
+                <w:sz w:val="18"/>
+                <w:szCs w:val="18"/>
+              </w:rPr>
+              <w:t xml:space="preserve">1929 industrial district</w:t>
+            </w:r>
+          </w:p>
+        </w:tc>
+        <w:tc>
+          <w:tcPr>
+            <w:tcW w:type="dxa" w:w="1638"/>
+            <w:tcMar>
+              <w:top w:type="dxa" w:w="40"/>
+              <w:left w:type="dxa" w:w="60"/>
+              <w:bottom w:type="dxa" w:w="40"/>
+              <w:right w:type="dxa" w:w="60"/>
+            </w:tcMar>
+          </w:tcPr>
+          <w:p>
+            <w:pPr>
+              <w:jc w:val="right"/>
+            </w:pPr>
+            <w:r>
+              <w:rPr>
+                <w:rFonts w:ascii="Times New Roman" w:cs="Times New Roman" w:eastAsia="Times New Roman" w:hAnsi="Times New Roman"/>
+                <w:b w:val="false"/>
+                <w:bCs w:val="false"/>
+                <w:i w:val="false"/>
+                <w:iCs w:val="false"/>
+                <w:sz w:val="18"/>
+                <w:szCs w:val="18"/>
+              </w:rPr>
+              <w:t xml:space="preserve">−0.51 (−0.78 to −0.24)</w:t>
+            </w:r>
+          </w:p>
+        </w:tc>
+        <w:tc>
+          <w:tcPr>
+            <w:tcW w:type="dxa" w:w="1638"/>
+            <w:tcMar>
+              <w:top w:type="dxa" w:w="40"/>
+              <w:left w:type="dxa" w:w="60"/>
+              <w:bottom w:type="dxa" w:w="40"/>
+              <w:right w:type="dxa" w:w="60"/>
+            </w:tcMar>
+          </w:tcPr>
+          <w:p>
+            <w:pPr>
+              <w:jc w:val="right"/>
+            </w:pPr>
+            <w:r>
+              <w:rPr>
+                <w:rFonts w:ascii="Times New Roman" w:cs="Times New Roman" w:eastAsia="Times New Roman" w:hAnsi="Times New Roman"/>
+                <w:b w:val="false"/>
+                <w:bCs w:val="false"/>
+                <w:i w:val="false"/>
+                <w:iCs w:val="false"/>
+                <w:sz w:val="18"/>
+                <w:szCs w:val="18"/>
+              </w:rPr>
+              <w:t xml:space="preserve">−0.85 (−1.44 to −0.26)</w:t>
+            </w:r>
+          </w:p>
+        </w:tc>
+        <w:tc>
+          <w:tcPr>
+            <w:tcW w:type="dxa" w:w="1638"/>
+            <w:tcMar>
+              <w:top w:type="dxa" w:w="40"/>
+              <w:left w:type="dxa" w:w="60"/>
+              <w:bottom w:type="dxa" w:w="40"/>
+              <w:right w:type="dxa" w:w="60"/>
+            </w:tcMar>
+          </w:tcPr>
+          <w:p>
+            <w:pPr>
+              <w:jc w:val="right"/>
+            </w:pPr>
+            <w:r>
+              <w:rPr>
+                <w:rFonts w:ascii="Times New Roman" w:cs="Times New Roman" w:eastAsia="Times New Roman" w:hAnsi="Times New Roman"/>
+                <w:b w:val="false"/>
+                <w:bCs w:val="false"/>
+                <w:i w:val="false"/>
+                <w:iCs w:val="false"/>
+                <w:sz w:val="18"/>
+                <w:szCs w:val="18"/>
+              </w:rPr>
+              <w:t xml:space="preserve">−3.7 (−8.2 to 0.8)</w:t>
+            </w:r>
+          </w:p>
+        </w:tc>
+        <w:tc>
+          <w:tcPr>
+            <w:tcW w:type="dxa" w:w="1638"/>
+            <w:tcMar>
+              <w:top w:type="dxa" w:w="40"/>
+              <w:left w:type="dxa" w:w="60"/>
+              <w:bottom w:type="dxa" w:w="40"/>
+              <w:right w:type="dxa" w:w="60"/>
+            </w:tcMar>
+          </w:tcPr>
+          <w:p>
+            <w:pPr>
+              <w:jc w:val="right"/>
+            </w:pPr>
+            <w:r>
+              <w:rPr>
+                <w:rFonts w:ascii="Times New Roman" w:cs="Times New Roman" w:eastAsia="Times New Roman" w:hAnsi="Times New Roman"/>
+                <w:b w:val="false"/>
+                <w:bCs w:val="false"/>
+                <w:i w:val="false"/>
+                <w:iCs w:val="false"/>
+                <w:sz w:val="18"/>
+                <w:szCs w:val="18"/>
+              </w:rPr>
+              <w:t xml:space="preserve">−0.60 (−0.97 to −0.23)</w:t>
+            </w:r>
+          </w:p>
+        </w:tc>
+      </w:tr>
+      <w:tr>
+        <w:trPr>
+          <w:tblHeader w:val="false"/>
+        </w:trPr>
+        <w:tc>
+          <w:tcPr>
+            <w:tcW w:type="dxa" w:w="2808"/>
+            <w:tcMar>
+              <w:top w:type="dxa" w:w="40"/>
+              <w:left w:type="dxa" w:w="60"/>
+              <w:bottom w:type="dxa" w:w="40"/>
+              <w:right w:type="dxa" w:w="60"/>
+            </w:tcMar>
+          </w:tcPr>
+          <w:p>
+            <w:pPr>
+              <w:jc w:val="left"/>
+            </w:pPr>
+            <w:r>
+              <w:rPr>
+                <w:rFonts w:ascii="Times New Roman" w:cs="Times New Roman" w:eastAsia="Times New Roman" w:hAnsi="Times New Roman"/>
+                <w:b w:val="false"/>
+                <w:bCs w:val="false"/>
+                <w:i w:val="false"/>
+                <w:iCs w:val="false"/>
+                <w:sz w:val="18"/>
+                <w:szCs w:val="18"/>
+              </w:rPr>
+              <w:t xml:space="preserve">industrial land within 250 m, 1937 (per 10 points)</w:t>
+            </w:r>
+          </w:p>
+        </w:tc>
+        <w:tc>
+          <w:tcPr>
+            <w:tcW w:type="dxa" w:w="1638"/>
+            <w:tcMar>
+              <w:top w:type="dxa" w:w="40"/>
+              <w:left w:type="dxa" w:w="60"/>
+              <w:bottom w:type="dxa" w:w="40"/>
+              <w:right w:type="dxa" w:w="60"/>
+            </w:tcMar>
+          </w:tcPr>
+          <w:p>
+            <w:pPr>
+              <w:jc w:val="right"/>
+            </w:pPr>
+            <w:r>
+              <w:rPr>
+                <w:rFonts w:ascii="Times New Roman" w:cs="Times New Roman" w:eastAsia="Times New Roman" w:hAnsi="Times New Roman"/>
+                <w:b w:val="false"/>
+                <w:bCs w:val="false"/>
+                <w:i w:val="false"/>
+                <w:iCs w:val="false"/>
+                <w:sz w:val="18"/>
+                <w:szCs w:val="18"/>
+              </w:rPr>
+              <w:t xml:space="preserve">−0.09 (−0.13 to −0.05)</w:t>
+            </w:r>
+          </w:p>
+        </w:tc>
+        <w:tc>
+          <w:tcPr>
+            <w:tcW w:type="dxa" w:w="1638"/>
+            <w:tcMar>
+              <w:top w:type="dxa" w:w="40"/>
+              <w:left w:type="dxa" w:w="60"/>
+              <w:bottom w:type="dxa" w:w="40"/>
+              <w:right w:type="dxa" w:w="60"/>
+            </w:tcMar>
+          </w:tcPr>
+          <w:p>
+            <w:pPr>
+              <w:jc w:val="right"/>
+            </w:pPr>
+            <w:r>
+              <w:rPr>
+                <w:rFonts w:ascii="Times New Roman" w:cs="Times New Roman" w:eastAsia="Times New Roman" w:hAnsi="Times New Roman"/>
+                <w:b w:val="false"/>
+                <w:bCs w:val="false"/>
+                <w:i w:val="false"/>
+                <w:iCs w:val="false"/>
+                <w:sz w:val="18"/>
+                <w:szCs w:val="18"/>
+              </w:rPr>
+              <w:t xml:space="preserve">−0.01 (−0.14 to 0.12)</w:t>
+            </w:r>
+          </w:p>
+        </w:tc>
+        <w:tc>
+          <w:tcPr>
+            <w:tcW w:type="dxa" w:w="1638"/>
+            <w:tcMar>
+              <w:top w:type="dxa" w:w="40"/>
+              <w:left w:type="dxa" w:w="60"/>
+              <w:bottom w:type="dxa" w:w="40"/>
+              <w:right w:type="dxa" w:w="60"/>
+            </w:tcMar>
+          </w:tcPr>
+          <w:p>
+            <w:pPr>
+              <w:jc w:val="right"/>
+            </w:pPr>
+            <w:r>
+              <w:rPr>
+                <w:rFonts w:ascii="Times New Roman" w:cs="Times New Roman" w:eastAsia="Times New Roman" w:hAnsi="Times New Roman"/>
+                <w:b w:val="false"/>
+                <w:bCs w:val="false"/>
+                <w:i w:val="false"/>
+                <w:iCs w:val="false"/>
+                <w:sz w:val="18"/>
+                <w:szCs w:val="18"/>
+              </w:rPr>
+              <w:t xml:space="preserve">0.0 (−1.0 to 0.9)</w:t>
+            </w:r>
+          </w:p>
+        </w:tc>
+        <w:tc>
+          <w:tcPr>
+            <w:tcW w:type="dxa" w:w="1638"/>
+            <w:tcMar>
+              <w:top w:type="dxa" w:w="40"/>
+              <w:left w:type="dxa" w:w="60"/>
+              <w:bottom w:type="dxa" w:w="40"/>
+              <w:right w:type="dxa" w:w="60"/>
+            </w:tcMar>
+          </w:tcPr>
+          <w:p>
+            <w:pPr>
+              <w:jc w:val="right"/>
+            </w:pPr>
+            <w:r>
+              <w:rPr>
+                <w:rFonts w:ascii="Times New Roman" w:cs="Times New Roman" w:eastAsia="Times New Roman" w:hAnsi="Times New Roman"/>
+                <w:b w:val="false"/>
+                <w:bCs w:val="false"/>
+                <w:i w:val="false"/>
+                <w:iCs w:val="false"/>
+                <w:sz w:val="18"/>
+                <w:szCs w:val="18"/>
+              </w:rPr>
+              <w:t xml:space="preserve">−0.12 (−0.18 to −0.06)</w:t>
+            </w:r>
+          </w:p>
+        </w:tc>
+      </w:tr>
+      <w:tr>
+        <w:trPr>
+          <w:tblHeader w:val="false"/>
+        </w:trPr>
+        <w:tc>
+          <w:tcPr>
+            <w:tcW w:type="dxa" w:w="2808"/>
+            <w:tcMar>
+              <w:top w:type="dxa" w:w="40"/>
+              <w:left w:type="dxa" w:w="60"/>
+              <w:bottom w:type="dxa" w:w="40"/>
+              <w:right w:type="dxa" w:w="60"/>
+            </w:tcMar>
+          </w:tcPr>
+          <w:p>
+            <w:pPr>
+              <w:jc w:val="left"/>
+            </w:pPr>
+            <w:r>
+              <w:rPr>
+                <w:rFonts w:ascii="Times New Roman" w:cs="Times New Roman" w:eastAsia="Times New Roman" w:hAnsi="Times New Roman"/>
+                <w:b w:val="false"/>
+                <w:bCs w:val="false"/>
+                <w:i w:val="false"/>
+                <w:iCs w:val="false"/>
+                <w:sz w:val="18"/>
+                <w:szCs w:val="18"/>
+              </w:rPr>
+              <w:t xml:space="preserve">hazardous trade listed by 1940 within 500 m</w:t>
+            </w:r>
+          </w:p>
+        </w:tc>
+        <w:tc>
+          <w:tcPr>
+            <w:tcW w:type="dxa" w:w="1638"/>
+            <w:tcMar>
+              <w:top w:type="dxa" w:w="40"/>
+              <w:left w:type="dxa" w:w="60"/>
+              <w:bottom w:type="dxa" w:w="40"/>
+              <w:right w:type="dxa" w:w="60"/>
+            </w:tcMar>
+          </w:tcPr>
+          <w:p>
+            <w:pPr>
+              <w:jc w:val="right"/>
+            </w:pPr>
+            <w:r>
+              <w:rPr>
+                <w:rFonts w:ascii="Times New Roman" w:cs="Times New Roman" w:eastAsia="Times New Roman" w:hAnsi="Times New Roman"/>
+                <w:b w:val="false"/>
+                <w:bCs w:val="false"/>
+                <w:i w:val="false"/>
+                <w:iCs w:val="false"/>
+                <w:sz w:val="18"/>
+                <w:szCs w:val="18"/>
+              </w:rPr>
+              <w:t xml:space="preserve">−0.24 (−0.39 to −0.09)</w:t>
+            </w:r>
+          </w:p>
+        </w:tc>
+        <w:tc>
+          <w:tcPr>
+            <w:tcW w:type="dxa" w:w="1638"/>
+            <w:tcMar>
+              <w:top w:type="dxa" w:w="40"/>
+              <w:left w:type="dxa" w:w="60"/>
+              <w:bottom w:type="dxa" w:w="40"/>
+              <w:right w:type="dxa" w:w="60"/>
+            </w:tcMar>
+          </w:tcPr>
+          <w:p>
+            <w:pPr>
+              <w:jc w:val="right"/>
+            </w:pPr>
+            <w:r>
+              <w:rPr>
+                <w:rFonts w:ascii="Times New Roman" w:cs="Times New Roman" w:eastAsia="Times New Roman" w:hAnsi="Times New Roman"/>
+                <w:b w:val="false"/>
+                <w:bCs w:val="false"/>
+                <w:i w:val="false"/>
+                <w:iCs w:val="false"/>
+                <w:sz w:val="18"/>
+                <w:szCs w:val="18"/>
+              </w:rPr>
+              <w:t xml:space="preserve">−0.40 (−0.71 to −0.09)</w:t>
+            </w:r>
+          </w:p>
+        </w:tc>
+        <w:tc>
+          <w:tcPr>
+            <w:tcW w:type="dxa" w:w="1638"/>
+            <w:tcMar>
+              <w:top w:type="dxa" w:w="40"/>
+              <w:left w:type="dxa" w:w="60"/>
+              <w:bottom w:type="dxa" w:w="40"/>
+              <w:right w:type="dxa" w:w="60"/>
+            </w:tcMar>
+          </w:tcPr>
+          <w:p>
+            <w:pPr>
+              <w:jc w:val="right"/>
+            </w:pPr>
+            <w:r>
+              <w:rPr>
+                <w:rFonts w:ascii="Times New Roman" w:cs="Times New Roman" w:eastAsia="Times New Roman" w:hAnsi="Times New Roman"/>
+                <w:b w:val="false"/>
+                <w:bCs w:val="false"/>
+                <w:i w:val="false"/>
+                <w:iCs w:val="false"/>
+                <w:sz w:val="18"/>
+                <w:szCs w:val="18"/>
+              </w:rPr>
+              <w:t xml:space="preserve">−2.6 (−4.9 to −0.4)</w:t>
+            </w:r>
+          </w:p>
+        </w:tc>
+        <w:tc>
+          <w:tcPr>
+            <w:tcW w:type="dxa" w:w="1638"/>
+            <w:tcMar>
+              <w:top w:type="dxa" w:w="40"/>
+              <w:left w:type="dxa" w:w="60"/>
+              <w:bottom w:type="dxa" w:w="40"/>
+              <w:right w:type="dxa" w:w="60"/>
+            </w:tcMar>
+          </w:tcPr>
+          <w:p>
+            <w:pPr>
+              <w:jc w:val="right"/>
+            </w:pPr>
+            <w:r>
+              <w:rPr>
+                <w:rFonts w:ascii="Times New Roman" w:cs="Times New Roman" w:eastAsia="Times New Roman" w:hAnsi="Times New Roman"/>
+                <w:b w:val="false"/>
+                <w:bCs w:val="false"/>
+                <w:i w:val="false"/>
+                <w:iCs w:val="false"/>
+                <w:sz w:val="18"/>
+                <w:szCs w:val="18"/>
+              </w:rPr>
+              <w:t xml:space="preserve">−0.26 (−0.47 to −0.04)</w:t>
+            </w:r>
+          </w:p>
+        </w:tc>
+      </w:tr>
+      <w:tr>
+        <w:trPr>
+          <w:tblHeader w:val="false"/>
+        </w:trPr>
+        <w:tc>
+          <w:tcPr>
+            <w:tcW w:type="dxa" w:w="2808"/>
+            <w:tcMar>
+              <w:top w:type="dxa" w:w="40"/>
+              <w:left w:type="dxa" w:w="60"/>
+              <w:bottom w:type="dxa" w:w="40"/>
+              <w:right w:type="dxa" w:w="60"/>
+            </w:tcMar>
+          </w:tcPr>
+          <w:p>
+            <w:pPr>
+              <w:jc w:val="left"/>
+            </w:pPr>
+            <w:r>
+              <w:rPr>
+                <w:rFonts w:ascii="Times New Roman" w:cs="Times New Roman" w:eastAsia="Times New Roman" w:hAnsi="Times New Roman"/>
+                <w:b w:val="false"/>
+                <w:bCs w:val="false"/>
+                <w:i w:val="false"/>
+                <w:iCs w:val="false"/>
+                <w:sz w:val="18"/>
+                <w:szCs w:val="18"/>
+              </w:rPr>
+              <w:t xml:space="preserve">HOLC grade D (vs A or B)</w:t>
+            </w:r>
+          </w:p>
+        </w:tc>
+        <w:tc>
+          <w:tcPr>
+            <w:tcW w:type="dxa" w:w="1638"/>
+            <w:tcMar>
+              <w:top w:type="dxa" w:w="40"/>
+              <w:left w:type="dxa" w:w="60"/>
+              <w:bottom w:type="dxa" w:w="40"/>
+              <w:right w:type="dxa" w:w="60"/>
+            </w:tcMar>
+          </w:tcPr>
+          <w:p>
+            <w:pPr>
+              <w:jc w:val="right"/>
+            </w:pPr>
+            <w:r>
+              <w:rPr>
+                <w:rFonts w:ascii="Times New Roman" w:cs="Times New Roman" w:eastAsia="Times New Roman" w:hAnsi="Times New Roman"/>
+                <w:b w:val="false"/>
+                <w:bCs w:val="false"/>
+                <w:i w:val="false"/>
+                <w:iCs w:val="false"/>
+                <w:sz w:val="18"/>
+                <w:szCs w:val="18"/>
+              </w:rPr>
+              <w:t xml:space="preserve">−0.56 (−0.83 to −0.30)</w:t>
+            </w:r>
+          </w:p>
+        </w:tc>
+        <w:tc>
+          <w:tcPr>
+            <w:tcW w:type="dxa" w:w="1638"/>
+            <w:tcMar>
+              <w:top w:type="dxa" w:w="40"/>
+              <w:left w:type="dxa" w:w="60"/>
+              <w:bottom w:type="dxa" w:w="40"/>
+              <w:right w:type="dxa" w:w="60"/>
+            </w:tcMar>
+          </w:tcPr>
+          <w:p>
+            <w:pPr>
+              <w:jc w:val="right"/>
+            </w:pPr>
+            <w:r>
+              <w:rPr>
+                <w:rFonts w:ascii="Times New Roman" w:cs="Times New Roman" w:eastAsia="Times New Roman" w:hAnsi="Times New Roman"/>
+                <w:b w:val="false"/>
+                <w:bCs w:val="false"/>
+                <w:i w:val="false"/>
+                <w:iCs w:val="false"/>
+                <w:sz w:val="18"/>
+                <w:szCs w:val="18"/>
+              </w:rPr>
+              <w:t xml:space="preserve">−0.57 (−1.17 to 0.03)</w:t>
+            </w:r>
+          </w:p>
+        </w:tc>
+        <w:tc>
+          <w:tcPr>
+            <w:tcW w:type="dxa" w:w="1638"/>
+            <w:tcMar>
+              <w:top w:type="dxa" w:w="40"/>
+              <w:left w:type="dxa" w:w="60"/>
+              <w:bottom w:type="dxa" w:w="40"/>
+              <w:right w:type="dxa" w:w="60"/>
+            </w:tcMar>
+          </w:tcPr>
+          <w:p>
+            <w:pPr>
+              <w:jc w:val="right"/>
+            </w:pPr>
+            <w:r>
+              <w:rPr>
+                <w:rFonts w:ascii="Times New Roman" w:cs="Times New Roman" w:eastAsia="Times New Roman" w:hAnsi="Times New Roman"/>
+                <w:b w:val="false"/>
+                <w:bCs w:val="false"/>
+                <w:i w:val="false"/>
+                <w:iCs w:val="false"/>
+                <w:sz w:val="18"/>
+                <w:szCs w:val="18"/>
+              </w:rPr>
+              <w:t xml:space="preserve">−6.7 (−10.8 to −2.6)</w:t>
+            </w:r>
+          </w:p>
+        </w:tc>
+        <w:tc>
+          <w:tcPr>
+            <w:tcW w:type="dxa" w:w="1638"/>
+            <w:tcMar>
+              <w:top w:type="dxa" w:w="40"/>
+              <w:left w:type="dxa" w:w="60"/>
+              <w:bottom w:type="dxa" w:w="40"/>
+              <w:right w:type="dxa" w:w="60"/>
+            </w:tcMar>
+          </w:tcPr>
+          <w:p>
+            <w:pPr>
+              <w:jc w:val="right"/>
+            </w:pPr>
+            <w:r>
+              <w:rPr>
+                <w:rFonts w:ascii="Times New Roman" w:cs="Times New Roman" w:eastAsia="Times New Roman" w:hAnsi="Times New Roman"/>
+                <w:b w:val="false"/>
+                <w:bCs w:val="false"/>
+                <w:i w:val="false"/>
+                <w:iCs w:val="false"/>
+                <w:sz w:val="18"/>
+                <w:szCs w:val="18"/>
+              </w:rPr>
+              <w:t xml:space="preserve">−0.42 (−0.68 to −0.16)</w:t>
+            </w:r>
+          </w:p>
+        </w:tc>
+      </w:tr>
+      <w:tr>
+        <w:trPr>
+          <w:tblHeader w:val="false"/>
+        </w:trPr>
+        <w:tc>
+          <w:tcPr>
+            <w:tcW w:type="dxa" w:w="2808"/>
+            <w:tcMar>
+              <w:top w:type="dxa" w:w="40"/>
+              <w:left w:type="dxa" w:w="60"/>
+              <w:bottom w:type="dxa" w:w="40"/>
+              <w:right w:type="dxa" w:w="60"/>
+            </w:tcMar>
+          </w:tcPr>
+          <w:p>
+            <w:pPr>
+              <w:jc w:val="left"/>
+            </w:pPr>
+            <w:r>
+              <w:rPr>
+                <w:rFonts w:ascii="Times New Roman" w:cs="Times New Roman" w:eastAsia="Times New Roman" w:hAnsi="Times New Roman"/>
+                <w:b w:val="false"/>
+                <w:bCs w:val="false"/>
+                <w:i w:val="false"/>
+                <w:iCs w:val="false"/>
+                <w:sz w:val="18"/>
+                <w:szCs w:val="18"/>
+              </w:rPr>
+              <w:t xml:space="preserve">major road open in 1940 within 100 m</w:t>
+            </w:r>
+          </w:p>
+        </w:tc>
+        <w:tc>
+          <w:tcPr>
+            <w:tcW w:type="dxa" w:w="1638"/>
+            <w:tcMar>
+              <w:top w:type="dxa" w:w="40"/>
+              <w:left w:type="dxa" w:w="60"/>
+              <w:bottom w:type="dxa" w:w="40"/>
+              <w:right w:type="dxa" w:w="60"/>
+            </w:tcMar>
+          </w:tcPr>
+          <w:p>
+            <w:pPr>
+              <w:jc w:val="right"/>
+            </w:pPr>
+            <w:r>
+              <w:rPr>
+                <w:rFonts w:ascii="Times New Roman" w:cs="Times New Roman" w:eastAsia="Times New Roman" w:hAnsi="Times New Roman"/>
+                <w:b w:val="false"/>
+                <w:bCs w:val="false"/>
+                <w:i w:val="false"/>
+                <w:iCs w:val="false"/>
+                <w:sz w:val="18"/>
+                <w:szCs w:val="18"/>
+              </w:rPr>
+              <w:t xml:space="preserve">−0.36 (−0.79 to 0.08)</w:t>
+            </w:r>
+          </w:p>
+        </w:tc>
+        <w:tc>
+          <w:tcPr>
+            <w:tcW w:type="dxa" w:w="1638"/>
+            <w:tcMar>
+              <w:top w:type="dxa" w:w="40"/>
+              <w:left w:type="dxa" w:w="60"/>
+              <w:bottom w:type="dxa" w:w="40"/>
+              <w:right w:type="dxa" w:w="60"/>
+            </w:tcMar>
+          </w:tcPr>
+          <w:p>
+            <w:pPr>
+              <w:jc w:val="right"/>
+            </w:pPr>
+            <w:r>
+              <w:rPr>
+                <w:rFonts w:ascii="Times New Roman" w:cs="Times New Roman" w:eastAsia="Times New Roman" w:hAnsi="Times New Roman"/>
+                <w:b w:val="false"/>
+                <w:bCs w:val="false"/>
+                <w:i w:val="false"/>
+                <w:iCs w:val="false"/>
+                <w:sz w:val="18"/>
+                <w:szCs w:val="18"/>
+              </w:rPr>
+              <w:t xml:space="preserve">−0.30 (−1.08 to 0.49)</w:t>
+            </w:r>
+          </w:p>
+        </w:tc>
+        <w:tc>
+          <w:tcPr>
+            <w:tcW w:type="dxa" w:w="1638"/>
+            <w:tcMar>
+              <w:top w:type="dxa" w:w="40"/>
+              <w:left w:type="dxa" w:w="60"/>
+              <w:bottom w:type="dxa" w:w="40"/>
+              <w:right w:type="dxa" w:w="60"/>
+            </w:tcMar>
+          </w:tcPr>
+          <w:p>
+            <w:pPr>
+              <w:jc w:val="right"/>
+            </w:pPr>
+            <w:r>
+              <w:rPr>
+                <w:rFonts w:ascii="Times New Roman" w:cs="Times New Roman" w:eastAsia="Times New Roman" w:hAnsi="Times New Roman"/>
+                <w:b w:val="false"/>
+                <w:bCs w:val="false"/>
+                <w:i w:val="false"/>
+                <w:iCs w:val="false"/>
+                <w:sz w:val="18"/>
+                <w:szCs w:val="18"/>
+              </w:rPr>
+              <w:t xml:space="preserve">−2.1 (−7.5 to 3.3)</w:t>
+            </w:r>
+          </w:p>
+        </w:tc>
+        <w:tc>
+          <w:tcPr>
+            <w:tcW w:type="dxa" w:w="1638"/>
+            <w:tcMar>
+              <w:top w:type="dxa" w:w="40"/>
+              <w:left w:type="dxa" w:w="60"/>
+              <w:bottom w:type="dxa" w:w="40"/>
+              <w:right w:type="dxa" w:w="60"/>
+            </w:tcMar>
+          </w:tcPr>
+          <w:p>
+            <w:pPr>
+              <w:jc w:val="right"/>
+            </w:pPr>
+            <w:r>
+              <w:rPr>
+                <w:rFonts w:ascii="Times New Roman" w:cs="Times New Roman" w:eastAsia="Times New Roman" w:hAnsi="Times New Roman"/>
+                <w:b w:val="false"/>
+                <w:bCs w:val="false"/>
+                <w:i w:val="false"/>
+                <w:iCs w:val="false"/>
+                <w:sz w:val="18"/>
+                <w:szCs w:val="18"/>
+              </w:rPr>
+              <w:t xml:space="preserve">−0.93 (−1.45 to −0.40)</w:t>
+            </w:r>
+          </w:p>
+        </w:tc>
+      </w:tr>
+      <w:tr>
+        <w:trPr>
+          <w:tblHeader w:val="false"/>
+        </w:trPr>
+        <w:tc>
+          <w:tcPr>
+            <w:tcW w:type="dxa" w:w="2808"/>
+            <w:tcMar>
+              <w:top w:type="dxa" w:w="40"/>
+              <w:left w:type="dxa" w:w="60"/>
+              <w:bottom w:type="dxa" w:w="40"/>
+              <w:right w:type="dxa" w:w="60"/>
+            </w:tcMar>
+          </w:tcPr>
+          <w:p>
+            <w:pPr>
+              <w:jc w:val="left"/>
+            </w:pPr>
+            <w:r>
+              <w:rPr>
+                <w:rFonts w:ascii="Times New Roman" w:cs="Times New Roman" w:eastAsia="Times New Roman" w:hAnsi="Times New Roman"/>
+                <w:b w:val="false"/>
+                <w:bCs w:val="false"/>
+                <w:i w:val="false"/>
+                <w:iCs w:val="false"/>
+                <w:sz w:val="18"/>
+                <w:szCs w:val="18"/>
+              </w:rPr>
+              <w:t xml:space="preserve">placebo: commercial land within 250 m (per 10 points)</w:t>
+            </w:r>
+          </w:p>
+        </w:tc>
+        <w:tc>
+          <w:tcPr>
+            <w:tcW w:type="dxa" w:w="1638"/>
+            <w:tcMar>
+              <w:top w:type="dxa" w:w="40"/>
+              <w:left w:type="dxa" w:w="60"/>
+              <w:bottom w:type="dxa" w:w="40"/>
+              <w:right w:type="dxa" w:w="60"/>
+            </w:tcMar>
+          </w:tcPr>
+          <w:p>
+            <w:pPr>
+              <w:jc w:val="right"/>
+            </w:pPr>
+            <w:r>
+              <w:rPr>
+                <w:rFonts w:ascii="Times New Roman" w:cs="Times New Roman" w:eastAsia="Times New Roman" w:hAnsi="Times New Roman"/>
+                <w:b w:val="false"/>
+                <w:bCs w:val="false"/>
+                <w:i w:val="false"/>
+                <w:iCs w:val="false"/>
+                <w:sz w:val="18"/>
+                <w:szCs w:val="18"/>
+              </w:rPr>
+              <w:t xml:space="preserve">−0.01 (−0.04 to 0.02)</w:t>
+            </w:r>
+          </w:p>
+        </w:tc>
+        <w:tc>
+          <w:tcPr>
+            <w:tcW w:type="dxa" w:w="1638"/>
+            <w:tcMar>
+              <w:top w:type="dxa" w:w="40"/>
+              <w:left w:type="dxa" w:w="60"/>
+              <w:bottom w:type="dxa" w:w="40"/>
+              <w:right w:type="dxa" w:w="60"/>
+            </w:tcMar>
+          </w:tcPr>
+          <w:p>
+            <w:pPr>
+              <w:jc w:val="right"/>
+            </w:pPr>
+            <w:r>
+              <w:rPr>
+                <w:rFonts w:ascii="Times New Roman" w:cs="Times New Roman" w:eastAsia="Times New Roman" w:hAnsi="Times New Roman"/>
+                <w:b w:val="false"/>
+                <w:bCs w:val="false"/>
+                <w:i w:val="false"/>
+                <w:iCs w:val="false"/>
+                <w:sz w:val="18"/>
+                <w:szCs w:val="18"/>
+              </w:rPr>
+              <w:t xml:space="preserve">−0.05 (−0.11 to 0.01)</w:t>
+            </w:r>
+          </w:p>
+        </w:tc>
+        <w:tc>
+          <w:tcPr>
+            <w:tcW w:type="dxa" w:w="1638"/>
+            <w:tcMar>
+              <w:top w:type="dxa" w:w="40"/>
+              <w:left w:type="dxa" w:w="60"/>
+              <w:bottom w:type="dxa" w:w="40"/>
+              <w:right w:type="dxa" w:w="60"/>
+            </w:tcMar>
+          </w:tcPr>
+          <w:p>
+            <w:pPr>
+              <w:jc w:val="right"/>
+            </w:pPr>
+            <w:r>
+              <w:rPr>
+                <w:rFonts w:ascii="Times New Roman" w:cs="Times New Roman" w:eastAsia="Times New Roman" w:hAnsi="Times New Roman"/>
+                <w:b w:val="false"/>
+                <w:bCs w:val="false"/>
+                <w:i w:val="false"/>
+                <w:iCs w:val="false"/>
+                <w:sz w:val="18"/>
+                <w:szCs w:val="18"/>
+              </w:rPr>
+              <w:t xml:space="preserve">−0.7 (−1.1 to −0.3)</w:t>
+            </w:r>
+          </w:p>
+        </w:tc>
+        <w:tc>
+          <w:tcPr>
+            <w:tcW w:type="dxa" w:w="1638"/>
+            <w:tcMar>
+              <w:top w:type="dxa" w:w="40"/>
+              <w:left w:type="dxa" w:w="60"/>
+              <w:bottom w:type="dxa" w:w="40"/>
+              <w:right w:type="dxa" w:w="60"/>
+            </w:tcMar>
+          </w:tcPr>
+          <w:p>
+            <w:pPr>
+              <w:jc w:val="right"/>
+            </w:pPr>
+            <w:r>
+              <w:rPr>
+                <w:rFonts w:ascii="Times New Roman" w:cs="Times New Roman" w:eastAsia="Times New Roman" w:hAnsi="Times New Roman"/>
+                <w:b w:val="false"/>
+                <w:bCs w:val="false"/>
+                <w:i w:val="false"/>
+                <w:iCs w:val="false"/>
+                <w:sz w:val="18"/>
+                <w:szCs w:val="18"/>
+              </w:rPr>
+              <w:t xml:space="preserve">−0.03 (−0.07 to 0.01)</w:t>
+            </w:r>
+          </w:p>
+        </w:tc>
+      </w:tr>
+    </w:tbl>
+    <w:p>
+      <w:pPr>
+        <w:spacing w:after="120"/>
+      </w:pPr>
+    </w:p>
+    <w:p>
+      <w:pPr>
+        <w:spacing w:after="160" w:line="360"/>
+        <w:jc w:val="both"/>
+      </w:pPr>
+      <w:r>
+        <w:rPr>
+          <w:rFonts w:ascii="Times New Roman" w:cs="Times New Roman" w:eastAsia="Times New Roman" w:hAnsi="Times New Roman"/>
+          <w:b w:val="false"/>
+          <w:bCs w:val="false"/>
+          <w:i w:val="false"/>
+          <w:iCs w:val="false"/>
+          <w:sz w:val="24"/>
+          <w:szCs w:val="24"/>
+        </w:rPr>
+        <w:t xml:space="preserve">Differences at enlistment (95% CI), with the 1940 person and household controls, birth-year and enlistment-year effects, errors clustered by 1940 enumeration district. Men born 1905–1927 who enlisted from civilian life: schooling 3,080; height and weight about 1,415 (enlistments before March 1943 only); boys aged 0–17 in 1940: schooling 1,059.</w:t>
+      </w:r>
+    </w:p>
+    <w:p>
+      <w:pPr>
+        <w:spacing w:after="160" w:line="360"/>
+        <w:jc w:val="both"/>
+      </w:pPr>
+      <w:r>
+        <w:rPr>
+          <w:rFonts w:ascii="Times New Roman" w:cs="Times New Roman" w:eastAsia="Times New Roman" w:hAnsi="Times New Roman"/>
+          <w:b w:val="false"/>
+          <w:bCs w:val="false"/>
+          <w:i w:val="false"/>
+          <w:iCs w:val="false"/>
+          <w:sz w:val="24"/>
+          <w:szCs w:val="24"/>
+        </w:rPr>
+        <w:t xml:space="preserve">Young men from industrial addresses arrived at enlistment with about half a year less schooling than men of the same age from households like theirs elsewhere in the city, and each ten points of industrial land around the home meant a tenth of a year less; the commercial placebo shows nothing. This is the clearest result in the linked data and holds for boys who were still at school in 1940. Height and weight point the same way for the industrial district, the hazardous trades and the D grade, but rest on few men, and the placebo also predicts slightly lower weight, so the weight differences partly reflect central neighbourhoods as such. Men from D addresses were also 1.5 percentage points less likely to appear in the enlistment records at all (−2.7 to −0.2), consistent with more rejections, which would make the measured gaps among those accepted smaller than the true ones. Taken with the mortality results, the 1940 industrial neighbourhoods are associated with less schooling and probably with smaller stature among the young men who grew up in them; their association with a shorter life is present for men in the main models but is not robust to every check.</w:t>
       </w:r>
     </w:p>
     <w:p>

</xml_diff>

<commit_message>
Sanborn coverage, Superfund soils, urban renewal case studies
</commit_message>
<xml_diff>
--- a/paper/Before_and_After_the_Map_manuscript.docx
+++ b/paper/Before_and_After_the_Map_manuscript.docx
@@ -34506,6 +34506,36 @@
           <w:szCs w:val="24"/>
         </w:rPr>
         <w:t xml:space="preserve">Freeways added a second, later industrial geography. Dated alignments from OpenHistoricalMap, checked against the NBER/FHWA interstate opening dates (Baum-Snow 2007; I-25 opened to interstate standard in Denver County in 1958–1965, I-70 in 1965–1968), put 133 km of freeway in the study area by 1970. Freeways built in 1950–1979 ran 0.74 km per km² through D land, against 0.17 in C, 0.04 in B and none in A, and 17% of D land lies within 250 m of one. A quarter of their length crossed the 1929 industrial districts, which were 12% of the mapped land, and two-thirds crossed residence and business districts. The 34 study tracts they cut through were already more Hispanic in 1960 (13% against 7.5% elsewhere) and lost more population afterwards (92% of their 1950 population in 1990, against 99%). To see what followed the openings rather than what preceded them, each of the 48 study tracts with a freeway opened within 250 m in 1950–1979 was lined up on its own opening year, and its population-weighted gap from tracts with no freeway within 1 km was traced from the last census before the opening; most of these openings fell in 1951–1968. Against inner tracts at a similar distance from downtown (within 5.8 km, 34 tracts), the freeway tracts' Hispanic share rose from about 1 point above theirs at the last census before opening to 17 points above two decades later and 25 points above four decades later; their white share went from 8 points above to 6 below; the owner-occupancy gap narrowed from 16 to 9 points; and poverty, first measured in 1970, went from 5 points below to 4 above. Population fell in both groups, and less in the freeway tracts (to 85% of the pre-opening count after four decades, against 70%). Against all tracts with no nearby freeway the direction is the same (Hispanic gap from 2 to 22 points, white from 5 to −8, poverty from 1 to 7). This is a comparison of trends, not a causal estimate: the routes were chosen through places already changing, and the owner-occupancy gap was already shrinking in the decades before opening. What it does show is that the neighbourhoods beside the new freeways became steadily more Hispanic and poorer than comparable inner neighbourhoods, while keeping more of their residents.</w:t>
+      </w:r>
+    </w:p>
+    <w:p>
+      <w:pPr>
+        <w:spacing w:after="160" w:line="360"/>
+        <w:jc w:val="both"/>
+      </w:pPr>
+      <w:r>
+        <w:rPr>
+          <w:rFonts w:ascii="Times New Roman" w:cs="Times New Roman" w:eastAsia="Times New Roman" w:hAnsi="Times New Roman"/>
+          <w:b/>
+          <w:bCs/>
+          <w:i w:val="false"/>
+          <w:iCs w:val="false"/>
+          <w:sz w:val="24"/>
+          <w:szCs w:val="24"/>
+        </w:rPr>
+        <w:t xml:space="preserve">Urban renewal.</w:t>
+      </w:r>
+      <w:r>
+        <w:rPr>
+          <w:rFonts w:ascii="Times New Roman" w:cs="Times New Roman" w:eastAsia="Times New Roman" w:hAnsi="Times New Roman"/>
+          <w:b w:val="false"/>
+          <w:bCs w:val="false"/>
+          <w:i w:val="false"/>
+          <w:iCs w:val="false"/>
+          <w:sz w:val="24"/>
+          <w:szCs w:val="24"/>
+        </w:rPr>
+        <w:t xml:space="preserve"> Federal urban renewal, run in Denver from 1958 by the Denver Urban Renewal Authority, cleared a different set of places. Renewing Inequality (Nelson, Winling et al.) maps six Denver projects from the federal Urban Renewal Project Characteristics reports. Two of the authority's first four projects were industrial in plan: 23.6 of Blake Street's 45.7 acres and 4.3 of Jerome Park's 6.3 acres were to be reused for industry, and the two areas held 3 pre-1960 hazardous trades each and 11 and 19 of the 1965–92 hazardous-sector manufacturers. The reports list 189 families in the Blake Street area (181 white, 8 non-white) and 69 white families in Jerome Park; at Whittier School, in the Black neighbourhood northeast of downtown, 128 of the 132 families were non-white, and the land went mostly to new housing. Skyline, approved by voters in 1967, cleared 120 acres of downtown where about 1,600 people lived, and its area had held 19 of the pre-1960 hazardous trades. Auraria, heavily Hispanic, flooded in 1965 and approved as a college campus by a 52% bond vote in 1969, is not mapped in the federal data. Area-weighted census figures, which borrow the composition of the surrounding tracts and so illustrate rather than test, show the project areas changing as the freeway tracts did: the Jerome Park area went from 56% Hispanic in 1960 to 79% in 1970 while its estimated population halved (850 to 421), and the Blake Street area lost two-fifths of its residents between 1960 and 1980 (598 to 362).</w:t>
       </w:r>
     </w:p>
     <w:p>
@@ -46414,6 +46444,53 @@
           <w:sz w:val="24"/>
           <w:szCs w:val="24"/>
         </w:rPr>
+        <w:t xml:space="preserve">Nelson, R. K., Winling, L., et al. </w:t>
+      </w:r>
+      <w:r>
+        <w:rPr>
+          <w:rFonts w:ascii="Times New Roman" w:cs="Times New Roman" w:eastAsia="Times New Roman" w:hAnsi="Times New Roman"/>
+          <w:b w:val="false"/>
+          <w:bCs w:val="false"/>
+          <w:i/>
+          <w:iCs/>
+          <w:sz w:val="24"/>
+          <w:szCs w:val="24"/>
+        </w:rPr>
+        <w:t xml:space="preserve">Renewing Inequality: Urban Renewal, Family Displacements, and Race, 1955–1966</w:t>
+      </w:r>
+      <w:r>
+        <w:rPr>
+          <w:rFonts w:ascii="Times New Roman" w:cs="Times New Roman" w:eastAsia="Times New Roman" w:hAnsi="Times New Roman"/>
+          <w:b w:val="false"/>
+          <w:bCs w:val="false"/>
+          <w:i w:val="false"/>
+          <w:iCs w:val="false"/>
+          <w:sz w:val="24"/>
+          <w:szCs w:val="24"/>
+        </w:rPr>
+        <w:t xml:space="preserve">. American Panorama, University of Richmond Digital Scholarship Lab; data at https://github.com/americanpanorama/Renewing_Inequality_Data.</w:t>
+      </w:r>
+    </w:p>
+    <w:p>
+      <w:pPr>
+        <w:pStyle w:val="ListParagraph"/>
+        <w:numPr>
+          <w:ilvl w:val="0"/>
+          <w:numId w:val="4"/>
+        </w:numPr>
+        <w:spacing w:after="120" w:line="340"/>
+        <w:jc w:val="both"/>
+      </w:pPr>
+      <w:r>
+        <w:rPr>
+          <w:rFonts w:ascii="Times New Roman" w:cs="Times New Roman" w:eastAsia="Times New Roman" w:hAnsi="Times New Roman"/>
+          <w:b w:val="false"/>
+          <w:bCs w:val="false"/>
+          <w:i w:val="false"/>
+          <w:iCs w:val="false"/>
+          <w:sz w:val="24"/>
+          <w:szCs w:val="24"/>
+        </w:rPr>
         <w:t xml:space="preserve">Breen, C. F., Osborne, M. and Goldstein, J. R. (2023) CenSoc: public linked administrative mortality records for individuals from the 1940 census. </w:t>
       </w:r>
       <w:r>

</xml_diff>